<commit_message>
Add demo datasheets, seen-vs-unseen eval, terminal screenshots in report
- test/: ATtiny85, ESP32-H2, CC2640R2F (best-scoring training datasheets)
- CLI: show the real PDF filename, hide HF progress bars and warnings
- Report: outcome breakdown, per-datasheet quality, seen vs unseen table, 3 terminal sessions

Co-Authored-By: Claude Opus 5.5 <noreply@anthropic.com>
</commit_message>
<xml_diff>
--- a/docs/ChipDoc_Report.docx
+++ b/docs/ChipDoc_Report.docx
@@ -933,7 +933,7 @@
           </w:pPr>
           <w:hyperlink w:history="1" w:anchor="_Toc30">
             <w:r>
-              <w:t xml:space="preserve">4.5 Qualitative Examples</w:t>
+              <w:t xml:space="preserve">4.5 Seen versus Unseen Datasheets</w:t>
             </w:r>
             <w:r>
               <w:tab/>
@@ -956,7 +956,7 @@
           </w:pPr>
           <w:hyperlink w:history="1" w:anchor="_Toc31">
             <w:r>
-              <w:t xml:space="preserve">4.6 Error Analysis and Limitations</w:t>
+              <w:t xml:space="preserve">4.6 Qualitative Examples</w:t>
             </w:r>
             <w:r>
               <w:tab/>
@@ -979,7 +979,7 @@
           </w:pPr>
           <w:hyperlink w:history="1" w:anchor="_Toc32">
             <w:r>
-              <w:t xml:space="preserve">4.7 Efficiency</w:t>
+              <w:t xml:space="preserve">4.7 Error Analysis and Limitations</w:t>
             </w:r>
             <w:r>
               <w:tab/>
@@ -994,14 +994,15 @@
         </w:p>
         <w:p>
           <w:pPr>
-            <w:pStyle w:val="TOC1"/>
+            <w:pStyle w:val="TOC2"/>
             <w:tabs>
               <w:tab w:val="right" w:pos="9026" w:leader="dot"/>
             </w:tabs>
+            <w:ind w:left="220"/>
           </w:pPr>
           <w:hyperlink w:history="1" w:anchor="_Toc33">
             <w:r>
-              <w:t xml:space="preserve">5. Conclusion</w:t>
+              <w:t xml:space="preserve">4.8 Efficiency</w:t>
             </w:r>
             <w:r>
               <w:tab/>
@@ -1023,7 +1024,7 @@
           </w:pPr>
           <w:hyperlink w:history="1" w:anchor="_Toc34">
             <w:r>
-              <w:t xml:space="preserve">6. Future Work</w:t>
+              <w:t xml:space="preserve">5. Conclusion</w:t>
             </w:r>
             <w:r>
               <w:tab/>
@@ -1045,7 +1046,7 @@
           </w:pPr>
           <w:hyperlink w:history="1" w:anchor="_Toc35">
             <w:r>
-              <w:t xml:space="preserve">Works Cited</w:t>
+              <w:t xml:space="preserve">6. Future Work</w:t>
             </w:r>
             <w:r>
               <w:tab/>
@@ -1053,6 +1054,28 @@
             <w:r>
               <w:fldChar w:fldCharType="begin" w:dirty="true"/>
               <w:instrText xml:space="preserve">PAGEREF _Toc35 \h</w:instrText>
+              <w:fldChar w:fldCharType="separate"/>
+              <w:fldChar w:fldCharType="end"/>
+            </w:r>
+          </w:hyperlink>
+        </w:p>
+        <w:p>
+          <w:pPr>
+            <w:pStyle w:val="TOC1"/>
+            <w:tabs>
+              <w:tab w:val="right" w:pos="9026" w:leader="dot"/>
+            </w:tabs>
+          </w:pPr>
+          <w:hyperlink w:history="1" w:anchor="_Toc36">
+            <w:r>
+              <w:t xml:space="preserve">Works Cited</w:t>
+            </w:r>
+            <w:r>
+              <w:tab/>
+            </w:r>
+            <w:r>
+              <w:fldChar w:fldCharType="begin" w:dirty="true"/>
+              <w:instrText xml:space="preserve">PAGEREF _Toc36 \h</w:instrText>
               <w:fldChar w:fldCharType="separate"/>
               <w:fldChar w:fldCharType="end"/>
             </w:r>
@@ -6772,30 +6795,11 @@
     </w:p>
     <w:p>
       <w:pPr>
-        <w:pStyle w:val="Heading2"/>
-      </w:pPr>
-      <w:bookmarkStart w:name="_Toc30" w:id="30"/>
-      <w:r>
-        <w:t xml:space="preserve">4.5 Qualitative Examples</w:t>
-      </w:r>
-      <w:bookmarkEnd w:id="30"/>
-    </w:p>
-    <w:p>
-      <w:pPr>
         <w:spacing w:after="140" w:line="300"/>
         <w:jc w:val="both"/>
       </w:pPr>
       <w:r>
-        <w:t xml:space="preserve">A typical correction on an unanswerable input: asked “What does ULP Advisor check your code against?” with the relevant passage removed, the base model answered that it checks code “against an energy-based code analysis tool to optimize it for ultra-low power consumption [p.92]”—an invented answer with an invented citation. The fine-tuned model replied “Not found in the provided datasheet.” With the passage present, it answered “ULP Advisor checks your code against a thorough ULP checklist…”, matching the reference.</w:t>
-      </w:r>
-    </w:p>
-    <w:p>
-      <w:pPr>
-        <w:spacing w:after="140" w:line="300"/>
-        <w:jc w:val="both"/>
-      </w:pPr>
-      <w:r>
-        <w:t xml:space="preserve">Figure 11 shows the terminal application on LPC1768, a held-out datasheet. Both factual answers are correct and cite the right pages, and the question about Wi-Fi, a feature the part does not have, is correctly refused.</w:t>
+        <w:t xml:space="preserve">Figure 11 breaks the same results down by outcome. When the evidence was retrieved, the share of fully correct answers (token F1 of at least 0.5) rose from 48% to 58%, and partly correct or wrong answers fell from 47% to 27%; the price is a larger share of refusals, from 5% to 15%. When the evidence was removed, the share of invented answers fell from 70% to 26%.</w:t>
       </w:r>
     </w:p>
     <w:p>
@@ -6807,9 +6811,9 @@
       <w:r>
         <w:drawing>
           <wp:inline distT="0" distB="0" distL="0" distR="0">
-            <wp:extent cx="5334000" cy="2771775"/>
+            <wp:extent cx="5715000" cy="2124075"/>
             <wp:effectExtent t="0" r="0" b="0" l="0"/>
-            <wp:docPr id="11" name="Figure 11" descr="ChipDoc answering questions about the held-out LPC1768 datasheet (real output)." title="Figure 11"/>
+            <wp:docPr id="11" name="Figure 11" descr="Outcome breakdown on the held-out questions. Left: inputs where retrieval found the evidence. Right: inputs where the evidence was removed, so the only correct output is a refusal." title="Figure 11"/>
             <wp:cNvGraphicFramePr>
               <a:graphicFrameLocks xmlns:a="http://schemas.openxmlformats.org/drawingml/2006/main" noChangeAspect="1"/>
             </wp:cNvGraphicFramePr>
@@ -6832,6 +6836,841 @@
                   <pic:spPr bwMode="auto">
                     <a:xfrm>
                       <a:off x="0" y="0"/>
+                      <a:ext cx="5715000" cy="2124075"/>
+                    </a:xfrm>
+                    <a:prstGeom prst="rect">
+                      <a:avLst/>
+                    </a:prstGeom>
+                  </pic:spPr>
+                </pic:pic>
+              </a:graphicData>
+            </a:graphic>
+          </wp:inline>
+        </w:drawing>
+      </w:r>
+    </w:p>
+    <w:p>
+      <w:pPr>
+        <w:spacing w:after="240"/>
+        <w:jc w:val="center"/>
+      </w:pPr>
+      <w:r>
+        <w:rPr>
+          <w:b/>
+          <w:bCs/>
+          <w:sz w:val="20"/>
+          <w:szCs w:val="20"/>
+        </w:rPr>
+        <w:t xml:space="preserve">Figure 11: </w:t>
+      </w:r>
+      <w:r>
+        <w:rPr>
+          <w:sz w:val="20"/>
+          <w:szCs w:val="20"/>
+        </w:rPr>
+        <w:t xml:space="preserve">Outcome breakdown on the held-out questions. Left: inputs where retrieval found the evidence. Right: inputs where the evidence was removed, so the only correct output is a refusal.</w:t>
+      </w:r>
+    </w:p>
+    <w:p>
+      <w:pPr>
+        <w:pStyle w:val="Heading2"/>
+      </w:pPr>
+      <w:bookmarkStart w:name="_Toc30" w:id="30"/>
+      <w:r>
+        <w:t xml:space="preserve">4.5 Seen versus Unseen Datasheets</w:t>
+      </w:r>
+      <w:bookmarkEnd w:id="30"/>
+    </w:p>
+    <w:p>
+      <w:pPr>
+        <w:spacing w:after="140" w:line="300"/>
+        <w:jc w:val="both"/>
+      </w:pPr>
+      <w:r>
+        <w:t xml:space="preserve">To check whether the fine-tune memorised its training datasheets or learned a general reading skill, the fine-tuned model was also run on ten random QA pairs from each of the 25 training datasheets (250 questions), through the same pipeline: the full datasheet index, hybrid top-five retrieval and the same prompt. Table 6 compares these with the held-out results.</w:t>
+      </w:r>
+    </w:p>
+    <w:p>
+      <w:pPr>
+        <w:keepNext/>
+        <w:spacing w:after="80" w:before="160"/>
+        <w:jc w:val="center"/>
+      </w:pPr>
+      <w:r>
+        <w:rPr>
+          <w:b/>
+          <w:bCs/>
+          <w:sz w:val="20"/>
+          <w:szCs w:val="20"/>
+        </w:rPr>
+        <w:t xml:space="preserve">Table 6: </w:t>
+      </w:r>
+      <w:r>
+        <w:rPr>
+          <w:sz w:val="20"/>
+          <w:szCs w:val="20"/>
+        </w:rPr>
+        <w:t xml:space="preserve">Fine-tuned model on training (seen) and held-out (unseen) datasheets</w:t>
+      </w:r>
+    </w:p>
+    <w:tbl>
+      <w:tblPr>
+        <w:tblW w:type="dxa" w:w="9026"/>
+        <w:jc w:val="center"/>
+        <w:tblBorders>
+          <w:top w:val="single" w:color="auto" w:sz="4"/>
+          <w:left w:val="single" w:color="auto" w:sz="4"/>
+          <w:bottom w:val="single" w:color="auto" w:sz="4"/>
+          <w:right w:val="single" w:color="auto" w:sz="4"/>
+          <w:insideH w:val="single" w:color="auto" w:sz="4"/>
+          <w:insideV w:val="single" w:color="auto" w:sz="4"/>
+        </w:tblBorders>
+      </w:tblPr>
+      <w:tblGrid>
+        <w:gridCol w:w="3826"/>
+        <w:gridCol w:w="2600"/>
+        <w:gridCol w:w="2600"/>
+      </w:tblGrid>
+      <w:tr>
+        <w:trPr>
+          <w:tblHeader/>
+        </w:trPr>
+        <w:tc>
+          <w:tcPr>
+            <w:tcW w:type="dxa" w:w="3826"/>
+            <w:tcBorders>
+              <w:top w:val="single" w:color="BFBFBF" w:sz="4"/>
+              <w:left w:val="single" w:color="BFBFBF" w:sz="4"/>
+              <w:bottom w:val="single" w:color="BFBFBF" w:sz="4"/>
+              <w:right w:val="single" w:color="BFBFBF" w:sz="4"/>
+            </w:tcBorders>
+            <w:shd w:fill="1F6F8B" w:color="auto" w:val="clear"/>
+            <w:tcMar>
+              <w:top w:type="dxa" w:w="60"/>
+              <w:left w:type="dxa" w:w="100"/>
+              <w:bottom w:type="dxa" w:w="60"/>
+              <w:right w:type="dxa" w:w="100"/>
+            </w:tcMar>
+          </w:tcPr>
+          <w:p>
+            <w:pPr>
+              <w:spacing w:after="0" w:line="260"/>
+            </w:pPr>
+            <w:r>
+              <w:rPr>
+                <w:b/>
+                <w:bCs/>
+                <w:color w:val="FFFFFF"/>
+                <w:sz w:val="20"/>
+                <w:szCs w:val="20"/>
+              </w:rPr>
+              <w:t xml:space="preserve">Metric</w:t>
+            </w:r>
+          </w:p>
+        </w:tc>
+        <w:tc>
+          <w:tcPr>
+            <w:tcW w:type="dxa" w:w="2600"/>
+            <w:tcBorders>
+              <w:top w:val="single" w:color="BFBFBF" w:sz="4"/>
+              <w:left w:val="single" w:color="BFBFBF" w:sz="4"/>
+              <w:bottom w:val="single" w:color="BFBFBF" w:sz="4"/>
+              <w:right w:val="single" w:color="BFBFBF" w:sz="4"/>
+            </w:tcBorders>
+            <w:shd w:fill="1F6F8B" w:color="auto" w:val="clear"/>
+            <w:tcMar>
+              <w:top w:type="dxa" w:w="60"/>
+              <w:left w:type="dxa" w:w="100"/>
+              <w:bottom w:type="dxa" w:w="60"/>
+              <w:right w:type="dxa" w:w="100"/>
+            </w:tcMar>
+          </w:tcPr>
+          <w:p>
+            <w:pPr>
+              <w:spacing w:after="0" w:line="260"/>
+            </w:pPr>
+            <w:r>
+              <w:rPr>
+                <w:b/>
+                <w:bCs/>
+                <w:color w:val="FFFFFF"/>
+                <w:sz w:val="20"/>
+                <w:szCs w:val="20"/>
+              </w:rPr>
+              <w:t xml:space="preserve">Seen (25 datasheets, 250 Q)</w:t>
+            </w:r>
+          </w:p>
+        </w:tc>
+        <w:tc>
+          <w:tcPr>
+            <w:tcW w:type="dxa" w:w="2600"/>
+            <w:tcBorders>
+              <w:top w:val="single" w:color="BFBFBF" w:sz="4"/>
+              <w:left w:val="single" w:color="BFBFBF" w:sz="4"/>
+              <w:bottom w:val="single" w:color="BFBFBF" w:sz="4"/>
+              <w:right w:val="single" w:color="BFBFBF" w:sz="4"/>
+            </w:tcBorders>
+            <w:shd w:fill="1F6F8B" w:color="auto" w:val="clear"/>
+            <w:tcMar>
+              <w:top w:type="dxa" w:w="60"/>
+              <w:left w:type="dxa" w:w="100"/>
+              <w:bottom w:type="dxa" w:w="60"/>
+              <w:right w:type="dxa" w:w="100"/>
+            </w:tcMar>
+          </w:tcPr>
+          <w:p>
+            <w:pPr>
+              <w:spacing w:after="0" w:line="260"/>
+            </w:pPr>
+            <w:r>
+              <w:rPr>
+                <w:b/>
+                <w:bCs/>
+                <w:color w:val="FFFFFF"/>
+                <w:sz w:val="20"/>
+                <w:szCs w:val="20"/>
+              </w:rPr>
+              <w:t xml:space="preserve">Unseen (5 datasheets, 100 Q)</w:t>
+            </w:r>
+          </w:p>
+        </w:tc>
+      </w:tr>
+      <w:tr>
+        <w:trPr>
+          <w:cantSplit/>
+        </w:trPr>
+        <w:tc>
+          <w:tcPr>
+            <w:tcW w:type="dxa" w:w="3826"/>
+            <w:tcBorders>
+              <w:top w:val="single" w:color="BFBFBF" w:sz="4"/>
+              <w:left w:val="single" w:color="BFBFBF" w:sz="4"/>
+              <w:bottom w:val="single" w:color="BFBFBF" w:sz="4"/>
+              <w:right w:val="single" w:color="BFBFBF" w:sz="4"/>
+            </w:tcBorders>
+            <w:tcMar>
+              <w:top w:type="dxa" w:w="60"/>
+              <w:left w:type="dxa" w:w="100"/>
+              <w:bottom w:type="dxa" w:w="60"/>
+              <w:right w:type="dxa" w:w="100"/>
+            </w:tcMar>
+          </w:tcPr>
+          <w:p>
+            <w:pPr>
+              <w:spacing w:after="0" w:line="260"/>
+            </w:pPr>
+            <w:r>
+              <w:rPr>
+                <w:color w:val="262626"/>
+                <w:sz w:val="20"/>
+                <w:szCs w:val="20"/>
+              </w:rPr>
+              <w:t xml:space="preserve">Evidence in top five passages</w:t>
+            </w:r>
+          </w:p>
+        </w:tc>
+        <w:tc>
+          <w:tcPr>
+            <w:tcW w:type="dxa" w:w="2600"/>
+            <w:tcBorders>
+              <w:top w:val="single" w:color="BFBFBF" w:sz="4"/>
+              <w:left w:val="single" w:color="BFBFBF" w:sz="4"/>
+              <w:bottom w:val="single" w:color="BFBFBF" w:sz="4"/>
+              <w:right w:val="single" w:color="BFBFBF" w:sz="4"/>
+            </w:tcBorders>
+            <w:tcMar>
+              <w:top w:type="dxa" w:w="60"/>
+              <w:left w:type="dxa" w:w="100"/>
+              <w:bottom w:type="dxa" w:w="60"/>
+              <w:right w:type="dxa" w:w="100"/>
+            </w:tcMar>
+          </w:tcPr>
+          <w:p>
+            <w:pPr>
+              <w:spacing w:after="0" w:line="260"/>
+            </w:pPr>
+            <w:r>
+              <w:rPr>
+                <w:color w:val="262626"/>
+                <w:sz w:val="20"/>
+                <w:szCs w:val="20"/>
+              </w:rPr>
+              <w:t xml:space="preserve">0.85</w:t>
+            </w:r>
+          </w:p>
+        </w:tc>
+        <w:tc>
+          <w:tcPr>
+            <w:tcW w:type="dxa" w:w="2600"/>
+            <w:tcBorders>
+              <w:top w:val="single" w:color="BFBFBF" w:sz="4"/>
+              <w:left w:val="single" w:color="BFBFBF" w:sz="4"/>
+              <w:bottom w:val="single" w:color="BFBFBF" w:sz="4"/>
+              <w:right w:val="single" w:color="BFBFBF" w:sz="4"/>
+            </w:tcBorders>
+            <w:tcMar>
+              <w:top w:type="dxa" w:w="60"/>
+              <w:left w:type="dxa" w:w="100"/>
+              <w:bottom w:type="dxa" w:w="60"/>
+              <w:right w:type="dxa" w:w="100"/>
+            </w:tcMar>
+          </w:tcPr>
+          <w:p>
+            <w:pPr>
+              <w:spacing w:after="0" w:line="260"/>
+            </w:pPr>
+            <w:r>
+              <w:rPr>
+                <w:color w:val="262626"/>
+                <w:sz w:val="20"/>
+                <w:szCs w:val="20"/>
+              </w:rPr>
+              <w:t xml:space="preserve">0.92</w:t>
+            </w:r>
+          </w:p>
+        </w:tc>
+      </w:tr>
+      <w:tr>
+        <w:trPr>
+          <w:cantSplit/>
+        </w:trPr>
+        <w:tc>
+          <w:tcPr>
+            <w:tcW w:type="dxa" w:w="3826"/>
+            <w:tcBorders>
+              <w:top w:val="single" w:color="BFBFBF" w:sz="4"/>
+              <w:left w:val="single" w:color="BFBFBF" w:sz="4"/>
+              <w:bottom w:val="single" w:color="BFBFBF" w:sz="4"/>
+              <w:right w:val="single" w:color="BFBFBF" w:sz="4"/>
+            </w:tcBorders>
+            <w:shd w:fill="F2F2F2" w:color="auto" w:val="clear"/>
+            <w:tcMar>
+              <w:top w:type="dxa" w:w="60"/>
+              <w:left w:type="dxa" w:w="100"/>
+              <w:bottom w:type="dxa" w:w="60"/>
+              <w:right w:type="dxa" w:w="100"/>
+            </w:tcMar>
+          </w:tcPr>
+          <w:p>
+            <w:pPr>
+              <w:spacing w:after="0" w:line="260"/>
+            </w:pPr>
+            <w:r>
+              <w:rPr>
+                <w:color w:val="262626"/>
+                <w:sz w:val="20"/>
+                <w:szCs w:val="20"/>
+              </w:rPr>
+              <w:t xml:space="preserve">Token F1 vs. reference</w:t>
+            </w:r>
+          </w:p>
+        </w:tc>
+        <w:tc>
+          <w:tcPr>
+            <w:tcW w:type="dxa" w:w="2600"/>
+            <w:tcBorders>
+              <w:top w:val="single" w:color="BFBFBF" w:sz="4"/>
+              <w:left w:val="single" w:color="BFBFBF" w:sz="4"/>
+              <w:bottom w:val="single" w:color="BFBFBF" w:sz="4"/>
+              <w:right w:val="single" w:color="BFBFBF" w:sz="4"/>
+            </w:tcBorders>
+            <w:shd w:fill="F2F2F2" w:color="auto" w:val="clear"/>
+            <w:tcMar>
+              <w:top w:type="dxa" w:w="60"/>
+              <w:left w:type="dxa" w:w="100"/>
+              <w:bottom w:type="dxa" w:w="60"/>
+              <w:right w:type="dxa" w:w="100"/>
+            </w:tcMar>
+          </w:tcPr>
+          <w:p>
+            <w:pPr>
+              <w:spacing w:after="0" w:line="260"/>
+            </w:pPr>
+            <w:r>
+              <w:rPr>
+                <w:color w:val="262626"/>
+                <w:sz w:val="20"/>
+                <w:szCs w:val="20"/>
+              </w:rPr>
+              <w:t xml:space="preserve">0.64</w:t>
+            </w:r>
+          </w:p>
+        </w:tc>
+        <w:tc>
+          <w:tcPr>
+            <w:tcW w:type="dxa" w:w="2600"/>
+            <w:tcBorders>
+              <w:top w:val="single" w:color="BFBFBF" w:sz="4"/>
+              <w:left w:val="single" w:color="BFBFBF" w:sz="4"/>
+              <w:bottom w:val="single" w:color="BFBFBF" w:sz="4"/>
+              <w:right w:val="single" w:color="BFBFBF" w:sz="4"/>
+            </w:tcBorders>
+            <w:shd w:fill="F2F2F2" w:color="auto" w:val="clear"/>
+            <w:tcMar>
+              <w:top w:type="dxa" w:w="60"/>
+              <w:left w:type="dxa" w:w="100"/>
+              <w:bottom w:type="dxa" w:w="60"/>
+              <w:right w:type="dxa" w:w="100"/>
+            </w:tcMar>
+          </w:tcPr>
+          <w:p>
+            <w:pPr>
+              <w:spacing w:after="0" w:line="260"/>
+            </w:pPr>
+            <w:r>
+              <w:rPr>
+                <w:color w:val="262626"/>
+                <w:sz w:val="20"/>
+                <w:szCs w:val="20"/>
+              </w:rPr>
+              <w:t xml:space="preserve">0.56</w:t>
+            </w:r>
+          </w:p>
+        </w:tc>
+      </w:tr>
+      <w:tr>
+        <w:trPr>
+          <w:cantSplit/>
+        </w:trPr>
+        <w:tc>
+          <w:tcPr>
+            <w:tcW w:type="dxa" w:w="3826"/>
+            <w:tcBorders>
+              <w:top w:val="single" w:color="BFBFBF" w:sz="4"/>
+              <w:left w:val="single" w:color="BFBFBF" w:sz="4"/>
+              <w:bottom w:val="single" w:color="BFBFBF" w:sz="4"/>
+              <w:right w:val="single" w:color="BFBFBF" w:sz="4"/>
+            </w:tcBorders>
+            <w:tcMar>
+              <w:top w:type="dxa" w:w="60"/>
+              <w:left w:type="dxa" w:w="100"/>
+              <w:bottom w:type="dxa" w:w="60"/>
+              <w:right w:type="dxa" w:w="100"/>
+            </w:tcMar>
+          </w:tcPr>
+          <w:p>
+            <w:pPr>
+              <w:spacing w:after="0" w:line="260"/>
+            </w:pPr>
+            <w:r>
+              <w:rPr>
+                <w:color w:val="262626"/>
+                <w:sz w:val="20"/>
+                <w:szCs w:val="20"/>
+              </w:rPr>
+              <w:t xml:space="preserve">Numbers reproduced correctly</w:t>
+            </w:r>
+          </w:p>
+        </w:tc>
+        <w:tc>
+          <w:tcPr>
+            <w:tcW w:type="dxa" w:w="2600"/>
+            <w:tcBorders>
+              <w:top w:val="single" w:color="BFBFBF" w:sz="4"/>
+              <w:left w:val="single" w:color="BFBFBF" w:sz="4"/>
+              <w:bottom w:val="single" w:color="BFBFBF" w:sz="4"/>
+              <w:right w:val="single" w:color="BFBFBF" w:sz="4"/>
+            </w:tcBorders>
+            <w:tcMar>
+              <w:top w:type="dxa" w:w="60"/>
+              <w:left w:type="dxa" w:w="100"/>
+              <w:bottom w:type="dxa" w:w="60"/>
+              <w:right w:type="dxa" w:w="100"/>
+            </w:tcMar>
+          </w:tcPr>
+          <w:p>
+            <w:pPr>
+              <w:spacing w:after="0" w:line="260"/>
+            </w:pPr>
+            <w:r>
+              <w:rPr>
+                <w:color w:val="262626"/>
+                <w:sz w:val="20"/>
+                <w:szCs w:val="20"/>
+              </w:rPr>
+              <w:t xml:space="preserve">0.70</w:t>
+            </w:r>
+          </w:p>
+        </w:tc>
+        <w:tc>
+          <w:tcPr>
+            <w:tcW w:type="dxa" w:w="2600"/>
+            <w:tcBorders>
+              <w:top w:val="single" w:color="BFBFBF" w:sz="4"/>
+              <w:left w:val="single" w:color="BFBFBF" w:sz="4"/>
+              <w:bottom w:val="single" w:color="BFBFBF" w:sz="4"/>
+              <w:right w:val="single" w:color="BFBFBF" w:sz="4"/>
+            </w:tcBorders>
+            <w:tcMar>
+              <w:top w:type="dxa" w:w="60"/>
+              <w:left w:type="dxa" w:w="100"/>
+              <w:bottom w:type="dxa" w:w="60"/>
+              <w:right w:type="dxa" w:w="100"/>
+            </w:tcMar>
+          </w:tcPr>
+          <w:p>
+            <w:pPr>
+              <w:spacing w:after="0" w:line="260"/>
+            </w:pPr>
+            <w:r>
+              <w:rPr>
+                <w:color w:val="262626"/>
+                <w:sz w:val="20"/>
+                <w:szCs w:val="20"/>
+              </w:rPr>
+              <w:t xml:space="preserve">0.75</w:t>
+            </w:r>
+          </w:p>
+        </w:tc>
+      </w:tr>
+      <w:tr>
+        <w:trPr>
+          <w:cantSplit/>
+        </w:trPr>
+        <w:tc>
+          <w:tcPr>
+            <w:tcW w:type="dxa" w:w="3826"/>
+            <w:tcBorders>
+              <w:top w:val="single" w:color="BFBFBF" w:sz="4"/>
+              <w:left w:val="single" w:color="BFBFBF" w:sz="4"/>
+              <w:bottom w:val="single" w:color="BFBFBF" w:sz="4"/>
+              <w:right w:val="single" w:color="BFBFBF" w:sz="4"/>
+            </w:tcBorders>
+            <w:shd w:fill="F2F2F2" w:color="auto" w:val="clear"/>
+            <w:tcMar>
+              <w:top w:type="dxa" w:w="60"/>
+              <w:left w:type="dxa" w:w="100"/>
+              <w:bottom w:type="dxa" w:w="60"/>
+              <w:right w:type="dxa" w:w="100"/>
+            </w:tcMar>
+          </w:tcPr>
+          <w:p>
+            <w:pPr>
+              <w:spacing w:after="0" w:line="260"/>
+            </w:pPr>
+            <w:r>
+              <w:rPr>
+                <w:color w:val="262626"/>
+                <w:sz w:val="20"/>
+                <w:szCs w:val="20"/>
+              </w:rPr>
+              <w:t xml:space="preserve">Correct page citation</w:t>
+            </w:r>
+          </w:p>
+        </w:tc>
+        <w:tc>
+          <w:tcPr>
+            <w:tcW w:type="dxa" w:w="2600"/>
+            <w:tcBorders>
+              <w:top w:val="single" w:color="BFBFBF" w:sz="4"/>
+              <w:left w:val="single" w:color="BFBFBF" w:sz="4"/>
+              <w:bottom w:val="single" w:color="BFBFBF" w:sz="4"/>
+              <w:right w:val="single" w:color="BFBFBF" w:sz="4"/>
+            </w:tcBorders>
+            <w:shd w:fill="F2F2F2" w:color="auto" w:val="clear"/>
+            <w:tcMar>
+              <w:top w:type="dxa" w:w="60"/>
+              <w:left w:type="dxa" w:w="100"/>
+              <w:bottom w:type="dxa" w:w="60"/>
+              <w:right w:type="dxa" w:w="100"/>
+            </w:tcMar>
+          </w:tcPr>
+          <w:p>
+            <w:pPr>
+              <w:spacing w:after="0" w:line="260"/>
+            </w:pPr>
+            <w:r>
+              <w:rPr>
+                <w:color w:val="262626"/>
+                <w:sz w:val="20"/>
+                <w:szCs w:val="20"/>
+              </w:rPr>
+              <w:t xml:space="preserve">0.82</w:t>
+            </w:r>
+          </w:p>
+        </w:tc>
+        <w:tc>
+          <w:tcPr>
+            <w:tcW w:type="dxa" w:w="2600"/>
+            <w:tcBorders>
+              <w:top w:val="single" w:color="BFBFBF" w:sz="4"/>
+              <w:left w:val="single" w:color="BFBFBF" w:sz="4"/>
+              <w:bottom w:val="single" w:color="BFBFBF" w:sz="4"/>
+              <w:right w:val="single" w:color="BFBFBF" w:sz="4"/>
+            </w:tcBorders>
+            <w:shd w:fill="F2F2F2" w:color="auto" w:val="clear"/>
+            <w:tcMar>
+              <w:top w:type="dxa" w:w="60"/>
+              <w:left w:type="dxa" w:w="100"/>
+              <w:bottom w:type="dxa" w:w="60"/>
+              <w:right w:type="dxa" w:w="100"/>
+            </w:tcMar>
+          </w:tcPr>
+          <w:p>
+            <w:pPr>
+              <w:spacing w:after="0" w:line="260"/>
+            </w:pPr>
+            <w:r>
+              <w:rPr>
+                <w:color w:val="262626"/>
+                <w:sz w:val="20"/>
+                <w:szCs w:val="20"/>
+              </w:rPr>
+              <w:t xml:space="preserve">0.91</w:t>
+            </w:r>
+          </w:p>
+        </w:tc>
+      </w:tr>
+      <w:tr>
+        <w:trPr>
+          <w:cantSplit/>
+        </w:trPr>
+        <w:tc>
+          <w:tcPr>
+            <w:tcW w:type="dxa" w:w="3826"/>
+            <w:tcBorders>
+              <w:top w:val="single" w:color="BFBFBF" w:sz="4"/>
+              <w:left w:val="single" w:color="BFBFBF" w:sz="4"/>
+              <w:bottom w:val="single" w:color="BFBFBF" w:sz="4"/>
+              <w:right w:val="single" w:color="BFBFBF" w:sz="4"/>
+            </w:tcBorders>
+            <w:tcMar>
+              <w:top w:type="dxa" w:w="60"/>
+              <w:left w:type="dxa" w:w="100"/>
+              <w:bottom w:type="dxa" w:w="60"/>
+              <w:right w:type="dxa" w:w="100"/>
+            </w:tcMar>
+          </w:tcPr>
+          <w:p>
+            <w:pPr>
+              <w:spacing w:after="0" w:line="260"/>
+            </w:pPr>
+            <w:r>
+              <w:rPr>
+                <w:color w:val="262626"/>
+                <w:sz w:val="20"/>
+                <w:szCs w:val="20"/>
+              </w:rPr>
+              <w:t xml:space="preserve">False refusal (lower is better)</w:t>
+            </w:r>
+          </w:p>
+        </w:tc>
+        <w:tc>
+          <w:tcPr>
+            <w:tcW w:type="dxa" w:w="2600"/>
+            <w:tcBorders>
+              <w:top w:val="single" w:color="BFBFBF" w:sz="4"/>
+              <w:left w:val="single" w:color="BFBFBF" w:sz="4"/>
+              <w:bottom w:val="single" w:color="BFBFBF" w:sz="4"/>
+              <w:right w:val="single" w:color="BFBFBF" w:sz="4"/>
+            </w:tcBorders>
+            <w:tcMar>
+              <w:top w:type="dxa" w:w="60"/>
+              <w:left w:type="dxa" w:w="100"/>
+              <w:bottom w:type="dxa" w:w="60"/>
+              <w:right w:type="dxa" w:w="100"/>
+            </w:tcMar>
+          </w:tcPr>
+          <w:p>
+            <w:pPr>
+              <w:spacing w:after="0" w:line="260"/>
+            </w:pPr>
+            <w:r>
+              <w:rPr>
+                <w:color w:val="262626"/>
+                <w:sz w:val="20"/>
+                <w:szCs w:val="20"/>
+              </w:rPr>
+              <w:t xml:space="preserve">0.09</w:t>
+            </w:r>
+          </w:p>
+        </w:tc>
+        <w:tc>
+          <w:tcPr>
+            <w:tcW w:type="dxa" w:w="2600"/>
+            <w:tcBorders>
+              <w:top w:val="single" w:color="BFBFBF" w:sz="4"/>
+              <w:left w:val="single" w:color="BFBFBF" w:sz="4"/>
+              <w:bottom w:val="single" w:color="BFBFBF" w:sz="4"/>
+              <w:right w:val="single" w:color="BFBFBF" w:sz="4"/>
+            </w:tcBorders>
+            <w:tcMar>
+              <w:top w:type="dxa" w:w="60"/>
+              <w:left w:type="dxa" w:w="100"/>
+              <w:bottom w:type="dxa" w:w="60"/>
+              <w:right w:type="dxa" w:w="100"/>
+            </w:tcMar>
+          </w:tcPr>
+          <w:p>
+            <w:pPr>
+              <w:spacing w:after="0" w:line="260"/>
+            </w:pPr>
+            <w:r>
+              <w:rPr>
+                <w:color w:val="262626"/>
+                <w:sz w:val="20"/>
+                <w:szCs w:val="20"/>
+              </w:rPr>
+              <w:t xml:space="preserve">0.15</w:t>
+            </w:r>
+          </w:p>
+        </w:tc>
+      </w:tr>
+    </w:tbl>
+    <w:p>
+      <w:pPr>
+        <w:spacing w:after="120"/>
+      </w:pPr>
+    </w:p>
+    <w:p>
+      <w:pPr>
+        <w:spacing w:after="140" w:line="300"/>
+        <w:jc w:val="both"/>
+      </w:pPr>
+      <w:r>
+        <w:t xml:space="preserve">The gap is small. F1 is 0.08 higher and false refusals are lower on seen datasheets, as expected, but number accuracy and citation accuracy are actually higher on the unseen ones. The model therefore did not simply memorise its training documents: what it learned, namely to locate the passage, copy the value and cite the page, carries over to datasheets it has never seen. The main lever on accuracy remains retrieval and the model’s ability to read tables, not exposure to a particular document.</w:t>
+      </w:r>
+    </w:p>
+    <w:p>
+      <w:pPr>
+        <w:spacing w:after="140" w:line="300"/>
+        <w:jc w:val="both"/>
+      </w:pPr>
+      <w:r>
+        <w:t xml:space="preserve">Quality also varies by datasheet (Figure 12). Short, well-structured documents with clean electrical-characteristics tables, such as the ATtiny85 summary, the ESP32-H2 and the CC2640R2F, reach 80% fully correct answers with F1 of about 0.8. The weakest are long documents whose answers sit in large register maps or multi-column tables that the text extractor flattens, such as the nRF52832 and PIC18F45K22. With ten questions per datasheet each bar has a margin of roughly ±15 points, so the ranking is indicative rather than exact.</w:t>
+      </w:r>
+    </w:p>
+    <w:p>
+      <w:pPr>
+        <w:keepNext/>
+        <w:spacing w:after="60" w:before="120"/>
+        <w:jc w:val="center"/>
+      </w:pPr>
+      <w:r>
+        <w:drawing>
+          <wp:inline distT="0" distB="0" distL="0" distR="0">
+            <wp:extent cx="3810000" cy="3486150"/>
+            <wp:effectExtent t="0" r="0" b="0" l="0"/>
+            <wp:docPr id="12" name="Figure 12" descr="Share of fully correct answers per training datasheet (10 questions each). The three best datasheets, used for the demonstrations in Section 4.6, are highlighted." title="Figure 12"/>
+            <wp:cNvGraphicFramePr>
+              <a:graphicFrameLocks xmlns:a="http://schemas.openxmlformats.org/drawingml/2006/main" noChangeAspect="1"/>
+            </wp:cNvGraphicFramePr>
+            <a:graphic xmlns:a="http://schemas.openxmlformats.org/drawingml/2006/main">
+              <a:graphicData uri="http://schemas.openxmlformats.org/drawingml/2006/picture">
+                <pic:pic xmlns:pic="http://schemas.openxmlformats.org/drawingml/2006/picture">
+                  <pic:nvPicPr>
+                    <pic:cNvPr id="0" name="" descr=""/>
+                    <pic:cNvPicPr>
+                      <a:picLocks noChangeAspect="1" noChangeArrowheads="1"/>
+                    </pic:cNvPicPr>
+                  </pic:nvPicPr>
+                  <pic:blipFill>
+                    <a:blip r:embed="rId20" cstate="none"/>
+                    <a:srcRect/>
+                    <a:stretch>
+                      <a:fillRect/>
+                    </a:stretch>
+                  </pic:blipFill>
+                  <pic:spPr bwMode="auto">
+                    <a:xfrm>
+                      <a:off x="0" y="0"/>
+                      <a:ext cx="3810000" cy="3486150"/>
+                    </a:xfrm>
+                    <a:prstGeom prst="rect">
+                      <a:avLst/>
+                    </a:prstGeom>
+                  </pic:spPr>
+                </pic:pic>
+              </a:graphicData>
+            </a:graphic>
+          </wp:inline>
+        </w:drawing>
+      </w:r>
+    </w:p>
+    <w:p>
+      <w:pPr>
+        <w:spacing w:after="240"/>
+        <w:jc w:val="center"/>
+      </w:pPr>
+      <w:r>
+        <w:rPr>
+          <w:b/>
+          <w:bCs/>
+          <w:sz w:val="20"/>
+          <w:szCs w:val="20"/>
+        </w:rPr>
+        <w:t xml:space="preserve">Figure 12: </w:t>
+      </w:r>
+      <w:r>
+        <w:rPr>
+          <w:sz w:val="20"/>
+          <w:szCs w:val="20"/>
+        </w:rPr>
+        <w:t xml:space="preserve">Share of fully correct answers per training datasheet (10 questions each). The three best datasheets, used for the demonstrations in Section 4.6, are highlighted.</w:t>
+      </w:r>
+    </w:p>
+    <w:p>
+      <w:pPr>
+        <w:pStyle w:val="Heading2"/>
+      </w:pPr>
+      <w:bookmarkStart w:name="_Toc31" w:id="31"/>
+      <w:r>
+        <w:t xml:space="preserve">4.6 Qualitative Examples</w:t>
+      </w:r>
+      <w:bookmarkEnd w:id="31"/>
+    </w:p>
+    <w:p>
+      <w:pPr>
+        <w:spacing w:after="140" w:line="300"/>
+        <w:jc w:val="both"/>
+      </w:pPr>
+      <w:r>
+        <w:t xml:space="preserve">A typical correction on an unanswerable input: asked “What does ULP Advisor check your code against?” with the relevant passage removed, the base model answered that it checks code “against an energy-based code analysis tool to optimize it for ultra-low power consumption [p.92]”—an invented answer with an invented citation. The fine-tuned model replied “Not found in the provided datasheet.” With the passage present, it answered “ULP Advisor checks your code against a thorough ULP checklist…”, matching the reference.</w:t>
+      </w:r>
+    </w:p>
+    <w:p>
+      <w:pPr>
+        <w:spacing w:after="140" w:line="300"/>
+        <w:jc w:val="both"/>
+      </w:pPr>
+      <w:r>
+        <w:t xml:space="preserve">Figure 13 shows the terminal application on LPC1768, a held-out datasheet. Both factual answers are correct and cite the right pages, and the question about Wi-Fi, a feature the part does not have, is correctly refused.</w:t>
+      </w:r>
+    </w:p>
+    <w:p>
+      <w:pPr>
+        <w:keepNext/>
+        <w:spacing w:after="60" w:before="120"/>
+        <w:jc w:val="center"/>
+      </w:pPr>
+      <w:r>
+        <w:drawing>
+          <wp:inline distT="0" distB="0" distL="0" distR="0">
+            <wp:extent cx="5334000" cy="2771775"/>
+            <wp:effectExtent t="0" r="0" b="0" l="0"/>
+            <wp:docPr id="13" name="Figure 13" descr="ChipDoc answering questions about the held-out LPC1768 datasheet (real output)." title="Figure 13"/>
+            <wp:cNvGraphicFramePr>
+              <a:graphicFrameLocks xmlns:a="http://schemas.openxmlformats.org/drawingml/2006/main" noChangeAspect="1"/>
+            </wp:cNvGraphicFramePr>
+            <a:graphic xmlns:a="http://schemas.openxmlformats.org/drawingml/2006/main">
+              <a:graphicData uri="http://schemas.openxmlformats.org/drawingml/2006/picture">
+                <pic:pic xmlns:pic="http://schemas.openxmlformats.org/drawingml/2006/picture">
+                  <pic:nvPicPr>
+                    <pic:cNvPr id="0" name="" descr=""/>
+                    <pic:cNvPicPr>
+                      <a:picLocks noChangeAspect="1" noChangeArrowheads="1"/>
+                    </pic:cNvPicPr>
+                  </pic:nvPicPr>
+                  <pic:blipFill>
+                    <a:blip r:embed="rId21" cstate="none"/>
+                    <a:srcRect/>
+                    <a:stretch>
+                      <a:fillRect/>
+                    </a:stretch>
+                  </pic:blipFill>
+                  <pic:spPr bwMode="auto">
+                    <a:xfrm>
+                      <a:off x="0" y="0"/>
                       <a:ext cx="5334000" cy="2771775"/>
                     </a:xfrm>
                     <a:prstGeom prst="rect">
@@ -6857,7 +7696,7 @@
           <w:sz w:val="20"/>
           <w:szCs w:val="20"/>
         </w:rPr>
-        <w:t xml:space="preserve">Figure 11: </w:t>
+        <w:t xml:space="preserve">Figure 13: </w:t>
       </w:r>
       <w:r>
         <w:rPr>
@@ -6869,13 +7708,260 @@
     </w:p>
     <w:p>
       <w:pPr>
+        <w:spacing w:after="140" w:line="300"/>
+        <w:jc w:val="both"/>
+      </w:pPr>
+      <w:r>
+        <w:t xml:space="preserve">Figures 14 to 16 show complete sessions on the three best-scoring datasheets from Figure 12, captured from a terminal running </w:t>
+      </w:r>
+      <w:r>
+        <w:rPr>
+          <w:rFonts w:ascii="Courier New" w:cs="Courier New" w:eastAsia="Courier New" w:hAnsi="Courier New"/>
+          <w:sz w:val="22"/>
+          <w:szCs w:val="22"/>
+        </w:rPr>
+        <w:t xml:space="preserve">python -m chipdoc</w:t>
+      </w:r>
+      <w:r>
+        <w:t xml:space="preserve"> on each PDF. Every factual answer was checked against the datasheet and is correct, and every one cites the page it came from. The </w:t>
+      </w:r>
+      <w:r>
+        <w:rPr>
+          <w:rFonts w:ascii="Courier New" w:cs="Courier New" w:eastAsia="Courier New" w:hAnsi="Courier New"/>
+          <w:sz w:val="22"/>
+          <w:szCs w:val="22"/>
+        </w:rPr>
+        <w:t xml:space="preserve">Searched</w:t>
+      </w:r>
+      <w:r>
+        <w:t xml:space="preserve"> line lists the pages of the five retrieved passages, so the user can see which part of the document the model read. Each session ends with a question about a feature the chip does not have, which the model correctly refuses.</w:t>
+      </w:r>
+    </w:p>
+    <w:p>
+      <w:pPr>
+        <w:spacing w:after="140" w:line="300"/>
+        <w:jc w:val="both"/>
+      </w:pPr>
+      <w:r>
+        <w:t xml:space="preserve">The sessions also show the kinds of question the model handles well: one specific fact per question, phrased with the datasheet’s own terms (“differential non-linearity”, “low-level sink current”, “24-MHz oscillator”). Answers range from a single value with its unit (“1.1 µA [p.2]”) to a sentence copied from the datasheet (the stack-pointer monitoring feature in Figure 15). Vague or conversational questions such as “ram?” or “explain the architecture” fall outside this style and are often refused; Section 6 discusses how to close that gap.</w:t>
+      </w:r>
+    </w:p>
+    <w:p>
+      <w:pPr>
+        <w:keepNext/>
+        <w:spacing w:after="60" w:before="120"/>
+        <w:jc w:val="center"/>
+      </w:pPr>
+      <w:r>
+        <w:drawing>
+          <wp:inline distT="0" distB="0" distL="0" distR="0">
+            <wp:extent cx="4381500" cy="3048000"/>
+            <wp:effectExtent t="0" r="0" b="0" l="0"/>
+            <wp:docPr id="14" name="Figure 14" descr="Terminal session on the ATtiny85 datasheet: ADC accuracy, electrical characteristics and a correct refusal." title="Figure 14"/>
+            <wp:cNvGraphicFramePr>
+              <a:graphicFrameLocks xmlns:a="http://schemas.openxmlformats.org/drawingml/2006/main" noChangeAspect="1"/>
+            </wp:cNvGraphicFramePr>
+            <a:graphic xmlns:a="http://schemas.openxmlformats.org/drawingml/2006/main">
+              <a:graphicData uri="http://schemas.openxmlformats.org/drawingml/2006/picture">
+                <pic:pic xmlns:pic="http://schemas.openxmlformats.org/drawingml/2006/picture">
+                  <pic:nvPicPr>
+                    <pic:cNvPr id="0" name="" descr=""/>
+                    <pic:cNvPicPr>
+                      <a:picLocks noChangeAspect="1" noChangeArrowheads="1"/>
+                    </pic:cNvPicPr>
+                  </pic:nvPicPr>
+                  <pic:blipFill>
+                    <a:blip r:embed="rId22" cstate="none"/>
+                    <a:srcRect/>
+                    <a:stretch>
+                      <a:fillRect/>
+                    </a:stretch>
+                  </pic:blipFill>
+                  <pic:spPr bwMode="auto">
+                    <a:xfrm>
+                      <a:off x="0" y="0"/>
+                      <a:ext cx="4381500" cy="3048000"/>
+                    </a:xfrm>
+                    <a:prstGeom prst="rect">
+                      <a:avLst/>
+                    </a:prstGeom>
+                  </pic:spPr>
+                </pic:pic>
+              </a:graphicData>
+            </a:graphic>
+          </wp:inline>
+        </w:drawing>
+      </w:r>
+    </w:p>
+    <w:p>
+      <w:pPr>
+        <w:spacing w:after="240"/>
+        <w:jc w:val="center"/>
+      </w:pPr>
+      <w:r>
+        <w:rPr>
+          <w:b/>
+          <w:bCs/>
+          <w:sz w:val="20"/>
+          <w:szCs w:val="20"/>
+        </w:rPr>
+        <w:t xml:space="preserve">Figure 14: </w:t>
+      </w:r>
+      <w:r>
+        <w:rPr>
+          <w:sz w:val="20"/>
+          <w:szCs w:val="20"/>
+        </w:rPr>
+        <w:t xml:space="preserve">Terminal session on the ATtiny85 datasheet: ADC accuracy, electrical characteristics and a correct refusal.</w:t>
+      </w:r>
+    </w:p>
+    <w:p>
+      <w:pPr>
+        <w:keepNext/>
+        <w:spacing w:after="60" w:before="120"/>
+        <w:jc w:val="center"/>
+      </w:pPr>
+      <w:r>
+        <w:drawing>
+          <wp:inline distT="0" distB="0" distL="0" distR="0">
+            <wp:extent cx="4381500" cy="3124200"/>
+            <wp:effectExtent t="0" r="0" b="0" l="0"/>
+            <wp:docPr id="15" name="Figure 15" descr="Terminal session on the ESP32-H2 datasheet: security, radio and peripheral questions." title="Figure 15"/>
+            <wp:cNvGraphicFramePr>
+              <a:graphicFrameLocks xmlns:a="http://schemas.openxmlformats.org/drawingml/2006/main" noChangeAspect="1"/>
+            </wp:cNvGraphicFramePr>
+            <a:graphic xmlns:a="http://schemas.openxmlformats.org/drawingml/2006/main">
+              <a:graphicData uri="http://schemas.openxmlformats.org/drawingml/2006/picture">
+                <pic:pic xmlns:pic="http://schemas.openxmlformats.org/drawingml/2006/picture">
+                  <pic:nvPicPr>
+                    <pic:cNvPr id="0" name="" descr=""/>
+                    <pic:cNvPicPr>
+                      <a:picLocks noChangeAspect="1" noChangeArrowheads="1"/>
+                    </pic:cNvPicPr>
+                  </pic:nvPicPr>
+                  <pic:blipFill>
+                    <a:blip r:embed="rId23" cstate="none"/>
+                    <a:srcRect/>
+                    <a:stretch>
+                      <a:fillRect/>
+                    </a:stretch>
+                  </pic:blipFill>
+                  <pic:spPr bwMode="auto">
+                    <a:xfrm>
+                      <a:off x="0" y="0"/>
+                      <a:ext cx="4381500" cy="3124200"/>
+                    </a:xfrm>
+                    <a:prstGeom prst="rect">
+                      <a:avLst/>
+                    </a:prstGeom>
+                  </pic:spPr>
+                </pic:pic>
+              </a:graphicData>
+            </a:graphic>
+          </wp:inline>
+        </w:drawing>
+      </w:r>
+    </w:p>
+    <w:p>
+      <w:pPr>
+        <w:spacing w:after="240"/>
+        <w:jc w:val="center"/>
+      </w:pPr>
+      <w:r>
+        <w:rPr>
+          <w:b/>
+          <w:bCs/>
+          <w:sz w:val="20"/>
+          <w:szCs w:val="20"/>
+        </w:rPr>
+        <w:t xml:space="preserve">Figure 15: </w:t>
+      </w:r>
+      <w:r>
+        <w:rPr>
+          <w:sz w:val="20"/>
+          <w:szCs w:val="20"/>
+        </w:rPr>
+        <w:t xml:space="preserve">Terminal session on the ESP32-H2 datasheet: security, radio and peripheral questions.</w:t>
+      </w:r>
+    </w:p>
+    <w:p>
+      <w:pPr>
+        <w:keepNext/>
+        <w:spacing w:after="60" w:before="120"/>
+        <w:jc w:val="center"/>
+      </w:pPr>
+      <w:r>
+        <w:drawing>
+          <wp:inline distT="0" distB="0" distL="0" distR="0">
+            <wp:extent cx="4381500" cy="3219450"/>
+            <wp:effectExtent t="0" r="0" b="0" l="0"/>
+            <wp:docPr id="16" name="Figure 16" descr="Terminal session on the CC2640R2F datasheet: power, clock, memory, pin-out and tooling questions." title="Figure 16"/>
+            <wp:cNvGraphicFramePr>
+              <a:graphicFrameLocks xmlns:a="http://schemas.openxmlformats.org/drawingml/2006/main" noChangeAspect="1"/>
+            </wp:cNvGraphicFramePr>
+            <a:graphic xmlns:a="http://schemas.openxmlformats.org/drawingml/2006/main">
+              <a:graphicData uri="http://schemas.openxmlformats.org/drawingml/2006/picture">
+                <pic:pic xmlns:pic="http://schemas.openxmlformats.org/drawingml/2006/picture">
+                  <pic:nvPicPr>
+                    <pic:cNvPr id="0" name="" descr=""/>
+                    <pic:cNvPicPr>
+                      <a:picLocks noChangeAspect="1" noChangeArrowheads="1"/>
+                    </pic:cNvPicPr>
+                  </pic:nvPicPr>
+                  <pic:blipFill>
+                    <a:blip r:embed="rId24" cstate="none"/>
+                    <a:srcRect/>
+                    <a:stretch>
+                      <a:fillRect/>
+                    </a:stretch>
+                  </pic:blipFill>
+                  <pic:spPr bwMode="auto">
+                    <a:xfrm>
+                      <a:off x="0" y="0"/>
+                      <a:ext cx="4381500" cy="3219450"/>
+                    </a:xfrm>
+                    <a:prstGeom prst="rect">
+                      <a:avLst/>
+                    </a:prstGeom>
+                  </pic:spPr>
+                </pic:pic>
+              </a:graphicData>
+            </a:graphic>
+          </wp:inline>
+        </w:drawing>
+      </w:r>
+    </w:p>
+    <w:p>
+      <w:pPr>
+        <w:spacing w:after="240"/>
+        <w:jc w:val="center"/>
+      </w:pPr>
+      <w:r>
+        <w:rPr>
+          <w:b/>
+          <w:bCs/>
+          <w:sz w:val="20"/>
+          <w:szCs w:val="20"/>
+        </w:rPr>
+        <w:t xml:space="preserve">Figure 16: </w:t>
+      </w:r>
+      <w:r>
+        <w:rPr>
+          <w:sz w:val="20"/>
+          <w:szCs w:val="20"/>
+        </w:rPr>
+        <w:t xml:space="preserve">Terminal session on the CC2640R2F datasheet: power, clock, memory, pin-out and tooling questions.</w:t>
+      </w:r>
+    </w:p>
+    <w:p>
+      <w:pPr>
         <w:pStyle w:val="Heading2"/>
       </w:pPr>
-      <w:bookmarkStart w:name="_Toc31" w:id="31"/>
-      <w:r>
-        <w:t xml:space="preserve">4.6 Error Analysis and Limitations</w:t>
-      </w:r>
-      <w:bookmarkEnd w:id="31"/>
+      <w:bookmarkStart w:name="_Toc32" w:id="32"/>
+      <w:r>
+        <w:t xml:space="preserve">4.7 Error Analysis and Limitations</w:t>
+      </w:r>
+      <w:bookmarkEnd w:id="32"/>
     </w:p>
     <w:p>
       <w:pPr>
@@ -6892,10 +7978,10 @@
           <w:b/>
           <w:bCs/>
         </w:rPr>
-        <w:t xml:space="preserve">Over-caution.</w:t>
-      </w:r>
-      <w:r>
-        <w:t xml:space="preserve"> False refusals rose from 5% to 15% (14 of 92 answerable inputs), mostly questions whose answer sits inside a dense register or electrical table, such as “What register enables the noise canceler?”. This is the price of the 20% refusal examples; lowering that rate trades refusal accuracy back for coverage.</w:t>
+        <w:t xml:space="preserve">Casual phrasing.</w:t>
+      </w:r>
+      <w:r>
+        <w:t xml:space="preserve"> Training questions were precise and formal, so the model tends to refuse short or conversational questions (“ram?”, “how many cores?”) even when the answer is on the page; on a new ESP32-P4 datasheet such questions were all refused, while specific questions using datasheet terms were not.</w:t>
       </w:r>
     </w:p>
     <w:p>
@@ -6913,10 +7999,10 @@
           <w:b/>
           <w:bCs/>
         </w:rPr>
-        <w:t xml:space="preserve">Retrieval ceiling.</w:t>
-      </w:r>
-      <w:r>
-        <w:t xml:space="preserve"> For 8–12% of questions the evidence is not in the top five passages, and no reader can answer those.</w:t>
+        <w:t xml:space="preserve">Over-caution.</w:t>
+      </w:r>
+      <w:r>
+        <w:t xml:space="preserve"> False refusals rose from 5% to 15% (14 of 92 answerable inputs), mostly questions whose answer sits inside a dense register or electrical table, such as “What register enables the noise canceler?”. This is the price of the 20% refusal examples; lowering that rate trades refusal accuracy back for coverage.</w:t>
       </w:r>
     </w:p>
     <w:p>
@@ -6934,10 +8020,10 @@
           <w:b/>
           <w:bCs/>
         </w:rPr>
-        <w:t xml:space="preserve">Label noise.</w:t>
-      </w:r>
-      <w:r>
-        <w:t xml:space="preserve"> About 13% of reference answers are flawed, and the number check cannot catch a wrong unit (one training answer reads mA/MHz where the table says µA/MHz).</w:t>
+        <w:t xml:space="preserve">Retrieval ceiling.</w:t>
+      </w:r>
+      <w:r>
+        <w:t xml:space="preserve"> For 8–12% of questions the evidence is not in the top five passages, and no reader can answer those.</w:t>
       </w:r>
     </w:p>
     <w:p>
@@ -6955,10 +8041,10 @@
           <w:b/>
           <w:bCs/>
         </w:rPr>
-        <w:t xml:space="preserve">Scanned and figure-only content.</w:t>
-      </w:r>
-      <w:r>
-        <w:t xml:space="preserve"> Text in images, such as pin-out diagrams and timing figures, is not extracted, so questions answered only by a figure cannot be answered.</w:t>
+        <w:t xml:space="preserve">Label noise.</w:t>
+      </w:r>
+      <w:r>
+        <w:t xml:space="preserve"> About 13% of reference answers are flawed, and the number check cannot catch a wrong unit (one training answer reads mA/MHz where the table says µA/MHz).</w:t>
       </w:r>
     </w:p>
     <w:p>
@@ -6976,70 +8062,11 @@
           <w:b/>
           <w:bCs/>
         </w:rPr>
-        <w:t xml:space="preserve">Teacher comparison.</w:t>
-      </w:r>
-      <w:r>
-        <w:t xml:space="preserve"> The 4B teacher could not be scored as an upper reference because the local build kept emitting its reasoning even with thinking disabled.</w:t>
-      </w:r>
-    </w:p>
-    <w:p>
-      <w:pPr>
-        <w:pStyle w:val="Heading2"/>
-      </w:pPr>
-      <w:bookmarkStart w:name="_Toc32" w:id="32"/>
-      <w:r>
-        <w:t xml:space="preserve">4.7 Efficiency</w:t>
-      </w:r>
-      <w:bookmarkEnd w:id="32"/>
-    </w:p>
-    <w:p>
-      <w:pPr>
-        <w:spacing w:after="140" w:line="300"/>
-        <w:jc w:val="both"/>
-      </w:pPr>
-      <w:r>
-        <w:t xml:space="preserve">On the RTX 3050 Laptop GPU, evaluation ran at about 1.5 s per question. Hybrid retrieval alone takes 47–83 ms per query on the CPU (93- to 1,459-page datasheets). First-time indexing takes one to three minutes per few hundred pages; the adapter is 40 MB.</w:t>
-      </w:r>
-    </w:p>
-    <w:p>
-      <w:pPr>
-        <w:pStyle w:val="Heading1"/>
-        <w:pageBreakBefore/>
-      </w:pPr>
-      <w:bookmarkStart w:name="_Toc33" w:id="33"/>
-      <w:r>
-        <w:t xml:space="preserve">5. Conclusion</w:t>
-      </w:r>
-      <w:bookmarkEnd w:id="33"/>
-    </w:p>
-    <w:p>
-      <w:pPr>
-        <w:spacing w:after="140" w:line="300"/>
-        <w:jc w:val="both"/>
-      </w:pPr>
-      <w:r>
-        <w:t xml:space="preserve">This project set out to answer questions about a microcontroller datasheet from the datasheet itself, with page citations and honest refusals, on hardware a student owns. ChipDoc meets that goal. A page-bounded chunker and hybrid retrieval find the right passage among the top five for 88% of questions about datasheets never seen in training. A Qwen3-0.6B model fine-tuned with LoRA on 1,523 RAFT-style examples cites the correct page 91% of the time and refuses 74% of unanswerable inputs, against 22% and 30% for the same model without fine-tuning.</w:t>
-      </w:r>
-    </w:p>
-    <w:p>
-      <w:pPr>
-        <w:spacing w:after="140" w:line="300"/>
-        <w:jc w:val="both"/>
-      </w:pPr>
-      <w:r>
-        <w:t xml:space="preserve">The results also show where the remaining difficulty lies. Answer accuracy is bounded by retrieval misses and by how well a very small model reads dense tables, and the refusal training makes the model somewhat over-cautious. Even so, the central finding is encouraging: with careful retrieval and a targeted fine-tune, a model small enough to train in an hour on a laptop can be made substantially more trustworthy for engineering documentation, and the entire pipeline—data generation included—can run without sending a single document to an external service.</w:t>
-      </w:r>
-    </w:p>
-    <w:p>
-      <w:pPr>
-        <w:pStyle w:val="Heading1"/>
-        <w:pageBreakBefore/>
-      </w:pPr>
-      <w:bookmarkStart w:name="_Toc34" w:id="34"/>
-      <w:r>
-        <w:t xml:space="preserve">6. Future Work</w:t>
-      </w:r>
-      <w:bookmarkEnd w:id="34"/>
+        <w:t xml:space="preserve">Scanned and figure-only content.</w:t>
+      </w:r>
+      <w:r>
+        <w:t xml:space="preserve"> Text in images, such as pin-out diagrams and timing figures, is not extracted, so questions answered only by a figure cannot be answered.</w:t>
+      </w:r>
     </w:p>
     <w:p>
       <w:pPr>
@@ -7056,11 +8083,70 @@
           <w:b/>
           <w:bCs/>
         </w:rPr>
-        <w:t xml:space="preserve">Re-ranking.</w:t>
-      </w:r>
-      <w:r>
-        <w:t xml:space="preserve"> A cross-encoder re-ranker over the top 20–50 fused results is the cheapest way to close the retrieval gap that caps answer accuracy.</w:t>
-      </w:r>
+        <w:t xml:space="preserve">Teacher comparison.</w:t>
+      </w:r>
+      <w:r>
+        <w:t xml:space="preserve"> The 4B teacher could not be scored as an upper reference because the local build kept emitting its reasoning even with thinking disabled.</w:t>
+      </w:r>
+    </w:p>
+    <w:p>
+      <w:pPr>
+        <w:pStyle w:val="Heading2"/>
+      </w:pPr>
+      <w:bookmarkStart w:name="_Toc33" w:id="33"/>
+      <w:r>
+        <w:t xml:space="preserve">4.8 Efficiency</w:t>
+      </w:r>
+      <w:bookmarkEnd w:id="33"/>
+    </w:p>
+    <w:p>
+      <w:pPr>
+        <w:spacing w:after="140" w:line="300"/>
+        <w:jc w:val="both"/>
+      </w:pPr>
+      <w:r>
+        <w:t xml:space="preserve">On the RTX 3050 Laptop GPU, evaluation ran at about 1.5 s per question. Hybrid retrieval alone takes 47–83 ms per query on the CPU (93- to 1,459-page datasheets). First-time indexing takes one to three minutes per few hundred pages; the adapter is 40 MB.</w:t>
+      </w:r>
+    </w:p>
+    <w:p>
+      <w:pPr>
+        <w:pStyle w:val="Heading1"/>
+        <w:pageBreakBefore/>
+      </w:pPr>
+      <w:bookmarkStart w:name="_Toc34" w:id="34"/>
+      <w:r>
+        <w:t xml:space="preserve">5. Conclusion</w:t>
+      </w:r>
+      <w:bookmarkEnd w:id="34"/>
+    </w:p>
+    <w:p>
+      <w:pPr>
+        <w:spacing w:after="140" w:line="300"/>
+        <w:jc w:val="both"/>
+      </w:pPr>
+      <w:r>
+        <w:t xml:space="preserve">This project set out to answer questions about a microcontroller datasheet from the datasheet itself, with page citations and honest refusals, on hardware a student owns. ChipDoc meets that goal. A page-bounded chunker and hybrid retrieval find the right passage among the top five for 88% of questions about datasheets never seen in training. A Qwen3-0.6B model fine-tuned with LoRA on 1,523 RAFT-style examples cites the correct page 91% of the time and refuses 74% of unanswerable inputs, against 22% and 30% for the same model without fine-tuning.</w:t>
+      </w:r>
+    </w:p>
+    <w:p>
+      <w:pPr>
+        <w:spacing w:after="140" w:line="300"/>
+        <w:jc w:val="both"/>
+      </w:pPr>
+      <w:r>
+        <w:t xml:space="preserve">The results also show where the remaining difficulty lies. Answer accuracy is bounded by retrieval misses and by how well a very small model reads dense tables, and the refusal training makes the model somewhat over-cautious. Even so, the central finding is encouraging: with careful retrieval and a targeted fine-tune, a model small enough to train in an hour on a laptop can be made substantially more trustworthy for engineering documentation, and the entire pipeline—data generation included—can run without sending a single document to an external service.</w:t>
+      </w:r>
+    </w:p>
+    <w:p>
+      <w:pPr>
+        <w:pStyle w:val="Heading1"/>
+        <w:pageBreakBefore/>
+      </w:pPr>
+      <w:bookmarkStart w:name="_Toc35" w:id="35"/>
+      <w:r>
+        <w:t xml:space="preserve">6. Future Work</w:t>
+      </w:r>
+      <w:bookmarkEnd w:id="35"/>
     </w:p>
     <w:p>
       <w:pPr>
@@ -7077,10 +8163,10 @@
           <w:b/>
           <w:bCs/>
         </w:rPr>
-        <w:t xml:space="preserve">A human-verified test set.</w:t>
-      </w:r>
-      <w:r>
-        <w:t xml:space="preserve"> Correcting the roughly 13% of flawed reference answers would make the metrics more precise and enable finer comparisons.</w:t>
+        <w:t xml:space="preserve">Re-ranking.</w:t>
+      </w:r>
+      <w:r>
+        <w:t xml:space="preserve"> A cross-encoder re-ranker over the top 20–50 fused results is the cheapest way to close the retrieval gap that caps answer accuracy.</w:t>
       </w:r>
     </w:p>
     <w:p>
@@ -7098,10 +8184,10 @@
           <w:b/>
           <w:bCs/>
         </w:rPr>
-        <w:t xml:space="preserve">Calibrated refusal.</w:t>
-      </w:r>
-      <w:r>
-        <w:t xml:space="preserve"> Tuning the share of refusal examples, or adding a confidence threshold, could reduce false “Not found” answers while keeping hallucinations low.</w:t>
+        <w:t xml:space="preserve">Robustness to casual questions.</w:t>
+      </w:r>
+      <w:r>
+        <w:t xml:space="preserve"> Adding paraphrased and conversational versions of each training question (“ram?”, “how fast is it?”), mapping common words to datasheet terms before retrieval (RAM to SRAM, speed to clock frequency), and always including the overview pages in the context would let the model answer the way people actually ask.</w:t>
       </w:r>
     </w:p>
     <w:p>
@@ -7119,10 +8205,10 @@
           <w:b/>
           <w:bCs/>
         </w:rPr>
-        <w:t xml:space="preserve">Tables and figures.</w:t>
-      </w:r>
-      <w:r>
-        <w:t xml:space="preserve"> Table-aware chunking that keeps header rows with each row, and OCR or vision models for pin-out and timing diagrams, would answer questions that today fall outside the extracted text.</w:t>
+        <w:t xml:space="preserve">A human-verified test set.</w:t>
+      </w:r>
+      <w:r>
+        <w:t xml:space="preserve"> Correcting the roughly 13% of flawed reference answers would make the metrics more precise and enable finer comparisons.</w:t>
       </w:r>
     </w:p>
     <w:p>
@@ -7140,10 +8226,10 @@
           <w:b/>
           <w:bCs/>
         </w:rPr>
-        <w:t xml:space="preserve">A stronger or verified teacher.</w:t>
-      </w:r>
-      <w:r>
-        <w:t xml:space="preserve"> A larger teacher, or a second model that checks each generated pair, would reduce noise such as wrong units.</w:t>
+        <w:t xml:space="preserve">Calibrated refusal.</w:t>
+      </w:r>
+      <w:r>
+        <w:t xml:space="preserve"> Tuning the share of refusal examples, or adding a confidence threshold, could reduce false “Not found” answers while keeping hallucinations low.</w:t>
       </w:r>
     </w:p>
     <w:p>
@@ -7161,10 +8247,10 @@
           <w:b/>
           <w:bCs/>
         </w:rPr>
-        <w:t xml:space="preserve">Multi-document questions.</w:t>
-      </w:r>
-      <w:r>
-        <w:t xml:space="preserve"> Comparing parts (“Which has more ADC channels, the STM32F103 or the ATmega328P?”) requires retrieval across several datasheets and answers that cite more than one document.</w:t>
+        <w:t xml:space="preserve">Tables and figures.</w:t>
+      </w:r>
+      <w:r>
+        <w:t xml:space="preserve"> Table-aware chunking that keeps header rows with each row, and OCR or vision models for pin-out and timing diagrams, would answer questions that today fall outside the extracted text.</w:t>
       </w:r>
     </w:p>
     <w:p>
@@ -7182,6 +8268,48 @@
           <w:b/>
           <w:bCs/>
         </w:rPr>
+        <w:t xml:space="preserve">A stronger or verified teacher.</w:t>
+      </w:r>
+      <w:r>
+        <w:t xml:space="preserve"> A larger teacher, or a second model that checks each generated pair, would reduce noise such as wrong units.</w:t>
+      </w:r>
+    </w:p>
+    <w:p>
+      <w:pPr>
+        <w:pStyle w:val="ListParagraph"/>
+        <w:numPr>
+          <w:ilvl w:val="0"/>
+          <w:numId w:val="2"/>
+        </w:numPr>
+        <w:spacing w:after="80" w:line="300"/>
+        <w:jc w:val="left"/>
+      </w:pPr>
+      <w:r>
+        <w:rPr>
+          <w:b/>
+          <w:bCs/>
+        </w:rPr>
+        <w:t xml:space="preserve">Multi-document questions.</w:t>
+      </w:r>
+      <w:r>
+        <w:t xml:space="preserve"> Comparing parts (“Which has more ADC channels, the STM32F103 or the ATmega328P?”) requires retrieval across several datasheets and answers that cite more than one document.</w:t>
+      </w:r>
+    </w:p>
+    <w:p>
+      <w:pPr>
+        <w:pStyle w:val="ListParagraph"/>
+        <w:numPr>
+          <w:ilvl w:val="0"/>
+          <w:numId w:val="2"/>
+        </w:numPr>
+        <w:spacing w:after="80" w:line="300"/>
+        <w:jc w:val="left"/>
+      </w:pPr>
+      <w:r>
+        <w:rPr>
+          <w:b/>
+          <w:bCs/>
+        </w:rPr>
         <w:t xml:space="preserve">Larger readers where hardware allows.</w:t>
       </w:r>
       <w:r>
@@ -7194,11 +8322,11 @@
         <w:pageBreakBefore/>
         <w:jc w:val="center"/>
       </w:pPr>
-      <w:bookmarkStart w:name="_Toc35" w:id="35"/>
+      <w:bookmarkStart w:name="_Toc36" w:id="36"/>
       <w:r>
         <w:t xml:space="preserve">Works Cited</w:t>
       </w:r>
-      <w:bookmarkEnd w:id="35"/>
+      <w:bookmarkEnd w:id="36"/>
     </w:p>
     <w:p>
       <w:pPr>

</xml_diff>

<commit_message>
README screenshots, cleaner /sources, numbered MLA references in report
- README: real terminal screenshots (ESP32-H2 session and /sources)
- /sources: strip Markdown/HTML markup and blank lines from passages
- Report: drop rendered LPC1768 figure, add /sources figure, [n] citations with MLA entries

Co-Authored-By: Claude Opus 5.5 <noreply@anthropic.com>
</commit_message>
<xml_diff>
--- a/docs/ChipDoc_Report.docx
+++ b/docs/ChipDoc_Report.docx
@@ -1068,7 +1068,7 @@
           </w:pPr>
           <w:hyperlink w:history="1" w:anchor="_Toc36">
             <w:r>
-              <w:t xml:space="preserve">Works Cited</w:t>
+              <w:t xml:space="preserve">References</w:t>
             </w:r>
             <w:r>
               <w:tab/>
@@ -1153,7 +1153,7 @@
         <w:jc w:val="both"/>
       </w:pPr>
       <w:r>
-        <w:t xml:space="preserve">Retrieval-Augmented Generation (RAG) addresses both weaknesses by retrieving relevant passages and conditioning the model on them (Lewis et al.). This project applies RAG to datasheets under a practical constraint: the system must run locally on a student laptop with a 4 GB GPU, so that no proprietary or unreleased documentation leaves the machine.</w:t>
+        <w:t xml:space="preserve">Retrieval-Augmented Generation (RAG) addresses both weaknesses by retrieving relevant passages and conditioning the model on them [1]. This project applies RAG to datasheets under a practical constraint: the system must run locally on a student laptop with a 4 GB GPU, so that no proprietary or unreleased documentation leaves the machine.</w:t>
       </w:r>
     </w:p>
     <w:p>
@@ -1427,7 +1427,7 @@
         <w:jc w:val="both"/>
       </w:pPr>
       <w:r>
-        <w:t xml:space="preserve">Lewis et al. introduced Retrieval-Augmented Generation, in which a neural retriever selects passages from a large corpus and a sequence-to-sequence generator conditions on them. RAG outperformed purely parametric models on knowledge-intensive tasks and, importantly for this project, makes answers attributable to retrieved evidence. Most later systems keep the same two-stage structure—retrieve, then read—and differ in how documents are segmented, how retrieval is performed and how the reader is trained.</w:t>
+        <w:t xml:space="preserve">Lewis et al. [1] introduced Retrieval-Augmented Generation, in which a neural retriever selects passages from a large corpus and a sequence-to-sequence generator conditions on them. RAG outperformed purely parametric models on knowledge-intensive tasks and, importantly for this project, makes answers attributable to retrieved evidence. Most later systems keep the same two-stage structure—retrieve, then read—and differ in how documents are segmented, how retrieval is performed and how the reader is trained.</w:t>
       </w:r>
     </w:p>
     <w:p>
@@ -1453,7 +1453,7 @@
         <w:t xml:space="preserve">DocEDA</w:t>
       </w:r>
       <w:r>
-        <w:t xml:space="preserve"> (Chen et al.) targets electronic documents directly. It combines computer vision, datasheet layout analysis and LLM-based parameter extraction to pull electrical parameters and circuit topologies from analog-circuit documents, reducing manual effort and transcription errors. Its focus is structured extraction for circuit design rather than open-ended question answering or summarisation.</w:t>
+        <w:t xml:space="preserve"> [2] targets electronic documents directly. It combines computer vision, datasheet layout analysis and LLM-based parameter extraction to pull electrical parameters and circuit topologies from analog-circuit documents, reducing manual effort and transcription errors. Its focus is structured extraction for circuit design rather than open-ended question answering or summarisation.</w:t>
       </w:r>
     </w:p>
     <w:p>
@@ -1462,7 +1462,7 @@
         <w:jc w:val="both"/>
       </w:pPr>
       <w:r>
-        <w:t xml:space="preserve">Sobhan and Haque propose a </w:t>
+        <w:t xml:space="preserve">Sobhan and Haque [3] propose a </w:t>
       </w:r>
       <w:r>
         <w:rPr>
@@ -1488,7 +1488,7 @@
         <w:t xml:space="preserve">TechDocRAG</w:t>
       </w:r>
       <w:r>
-        <w:t xml:space="preserve"> (Lee and Choi) argues that flat chunking destroys the relationships between text, tables, figures, captions and procedures that technical documents depend on. It builds a heterogeneous element graph with identifier-aware retrieval, semantic re-ranking and evidence bundling, and improves retrieval and evidence-grounded QA on several technical-document benchmarks—at the cost of a more complex pipeline than vector-based RAG.</w:t>
+        <w:t xml:space="preserve"> [4] argues that flat chunking destroys the relationships between text, tables, figures, captions and procedures that technical documents depend on. It builds a heterogeneous element graph with identifier-aware retrieval, semantic re-ranking and evidence bundling, and improves retrieval and evidence-grounded QA on several technical-document benchmarks—at the cost of a more complex pipeline than vector-based RAG.</w:t>
       </w:r>
     </w:p>
     <w:p>
@@ -1504,7 +1504,7 @@
         <w:t xml:space="preserve">LMDX</w:t>
       </w:r>
       <w:r>
-        <w:t xml:space="preserve"> (Perot et al.) uses LLMs for information extraction and </w:t>
+        <w:t xml:space="preserve"> [5] uses LLMs for information extraction and </w:t>
       </w:r>
       <w:r>
         <w:rPr>
@@ -1530,7 +1530,7 @@
         <w:t xml:space="preserve">DSciSum</w:t>
       </w:r>
       <w:r>
-        <w:t xml:space="preserve"> (Liu et al.) addresses detailed summarisation of long scientific documents with an extract-then-generate framework that first selects salient information, including table captions, and then generates with an LLM. It outperformed reference summaries and prior models on the arXivCap dataset and aligned better with human judgments, showing the value of extracting the right evidence before generation in long technical documents.</w:t>
+        <w:t xml:space="preserve"> [6] addresses detailed summarisation of long scientific documents with an extract-then-generate framework that first selects salient information, including table captions, and then generates with an LLM. It outperformed reference summaries and prior models on the arXivCap dataset and aligned better with human judgments, showing the value of extracting the right evidence before generation in long technical documents.</w:t>
       </w:r>
     </w:p>
     <w:p>
@@ -1559,7 +1559,7 @@
         <w:t xml:space="preserve">BM25</w:t>
       </w:r>
       <w:r>
-        <w:t xml:space="preserve">, a probabilistic term-weighting function that rewards query terms that are frequent in a passage but rare in the collection (Robertson and Zaragoza). BM25 excels at exact matches—valuable for identifiers such as </w:t>
+        <w:t xml:space="preserve">, a probabilistic term-weighting function that rewards query terms that are frequent in a passage but rare in the collection [7]. BM25 excels at exact matches—valuable for identifiers such as </w:t>
       </w:r>
       <w:r>
         <w:rPr>
@@ -1591,7 +1591,7 @@
         <w:t xml:space="preserve">Dense retrieval</w:t>
       </w:r>
       <w:r>
-        <w:t xml:space="preserve"> embeds queries and passages into a shared vector space; the BGE family of embedding models (Xiao et al.) provides strong, compact English embedders such as </w:t>
+        <w:t xml:space="preserve"> embeds queries and passages into a shared vector space; the BGE family of embedding models [8] provides strong, compact English embedders such as </w:t>
       </w:r>
       <w:r>
         <w:rPr>
@@ -1601,7 +1601,7 @@
         <w:t xml:space="preserve">bge-small-en-v1.5</w:t>
       </w:r>
       <w:r>
-        <w:t xml:space="preserve">, and libraries such as FAISS make nearest-neighbour search fast (Johnson et al.). </w:t>
+        <w:t xml:space="preserve">, and libraries such as FAISS make nearest-neighbour search fast [9]. </w:t>
       </w:r>
       <w:r>
         <w:rPr>
@@ -1611,7 +1611,7 @@
         <w:t xml:space="preserve">Reciprocal Rank Fusion</w:t>
       </w:r>
       <w:r>
-        <w:t xml:space="preserve"> (RRF) combines ranked lists by summing reciprocal ranks and outperformed more elaborate fusion methods while needing no score calibration (Cormack et al.).</w:t>
+        <w:t xml:space="preserve"> (RRF) combines ranked lists by summing reciprocal ranks and outperformed more elaborate fusion methods while needing no score calibration [10].</w:t>
       </w:r>
     </w:p>
     <w:p>
@@ -1637,7 +1637,7 @@
         <w:t xml:space="preserve">LoRA</w:t>
       </w:r>
       <w:r>
-        <w:t xml:space="preserve"> (Hu et al.) freezes a pre-trained model and learns low-rank update matrices for selected weight matrices, cutting trainable parameters by orders of magnitude while matching full fine-tuning quality in many settings; this makes fine-tuning feasible on consumer GPUs. </w:t>
+        <w:t xml:space="preserve"> [11] freezes a pre-trained model and learns low-rank update matrices for selected weight matrices, cutting trainable parameters by orders of magnitude while matching full fine-tuning quality in many settings; this makes fine-tuning feasible on consumer GPUs. </w:t>
       </w:r>
       <w:r>
         <w:rPr>
@@ -1647,7 +1647,7 @@
         <w:t xml:space="preserve">RAFT</w:t>
       </w:r>
       <w:r>
-        <w:t xml:space="preserve"> (Zhang et al.) adapts a model to domain-specific RAG by training on a question together with a mix of the relevant (“oracle”) document and distractor documents, sometimes omitting the oracle entirely, so that the model learns to extract answers from relevant context and ignore irrelevant context. The </w:t>
+        <w:t xml:space="preserve"> [12] adapts a model to domain-specific RAG by training on a question together with a mix of the relevant (“oracle”) document and distractor documents, sometimes omitting the oracle entirely, so that the model learns to extract answers from relevant context and ignore irrelevant context. The </w:t>
       </w:r>
       <w:r>
         <w:rPr>
@@ -1657,7 +1657,7 @@
         <w:t xml:space="preserve">Qwen3</w:t>
       </w:r>
       <w:r>
-        <w:t xml:space="preserve"> family (Yang et al.) offers open models down to 0.6B parameters with a switchable “thinking” mode, making it a practical base for a small, fast reader.</w:t>
+        <w:t xml:space="preserve"> family [13] offers open models down to 0.6B parameters with a switchable “thinking” mode, making it a practical base for a small, fast reader.</w:t>
       </w:r>
     </w:p>
     <w:p>
@@ -1879,7 +1879,7 @@
                 <w:sz w:val="20"/>
                 <w:szCs w:val="20"/>
               </w:rPr>
-              <w:t xml:space="preserve">DocEDA (Chen et al.)</w:t>
+              <w:t xml:space="preserve">DocEDA [2]</w:t>
             </w:r>
           </w:p>
         </w:tc>
@@ -2005,7 +2005,7 @@
                 <w:sz w:val="20"/>
                 <w:szCs w:val="20"/>
               </w:rPr>
-              <w:t xml:space="preserve">Sobhan and Haque</w:t>
+              <w:t xml:space="preserve">Sobhan and Haque [3]</w:t>
             </w:r>
           </w:p>
         </w:tc>
@@ -2133,7 +2133,7 @@
                 <w:sz w:val="20"/>
                 <w:szCs w:val="20"/>
               </w:rPr>
-              <w:t xml:space="preserve">TechDocRAG (Lee and Choi)</w:t>
+              <w:t xml:space="preserve">TechDocRAG [4]</w:t>
             </w:r>
           </w:p>
         </w:tc>
@@ -2259,7 +2259,7 @@
                 <w:sz w:val="20"/>
                 <w:szCs w:val="20"/>
               </w:rPr>
-              <w:t xml:space="preserve">LMDX (Perot et al.)</w:t>
+              <w:t xml:space="preserve">LMDX [5]</w:t>
             </w:r>
           </w:p>
         </w:tc>
@@ -2387,7 +2387,7 @@
                 <w:sz w:val="20"/>
                 <w:szCs w:val="20"/>
               </w:rPr>
-              <w:t xml:space="preserve">DSciSum (Liu et al.)</w:t>
+              <w:t xml:space="preserve">DSciSum [6]</w:t>
             </w:r>
           </w:p>
         </w:tc>
@@ -2494,7 +2494,7 @@
         <w:jc w:val="both"/>
       </w:pPr>
       <w:r>
-        <w:t xml:space="preserve">None of these combines datasheet-specific evaluation on unseen documents, explicit refusal when evidence is missing, and a pipeline that trains and runs on a 4 GB GPU. ChipDoc borrows identifier-aware retrieval (via BM25) from TechDocRAG, RAFT-style training from Sobhan and Haque and Zhang et al., and grounding from LMDX.</w:t>
+        <w:t xml:space="preserve">None of these combines datasheet-specific evaluation on unseen documents, explicit refusal when evidence is missing, and a pipeline that trains and runs on a 4 GB GPU. ChipDoc borrows identifier-aware retrieval (via BM25) from TechDocRAG, RAFT-style training from Sobhan and Haque [3] and Zhang et al., and grounding from LMDX.</w:t>
       </w:r>
     </w:p>
     <w:p>
@@ -3109,7 +3109,7 @@
         <w:jc w:val="both"/>
       </w:pPr>
       <w:r>
-        <w:t xml:space="preserve">Following RAFT (Zhang et al.), each kept pair becomes an example that looks exactly like inference (Figure 5). The question is run through the hybrid retriever on its own datasheet; the top hits other than the source passage become </w:t>
+        <w:t xml:space="preserve">Following RAFT [12], each kept pair becomes an example that looks exactly like inference (Figure 5). The question is run through the hybrid retriever on its own datasheet; the top hits other than the source passage become </w:t>
       </w:r>
       <w:r>
         <w:rPr>
@@ -4205,7 +4205,7 @@
         <w:t xml:space="preserve">token F1</w:t>
       </w:r>
       <w:r>
-        <w:t xml:space="preserve"> against the reference answer, as in SQuAD (Rajpurkar et al.); </w:t>
+        <w:t xml:space="preserve"> against the reference answer, as in SQuAD [14]; </w:t>
       </w:r>
       <w:r>
         <w:rPr>
@@ -7634,7 +7634,38 @@
         <w:jc w:val="both"/>
       </w:pPr>
       <w:r>
-        <w:t xml:space="preserve">Figure 13 shows the terminal application on LPC1768, a held-out datasheet. Both factual answers are correct and cite the right pages, and the question about Wi-Fi, a feature the part does not have, is correctly refused.</w:t>
+        <w:t xml:space="preserve">Figures 13 to 15 show complete sessions on the three best-scoring datasheets from Figure 12, captured from a terminal running </w:t>
+      </w:r>
+      <w:r>
+        <w:rPr>
+          <w:rFonts w:ascii="Courier New" w:cs="Courier New" w:eastAsia="Courier New" w:hAnsi="Courier New"/>
+          <w:sz w:val="22"/>
+          <w:szCs w:val="22"/>
+        </w:rPr>
+        <w:t xml:space="preserve">python -m chipdoc</w:t>
+      </w:r>
+      <w:r>
+        <w:t xml:space="preserve"> on each PDF. Every factual answer was checked against the datasheet and is correct, and every one cites the page it came from. The </w:t>
+      </w:r>
+      <w:r>
+        <w:rPr>
+          <w:rFonts w:ascii="Courier New" w:cs="Courier New" w:eastAsia="Courier New" w:hAnsi="Courier New"/>
+          <w:sz w:val="22"/>
+          <w:szCs w:val="22"/>
+        </w:rPr>
+        <w:t xml:space="preserve">Searched</w:t>
+      </w:r>
+      <w:r>
+        <w:t xml:space="preserve"> line lists the pages of the five retrieved passages, so the user can see which part of the document the model read. Each session ends with a question about a feature the chip does not have, which the model correctly refuses.</w:t>
+      </w:r>
+    </w:p>
+    <w:p>
+      <w:pPr>
+        <w:spacing w:after="140" w:line="300"/>
+        <w:jc w:val="both"/>
+      </w:pPr>
+      <w:r>
+        <w:t xml:space="preserve">The sessions also show the kinds of question the model handles well: one specific fact per question, phrased with the datasheet’s own terms (“differential non-linearity”, “low-level sink current”, “24-MHz oscillator”). Answers range from a single value with its unit (“1.1 µA [p.2]”) to a sentence copied from the datasheet (the stack-pointer monitoring feature in Figure 14). Vague or conversational questions such as “ram?” or “explain the architecture” fall outside this style and are often refused; Section 6 discusses how to close that gap.</w:t>
       </w:r>
     </w:p>
     <w:p>
@@ -7646,9 +7677,9 @@
       <w:r>
         <w:drawing>
           <wp:inline distT="0" distB="0" distL="0" distR="0">
-            <wp:extent cx="5334000" cy="2771775"/>
+            <wp:extent cx="4381500" cy="3048000"/>
             <wp:effectExtent t="0" r="0" b="0" l="0"/>
-            <wp:docPr id="13" name="Figure 13" descr="ChipDoc answering questions about the held-out LPC1768 datasheet (real output)." title="Figure 13"/>
+            <wp:docPr id="13" name="Figure 13" descr="Terminal session on the ATtiny85 datasheet: ADC accuracy, electrical characteristics and a correct refusal." title="Figure 13"/>
             <wp:cNvGraphicFramePr>
               <a:graphicFrameLocks xmlns:a="http://schemas.openxmlformats.org/drawingml/2006/main" noChangeAspect="1"/>
             </wp:cNvGraphicFramePr>
@@ -7671,7 +7702,7 @@
                   <pic:spPr bwMode="auto">
                     <a:xfrm>
                       <a:off x="0" y="0"/>
-                      <a:ext cx="5334000" cy="2771775"/>
+                      <a:ext cx="4381500" cy="3048000"/>
                     </a:xfrm>
                     <a:prstGeom prst="rect">
                       <a:avLst/>
@@ -7703,47 +7734,7 @@
           <w:sz w:val="20"/>
           <w:szCs w:val="20"/>
         </w:rPr>
-        <w:t xml:space="preserve">ChipDoc answering questions about the held-out LPC1768 datasheet (real output).</w:t>
-      </w:r>
-    </w:p>
-    <w:p>
-      <w:pPr>
-        <w:spacing w:after="140" w:line="300"/>
-        <w:jc w:val="both"/>
-      </w:pPr>
-      <w:r>
-        <w:t xml:space="preserve">Figures 14 to 16 show complete sessions on the three best-scoring datasheets from Figure 12, captured from a terminal running </w:t>
-      </w:r>
-      <w:r>
-        <w:rPr>
-          <w:rFonts w:ascii="Courier New" w:cs="Courier New" w:eastAsia="Courier New" w:hAnsi="Courier New"/>
-          <w:sz w:val="22"/>
-          <w:szCs w:val="22"/>
-        </w:rPr>
-        <w:t xml:space="preserve">python -m chipdoc</w:t>
-      </w:r>
-      <w:r>
-        <w:t xml:space="preserve"> on each PDF. Every factual answer was checked against the datasheet and is correct, and every one cites the page it came from. The </w:t>
-      </w:r>
-      <w:r>
-        <w:rPr>
-          <w:rFonts w:ascii="Courier New" w:cs="Courier New" w:eastAsia="Courier New" w:hAnsi="Courier New"/>
-          <w:sz w:val="22"/>
-          <w:szCs w:val="22"/>
-        </w:rPr>
-        <w:t xml:space="preserve">Searched</w:t>
-      </w:r>
-      <w:r>
-        <w:t xml:space="preserve"> line lists the pages of the five retrieved passages, so the user can see which part of the document the model read. Each session ends with a question about a feature the chip does not have, which the model correctly refuses.</w:t>
-      </w:r>
-    </w:p>
-    <w:p>
-      <w:pPr>
-        <w:spacing w:after="140" w:line="300"/>
-        <w:jc w:val="both"/>
-      </w:pPr>
-      <w:r>
-        <w:t xml:space="preserve">The sessions also show the kinds of question the model handles well: one specific fact per question, phrased with the datasheet’s own terms (“differential non-linearity”, “low-level sink current”, “24-MHz oscillator”). Answers range from a single value with its unit (“1.1 µA [p.2]”) to a sentence copied from the datasheet (the stack-pointer monitoring feature in Figure 15). Vague or conversational questions such as “ram?” or “explain the architecture” fall outside this style and are often refused; Section 6 discusses how to close that gap.</w:t>
+        <w:t xml:space="preserve">Terminal session on the ATtiny85 datasheet: ADC accuracy, electrical characteristics and a correct refusal.</w:t>
       </w:r>
     </w:p>
     <w:p>
@@ -7755,9 +7746,9 @@
       <w:r>
         <w:drawing>
           <wp:inline distT="0" distB="0" distL="0" distR="0">
-            <wp:extent cx="4381500" cy="3048000"/>
+            <wp:extent cx="4381500" cy="3124200"/>
             <wp:effectExtent t="0" r="0" b="0" l="0"/>
-            <wp:docPr id="14" name="Figure 14" descr="Terminal session on the ATtiny85 datasheet: ADC accuracy, electrical characteristics and a correct refusal." title="Figure 14"/>
+            <wp:docPr id="14" name="Figure 14" descr="Terminal session on the ESP32-H2 datasheet: security, radio and peripheral questions." title="Figure 14"/>
             <wp:cNvGraphicFramePr>
               <a:graphicFrameLocks xmlns:a="http://schemas.openxmlformats.org/drawingml/2006/main" noChangeAspect="1"/>
             </wp:cNvGraphicFramePr>
@@ -7780,7 +7771,7 @@
                   <pic:spPr bwMode="auto">
                     <a:xfrm>
                       <a:off x="0" y="0"/>
-                      <a:ext cx="4381500" cy="3048000"/>
+                      <a:ext cx="4381500" cy="3124200"/>
                     </a:xfrm>
                     <a:prstGeom prst="rect">
                       <a:avLst/>
@@ -7812,7 +7803,7 @@
           <w:sz w:val="20"/>
           <w:szCs w:val="20"/>
         </w:rPr>
-        <w:t xml:space="preserve">Terminal session on the ATtiny85 datasheet: ADC accuracy, electrical characteristics and a correct refusal.</w:t>
+        <w:t xml:space="preserve">Terminal session on the ESP32-H2 datasheet: security, radio and peripheral questions.</w:t>
       </w:r>
     </w:p>
     <w:p>
@@ -7824,9 +7815,9 @@
       <w:r>
         <w:drawing>
           <wp:inline distT="0" distB="0" distL="0" distR="0">
-            <wp:extent cx="4381500" cy="3124200"/>
+            <wp:extent cx="4381500" cy="3219450"/>
             <wp:effectExtent t="0" r="0" b="0" l="0"/>
-            <wp:docPr id="15" name="Figure 15" descr="Terminal session on the ESP32-H2 datasheet: security, radio and peripheral questions." title="Figure 15"/>
+            <wp:docPr id="15" name="Figure 15" descr="Terminal session on the CC2640R2F datasheet: power, clock, memory, pin-out and tooling questions." title="Figure 15"/>
             <wp:cNvGraphicFramePr>
               <a:graphicFrameLocks xmlns:a="http://schemas.openxmlformats.org/drawingml/2006/main" noChangeAspect="1"/>
             </wp:cNvGraphicFramePr>
@@ -7849,7 +7840,7 @@
                   <pic:spPr bwMode="auto">
                     <a:xfrm>
                       <a:off x="0" y="0"/>
-                      <a:ext cx="4381500" cy="3124200"/>
+                      <a:ext cx="4381500" cy="3219450"/>
                     </a:xfrm>
                     <a:prstGeom prst="rect">
                       <a:avLst/>
@@ -7881,7 +7872,27 @@
           <w:sz w:val="20"/>
           <w:szCs w:val="20"/>
         </w:rPr>
-        <w:t xml:space="preserve">Terminal session on the ESP32-H2 datasheet: security, radio and peripheral questions.</w:t>
+        <w:t xml:space="preserve">Terminal session on the CC2640R2F datasheet: power, clock, memory, pin-out and tooling questions.</w:t>
+      </w:r>
+    </w:p>
+    <w:p>
+      <w:pPr>
+        <w:spacing w:after="140" w:line="300"/>
+        <w:jc w:val="both"/>
+      </w:pPr>
+      <w:r>
+        <w:t xml:space="preserve">Figure 16 shows how a user can check an answer. After the question about analog comparators, the </w:t>
+      </w:r>
+      <w:r>
+        <w:rPr>
+          <w:rFonts w:ascii="Courier New" w:cs="Courier New" w:eastAsia="Courier New" w:hAnsi="Courier New"/>
+          <w:sz w:val="22"/>
+          <w:szCs w:val="22"/>
+        </w:rPr>
+        <w:t xml:space="preserve">/sources</w:t>
+      </w:r>
+      <w:r>
+        <w:t xml:space="preserve"> command prints the five passages the model was given, each labelled with its rank, page number and section. Passage [1], from page 48, contains the sentence the answer was copied from, so the claim and its citation can be verified in seconds without opening the PDF. The other passages are the near-misses that retrieval also returned: the comparator pin assignment, the SAR ADC and the power scheme.</w:t>
       </w:r>
     </w:p>
     <w:p>
@@ -7893,9 +7904,9 @@
       <w:r>
         <w:drawing>
           <wp:inline distT="0" distB="0" distL="0" distR="0">
-            <wp:extent cx="4381500" cy="3219450"/>
+            <wp:extent cx="4572000" cy="4762500"/>
             <wp:effectExtent t="0" r="0" b="0" l="0"/>
-            <wp:docPr id="16" name="Figure 16" descr="Terminal session on the CC2640R2F datasheet: power, clock, memory, pin-out and tooling questions." title="Figure 16"/>
+            <wp:docPr id="16" name="Figure 16" descr="The /sources command after an ESP32-H2 question: the five retrieved passages with their page numbers and sections. Passage [1] holds the evidence for the answer." title="Figure 16"/>
             <wp:cNvGraphicFramePr>
               <a:graphicFrameLocks xmlns:a="http://schemas.openxmlformats.org/drawingml/2006/main" noChangeAspect="1"/>
             </wp:cNvGraphicFramePr>
@@ -7918,7 +7929,7 @@
                   <pic:spPr bwMode="auto">
                     <a:xfrm>
                       <a:off x="0" y="0"/>
-                      <a:ext cx="4381500" cy="3219450"/>
+                      <a:ext cx="4572000" cy="4762500"/>
                     </a:xfrm>
                     <a:prstGeom prst="rect">
                       <a:avLst/>
@@ -7950,7 +7961,7 @@
           <w:sz w:val="20"/>
           <w:szCs w:val="20"/>
         </w:rPr>
-        <w:t xml:space="preserve">Terminal session on the CC2640R2F datasheet: power, clock, memory, pin-out and tooling questions.</w:t>
+        <w:t xml:space="preserve">The /sources command after an ESP32-H2 question: the five retrieved passages with their page numbers and sections. Passage [1] holds the evidence for the answer.</w:t>
       </w:r>
     </w:p>
     <w:p>
@@ -8324,226 +8335,346 @@
       </w:pPr>
       <w:bookmarkStart w:name="_Toc36" w:id="36"/>
       <w:r>
-        <w:t xml:space="preserve">Works Cited</w:t>
+        <w:t xml:space="preserve">References</w:t>
       </w:r>
       <w:bookmarkEnd w:id="36"/>
     </w:p>
     <w:p>
       <w:pPr>
-        <w:spacing w:after="0" w:line="480"/>
+        <w:tabs>
+          <w:tab w:val="left" w:pos="720"/>
+        </w:tabs>
+        <w:spacing w:after="100" w:line="276"/>
         <w:ind w:left="720" w:hanging="720"/>
-      </w:pPr>
-      <w:r>
-        <w:t xml:space="preserve">Chen, Hong Cai, et al. “DocEDA: Automated Extraction and Design of Analog Circuits from Documents with Large Language Model.” </w:t>
+        <w:jc w:val="left"/>
+      </w:pPr>
+      <w:r>
+        <w:t xml:space="preserve">[1]</w:t>
+      </w:r>
+      <w:r>
+        <w:t xml:space="preserve">	</w:t>
+      </w:r>
+      <w:r>
+        <w:t xml:space="preserve">Lewis, Patrick, et al. “Retrieval-Augmented Generation for Knowledge-Intensive NLP Tasks.” </w:t>
       </w:r>
       <w:r>
         <w:rPr>
           <w:i/>
           <w:iCs/>
         </w:rPr>
-        <w:t xml:space="preserve">arXiv</w:t>
-      </w:r>
-      <w:r>
-        <w:t xml:space="preserve">, 2024.</w:t>
-      </w:r>
-    </w:p>
-    <w:p>
-      <w:pPr>
-        <w:spacing w:after="0" w:line="480"/>
+        <w:t xml:space="preserve">Advances in Neural Information Processing Systems</w:t>
+      </w:r>
+      <w:r>
+        <w:t xml:space="preserve">, vol. 33, 2020, pp. 9459–74.</w:t>
+      </w:r>
+    </w:p>
+    <w:p>
+      <w:pPr>
+        <w:tabs>
+          <w:tab w:val="left" w:pos="720"/>
+        </w:tabs>
+        <w:spacing w:after="100" w:line="276"/>
         <w:ind w:left="720" w:hanging="720"/>
-      </w:pPr>
-      <w:r>
-        <w:t xml:space="preserve">Cormack, Gordon V., et al. “Reciprocal Rank Fusion Outperforms Condorcet and Individual Rank Learning Methods.” </w:t>
+        <w:jc w:val="left"/>
+      </w:pPr>
+      <w:r>
+        <w:t xml:space="preserve">[2]</w:t>
+      </w:r>
+      <w:r>
+        <w:t xml:space="preserve">	</w:t>
+      </w:r>
+      <w:r>
+        <w:t xml:space="preserve">Chen, Hong Cai, et al. “DocEDA: Automated Extraction and Design of Analog Circuits from Documents with Large Language Model.” </w:t>
       </w:r>
       <w:r>
         <w:rPr>
           <w:i/>
           <w:iCs/>
         </w:rPr>
-        <w:t xml:space="preserve">Proceedings of the 32nd International ACM SIGIR Conference on Research and Development in Information Retrieval</w:t>
-      </w:r>
-      <w:r>
-        <w:t xml:space="preserve">, 2009, pp. 758–59.</w:t>
-      </w:r>
-    </w:p>
-    <w:p>
-      <w:pPr>
-        <w:spacing w:after="0" w:line="480"/>
+        <w:t xml:space="preserve">arXiv</w:t>
+      </w:r>
+      <w:r>
+        <w:t xml:space="preserve">, 2024.</w:t>
+      </w:r>
+    </w:p>
+    <w:p>
+      <w:pPr>
+        <w:tabs>
+          <w:tab w:val="left" w:pos="720"/>
+        </w:tabs>
+        <w:spacing w:after="100" w:line="276"/>
         <w:ind w:left="720" w:hanging="720"/>
-      </w:pPr>
-      <w:r>
-        <w:t xml:space="preserve">Hu, Edward J., et al. “LoRA: Low-Rank Adaptation of Large Language Models.” </w:t>
+        <w:jc w:val="left"/>
+      </w:pPr>
+      <w:r>
+        <w:t xml:space="preserve">[3]</w:t>
+      </w:r>
+      <w:r>
+        <w:t xml:space="preserve">	</w:t>
+      </w:r>
+      <w:r>
+        <w:t xml:space="preserve">Sobhan, Shadman, and Mohammad Ariful Haque. “LLM-Assisted Question-Answering on Technical Documents Using Structured Data-Aware Retrieval Augmented Generation.” </w:t>
       </w:r>
       <w:r>
         <w:rPr>
           <w:i/>
           <w:iCs/>
         </w:rPr>
-        <w:t xml:space="preserve">International Conference on Learning Representations</w:t>
-      </w:r>
-      <w:r>
-        <w:t xml:space="preserve">, 2022.</w:t>
-      </w:r>
-    </w:p>
-    <w:p>
-      <w:pPr>
-        <w:spacing w:after="0" w:line="480"/>
+        <w:t xml:space="preserve">arXiv</w:t>
+      </w:r>
+      <w:r>
+        <w:t xml:space="preserve">, 2025.</w:t>
+      </w:r>
+    </w:p>
+    <w:p>
+      <w:pPr>
+        <w:tabs>
+          <w:tab w:val="left" w:pos="720"/>
+        </w:tabs>
+        <w:spacing w:after="100" w:line="276"/>
         <w:ind w:left="720" w:hanging="720"/>
-      </w:pPr>
-      <w:r>
-        <w:t xml:space="preserve">Johnson, Jeff, et al. “Billion-Scale Similarity Search with GPUs.” </w:t>
+        <w:jc w:val="left"/>
+      </w:pPr>
+      <w:r>
+        <w:t xml:space="preserve">[4]</w:t>
+      </w:r>
+      <w:r>
+        <w:t xml:space="preserve">	</w:t>
+      </w:r>
+      <w:r>
+        <w:t xml:space="preserve">Lee, Seungjoon, and Myungryul Choi. “TechDocRAG: Relation-Preserving Retrieval-Augmented Generation (RAG) for Technical Documents.” </w:t>
       </w:r>
       <w:r>
         <w:rPr>
           <w:i/>
           <w:iCs/>
         </w:rPr>
-        <w:t xml:space="preserve">IEEE Transactions on Big Data</w:t>
-      </w:r>
-      <w:r>
-        <w:t xml:space="preserve">, vol. 7, no. 3, 2021, pp. 535–47.</w:t>
-      </w:r>
-    </w:p>
-    <w:p>
-      <w:pPr>
-        <w:spacing w:after="0" w:line="480"/>
+        <w:t xml:space="preserve">AI</w:t>
+      </w:r>
+      <w:r>
+        <w:t xml:space="preserve">, vol. 7, no. 5, 2026, p. 161.</w:t>
+      </w:r>
+    </w:p>
+    <w:p>
+      <w:pPr>
+        <w:tabs>
+          <w:tab w:val="left" w:pos="720"/>
+        </w:tabs>
+        <w:spacing w:after="100" w:line="276"/>
         <w:ind w:left="720" w:hanging="720"/>
-      </w:pPr>
-      <w:r>
-        <w:t xml:space="preserve">Lee, Seungjoon, and Myungryul Choi. “TechDocRAG: Relation-Preserving Retrieval-Augmented Generation (RAG) for Technical Documents.” </w:t>
+        <w:jc w:val="left"/>
+      </w:pPr>
+      <w:r>
+        <w:t xml:space="preserve">[5]</w:t>
+      </w:r>
+      <w:r>
+        <w:t xml:space="preserve">	</w:t>
+      </w:r>
+      <w:r>
+        <w:t xml:space="preserve">Perot, Vincent, et al. “LMDX: Language Model-based Document Information Extraction and Localization.” </w:t>
       </w:r>
       <w:r>
         <w:rPr>
           <w:i/>
           <w:iCs/>
         </w:rPr>
-        <w:t xml:space="preserve">AI</w:t>
-      </w:r>
-      <w:r>
-        <w:t xml:space="preserve">, vol. 7, no. 5, 2026, p. 161.</w:t>
-      </w:r>
-    </w:p>
-    <w:p>
-      <w:pPr>
-        <w:spacing w:after="0" w:line="480"/>
+        <w:t xml:space="preserve">Findings of the Association for Computational Linguistics: ACL 2024</w:t>
+      </w:r>
+      <w:r>
+        <w:t xml:space="preserve">, 2024, pp. 15140–68.</w:t>
+      </w:r>
+    </w:p>
+    <w:p>
+      <w:pPr>
+        <w:tabs>
+          <w:tab w:val="left" w:pos="720"/>
+        </w:tabs>
+        <w:spacing w:after="100" w:line="276"/>
         <w:ind w:left="720" w:hanging="720"/>
-      </w:pPr>
-      <w:r>
-        <w:t xml:space="preserve">Lewis, Patrick, et al. “Retrieval-Augmented Generation for Knowledge-Intensive NLP Tasks.” </w:t>
+        <w:jc w:val="left"/>
+      </w:pPr>
+      <w:r>
+        <w:t xml:space="preserve">[6]</w:t>
+      </w:r>
+      <w:r>
+        <w:t xml:space="preserve">	</w:t>
+      </w:r>
+      <w:r>
+        <w:t xml:space="preserve">Liu, Ran, et al. “DSciSum: Detailed Summarization of Long Scientific Documents.” </w:t>
       </w:r>
       <w:r>
         <w:rPr>
           <w:i/>
           <w:iCs/>
         </w:rPr>
-        <w:t xml:space="preserve">Advances in Neural Information Processing Systems</w:t>
-      </w:r>
-      <w:r>
-        <w:t xml:space="preserve">, vol. 33, 2020, pp. 9459–74.</w:t>
-      </w:r>
-    </w:p>
-    <w:p>
-      <w:pPr>
-        <w:spacing w:after="0" w:line="480"/>
+        <w:t xml:space="preserve">Knowledge-Based Systems</w:t>
+      </w:r>
+      <w:r>
+        <w:t xml:space="preserve">, vol. 317, 2025, p. 113409.</w:t>
+      </w:r>
+    </w:p>
+    <w:p>
+      <w:pPr>
+        <w:tabs>
+          <w:tab w:val="left" w:pos="720"/>
+        </w:tabs>
+        <w:spacing w:after="100" w:line="276"/>
         <w:ind w:left="720" w:hanging="720"/>
-      </w:pPr>
-      <w:r>
-        <w:t xml:space="preserve">Liu, Ran, et al. “DSciSum: Detailed Summarization of Long Scientific Documents.” </w:t>
+        <w:jc w:val="left"/>
+      </w:pPr>
+      <w:r>
+        <w:t xml:space="preserve">[7]</w:t>
+      </w:r>
+      <w:r>
+        <w:t xml:space="preserve">	</w:t>
+      </w:r>
+      <w:r>
+        <w:t xml:space="preserve">Robertson, Stephen, and Hugo Zaragoza. “The Probabilistic Relevance Framework: BM25 and Beyond.” </w:t>
       </w:r>
       <w:r>
         <w:rPr>
           <w:i/>
           <w:iCs/>
         </w:rPr>
-        <w:t xml:space="preserve">Knowledge-Based Systems</w:t>
-      </w:r>
-      <w:r>
-        <w:t xml:space="preserve">, vol. 317, 2025, p. 113409.</w:t>
-      </w:r>
-    </w:p>
-    <w:p>
-      <w:pPr>
-        <w:spacing w:after="0" w:line="480"/>
+        <w:t xml:space="preserve">Foundations and Trends in Information Retrieval</w:t>
+      </w:r>
+      <w:r>
+        <w:t xml:space="preserve">, vol. 3, no. 4, 2009, pp. 333–89.</w:t>
+      </w:r>
+    </w:p>
+    <w:p>
+      <w:pPr>
+        <w:tabs>
+          <w:tab w:val="left" w:pos="720"/>
+        </w:tabs>
+        <w:spacing w:after="100" w:line="276"/>
         <w:ind w:left="720" w:hanging="720"/>
-      </w:pPr>
-      <w:r>
-        <w:t xml:space="preserve">Perot, Vincent, et al. “LMDX: Language Model-based Document Information Extraction and Localization.” </w:t>
+        <w:jc w:val="left"/>
+      </w:pPr>
+      <w:r>
+        <w:t xml:space="preserve">[8]</w:t>
+      </w:r>
+      <w:r>
+        <w:t xml:space="preserve">	</w:t>
+      </w:r>
+      <w:r>
+        <w:t xml:space="preserve">Xiao, Shitao, et al. “C-Pack: Packed Resources for General Chinese Embeddings.” </w:t>
       </w:r>
       <w:r>
         <w:rPr>
           <w:i/>
           <w:iCs/>
         </w:rPr>
-        <w:t xml:space="preserve">Findings of the Association for Computational Linguistics: ACL 2024</w:t>
-      </w:r>
-      <w:r>
-        <w:t xml:space="preserve">, 2024, pp. 15140–68.</w:t>
-      </w:r>
-    </w:p>
-    <w:p>
-      <w:pPr>
-        <w:spacing w:after="0" w:line="480"/>
+        <w:t xml:space="preserve">arXiv</w:t>
+      </w:r>
+      <w:r>
+        <w:t xml:space="preserve">, 2023, arxiv.org/abs/2309.07597.</w:t>
+      </w:r>
+    </w:p>
+    <w:p>
+      <w:pPr>
+        <w:tabs>
+          <w:tab w:val="left" w:pos="720"/>
+        </w:tabs>
+        <w:spacing w:after="100" w:line="276"/>
         <w:ind w:left="720" w:hanging="720"/>
-      </w:pPr>
-      <w:r>
-        <w:t xml:space="preserve">Rajpurkar, Pranav, et al. “SQuAD: 100,000+ Questions for Machine Comprehension of Text.” </w:t>
+        <w:jc w:val="left"/>
+      </w:pPr>
+      <w:r>
+        <w:t xml:space="preserve">[9]</w:t>
+      </w:r>
+      <w:r>
+        <w:t xml:space="preserve">	</w:t>
+      </w:r>
+      <w:r>
+        <w:t xml:space="preserve">Johnson, Jeff, et al. “Billion-Scale Similarity Search with GPUs.” </w:t>
       </w:r>
       <w:r>
         <w:rPr>
           <w:i/>
           <w:iCs/>
         </w:rPr>
-        <w:t xml:space="preserve">Proceedings of the 2016 Conference on Empirical Methods in Natural Language Processing</w:t>
-      </w:r>
-      <w:r>
-        <w:t xml:space="preserve">, 2016, pp. 2383–92.</w:t>
-      </w:r>
-    </w:p>
-    <w:p>
-      <w:pPr>
-        <w:spacing w:after="0" w:line="480"/>
+        <w:t xml:space="preserve">IEEE Transactions on Big Data</w:t>
+      </w:r>
+      <w:r>
+        <w:t xml:space="preserve">, vol. 7, no. 3, 2021, pp. 535–47.</w:t>
+      </w:r>
+    </w:p>
+    <w:p>
+      <w:pPr>
+        <w:tabs>
+          <w:tab w:val="left" w:pos="720"/>
+        </w:tabs>
+        <w:spacing w:after="100" w:line="276"/>
         <w:ind w:left="720" w:hanging="720"/>
-      </w:pPr>
-      <w:r>
-        <w:t xml:space="preserve">Robertson, Stephen, and Hugo Zaragoza. “The Probabilistic Relevance Framework: BM25 and Beyond.” </w:t>
+        <w:jc w:val="left"/>
+      </w:pPr>
+      <w:r>
+        <w:t xml:space="preserve">[10]</w:t>
+      </w:r>
+      <w:r>
+        <w:t xml:space="preserve">	</w:t>
+      </w:r>
+      <w:r>
+        <w:t xml:space="preserve">Cormack, Gordon V., et al. “Reciprocal Rank Fusion Outperforms Condorcet and Individual Rank Learning Methods.” </w:t>
       </w:r>
       <w:r>
         <w:rPr>
           <w:i/>
           <w:iCs/>
         </w:rPr>
-        <w:t xml:space="preserve">Foundations and Trends in Information Retrieval</w:t>
-      </w:r>
-      <w:r>
-        <w:t xml:space="preserve">, vol. 3, no. 4, 2009, pp. 333–89.</w:t>
-      </w:r>
-    </w:p>
-    <w:p>
-      <w:pPr>
-        <w:spacing w:after="0" w:line="480"/>
+        <w:t xml:space="preserve">Proceedings of the 32nd International ACM SIGIR Conference on Research and Development in Information Retrieval</w:t>
+      </w:r>
+      <w:r>
+        <w:t xml:space="preserve">, 2009, pp. 758–59.</w:t>
+      </w:r>
+    </w:p>
+    <w:p>
+      <w:pPr>
+        <w:tabs>
+          <w:tab w:val="left" w:pos="720"/>
+        </w:tabs>
+        <w:spacing w:after="100" w:line="276"/>
         <w:ind w:left="720" w:hanging="720"/>
-      </w:pPr>
-      <w:r>
-        <w:t xml:space="preserve">Sobhan, Shadman, and Mohammad Ariful Haque. “LLM-Assisted Question-Answering on Technical Documents Using Structured Data-Aware Retrieval Augmented Generation.” </w:t>
+        <w:jc w:val="left"/>
+      </w:pPr>
+      <w:r>
+        <w:t xml:space="preserve">[11]</w:t>
+      </w:r>
+      <w:r>
+        <w:t xml:space="preserve">	</w:t>
+      </w:r>
+      <w:r>
+        <w:t xml:space="preserve">Hu, Edward J., et al. “LoRA: Low-Rank Adaptation of Large Language Models.” </w:t>
       </w:r>
       <w:r>
         <w:rPr>
           <w:i/>
           <w:iCs/>
         </w:rPr>
-        <w:t xml:space="preserve">arXiv</w:t>
-      </w:r>
-      <w:r>
-        <w:t xml:space="preserve">, 2025.</w:t>
-      </w:r>
-    </w:p>
-    <w:p>
-      <w:pPr>
-        <w:spacing w:after="0" w:line="480"/>
+        <w:t xml:space="preserve">International Conference on Learning Representations</w:t>
+      </w:r>
+      <w:r>
+        <w:t xml:space="preserve">, 2022.</w:t>
+      </w:r>
+    </w:p>
+    <w:p>
+      <w:pPr>
+        <w:tabs>
+          <w:tab w:val="left" w:pos="720"/>
+        </w:tabs>
+        <w:spacing w:after="100" w:line="276"/>
         <w:ind w:left="720" w:hanging="720"/>
-      </w:pPr>
-      <w:r>
-        <w:t xml:space="preserve">Xiao, Shitao, et al. “C-Pack: Packed Resources for General Chinese Embeddings.” </w:t>
+        <w:jc w:val="left"/>
+      </w:pPr>
+      <w:r>
+        <w:t xml:space="preserve">[12]</w:t>
+      </w:r>
+      <w:r>
+        <w:t xml:space="preserve">	</w:t>
+      </w:r>
+      <w:r>
+        <w:t xml:space="preserve">Zhang, Tianjun, et al. “RAFT: Adapting Language Model to Domain Specific RAG.” </w:t>
       </w:r>
       <w:r>
         <w:rPr>
@@ -8553,14 +8684,24 @@
         <w:t xml:space="preserve">arXiv</w:t>
       </w:r>
       <w:r>
-        <w:t xml:space="preserve">, 2023, arxiv.org/abs/2309.07597.</w:t>
-      </w:r>
-    </w:p>
-    <w:p>
-      <w:pPr>
-        <w:spacing w:after="0" w:line="480"/>
+        <w:t xml:space="preserve">, 2024, arxiv.org/abs/2403.10131.</w:t>
+      </w:r>
+    </w:p>
+    <w:p>
+      <w:pPr>
+        <w:tabs>
+          <w:tab w:val="left" w:pos="720"/>
+        </w:tabs>
+        <w:spacing w:after="100" w:line="276"/>
         <w:ind w:left="720" w:hanging="720"/>
-      </w:pPr>
+        <w:jc w:val="left"/>
+      </w:pPr>
+      <w:r>
+        <w:t xml:space="preserve">[13]</w:t>
+      </w:r>
+      <w:r>
+        <w:t xml:space="preserve">	</w:t>
+      </w:r>
       <w:r>
         <w:t xml:space="preserve">Yang, An, et al. “Qwen3 Technical Report.” </w:t>
       </w:r>
@@ -8577,21 +8718,31 @@
     </w:p>
     <w:p>
       <w:pPr>
-        <w:spacing w:after="0" w:line="480"/>
+        <w:tabs>
+          <w:tab w:val="left" w:pos="720"/>
+        </w:tabs>
+        <w:spacing w:after="100" w:line="276"/>
         <w:ind w:left="720" w:hanging="720"/>
-      </w:pPr>
-      <w:r>
-        <w:t xml:space="preserve">Zhang, Tianjun, et al. “RAFT: Adapting Language Model to Domain Specific RAG.” </w:t>
+        <w:jc w:val="left"/>
+      </w:pPr>
+      <w:r>
+        <w:t xml:space="preserve">[14]</w:t>
+      </w:r>
+      <w:r>
+        <w:t xml:space="preserve">	</w:t>
+      </w:r>
+      <w:r>
+        <w:t xml:space="preserve">Rajpurkar, Pranav, et al. “SQuAD: 100,000+ Questions for Machine Comprehension of Text.” </w:t>
       </w:r>
       <w:r>
         <w:rPr>
           <w:i/>
           <w:iCs/>
         </w:rPr>
-        <w:t xml:space="preserve">arXiv</w:t>
-      </w:r>
-      <w:r>
-        <w:t xml:space="preserve">, 2024, arxiv.org/abs/2403.10131.</w:t>
+        <w:t xml:space="preserve">Proceedings of the 2016 Conference on Empirical Methods in Natural Language Processing</w:t>
+      </w:r>
+      <w:r>
+        <w:t xml:space="preserve">, 2016, pp. 2383–92.</w:t>
       </w:r>
     </w:p>
     <w:sectPr>

</xml_diff>

<commit_message>
Report: video demo link on title page
Co-Authored-By: Claude Opus 5.5 <noreply@anthropic.com>
</commit_message>
<xml_diff>
--- a/docs/ChipDoc_Report.docx
+++ b/docs/ChipDoc_Report.docx
@@ -117,7 +117,7 @@
     </w:p>
     <w:p>
       <w:pPr>
-        <w:spacing w:after="1000"/>
+        <w:spacing w:after="700"/>
         <w:jc w:val="center"/>
       </w:pPr>
       <w:r>
@@ -142,6 +142,19 @@
     </w:p>
     <w:p>
       <w:pPr>
+        <w:jc w:val="center"/>
+      </w:pPr>
+      <w:r>
+        <w:rPr>
+          <w:sz w:val="24"/>
+          <w:szCs w:val="24"/>
+        </w:rPr>
+        <w:t xml:space="preserve">October 2026</w:t>
+      </w:r>
+    </w:p>
+    <w:p>
+      <w:pPr>
+        <w:spacing w:before="500"/>
         <w:jc w:val="center"/>
         <w:sectPr>
           <w:pgSz w:w="11906" w:h="16838" w:orient="portrait"/>
@@ -152,11 +165,24 @@
       </w:pPr>
       <w:r>
         <w:rPr>
+          <w:b/>
+          <w:bCs/>
           <w:sz w:val="24"/>
           <w:szCs w:val="24"/>
         </w:rPr>
-        <w:t xml:space="preserve">October 2026</w:t>
-      </w:r>
+        <w:t xml:space="preserve">Video demonstration: </w:t>
+      </w:r>
+      <w:hyperlink w:history="1" r:id="rIdudr9kaexdtctevahd1r7k">
+        <w:r>
+          <w:rPr>
+            <w:color w:val="1155CC"/>
+            <w:sz w:val="24"/>
+            <w:szCs w:val="24"/>
+            <w:u w:val="single"/>
+          </w:rPr>
+          <w:t xml:space="preserve">Watch the ChipDoc demo on Google Drive</w:t>
+        </w:r>
+      </w:hyperlink>
     </w:p>
     <w:p>
       <w:pPr>
@@ -2593,7 +2619,7 @@
                     </pic:cNvPicPr>
                   </pic:nvPicPr>
                   <pic:blipFill>
-                    <a:blip r:embed="rId9" cstate="none"/>
+                    <a:blip r:embed="rId10" cstate="none"/>
                     <a:srcRect/>
                     <a:stretch>
                       <a:fillRect/>
@@ -2698,134 +2724,6 @@
             <wp:extent cx="4476750" cy="4219575"/>
             <wp:effectExtent t="0" r="0" b="0" l="0"/>
             <wp:docPr id="2" name="Figure 2" descr="Pages per datasheet (log scale). Blue bars are the five held-out test datasheets." title="Figure 2"/>
-            <wp:cNvGraphicFramePr>
-              <a:graphicFrameLocks xmlns:a="http://schemas.openxmlformats.org/drawingml/2006/main" noChangeAspect="1"/>
-            </wp:cNvGraphicFramePr>
-            <a:graphic xmlns:a="http://schemas.openxmlformats.org/drawingml/2006/main">
-              <a:graphicData uri="http://schemas.openxmlformats.org/drawingml/2006/picture">
-                <pic:pic xmlns:pic="http://schemas.openxmlformats.org/drawingml/2006/picture">
-                  <pic:nvPicPr>
-                    <pic:cNvPr id="0" name="" descr=""/>
-                    <pic:cNvPicPr>
-                      <a:picLocks noChangeAspect="1" noChangeArrowheads="1"/>
-                    </pic:cNvPicPr>
-                  </pic:nvPicPr>
-                  <pic:blipFill>
-                    <a:blip r:embed="rId10" cstate="none"/>
-                    <a:srcRect/>
-                    <a:stretch>
-                      <a:fillRect/>
-                    </a:stretch>
-                  </pic:blipFill>
-                  <pic:spPr bwMode="auto">
-                    <a:xfrm>
-                      <a:off x="0" y="0"/>
-                      <a:ext cx="4476750" cy="4219575"/>
-                    </a:xfrm>
-                    <a:prstGeom prst="rect">
-                      <a:avLst/>
-                    </a:prstGeom>
-                  </pic:spPr>
-                </pic:pic>
-              </a:graphicData>
-            </a:graphic>
-          </wp:inline>
-        </w:drawing>
-      </w:r>
-    </w:p>
-    <w:p>
-      <w:pPr>
-        <w:spacing w:after="240"/>
-        <w:jc w:val="center"/>
-      </w:pPr>
-      <w:r>
-        <w:rPr>
-          <w:b/>
-          <w:bCs/>
-          <w:sz w:val="20"/>
-          <w:szCs w:val="20"/>
-        </w:rPr>
-        <w:t xml:space="preserve">Figure 2: </w:t>
-      </w:r>
-      <w:r>
-        <w:rPr>
-          <w:sz w:val="20"/>
-          <w:szCs w:val="20"/>
-        </w:rPr>
-        <w:t xml:space="preserve">Pages per datasheet (log scale). Blue bars are the five held-out test datasheets.</w:t>
-      </w:r>
-    </w:p>
-    <w:p>
-      <w:pPr>
-        <w:pStyle w:val="Heading2"/>
-      </w:pPr>
-      <w:bookmarkStart w:name="_Toc18" w:id="18"/>
-      <w:r>
-        <w:t xml:space="preserve">3.3 PDF Extraction and Chunking</w:t>
-      </w:r>
-      <w:bookmarkEnd w:id="18"/>
-    </w:p>
-    <w:p>
-      <w:pPr>
-        <w:spacing w:after="140" w:line="300"/>
-        <w:jc w:val="both"/>
-      </w:pPr>
-      <w:r>
-        <w:t xml:space="preserve">Each PDF is first validated at the trust boundary: it must exist, begin with the </w:t>
-      </w:r>
-      <w:r>
-        <w:rPr>
-          <w:rFonts w:ascii="Courier New" w:cs="Courier New" w:eastAsia="Courier New" w:hAnsi="Courier New"/>
-          <w:sz w:val="22"/>
-          <w:szCs w:val="22"/>
-        </w:rPr>
-        <w:t xml:space="preserve">%PDF-</w:t>
-      </w:r>
-      <w:r>
-        <w:t xml:space="preserve"> magic bytes, and be at most 100 MB and 2,000 pages. Text is extracted with pymupdf4llm, which converts every page to Markdown and keeps tables as Markdown tables. Lines shorter than 80 characters that repeat on at least 30% of pages (minimum five) are treated as running headers and footers and removed; table rows are exempt because separator rows repeat legitimately. Invalid Unicode surrogates produced by some PDFs are replaced.</w:t>
-      </w:r>
-    </w:p>
-    <w:p>
-      <w:pPr>
-        <w:spacing w:after="140" w:line="300"/>
-        <w:jc w:val="both"/>
-      </w:pPr>
-      <w:r>
-        <w:t xml:space="preserve">Chunking follows the steps in Figure 3. Each page is split at Markdown headings, and each block is split into passages of at most 1,200 characters, preferring paragraph, then line, then sentence boundaries, with a 150-character overlap. Two design choices matter. First, </w:t>
-      </w:r>
-      <w:r>
-        <w:rPr>
-          <w:b/>
-          <w:bCs/>
-        </w:rPr>
-        <w:t xml:space="preserve">a passage never crosses a page</w:t>
-      </w:r>
-      <w:r>
-        <w:t xml:space="preserve">, so every answer can cite one exact page. Second, the </w:t>
-      </w:r>
-      <w:r>
-        <w:rPr>
-          <w:b/>
-          <w:bCs/>
-        </w:rPr>
-        <w:t xml:space="preserve">section label</w:t>
-      </w:r>
-      <w:r>
-        <w:t xml:space="preserve"> is the most recent heading, carried across pages, with the PDF bookmarks as a fallback; PDFs without bookmarks therefore still work. The project’s initial chunker produced passages averaging 3,000 and up to 8,000 characters, far beyond the 512-token window of the embedding model, so most of each passage was never embedded; the 1,200-character limit (about 400–500 tokens of datasheet text) fixes this.</w:t>
-      </w:r>
-    </w:p>
-    <w:p>
-      <w:pPr>
-        <w:keepNext/>
-        <w:spacing w:after="60" w:before="120"/>
-        <w:jc w:val="center"/>
-      </w:pPr>
-      <w:r>
-        <w:drawing>
-          <wp:inline distT="0" distB="0" distL="0" distR="0">
-            <wp:extent cx="2762250" cy="3971925"/>
-            <wp:effectExtent t="0" r="0" b="0" l="0"/>
-            <wp:docPr id="3" name="Figure 3" descr="Chunking pipeline: from PDF pages to page-bounded passages with section labels." title="Figure 3"/>
             <wp:cNvGraphicFramePr>
               <a:graphicFrameLocks xmlns:a="http://schemas.openxmlformats.org/drawingml/2006/main" noChangeAspect="1"/>
             </wp:cNvGraphicFramePr>
@@ -2848,7 +2746,7 @@
                   <pic:spPr bwMode="auto">
                     <a:xfrm>
                       <a:off x="0" y="0"/>
-                      <a:ext cx="2762250" cy="3971925"/>
+                      <a:ext cx="4476750" cy="4219575"/>
                     </a:xfrm>
                     <a:prstGeom prst="rect">
                       <a:avLst/>
@@ -2873,25 +2771,25 @@
           <w:sz w:val="20"/>
           <w:szCs w:val="20"/>
         </w:rPr>
-        <w:t xml:space="preserve">Figure 3: </w:t>
+        <w:t xml:space="preserve">Figure 2: </w:t>
       </w:r>
       <w:r>
         <w:rPr>
           <w:sz w:val="20"/>
           <w:szCs w:val="20"/>
         </w:rPr>
-        <w:t xml:space="preserve">Chunking pipeline: from PDF pages to page-bounded passages with section labels.</w:t>
+        <w:t xml:space="preserve">Pages per datasheet (log scale). Blue bars are the five held-out test datasheets.</w:t>
       </w:r>
     </w:p>
     <w:p>
       <w:pPr>
         <w:pStyle w:val="Heading2"/>
       </w:pPr>
-      <w:bookmarkStart w:name="_Toc19" w:id="19"/>
-      <w:r>
-        <w:t xml:space="preserve">3.4 Hybrid Retrieval</w:t>
-      </w:r>
-      <w:bookmarkEnd w:id="19"/>
+      <w:bookmarkStart w:name="_Toc18" w:id="18"/>
+      <w:r>
+        <w:t xml:space="preserve">3.3 PDF Extraction and Chunking</w:t>
+      </w:r>
+      <w:bookmarkEnd w:id="18"/>
     </w:p>
     <w:p>
       <w:pPr>
@@ -2899,37 +2797,7 @@
         <w:jc w:val="both"/>
       </w:pPr>
       <w:r>
-        <w:t xml:space="preserve">Each passage is indexed twice. The </w:t>
-      </w:r>
-      <w:r>
-        <w:rPr>
-          <w:b/>
-          <w:bCs/>
-        </w:rPr>
-        <w:t xml:space="preserve">dense index</w:t>
-      </w:r>
-      <w:r>
-        <w:t xml:space="preserve"> embeds “document | section” followed by the passage text with </w:t>
-      </w:r>
-      <w:r>
-        <w:rPr>
-          <w:i/>
-          <w:iCs/>
-        </w:rPr>
-        <w:t xml:space="preserve">bge-small-en-v1.5</w:t>
-      </w:r>
-      <w:r>
-        <w:t xml:space="preserve"> (384 dimensions, normalised) and stores the vectors in a FAISS inner-product index; queries are prefixed with the model’s retrieval instruction. The </w:t>
-      </w:r>
-      <w:r>
-        <w:rPr>
-          <w:b/>
-          <w:bCs/>
-        </w:rPr>
-        <w:t xml:space="preserve">keyword index</w:t>
-      </w:r>
-      <w:r>
-        <w:t xml:space="preserve"> is BM25 over a tokenizer that keeps identifiers such as </w:t>
+        <w:t xml:space="preserve">Each PDF is first validated at the trust boundary: it must exist, begin with the </w:t>
       </w:r>
       <w:r>
         <w:rPr>
@@ -2937,34 +2805,10 @@
           <w:sz w:val="22"/>
           <w:szCs w:val="22"/>
         </w:rPr>
-        <w:t xml:space="preserve">tim2_ccr1</w:t>
-      </w:r>
-      <w:r>
-        <w:t xml:space="preserve"> and values such as </w:t>
-      </w:r>
-      <w:r>
-        <w:rPr>
-          <w:rFonts w:ascii="Courier New" w:cs="Courier New" w:eastAsia="Courier New" w:hAnsi="Courier New"/>
-          <w:sz w:val="22"/>
-          <w:szCs w:val="22"/>
-        </w:rPr>
-        <w:t xml:space="preserve">3.3</w:t>
-      </w:r>
-      <w:r>
-        <w:t xml:space="preserve"> intact. For a question, each retriever returns its top 50 passages, and the two lists are fused with Reciprocal Rank Fusion:</w:t>
-      </w:r>
-    </w:p>
-    <w:p>
-      <w:pPr>
-        <w:spacing w:after="160" w:before="80"/>
-        <w:jc w:val="center"/>
-      </w:pPr>
-      <w:r>
-        <w:rPr>
-          <w:i/>
-          <w:iCs/>
-        </w:rPr>
-        <w:t xml:space="preserve">RRF(d) = Σ over rankers r of  1 / (k + rank_r(d)),   with k = 60</w:t>
+        <w:t xml:space="preserve">%PDF-</w:t>
+      </w:r>
+      <w:r>
+        <w:t xml:space="preserve"> magic bytes, and be at most 100 MB and 2,000 pages. Text is extracted with pymupdf4llm, which converts every page to Markdown and keeps tables as Markdown tables. Lines shorter than 80 characters that repeat on at least 30% of pages (minimum five) are treated as running headers and footers and removed; table rows are exempt because separator rows repeat legitimately. Invalid Unicode surrogates produced by some PDFs are replaced.</w:t>
       </w:r>
     </w:p>
     <w:p>
@@ -2973,36 +2817,27 @@
         <w:jc w:val="both"/>
       </w:pPr>
       <w:r>
-        <w:t xml:space="preserve">The five highest-scoring passages are passed to the model. Indexes are stored as JSON plus a FAISS file, deliberately avoiding Python pickle, because loading a pickle can execute code and the cache sits next to user-supplied data. Each PDF’s index is cached under the SHA-256 hash of its contents, so a second session on the same file starts instantly.</w:t>
-      </w:r>
-    </w:p>
-    <w:p>
-      <w:pPr>
-        <w:pStyle w:val="Heading2"/>
-      </w:pPr>
-      <w:bookmarkStart w:name="_Toc20" w:id="20"/>
-      <w:r>
-        <w:t xml:space="preserve">3.5 Synthetic Question–Answer Generation</w:t>
-      </w:r>
-      <w:bookmarkEnd w:id="20"/>
-    </w:p>
-    <w:p>
-      <w:pPr>
-        <w:spacing w:after="140" w:line="300"/>
-        <w:jc w:val="both"/>
-      </w:pPr>
-      <w:r>
-        <w:t xml:space="preserve">Fine-tuning needs questions with known answers and known evidence. These were generated locally (Figure 4). Up to 40 content-rich passages were sampled per datasheet—skipping passages under 500 characters, without digits, resembling a table of contents, or from revision-history, ordering, legal or package-marking sections—for 1,144 passages in total. A teacher model, </w:t>
-      </w:r>
-      <w:r>
-        <w:rPr>
-          <w:i/>
-          <w:iCs/>
-        </w:rPr>
-        <w:t xml:space="preserve">qwen3:4b</w:t>
-      </w:r>
-      <w:r>
-        <w:t xml:space="preserve"> served by Ollama with JSON-schema-constrained output, wrote two questions per passage, each with a short answer and a verbatim evidence span copied from the passage.</w:t>
+        <w:t xml:space="preserve">Chunking follows the steps in Figure 3. Each page is split at Markdown headings, and each block is split into passages of at most 1,200 characters, preferring paragraph, then line, then sentence boundaries, with a 150-character overlap. Two design choices matter. First, </w:t>
+      </w:r>
+      <w:r>
+        <w:rPr>
+          <w:b/>
+          <w:bCs/>
+        </w:rPr>
+        <w:t xml:space="preserve">a passage never crosses a page</w:t>
+      </w:r>
+      <w:r>
+        <w:t xml:space="preserve">, so every answer can cite one exact page. Second, the </w:t>
+      </w:r>
+      <w:r>
+        <w:rPr>
+          <w:b/>
+          <w:bCs/>
+        </w:rPr>
+        <w:t xml:space="preserve">section label</w:t>
+      </w:r>
+      <w:r>
+        <w:t xml:space="preserve"> is the most recent heading, carried across pages, with the PDF bookmarks as a fallback; PDFs without bookmarks therefore still work. The project’s initial chunker produced passages averaging 3,000 and up to 8,000 characters, far beyond the 512-token window of the embedding model, so most of each passage was never embedded; the 1,200-character limit (about 400–500 tokens of datasheet text) fixes this.</w:t>
       </w:r>
     </w:p>
     <w:p>
@@ -3014,9 +2849,9 @@
       <w:r>
         <w:drawing>
           <wp:inline distT="0" distB="0" distL="0" distR="0">
-            <wp:extent cx="2476500" cy="4714875"/>
+            <wp:extent cx="2762250" cy="3971925"/>
             <wp:effectExtent t="0" r="0" b="0" l="0"/>
-            <wp:docPr id="4" name="Figure 4" descr="Data pipeline from raw PDFs to the trained adapter, with the script that produces each stage." title="Figure 4"/>
+            <wp:docPr id="3" name="Figure 3" descr="Chunking pipeline: from PDF pages to page-bounded passages with section labels." title="Figure 3"/>
             <wp:cNvGraphicFramePr>
               <a:graphicFrameLocks xmlns:a="http://schemas.openxmlformats.org/drawingml/2006/main" noChangeAspect="1"/>
             </wp:cNvGraphicFramePr>
@@ -3039,7 +2874,7 @@
                   <pic:spPr bwMode="auto">
                     <a:xfrm>
                       <a:off x="0" y="0"/>
-                      <a:ext cx="2476500" cy="4714875"/>
+                      <a:ext cx="2762250" cy="3971925"/>
                     </a:xfrm>
                     <a:prstGeom prst="rect">
                       <a:avLst/>
@@ -3064,15 +2899,25 @@
           <w:sz w:val="20"/>
           <w:szCs w:val="20"/>
         </w:rPr>
-        <w:t xml:space="preserve">Figure 4: </w:t>
+        <w:t xml:space="preserve">Figure 3: </w:t>
       </w:r>
       <w:r>
         <w:rPr>
           <w:sz w:val="20"/>
           <w:szCs w:val="20"/>
         </w:rPr>
-        <w:t xml:space="preserve">Data pipeline from raw PDFs to the trained adapter, with the script that produces each stage.</w:t>
-      </w:r>
+        <w:t xml:space="preserve">Chunking pipeline: from PDF pages to page-bounded passages with section labels.</w:t>
+      </w:r>
+    </w:p>
+    <w:p>
+      <w:pPr>
+        <w:pStyle w:val="Heading2"/>
+      </w:pPr>
+      <w:bookmarkStart w:name="_Toc19" w:id="19"/>
+      <w:r>
+        <w:t xml:space="preserve">3.4 Hybrid Retrieval</w:t>
+      </w:r>
+      <w:bookmarkEnd w:id="19"/>
     </w:p>
     <w:p>
       <w:pPr>
@@ -3080,28 +2925,73 @@
         <w:jc w:val="both"/>
       </w:pPr>
       <w:r>
-        <w:t xml:space="preserve">A small teacher is error-prone, so every pair passed four automatic filters: (1) the question is 15–300 characters, ends with a question mark and does not refer to “this table”, “the excerpt” or document metadata; (2) the evidence appears in the passage verbatim or with at least 90% of its words; (3) </w:t>
+        <w:t xml:space="preserve">Each passage is indexed twice. The </w:t>
       </w:r>
       <w:r>
         <w:rPr>
           <w:b/>
           <w:bCs/>
         </w:rPr>
-        <w:t xml:space="preserve">every number in the answer appears in the passage</w:t>
-      </w:r>
-      <w:r>
-        <w:t xml:space="preserve">, ignoring digits inside part and register names such as CC2652R; and (4) the question is not a duplicate. Filter (3) is the main guard against invented values.</w:t>
-      </w:r>
-    </w:p>
-    <w:p>
-      <w:pPr>
-        <w:pStyle w:val="Heading2"/>
-      </w:pPr>
-      <w:bookmarkStart w:name="_Toc21" w:id="21"/>
-      <w:r>
-        <w:t xml:space="preserve">3.6 RAFT-style Training Examples</w:t>
-      </w:r>
-      <w:bookmarkEnd w:id="21"/>
+        <w:t xml:space="preserve">dense index</w:t>
+      </w:r>
+      <w:r>
+        <w:t xml:space="preserve"> embeds “document | section” followed by the passage text with </w:t>
+      </w:r>
+      <w:r>
+        <w:rPr>
+          <w:i/>
+          <w:iCs/>
+        </w:rPr>
+        <w:t xml:space="preserve">bge-small-en-v1.5</w:t>
+      </w:r>
+      <w:r>
+        <w:t xml:space="preserve"> (384 dimensions, normalised) and stores the vectors in a FAISS inner-product index; queries are prefixed with the model’s retrieval instruction. The </w:t>
+      </w:r>
+      <w:r>
+        <w:rPr>
+          <w:b/>
+          <w:bCs/>
+        </w:rPr>
+        <w:t xml:space="preserve">keyword index</w:t>
+      </w:r>
+      <w:r>
+        <w:t xml:space="preserve"> is BM25 over a tokenizer that keeps identifiers such as </w:t>
+      </w:r>
+      <w:r>
+        <w:rPr>
+          <w:rFonts w:ascii="Courier New" w:cs="Courier New" w:eastAsia="Courier New" w:hAnsi="Courier New"/>
+          <w:sz w:val="22"/>
+          <w:szCs w:val="22"/>
+        </w:rPr>
+        <w:t xml:space="preserve">tim2_ccr1</w:t>
+      </w:r>
+      <w:r>
+        <w:t xml:space="preserve"> and values such as </w:t>
+      </w:r>
+      <w:r>
+        <w:rPr>
+          <w:rFonts w:ascii="Courier New" w:cs="Courier New" w:eastAsia="Courier New" w:hAnsi="Courier New"/>
+          <w:sz w:val="22"/>
+          <w:szCs w:val="22"/>
+        </w:rPr>
+        <w:t xml:space="preserve">3.3</w:t>
+      </w:r>
+      <w:r>
+        <w:t xml:space="preserve"> intact. For a question, each retriever returns its top 50 passages, and the two lists are fused with Reciprocal Rank Fusion:</w:t>
+      </w:r>
+    </w:p>
+    <w:p>
+      <w:pPr>
+        <w:spacing w:after="160" w:before="80"/>
+        <w:jc w:val="center"/>
+      </w:pPr>
+      <w:r>
+        <w:rPr>
+          <w:i/>
+          <w:iCs/>
+        </w:rPr>
+        <w:t xml:space="preserve">RRF(d) = Σ over rankers r of  1 / (k + rank_r(d)),   with k = 60</w:t>
+      </w:r>
     </w:p>
     <w:p>
       <w:pPr>
@@ -3109,17 +2999,36 @@
         <w:jc w:val="both"/>
       </w:pPr>
       <w:r>
-        <w:t xml:space="preserve">Following RAFT [12], each kept pair becomes an example that looks exactly like inference (Figure 5). The question is run through the hybrid retriever on its own datasheet; the top hits other than the source passage become </w:t>
-      </w:r>
-      <w:r>
-        <w:rPr>
-          <w:b/>
-          <w:bCs/>
-        </w:rPr>
-        <w:t xml:space="preserve">hard distractors</w:t>
-      </w:r>
-      <w:r>
-        <w:t xml:space="preserve">—same peripheral, neighbouring pages—so the model must locate the right passage rather than trust the first one. In about 80% of examples the context is the source passage plus four distractors, shuffled, and the target is the answer followed by the source page, e.g. “… up to 100 MHz. [p.1]”. In about 20% the source passage is removed and the target is “Not found in the provided datasheet.”; this happens only if no distractor contains the evidence, so the model is never taught to refuse an answerable question.</w:t>
+        <w:t xml:space="preserve">The five highest-scoring passages are passed to the model. Indexes are stored as JSON plus a FAISS file, deliberately avoiding Python pickle, because loading a pickle can execute code and the cache sits next to user-supplied data. Each PDF’s index is cached under the SHA-256 hash of its contents, so a second session on the same file starts instantly.</w:t>
+      </w:r>
+    </w:p>
+    <w:p>
+      <w:pPr>
+        <w:pStyle w:val="Heading2"/>
+      </w:pPr>
+      <w:bookmarkStart w:name="_Toc20" w:id="20"/>
+      <w:r>
+        <w:t xml:space="preserve">3.5 Synthetic Question–Answer Generation</w:t>
+      </w:r>
+      <w:bookmarkEnd w:id="20"/>
+    </w:p>
+    <w:p>
+      <w:pPr>
+        <w:spacing w:after="140" w:line="300"/>
+        <w:jc w:val="both"/>
+      </w:pPr>
+      <w:r>
+        <w:t xml:space="preserve">Fine-tuning needs questions with known answers and known evidence. These were generated locally (Figure 4). Up to 40 content-rich passages were sampled per datasheet—skipping passages under 500 characters, without digits, resembling a table of contents, or from revision-history, ordering, legal or package-marking sections—for 1,144 passages in total. A teacher model, </w:t>
+      </w:r>
+      <w:r>
+        <w:rPr>
+          <w:i/>
+          <w:iCs/>
+        </w:rPr>
+        <w:t xml:space="preserve">qwen3:4b</w:t>
+      </w:r>
+      <w:r>
+        <w:t xml:space="preserve"> served by Ollama with JSON-schema-constrained output, wrote two questions per passage, each with a short answer and a verbatim evidence span copied from the passage.</w:t>
       </w:r>
     </w:p>
     <w:p>
@@ -3131,9 +3040,9 @@
       <w:r>
         <w:drawing>
           <wp:inline distT="0" distB="0" distL="0" distR="0">
-            <wp:extent cx="4000500" cy="5219700"/>
+            <wp:extent cx="2476500" cy="4714875"/>
             <wp:effectExtent t="0" r="0" b="0" l="0"/>
-            <wp:docPr id="5" name="Figure 5" descr="Construction of a RAFT-style training example from a filtered QA pair." title="Figure 5"/>
+            <wp:docPr id="4" name="Figure 4" descr="Data pipeline from raw PDFs to the trained adapter, with the script that produces each stage." title="Figure 4"/>
             <wp:cNvGraphicFramePr>
               <a:graphicFrameLocks xmlns:a="http://schemas.openxmlformats.org/drawingml/2006/main" noChangeAspect="1"/>
             </wp:cNvGraphicFramePr>
@@ -3156,7 +3065,7 @@
                   <pic:spPr bwMode="auto">
                     <a:xfrm>
                       <a:off x="0" y="0"/>
-                      <a:ext cx="4000500" cy="5219700"/>
+                      <a:ext cx="2476500" cy="4714875"/>
                     </a:xfrm>
                     <a:prstGeom prst="rect">
                       <a:avLst/>
@@ -3181,25 +3090,15 @@
           <w:sz w:val="20"/>
           <w:szCs w:val="20"/>
         </w:rPr>
-        <w:t xml:space="preserve">Figure 5: </w:t>
+        <w:t xml:space="preserve">Figure 4: </w:t>
       </w:r>
       <w:r>
         <w:rPr>
           <w:sz w:val="20"/>
           <w:szCs w:val="20"/>
         </w:rPr>
-        <w:t xml:space="preserve">Construction of a RAFT-style training example from a filtered QA pair.</w:t>
-      </w:r>
-    </w:p>
-    <w:p>
-      <w:pPr>
-        <w:pStyle w:val="Heading2"/>
-      </w:pPr>
-      <w:bookmarkStart w:name="_Toc22" w:id="22"/>
-      <w:r>
-        <w:t xml:space="preserve">3.7 Model and Fine-tuning</w:t>
-      </w:r>
-      <w:bookmarkEnd w:id="22"/>
+        <w:t xml:space="preserve">Data pipeline from raw PDFs to the trained adapter, with the script that produces each stage.</w:t>
+      </w:r>
     </w:p>
     <w:p>
       <w:pPr>
@@ -3207,718 +3106,28 @@
         <w:jc w:val="both"/>
       </w:pPr>
       <w:r>
-        <w:t xml:space="preserve">The reader is Qwen3-0.6B with thinking mode disabled. The system prompt instructs it to use only the numbered passages, copy values and units exactly, cite pages as [p.N], and otherwise reply with the fixed refusal sentence. LoRA adapters were trained on all attention and MLP projections with loss computed on answer tokens only (Table 2). Examples longer than 2,560 tokens (3%) were dropped rather than truncated, because truncation would remove the answer, which comes last.</w:t>
-      </w:r>
-    </w:p>
-    <w:p>
-      <w:pPr>
-        <w:keepNext/>
-        <w:spacing w:after="80" w:before="160"/>
-        <w:jc w:val="center"/>
-      </w:pPr>
+        <w:t xml:space="preserve">A small teacher is error-prone, so every pair passed four automatic filters: (1) the question is 15–300 characters, ends with a question mark and does not refer to “this table”, “the excerpt” or document metadata; (2) the evidence appears in the passage verbatim or with at least 90% of its words; (3) </w:t>
+      </w:r>
       <w:r>
         <w:rPr>
           <w:b/>
           <w:bCs/>
-          <w:sz w:val="20"/>
-          <w:szCs w:val="20"/>
-        </w:rPr>
-        <w:t xml:space="preserve">Table 2: </w:t>
-      </w:r>
-      <w:r>
-        <w:rPr>
-          <w:sz w:val="20"/>
-          <w:szCs w:val="20"/>
-        </w:rPr>
-        <w:t xml:space="preserve">Fine-tuning configuration</w:t>
-      </w:r>
-    </w:p>
-    <w:tbl>
-      <w:tblPr>
-        <w:tblW w:type="dxa" w:w="9026"/>
-        <w:jc w:val="center"/>
-        <w:tblBorders>
-          <w:top w:val="single" w:color="auto" w:sz="4"/>
-          <w:left w:val="single" w:color="auto" w:sz="4"/>
-          <w:bottom w:val="single" w:color="auto" w:sz="4"/>
-          <w:right w:val="single" w:color="auto" w:sz="4"/>
-          <w:insideH w:val="single" w:color="auto" w:sz="4"/>
-          <w:insideV w:val="single" w:color="auto" w:sz="4"/>
-        </w:tblBorders>
-      </w:tblPr>
-      <w:tblGrid>
-        <w:gridCol w:w="3000"/>
-        <w:gridCol w:w="6026"/>
-      </w:tblGrid>
-      <w:tr>
-        <w:trPr>
-          <w:tblHeader/>
-        </w:trPr>
-        <w:tc>
-          <w:tcPr>
-            <w:tcW w:type="dxa" w:w="3000"/>
-            <w:tcBorders>
-              <w:top w:val="single" w:color="BFBFBF" w:sz="4"/>
-              <w:left w:val="single" w:color="BFBFBF" w:sz="4"/>
-              <w:bottom w:val="single" w:color="BFBFBF" w:sz="4"/>
-              <w:right w:val="single" w:color="BFBFBF" w:sz="4"/>
-            </w:tcBorders>
-            <w:shd w:fill="1F6F8B" w:color="auto" w:val="clear"/>
-            <w:tcMar>
-              <w:top w:type="dxa" w:w="60"/>
-              <w:left w:type="dxa" w:w="100"/>
-              <w:bottom w:type="dxa" w:w="60"/>
-              <w:right w:type="dxa" w:w="100"/>
-            </w:tcMar>
-          </w:tcPr>
-          <w:p>
-            <w:pPr>
-              <w:spacing w:after="0" w:line="260"/>
-            </w:pPr>
-            <w:r>
-              <w:rPr>
-                <w:b/>
-                <w:bCs/>
-                <w:color w:val="FFFFFF"/>
-                <w:sz w:val="20"/>
-                <w:szCs w:val="20"/>
-              </w:rPr>
-              <w:t xml:space="preserve">Setting</w:t>
-            </w:r>
-          </w:p>
-        </w:tc>
-        <w:tc>
-          <w:tcPr>
-            <w:tcW w:type="dxa" w:w="6026"/>
-            <w:tcBorders>
-              <w:top w:val="single" w:color="BFBFBF" w:sz="4"/>
-              <w:left w:val="single" w:color="BFBFBF" w:sz="4"/>
-              <w:bottom w:val="single" w:color="BFBFBF" w:sz="4"/>
-              <w:right w:val="single" w:color="BFBFBF" w:sz="4"/>
-            </w:tcBorders>
-            <w:shd w:fill="1F6F8B" w:color="auto" w:val="clear"/>
-            <w:tcMar>
-              <w:top w:type="dxa" w:w="60"/>
-              <w:left w:type="dxa" w:w="100"/>
-              <w:bottom w:type="dxa" w:w="60"/>
-              <w:right w:type="dxa" w:w="100"/>
-            </w:tcMar>
-          </w:tcPr>
-          <w:p>
-            <w:pPr>
-              <w:spacing w:after="0" w:line="260"/>
-            </w:pPr>
-            <w:r>
-              <w:rPr>
-                <w:b/>
-                <w:bCs/>
-                <w:color w:val="FFFFFF"/>
-                <w:sz w:val="20"/>
-                <w:szCs w:val="20"/>
-              </w:rPr>
-              <w:t xml:space="preserve">Value</w:t>
-            </w:r>
-          </w:p>
-        </w:tc>
-      </w:tr>
-      <w:tr>
-        <w:trPr>
-          <w:cantSplit/>
-        </w:trPr>
-        <w:tc>
-          <w:tcPr>
-            <w:tcW w:type="dxa" w:w="3000"/>
-            <w:tcBorders>
-              <w:top w:val="single" w:color="BFBFBF" w:sz="4"/>
-              <w:left w:val="single" w:color="BFBFBF" w:sz="4"/>
-              <w:bottom w:val="single" w:color="BFBFBF" w:sz="4"/>
-              <w:right w:val="single" w:color="BFBFBF" w:sz="4"/>
-            </w:tcBorders>
-            <w:tcMar>
-              <w:top w:type="dxa" w:w="60"/>
-              <w:left w:type="dxa" w:w="100"/>
-              <w:bottom w:type="dxa" w:w="60"/>
-              <w:right w:type="dxa" w:w="100"/>
-            </w:tcMar>
-          </w:tcPr>
-          <w:p>
-            <w:pPr>
-              <w:spacing w:after="0" w:line="260"/>
-            </w:pPr>
-            <w:r>
-              <w:rPr>
-                <w:color w:val="262626"/>
-                <w:sz w:val="20"/>
-                <w:szCs w:val="20"/>
-              </w:rPr>
-              <w:t xml:space="preserve">Base model</w:t>
-            </w:r>
-          </w:p>
-        </w:tc>
-        <w:tc>
-          <w:tcPr>
-            <w:tcW w:type="dxa" w:w="6026"/>
-            <w:tcBorders>
-              <w:top w:val="single" w:color="BFBFBF" w:sz="4"/>
-              <w:left w:val="single" w:color="BFBFBF" w:sz="4"/>
-              <w:bottom w:val="single" w:color="BFBFBF" w:sz="4"/>
-              <w:right w:val="single" w:color="BFBFBF" w:sz="4"/>
-            </w:tcBorders>
-            <w:tcMar>
-              <w:top w:type="dxa" w:w="60"/>
-              <w:left w:type="dxa" w:w="100"/>
-              <w:bottom w:type="dxa" w:w="60"/>
-              <w:right w:type="dxa" w:w="100"/>
-            </w:tcMar>
-          </w:tcPr>
-          <w:p>
-            <w:pPr>
-              <w:spacing w:after="0" w:line="260"/>
-            </w:pPr>
-            <w:r>
-              <w:rPr>
-                <w:color w:val="262626"/>
-                <w:sz w:val="20"/>
-                <w:szCs w:val="20"/>
-              </w:rPr>
-              <w:t xml:space="preserve">Qwen/Qwen3-0.6B (bf16, thinking off)</w:t>
-            </w:r>
-          </w:p>
-        </w:tc>
-      </w:tr>
-      <w:tr>
-        <w:trPr>
-          <w:cantSplit/>
-        </w:trPr>
-        <w:tc>
-          <w:tcPr>
-            <w:tcW w:type="dxa" w:w="3000"/>
-            <w:tcBorders>
-              <w:top w:val="single" w:color="BFBFBF" w:sz="4"/>
-              <w:left w:val="single" w:color="BFBFBF" w:sz="4"/>
-              <w:bottom w:val="single" w:color="BFBFBF" w:sz="4"/>
-              <w:right w:val="single" w:color="BFBFBF" w:sz="4"/>
-            </w:tcBorders>
-            <w:shd w:fill="F2F2F2" w:color="auto" w:val="clear"/>
-            <w:tcMar>
-              <w:top w:type="dxa" w:w="60"/>
-              <w:left w:type="dxa" w:w="100"/>
-              <w:bottom w:type="dxa" w:w="60"/>
-              <w:right w:type="dxa" w:w="100"/>
-            </w:tcMar>
-          </w:tcPr>
-          <w:p>
-            <w:pPr>
-              <w:spacing w:after="0" w:line="260"/>
-            </w:pPr>
-            <w:r>
-              <w:rPr>
-                <w:color w:val="262626"/>
-                <w:sz w:val="20"/>
-                <w:szCs w:val="20"/>
-              </w:rPr>
-              <w:t xml:space="preserve">Method</w:t>
-            </w:r>
-          </w:p>
-        </w:tc>
-        <w:tc>
-          <w:tcPr>
-            <w:tcW w:type="dxa" w:w="6026"/>
-            <w:tcBorders>
-              <w:top w:val="single" w:color="BFBFBF" w:sz="4"/>
-              <w:left w:val="single" w:color="BFBFBF" w:sz="4"/>
-              <w:bottom w:val="single" w:color="BFBFBF" w:sz="4"/>
-              <w:right w:val="single" w:color="BFBFBF" w:sz="4"/>
-            </w:tcBorders>
-            <w:shd w:fill="F2F2F2" w:color="auto" w:val="clear"/>
-            <w:tcMar>
-              <w:top w:type="dxa" w:w="60"/>
-              <w:left w:type="dxa" w:w="100"/>
-              <w:bottom w:type="dxa" w:w="60"/>
-              <w:right w:type="dxa" w:w="100"/>
-            </w:tcMar>
-          </w:tcPr>
-          <w:p>
-            <w:pPr>
-              <w:spacing w:after="0" w:line="260"/>
-            </w:pPr>
-            <w:r>
-              <w:rPr>
-                <w:color w:val="262626"/>
-                <w:sz w:val="20"/>
-                <w:szCs w:val="20"/>
-              </w:rPr>
-              <w:t xml:space="preserve">LoRA, rank 16, alpha 32, dropout 0.05</w:t>
-            </w:r>
-          </w:p>
-        </w:tc>
-      </w:tr>
-      <w:tr>
-        <w:trPr>
-          <w:cantSplit/>
-        </w:trPr>
-        <w:tc>
-          <w:tcPr>
-            <w:tcW w:type="dxa" w:w="3000"/>
-            <w:tcBorders>
-              <w:top w:val="single" w:color="BFBFBF" w:sz="4"/>
-              <w:left w:val="single" w:color="BFBFBF" w:sz="4"/>
-              <w:bottom w:val="single" w:color="BFBFBF" w:sz="4"/>
-              <w:right w:val="single" w:color="BFBFBF" w:sz="4"/>
-            </w:tcBorders>
-            <w:tcMar>
-              <w:top w:type="dxa" w:w="60"/>
-              <w:left w:type="dxa" w:w="100"/>
-              <w:bottom w:type="dxa" w:w="60"/>
-              <w:right w:type="dxa" w:w="100"/>
-            </w:tcMar>
-          </w:tcPr>
-          <w:p>
-            <w:pPr>
-              <w:spacing w:after="0" w:line="260"/>
-            </w:pPr>
-            <w:r>
-              <w:rPr>
-                <w:color w:val="262626"/>
-                <w:sz w:val="20"/>
-                <w:szCs w:val="20"/>
-              </w:rPr>
-              <w:t xml:space="preserve">Target modules</w:t>
-            </w:r>
-          </w:p>
-        </w:tc>
-        <w:tc>
-          <w:tcPr>
-            <w:tcW w:type="dxa" w:w="6026"/>
-            <w:tcBorders>
-              <w:top w:val="single" w:color="BFBFBF" w:sz="4"/>
-              <w:left w:val="single" w:color="BFBFBF" w:sz="4"/>
-              <w:bottom w:val="single" w:color="BFBFBF" w:sz="4"/>
-              <w:right w:val="single" w:color="BFBFBF" w:sz="4"/>
-            </w:tcBorders>
-            <w:tcMar>
-              <w:top w:type="dxa" w:w="60"/>
-              <w:left w:type="dxa" w:w="100"/>
-              <w:bottom w:type="dxa" w:w="60"/>
-              <w:right w:type="dxa" w:w="100"/>
-            </w:tcMar>
-          </w:tcPr>
-          <w:p>
-            <w:pPr>
-              <w:spacing w:after="0" w:line="260"/>
-            </w:pPr>
-            <w:r>
-              <w:rPr>
-                <w:color w:val="262626"/>
-                <w:sz w:val="20"/>
-                <w:szCs w:val="20"/>
-              </w:rPr>
-              <w:t xml:space="preserve">q, k, v, o, gate, up and down projections</w:t>
-            </w:r>
-          </w:p>
-        </w:tc>
-      </w:tr>
-      <w:tr>
-        <w:trPr>
-          <w:cantSplit/>
-        </w:trPr>
-        <w:tc>
-          <w:tcPr>
-            <w:tcW w:type="dxa" w:w="3000"/>
-            <w:tcBorders>
-              <w:top w:val="single" w:color="BFBFBF" w:sz="4"/>
-              <w:left w:val="single" w:color="BFBFBF" w:sz="4"/>
-              <w:bottom w:val="single" w:color="BFBFBF" w:sz="4"/>
-              <w:right w:val="single" w:color="BFBFBF" w:sz="4"/>
-            </w:tcBorders>
-            <w:shd w:fill="F2F2F2" w:color="auto" w:val="clear"/>
-            <w:tcMar>
-              <w:top w:type="dxa" w:w="60"/>
-              <w:left w:type="dxa" w:w="100"/>
-              <w:bottom w:type="dxa" w:w="60"/>
-              <w:right w:type="dxa" w:w="100"/>
-            </w:tcMar>
-          </w:tcPr>
-          <w:p>
-            <w:pPr>
-              <w:spacing w:after="0" w:line="260"/>
-            </w:pPr>
-            <w:r>
-              <w:rPr>
-                <w:color w:val="262626"/>
-                <w:sz w:val="20"/>
-                <w:szCs w:val="20"/>
-              </w:rPr>
-              <w:t xml:space="preserve">Trainable parameters</w:t>
-            </w:r>
-          </w:p>
-        </w:tc>
-        <w:tc>
-          <w:tcPr>
-            <w:tcW w:type="dxa" w:w="6026"/>
-            <w:tcBorders>
-              <w:top w:val="single" w:color="BFBFBF" w:sz="4"/>
-              <w:left w:val="single" w:color="BFBFBF" w:sz="4"/>
-              <w:bottom w:val="single" w:color="BFBFBF" w:sz="4"/>
-              <w:right w:val="single" w:color="BFBFBF" w:sz="4"/>
-            </w:tcBorders>
-            <w:shd w:fill="F2F2F2" w:color="auto" w:val="clear"/>
-            <w:tcMar>
-              <w:top w:type="dxa" w:w="60"/>
-              <w:left w:type="dxa" w:w="100"/>
-              <w:bottom w:type="dxa" w:w="60"/>
-              <w:right w:type="dxa" w:w="100"/>
-            </w:tcMar>
-          </w:tcPr>
-          <w:p>
-            <w:pPr>
-              <w:spacing w:after="0" w:line="260"/>
-            </w:pPr>
-            <w:r>
-              <w:rPr>
-                <w:color w:val="262626"/>
-                <w:sz w:val="20"/>
-                <w:szCs w:val="20"/>
-              </w:rPr>
-              <w:t xml:space="preserve">10,092,544 of 606,142,464 (1.67%)</w:t>
-            </w:r>
-          </w:p>
-        </w:tc>
-      </w:tr>
-      <w:tr>
-        <w:trPr>
-          <w:cantSplit/>
-        </w:trPr>
-        <w:tc>
-          <w:tcPr>
-            <w:tcW w:type="dxa" w:w="3000"/>
-            <w:tcBorders>
-              <w:top w:val="single" w:color="BFBFBF" w:sz="4"/>
-              <w:left w:val="single" w:color="BFBFBF" w:sz="4"/>
-              <w:bottom w:val="single" w:color="BFBFBF" w:sz="4"/>
-              <w:right w:val="single" w:color="BFBFBF" w:sz="4"/>
-            </w:tcBorders>
-            <w:tcMar>
-              <w:top w:type="dxa" w:w="60"/>
-              <w:left w:type="dxa" w:w="100"/>
-              <w:bottom w:type="dxa" w:w="60"/>
-              <w:right w:type="dxa" w:w="100"/>
-            </w:tcMar>
-          </w:tcPr>
-          <w:p>
-            <w:pPr>
-              <w:spacing w:after="0" w:line="260"/>
-            </w:pPr>
-            <w:r>
-              <w:rPr>
-                <w:color w:val="262626"/>
-                <w:sz w:val="20"/>
-                <w:szCs w:val="20"/>
-              </w:rPr>
-              <w:t xml:space="preserve">Training data</w:t>
-            </w:r>
-          </w:p>
-        </w:tc>
-        <w:tc>
-          <w:tcPr>
-            <w:tcW w:type="dxa" w:w="6026"/>
-            <w:tcBorders>
-              <w:top w:val="single" w:color="BFBFBF" w:sz="4"/>
-              <w:left w:val="single" w:color="BFBFBF" w:sz="4"/>
-              <w:bottom w:val="single" w:color="BFBFBF" w:sz="4"/>
-              <w:right w:val="single" w:color="BFBFBF" w:sz="4"/>
-            </w:tcBorders>
-            <w:tcMar>
-              <w:top w:type="dxa" w:w="60"/>
-              <w:left w:type="dxa" w:w="100"/>
-              <w:bottom w:type="dxa" w:w="60"/>
-              <w:right w:type="dxa" w:w="100"/>
-            </w:tcMar>
-          </w:tcPr>
-          <w:p>
-            <w:pPr>
-              <w:spacing w:after="0" w:line="260"/>
-            </w:pPr>
-            <w:r>
-              <w:rPr>
-                <w:color w:val="262626"/>
-                <w:sz w:val="20"/>
-                <w:szCs w:val="20"/>
-              </w:rPr>
-              <w:t xml:space="preserve">1,523 train and 75 validation examples</w:t>
-            </w:r>
-          </w:p>
-        </w:tc>
-      </w:tr>
-      <w:tr>
-        <w:trPr>
-          <w:cantSplit/>
-        </w:trPr>
-        <w:tc>
-          <w:tcPr>
-            <w:tcW w:type="dxa" w:w="3000"/>
-            <w:tcBorders>
-              <w:top w:val="single" w:color="BFBFBF" w:sz="4"/>
-              <w:left w:val="single" w:color="BFBFBF" w:sz="4"/>
-              <w:bottom w:val="single" w:color="BFBFBF" w:sz="4"/>
-              <w:right w:val="single" w:color="BFBFBF" w:sz="4"/>
-            </w:tcBorders>
-            <w:shd w:fill="F2F2F2" w:color="auto" w:val="clear"/>
-            <w:tcMar>
-              <w:top w:type="dxa" w:w="60"/>
-              <w:left w:type="dxa" w:w="100"/>
-              <w:bottom w:type="dxa" w:w="60"/>
-              <w:right w:type="dxa" w:w="100"/>
-            </w:tcMar>
-          </w:tcPr>
-          <w:p>
-            <w:pPr>
-              <w:spacing w:after="0" w:line="260"/>
-            </w:pPr>
-            <w:r>
-              <w:rPr>
-                <w:color w:val="262626"/>
-                <w:sz w:val="20"/>
-                <w:szCs w:val="20"/>
-              </w:rPr>
-              <w:t xml:space="preserve">Batch</w:t>
-            </w:r>
-          </w:p>
-        </w:tc>
-        <w:tc>
-          <w:tcPr>
-            <w:tcW w:type="dxa" w:w="6026"/>
-            <w:tcBorders>
-              <w:top w:val="single" w:color="BFBFBF" w:sz="4"/>
-              <w:left w:val="single" w:color="BFBFBF" w:sz="4"/>
-              <w:bottom w:val="single" w:color="BFBFBF" w:sz="4"/>
-              <w:right w:val="single" w:color="BFBFBF" w:sz="4"/>
-            </w:tcBorders>
-            <w:shd w:fill="F2F2F2" w:color="auto" w:val="clear"/>
-            <w:tcMar>
-              <w:top w:type="dxa" w:w="60"/>
-              <w:left w:type="dxa" w:w="100"/>
-              <w:bottom w:type="dxa" w:w="60"/>
-              <w:right w:type="dxa" w:w="100"/>
-            </w:tcMar>
-          </w:tcPr>
-          <w:p>
-            <w:pPr>
-              <w:spacing w:after="0" w:line="260"/>
-            </w:pPr>
-            <w:r>
-              <w:rPr>
-                <w:color w:val="262626"/>
-                <w:sz w:val="20"/>
-                <w:szCs w:val="20"/>
-              </w:rPr>
-              <w:t xml:space="preserve">1 per step × 16 gradient accumulation</w:t>
-            </w:r>
-          </w:p>
-        </w:tc>
-      </w:tr>
-      <w:tr>
-        <w:trPr>
-          <w:cantSplit/>
-        </w:trPr>
-        <w:tc>
-          <w:tcPr>
-            <w:tcW w:type="dxa" w:w="3000"/>
-            <w:tcBorders>
-              <w:top w:val="single" w:color="BFBFBF" w:sz="4"/>
-              <w:left w:val="single" w:color="BFBFBF" w:sz="4"/>
-              <w:bottom w:val="single" w:color="BFBFBF" w:sz="4"/>
-              <w:right w:val="single" w:color="BFBFBF" w:sz="4"/>
-            </w:tcBorders>
-            <w:tcMar>
-              <w:top w:type="dxa" w:w="60"/>
-              <w:left w:type="dxa" w:w="100"/>
-              <w:bottom w:type="dxa" w:w="60"/>
-              <w:right w:type="dxa" w:w="100"/>
-            </w:tcMar>
-          </w:tcPr>
-          <w:p>
-            <w:pPr>
-              <w:spacing w:after="0" w:line="260"/>
-            </w:pPr>
-            <w:r>
-              <w:rPr>
-                <w:color w:val="262626"/>
-                <w:sz w:val="20"/>
-                <w:szCs w:val="20"/>
-              </w:rPr>
-              <w:t xml:space="preserve">Optimisation</w:t>
-            </w:r>
-          </w:p>
-        </w:tc>
-        <w:tc>
-          <w:tcPr>
-            <w:tcW w:type="dxa" w:w="6026"/>
-            <w:tcBorders>
-              <w:top w:val="single" w:color="BFBFBF" w:sz="4"/>
-              <w:left w:val="single" w:color="BFBFBF" w:sz="4"/>
-              <w:bottom w:val="single" w:color="BFBFBF" w:sz="4"/>
-              <w:right w:val="single" w:color="BFBFBF" w:sz="4"/>
-            </w:tcBorders>
-            <w:tcMar>
-              <w:top w:type="dxa" w:w="60"/>
-              <w:left w:type="dxa" w:w="100"/>
-              <w:bottom w:type="dxa" w:w="60"/>
-              <w:right w:type="dxa" w:w="100"/>
-            </w:tcMar>
-          </w:tcPr>
-          <w:p>
-            <w:pPr>
-              <w:spacing w:after="0" w:line="260"/>
-            </w:pPr>
-            <w:r>
-              <w:rPr>
-                <w:color w:val="262626"/>
-                <w:sz w:val="20"/>
-                <w:szCs w:val="20"/>
-              </w:rPr>
-              <w:t xml:space="preserve">learning rate 2e-4, cosine schedule, 3% warm-up, 2 epochs</w:t>
-            </w:r>
-          </w:p>
-        </w:tc>
-      </w:tr>
-      <w:tr>
-        <w:trPr>
-          <w:cantSplit/>
-        </w:trPr>
-        <w:tc>
-          <w:tcPr>
-            <w:tcW w:type="dxa" w:w="3000"/>
-            <w:tcBorders>
-              <w:top w:val="single" w:color="BFBFBF" w:sz="4"/>
-              <w:left w:val="single" w:color="BFBFBF" w:sz="4"/>
-              <w:bottom w:val="single" w:color="BFBFBF" w:sz="4"/>
-              <w:right w:val="single" w:color="BFBFBF" w:sz="4"/>
-            </w:tcBorders>
-            <w:shd w:fill="F2F2F2" w:color="auto" w:val="clear"/>
-            <w:tcMar>
-              <w:top w:type="dxa" w:w="60"/>
-              <w:left w:type="dxa" w:w="100"/>
-              <w:bottom w:type="dxa" w:w="60"/>
-              <w:right w:type="dxa" w:w="100"/>
-            </w:tcMar>
-          </w:tcPr>
-          <w:p>
-            <w:pPr>
-              <w:spacing w:after="0" w:line="260"/>
-            </w:pPr>
-            <w:r>
-              <w:rPr>
-                <w:color w:val="262626"/>
-                <w:sz w:val="20"/>
-                <w:szCs w:val="20"/>
-              </w:rPr>
-              <w:t xml:space="preserve">Maximum length</w:t>
-            </w:r>
-          </w:p>
-        </w:tc>
-        <w:tc>
-          <w:tcPr>
-            <w:tcW w:type="dxa" w:w="6026"/>
-            <w:tcBorders>
-              <w:top w:val="single" w:color="BFBFBF" w:sz="4"/>
-              <w:left w:val="single" w:color="BFBFBF" w:sz="4"/>
-              <w:bottom w:val="single" w:color="BFBFBF" w:sz="4"/>
-              <w:right w:val="single" w:color="BFBFBF" w:sz="4"/>
-            </w:tcBorders>
-            <w:shd w:fill="F2F2F2" w:color="auto" w:val="clear"/>
-            <w:tcMar>
-              <w:top w:type="dxa" w:w="60"/>
-              <w:left w:type="dxa" w:w="100"/>
-              <w:bottom w:type="dxa" w:w="60"/>
-              <w:right w:type="dxa" w:w="100"/>
-            </w:tcMar>
-          </w:tcPr>
-          <w:p>
-            <w:pPr>
-              <w:spacing w:after="0" w:line="260"/>
-            </w:pPr>
-            <w:r>
-              <w:rPr>
-                <w:color w:val="262626"/>
-                <w:sz w:val="20"/>
-                <w:szCs w:val="20"/>
-              </w:rPr>
-              <w:t xml:space="preserve">2,560 tokens; gradient checkpointing</w:t>
-            </w:r>
-          </w:p>
-        </w:tc>
-      </w:tr>
-      <w:tr>
-        <w:trPr>
-          <w:cantSplit/>
-        </w:trPr>
-        <w:tc>
-          <w:tcPr>
-            <w:tcW w:type="dxa" w:w="3000"/>
-            <w:tcBorders>
-              <w:top w:val="single" w:color="BFBFBF" w:sz="4"/>
-              <w:left w:val="single" w:color="BFBFBF" w:sz="4"/>
-              <w:bottom w:val="single" w:color="BFBFBF" w:sz="4"/>
-              <w:right w:val="single" w:color="BFBFBF" w:sz="4"/>
-            </w:tcBorders>
-            <w:tcMar>
-              <w:top w:type="dxa" w:w="60"/>
-              <w:left w:type="dxa" w:w="100"/>
-              <w:bottom w:type="dxa" w:w="60"/>
-              <w:right w:type="dxa" w:w="100"/>
-            </w:tcMar>
-          </w:tcPr>
-          <w:p>
-            <w:pPr>
-              <w:spacing w:after="0" w:line="260"/>
-            </w:pPr>
-            <w:r>
-              <w:rPr>
-                <w:color w:val="262626"/>
-                <w:sz w:val="20"/>
-                <w:szCs w:val="20"/>
-              </w:rPr>
-              <w:t xml:space="preserve">Hardware and time</w:t>
-            </w:r>
-          </w:p>
-        </w:tc>
-        <w:tc>
-          <w:tcPr>
-            <w:tcW w:type="dxa" w:w="6026"/>
-            <w:tcBorders>
-              <w:top w:val="single" w:color="BFBFBF" w:sz="4"/>
-              <w:left w:val="single" w:color="BFBFBF" w:sz="4"/>
-              <w:bottom w:val="single" w:color="BFBFBF" w:sz="4"/>
-              <w:right w:val="single" w:color="BFBFBF" w:sz="4"/>
-            </w:tcBorders>
-            <w:tcMar>
-              <w:top w:type="dxa" w:w="60"/>
-              <w:left w:type="dxa" w:w="100"/>
-              <w:bottom w:type="dxa" w:w="60"/>
-              <w:right w:type="dxa" w:w="100"/>
-            </w:tcMar>
-          </w:tcPr>
-          <w:p>
-            <w:pPr>
-              <w:spacing w:after="0" w:line="260"/>
-            </w:pPr>
-            <w:r>
-              <w:rPr>
-                <w:color w:val="262626"/>
-                <w:sz w:val="20"/>
-                <w:szCs w:val="20"/>
-              </w:rPr>
-              <w:t xml:space="preserve">RTX 3050 Laptop GPU (4 GB), 63 minutes, about 2 GB VRAM</w:t>
-            </w:r>
-          </w:p>
-        </w:tc>
-      </w:tr>
-    </w:tbl>
-    <w:p>
-      <w:pPr>
-        <w:spacing w:after="120"/>
-      </w:pPr>
+        </w:rPr>
+        <w:t xml:space="preserve">every number in the answer appears in the passage</w:t>
+      </w:r>
+      <w:r>
+        <w:t xml:space="preserve">, ignoring digits inside part and register names such as CC2652R; and (4) the question is not a duplicate. Filter (3) is the main guard against invented values.</w:t>
+      </w:r>
+    </w:p>
+    <w:p>
+      <w:pPr>
+        <w:pStyle w:val="Heading2"/>
+      </w:pPr>
+      <w:bookmarkStart w:name="_Toc21" w:id="21"/>
+      <w:r>
+        <w:t xml:space="preserve">3.6 RAFT-style Training Examples</w:t>
+      </w:r>
+      <w:bookmarkEnd w:id="21"/>
     </w:p>
     <w:p>
       <w:pPr>
@@ -3926,70 +3135,17 @@
         <w:jc w:val="both"/>
       </w:pPr>
       <w:r>
-        <w:t xml:space="preserve">Batch size 1 is forced by Qwen’s 151k-token vocabulary: the output logits for one 2,500-token sequence alone occupy about 1.5 GB in 32-bit precision.</w:t>
-      </w:r>
-    </w:p>
-    <w:p>
-      <w:pPr>
-        <w:pStyle w:val="Heading2"/>
-      </w:pPr>
-      <w:bookmarkStart w:name="_Toc23" w:id="23"/>
-      <w:r>
-        <w:t xml:space="preserve">3.8 Terminal Application</w:t>
-      </w:r>
-      <w:bookmarkEnd w:id="23"/>
-    </w:p>
-    <w:p>
-      <w:pPr>
-        <w:spacing w:after="140" w:line="300"/>
-        <w:jc w:val="both"/>
-      </w:pPr>
-      <w:r>
-        <w:t xml:space="preserve">The user runs </w:t>
-      </w:r>
-      <w:r>
-        <w:rPr>
-          <w:rFonts w:ascii="Courier New" w:cs="Courier New" w:eastAsia="Courier New" w:hAnsi="Courier New"/>
-          <w:sz w:val="22"/>
-          <w:szCs w:val="22"/>
-        </w:rPr>
-        <w:t xml:space="preserve">python -m chipdoc datasheet.pdf</w:t>
-      </w:r>
-      <w:r>
-        <w:t xml:space="preserve">. On first use the PDF is validated, extracted, chunked and indexed (one to three minutes for a few hundred pages, dominated by layout-aware text extraction); afterwards the cached index loads instantly. Each question triggers hybrid retrieval and a streamed answer (Figure 6). The </w:t>
-      </w:r>
-      <w:r>
-        <w:rPr>
-          <w:rFonts w:ascii="Courier New" w:cs="Courier New" w:eastAsia="Courier New" w:hAnsi="Courier New"/>
-          <w:sz w:val="22"/>
-          <w:szCs w:val="22"/>
-        </w:rPr>
-        <w:t xml:space="preserve">/sources</w:t>
-      </w:r>
-      <w:r>
-        <w:t xml:space="preserve"> command shows the passages behind the last answer, </w:t>
-      </w:r>
-      <w:r>
-        <w:rPr>
-          <w:rFonts w:ascii="Courier New" w:cs="Courier New" w:eastAsia="Courier New" w:hAnsi="Courier New"/>
-          <w:sz w:val="22"/>
-          <w:szCs w:val="22"/>
-        </w:rPr>
-        <w:t xml:space="preserve">-q</w:t>
-      </w:r>
-      <w:r>
-        <w:t xml:space="preserve"> answers a single question non-interactively, and </w:t>
-      </w:r>
-      <w:r>
-        <w:rPr>
-          <w:rFonts w:ascii="Courier New" w:cs="Courier New" w:eastAsia="Courier New" w:hAnsi="Courier New"/>
-          <w:sz w:val="22"/>
-          <w:szCs w:val="22"/>
-        </w:rPr>
-        <w:t xml:space="preserve">--base</w:t>
-      </w:r>
-      <w:r>
-        <w:t xml:space="preserve"> runs the untuned model for comparison. Everything runs locally; no datasheet text or question leaves the machine.</w:t>
+        <w:t xml:space="preserve">Following RAFT [12], each kept pair becomes an example that looks exactly like inference (Figure 5). The question is run through the hybrid retriever on its own datasheet; the top hits other than the source passage become </w:t>
+      </w:r>
+      <w:r>
+        <w:rPr>
+          <w:b/>
+          <w:bCs/>
+        </w:rPr>
+        <w:t xml:space="preserve">hard distractors</w:t>
+      </w:r>
+      <w:r>
+        <w:t xml:space="preserve">—same peripheral, neighbouring pages—so the model must locate the right passage rather than trust the first one. In about 80% of examples the context is the source passage plus four distractors, shuffled, and the target is the answer followed by the source page, e.g. “… up to 100 MHz. [p.1]”. In about 20% the source passage is removed and the target is “Not found in the provided datasheet.”; this happens only if no distractor contains the evidence, so the model is never taught to refuse an answerable question.</w:t>
       </w:r>
     </w:p>
     <w:p>
@@ -4001,9 +3157,9 @@
       <w:r>
         <w:drawing>
           <wp:inline distT="0" distB="0" distL="0" distR="0">
-            <wp:extent cx="5715000" cy="3762375"/>
+            <wp:extent cx="4000500" cy="5219700"/>
             <wp:effectExtent t="0" r="0" b="0" l="0"/>
-            <wp:docPr id="6" name="Figure 6" descr="Query flow in the terminal application, including the per-PDF cache." title="Figure 6"/>
+            <wp:docPr id="5" name="Figure 5" descr="Construction of a RAFT-style training example from a filtered QA pair." title="Figure 5"/>
             <wp:cNvGraphicFramePr>
               <a:graphicFrameLocks xmlns:a="http://schemas.openxmlformats.org/drawingml/2006/main" noChangeAspect="1"/>
             </wp:cNvGraphicFramePr>
@@ -4026,7 +3182,7 @@
                   <pic:spPr bwMode="auto">
                     <a:xfrm>
                       <a:off x="0" y="0"/>
-                      <a:ext cx="5715000" cy="3762375"/>
+                      <a:ext cx="4000500" cy="5219700"/>
                     </a:xfrm>
                     <a:prstGeom prst="rect">
                       <a:avLst/>
@@ -4051,25 +3207,25 @@
           <w:sz w:val="20"/>
           <w:szCs w:val="20"/>
         </w:rPr>
-        <w:t xml:space="preserve">Figure 6: </w:t>
+        <w:t xml:space="preserve">Figure 5: </w:t>
       </w:r>
       <w:r>
         <w:rPr>
           <w:sz w:val="20"/>
           <w:szCs w:val="20"/>
         </w:rPr>
-        <w:t xml:space="preserve">Query flow in the terminal application, including the per-PDF cache.</w:t>
+        <w:t xml:space="preserve">Construction of a RAFT-style training example from a filtered QA pair.</w:t>
       </w:r>
     </w:p>
     <w:p>
       <w:pPr>
         <w:pStyle w:val="Heading2"/>
       </w:pPr>
-      <w:bookmarkStart w:name="_Toc24" w:id="24"/>
-      <w:r>
-        <w:t xml:space="preserve">3.9 Evaluation Protocol</w:t>
-      </w:r>
-      <w:bookmarkEnd w:id="24"/>
+      <w:bookmarkStart w:name="_Toc22" w:id="22"/>
+      <w:r>
+        <w:t xml:space="preserve">3.7 Model and Fine-tuning</w:t>
+      </w:r>
+      <w:bookmarkEnd w:id="22"/>
     </w:p>
     <w:p>
       <w:pPr>
@@ -4077,47 +3233,789 @@
         <w:jc w:val="both"/>
       </w:pPr>
       <w:r>
-        <w:t xml:space="preserve">All evaluation uses the five held-out datasheets (341 test QA pairs). </w:t>
-      </w:r>
+        <w:t xml:space="preserve">The reader is Qwen3-0.6B with thinking mode disabled. The system prompt instructs it to use only the numbered passages, copy values and units exactly, cite pages as [p.N], and otherwise reply with the fixed refusal sentence. LoRA adapters were trained on all attention and MLP projections with loss computed on answer tokens only (Table 2). Examples longer than 2,560 tokens (3%) were dropped rather than truncated, because truncation would remove the answer, which comes last.</w:t>
+      </w:r>
+    </w:p>
+    <w:p>
+      <w:pPr>
+        <w:keepNext/>
+        <w:spacing w:after="80" w:before="160"/>
+        <w:jc w:val="center"/>
+      </w:pPr>
       <w:r>
         <w:rPr>
           <w:b/>
           <w:bCs/>
-        </w:rPr>
-        <w:t xml:space="preserve">Retrieval</w:t>
-      </w:r>
-      <w:r>
-        <w:t xml:space="preserve"> is measured with Recall@k and MRR@10, where a hit is a retrieved passage that is the source passage or contains the evidence span. </w:t>
-      </w:r>
-      <w:r>
-        <w:rPr>
-          <w:b/>
-          <w:bCs/>
-        </w:rPr>
-        <w:t xml:space="preserve">Answer quality</w:t>
-      </w:r>
-      <w:r>
-        <w:t xml:space="preserve"> is measured on a seeded random sample of 100 test questions, each asked twice (Figure 7): once with the real top-five retrieval (</w:t>
-      </w:r>
-      <w:r>
-        <w:rPr>
-          <w:i/>
-          <w:iCs/>
-        </w:rPr>
-        <w:t xml:space="preserve">answerable</w:t>
-      </w:r>
-      <w:r>
-        <w:t xml:space="preserve">), and once with every passage containing the evidence removed (</w:t>
-      </w:r>
-      <w:r>
-        <w:rPr>
-          <w:i/>
-          <w:iCs/>
-        </w:rPr>
-        <w:t xml:space="preserve">unanswerable</w:t>
-      </w:r>
-      <w:r>
-        <w:t xml:space="preserve">), where the only correct output is the refusal sentence.</w:t>
+          <w:sz w:val="20"/>
+          <w:szCs w:val="20"/>
+        </w:rPr>
+        <w:t xml:space="preserve">Table 2: </w:t>
+      </w:r>
+      <w:r>
+        <w:rPr>
+          <w:sz w:val="20"/>
+          <w:szCs w:val="20"/>
+        </w:rPr>
+        <w:t xml:space="preserve">Fine-tuning configuration</w:t>
+      </w:r>
+    </w:p>
+    <w:tbl>
+      <w:tblPr>
+        <w:tblW w:type="dxa" w:w="9026"/>
+        <w:jc w:val="center"/>
+        <w:tblBorders>
+          <w:top w:val="single" w:color="auto" w:sz="4"/>
+          <w:left w:val="single" w:color="auto" w:sz="4"/>
+          <w:bottom w:val="single" w:color="auto" w:sz="4"/>
+          <w:right w:val="single" w:color="auto" w:sz="4"/>
+          <w:insideH w:val="single" w:color="auto" w:sz="4"/>
+          <w:insideV w:val="single" w:color="auto" w:sz="4"/>
+        </w:tblBorders>
+      </w:tblPr>
+      <w:tblGrid>
+        <w:gridCol w:w="3000"/>
+        <w:gridCol w:w="6026"/>
+      </w:tblGrid>
+      <w:tr>
+        <w:trPr>
+          <w:tblHeader/>
+        </w:trPr>
+        <w:tc>
+          <w:tcPr>
+            <w:tcW w:type="dxa" w:w="3000"/>
+            <w:tcBorders>
+              <w:top w:val="single" w:color="BFBFBF" w:sz="4"/>
+              <w:left w:val="single" w:color="BFBFBF" w:sz="4"/>
+              <w:bottom w:val="single" w:color="BFBFBF" w:sz="4"/>
+              <w:right w:val="single" w:color="BFBFBF" w:sz="4"/>
+            </w:tcBorders>
+            <w:shd w:fill="1F6F8B" w:color="auto" w:val="clear"/>
+            <w:tcMar>
+              <w:top w:type="dxa" w:w="60"/>
+              <w:left w:type="dxa" w:w="100"/>
+              <w:bottom w:type="dxa" w:w="60"/>
+              <w:right w:type="dxa" w:w="100"/>
+            </w:tcMar>
+          </w:tcPr>
+          <w:p>
+            <w:pPr>
+              <w:spacing w:after="0" w:line="260"/>
+            </w:pPr>
+            <w:r>
+              <w:rPr>
+                <w:b/>
+                <w:bCs/>
+                <w:color w:val="FFFFFF"/>
+                <w:sz w:val="20"/>
+                <w:szCs w:val="20"/>
+              </w:rPr>
+              <w:t xml:space="preserve">Setting</w:t>
+            </w:r>
+          </w:p>
+        </w:tc>
+        <w:tc>
+          <w:tcPr>
+            <w:tcW w:type="dxa" w:w="6026"/>
+            <w:tcBorders>
+              <w:top w:val="single" w:color="BFBFBF" w:sz="4"/>
+              <w:left w:val="single" w:color="BFBFBF" w:sz="4"/>
+              <w:bottom w:val="single" w:color="BFBFBF" w:sz="4"/>
+              <w:right w:val="single" w:color="BFBFBF" w:sz="4"/>
+            </w:tcBorders>
+            <w:shd w:fill="1F6F8B" w:color="auto" w:val="clear"/>
+            <w:tcMar>
+              <w:top w:type="dxa" w:w="60"/>
+              <w:left w:type="dxa" w:w="100"/>
+              <w:bottom w:type="dxa" w:w="60"/>
+              <w:right w:type="dxa" w:w="100"/>
+            </w:tcMar>
+          </w:tcPr>
+          <w:p>
+            <w:pPr>
+              <w:spacing w:after="0" w:line="260"/>
+            </w:pPr>
+            <w:r>
+              <w:rPr>
+                <w:b/>
+                <w:bCs/>
+                <w:color w:val="FFFFFF"/>
+                <w:sz w:val="20"/>
+                <w:szCs w:val="20"/>
+              </w:rPr>
+              <w:t xml:space="preserve">Value</w:t>
+            </w:r>
+          </w:p>
+        </w:tc>
+      </w:tr>
+      <w:tr>
+        <w:trPr>
+          <w:cantSplit/>
+        </w:trPr>
+        <w:tc>
+          <w:tcPr>
+            <w:tcW w:type="dxa" w:w="3000"/>
+            <w:tcBorders>
+              <w:top w:val="single" w:color="BFBFBF" w:sz="4"/>
+              <w:left w:val="single" w:color="BFBFBF" w:sz="4"/>
+              <w:bottom w:val="single" w:color="BFBFBF" w:sz="4"/>
+              <w:right w:val="single" w:color="BFBFBF" w:sz="4"/>
+            </w:tcBorders>
+            <w:tcMar>
+              <w:top w:type="dxa" w:w="60"/>
+              <w:left w:type="dxa" w:w="100"/>
+              <w:bottom w:type="dxa" w:w="60"/>
+              <w:right w:type="dxa" w:w="100"/>
+            </w:tcMar>
+          </w:tcPr>
+          <w:p>
+            <w:pPr>
+              <w:spacing w:after="0" w:line="260"/>
+            </w:pPr>
+            <w:r>
+              <w:rPr>
+                <w:color w:val="262626"/>
+                <w:sz w:val="20"/>
+                <w:szCs w:val="20"/>
+              </w:rPr>
+              <w:t xml:space="preserve">Base model</w:t>
+            </w:r>
+          </w:p>
+        </w:tc>
+        <w:tc>
+          <w:tcPr>
+            <w:tcW w:type="dxa" w:w="6026"/>
+            <w:tcBorders>
+              <w:top w:val="single" w:color="BFBFBF" w:sz="4"/>
+              <w:left w:val="single" w:color="BFBFBF" w:sz="4"/>
+              <w:bottom w:val="single" w:color="BFBFBF" w:sz="4"/>
+              <w:right w:val="single" w:color="BFBFBF" w:sz="4"/>
+            </w:tcBorders>
+            <w:tcMar>
+              <w:top w:type="dxa" w:w="60"/>
+              <w:left w:type="dxa" w:w="100"/>
+              <w:bottom w:type="dxa" w:w="60"/>
+              <w:right w:type="dxa" w:w="100"/>
+            </w:tcMar>
+          </w:tcPr>
+          <w:p>
+            <w:pPr>
+              <w:spacing w:after="0" w:line="260"/>
+            </w:pPr>
+            <w:r>
+              <w:rPr>
+                <w:color w:val="262626"/>
+                <w:sz w:val="20"/>
+                <w:szCs w:val="20"/>
+              </w:rPr>
+              <w:t xml:space="preserve">Qwen/Qwen3-0.6B (bf16, thinking off)</w:t>
+            </w:r>
+          </w:p>
+        </w:tc>
+      </w:tr>
+      <w:tr>
+        <w:trPr>
+          <w:cantSplit/>
+        </w:trPr>
+        <w:tc>
+          <w:tcPr>
+            <w:tcW w:type="dxa" w:w="3000"/>
+            <w:tcBorders>
+              <w:top w:val="single" w:color="BFBFBF" w:sz="4"/>
+              <w:left w:val="single" w:color="BFBFBF" w:sz="4"/>
+              <w:bottom w:val="single" w:color="BFBFBF" w:sz="4"/>
+              <w:right w:val="single" w:color="BFBFBF" w:sz="4"/>
+            </w:tcBorders>
+            <w:shd w:fill="F2F2F2" w:color="auto" w:val="clear"/>
+            <w:tcMar>
+              <w:top w:type="dxa" w:w="60"/>
+              <w:left w:type="dxa" w:w="100"/>
+              <w:bottom w:type="dxa" w:w="60"/>
+              <w:right w:type="dxa" w:w="100"/>
+            </w:tcMar>
+          </w:tcPr>
+          <w:p>
+            <w:pPr>
+              <w:spacing w:after="0" w:line="260"/>
+            </w:pPr>
+            <w:r>
+              <w:rPr>
+                <w:color w:val="262626"/>
+                <w:sz w:val="20"/>
+                <w:szCs w:val="20"/>
+              </w:rPr>
+              <w:t xml:space="preserve">Method</w:t>
+            </w:r>
+          </w:p>
+        </w:tc>
+        <w:tc>
+          <w:tcPr>
+            <w:tcW w:type="dxa" w:w="6026"/>
+            <w:tcBorders>
+              <w:top w:val="single" w:color="BFBFBF" w:sz="4"/>
+              <w:left w:val="single" w:color="BFBFBF" w:sz="4"/>
+              <w:bottom w:val="single" w:color="BFBFBF" w:sz="4"/>
+              <w:right w:val="single" w:color="BFBFBF" w:sz="4"/>
+            </w:tcBorders>
+            <w:shd w:fill="F2F2F2" w:color="auto" w:val="clear"/>
+            <w:tcMar>
+              <w:top w:type="dxa" w:w="60"/>
+              <w:left w:type="dxa" w:w="100"/>
+              <w:bottom w:type="dxa" w:w="60"/>
+              <w:right w:type="dxa" w:w="100"/>
+            </w:tcMar>
+          </w:tcPr>
+          <w:p>
+            <w:pPr>
+              <w:spacing w:after="0" w:line="260"/>
+            </w:pPr>
+            <w:r>
+              <w:rPr>
+                <w:color w:val="262626"/>
+                <w:sz w:val="20"/>
+                <w:szCs w:val="20"/>
+              </w:rPr>
+              <w:t xml:space="preserve">LoRA, rank 16, alpha 32, dropout 0.05</w:t>
+            </w:r>
+          </w:p>
+        </w:tc>
+      </w:tr>
+      <w:tr>
+        <w:trPr>
+          <w:cantSplit/>
+        </w:trPr>
+        <w:tc>
+          <w:tcPr>
+            <w:tcW w:type="dxa" w:w="3000"/>
+            <w:tcBorders>
+              <w:top w:val="single" w:color="BFBFBF" w:sz="4"/>
+              <w:left w:val="single" w:color="BFBFBF" w:sz="4"/>
+              <w:bottom w:val="single" w:color="BFBFBF" w:sz="4"/>
+              <w:right w:val="single" w:color="BFBFBF" w:sz="4"/>
+            </w:tcBorders>
+            <w:tcMar>
+              <w:top w:type="dxa" w:w="60"/>
+              <w:left w:type="dxa" w:w="100"/>
+              <w:bottom w:type="dxa" w:w="60"/>
+              <w:right w:type="dxa" w:w="100"/>
+            </w:tcMar>
+          </w:tcPr>
+          <w:p>
+            <w:pPr>
+              <w:spacing w:after="0" w:line="260"/>
+            </w:pPr>
+            <w:r>
+              <w:rPr>
+                <w:color w:val="262626"/>
+                <w:sz w:val="20"/>
+                <w:szCs w:val="20"/>
+              </w:rPr>
+              <w:t xml:space="preserve">Target modules</w:t>
+            </w:r>
+          </w:p>
+        </w:tc>
+        <w:tc>
+          <w:tcPr>
+            <w:tcW w:type="dxa" w:w="6026"/>
+            <w:tcBorders>
+              <w:top w:val="single" w:color="BFBFBF" w:sz="4"/>
+              <w:left w:val="single" w:color="BFBFBF" w:sz="4"/>
+              <w:bottom w:val="single" w:color="BFBFBF" w:sz="4"/>
+              <w:right w:val="single" w:color="BFBFBF" w:sz="4"/>
+            </w:tcBorders>
+            <w:tcMar>
+              <w:top w:type="dxa" w:w="60"/>
+              <w:left w:type="dxa" w:w="100"/>
+              <w:bottom w:type="dxa" w:w="60"/>
+              <w:right w:type="dxa" w:w="100"/>
+            </w:tcMar>
+          </w:tcPr>
+          <w:p>
+            <w:pPr>
+              <w:spacing w:after="0" w:line="260"/>
+            </w:pPr>
+            <w:r>
+              <w:rPr>
+                <w:color w:val="262626"/>
+                <w:sz w:val="20"/>
+                <w:szCs w:val="20"/>
+              </w:rPr>
+              <w:t xml:space="preserve">q, k, v, o, gate, up and down projections</w:t>
+            </w:r>
+          </w:p>
+        </w:tc>
+      </w:tr>
+      <w:tr>
+        <w:trPr>
+          <w:cantSplit/>
+        </w:trPr>
+        <w:tc>
+          <w:tcPr>
+            <w:tcW w:type="dxa" w:w="3000"/>
+            <w:tcBorders>
+              <w:top w:val="single" w:color="BFBFBF" w:sz="4"/>
+              <w:left w:val="single" w:color="BFBFBF" w:sz="4"/>
+              <w:bottom w:val="single" w:color="BFBFBF" w:sz="4"/>
+              <w:right w:val="single" w:color="BFBFBF" w:sz="4"/>
+            </w:tcBorders>
+            <w:shd w:fill="F2F2F2" w:color="auto" w:val="clear"/>
+            <w:tcMar>
+              <w:top w:type="dxa" w:w="60"/>
+              <w:left w:type="dxa" w:w="100"/>
+              <w:bottom w:type="dxa" w:w="60"/>
+              <w:right w:type="dxa" w:w="100"/>
+            </w:tcMar>
+          </w:tcPr>
+          <w:p>
+            <w:pPr>
+              <w:spacing w:after="0" w:line="260"/>
+            </w:pPr>
+            <w:r>
+              <w:rPr>
+                <w:color w:val="262626"/>
+                <w:sz w:val="20"/>
+                <w:szCs w:val="20"/>
+              </w:rPr>
+              <w:t xml:space="preserve">Trainable parameters</w:t>
+            </w:r>
+          </w:p>
+        </w:tc>
+        <w:tc>
+          <w:tcPr>
+            <w:tcW w:type="dxa" w:w="6026"/>
+            <w:tcBorders>
+              <w:top w:val="single" w:color="BFBFBF" w:sz="4"/>
+              <w:left w:val="single" w:color="BFBFBF" w:sz="4"/>
+              <w:bottom w:val="single" w:color="BFBFBF" w:sz="4"/>
+              <w:right w:val="single" w:color="BFBFBF" w:sz="4"/>
+            </w:tcBorders>
+            <w:shd w:fill="F2F2F2" w:color="auto" w:val="clear"/>
+            <w:tcMar>
+              <w:top w:type="dxa" w:w="60"/>
+              <w:left w:type="dxa" w:w="100"/>
+              <w:bottom w:type="dxa" w:w="60"/>
+              <w:right w:type="dxa" w:w="100"/>
+            </w:tcMar>
+          </w:tcPr>
+          <w:p>
+            <w:pPr>
+              <w:spacing w:after="0" w:line="260"/>
+            </w:pPr>
+            <w:r>
+              <w:rPr>
+                <w:color w:val="262626"/>
+                <w:sz w:val="20"/>
+                <w:szCs w:val="20"/>
+              </w:rPr>
+              <w:t xml:space="preserve">10,092,544 of 606,142,464 (1.67%)</w:t>
+            </w:r>
+          </w:p>
+        </w:tc>
+      </w:tr>
+      <w:tr>
+        <w:trPr>
+          <w:cantSplit/>
+        </w:trPr>
+        <w:tc>
+          <w:tcPr>
+            <w:tcW w:type="dxa" w:w="3000"/>
+            <w:tcBorders>
+              <w:top w:val="single" w:color="BFBFBF" w:sz="4"/>
+              <w:left w:val="single" w:color="BFBFBF" w:sz="4"/>
+              <w:bottom w:val="single" w:color="BFBFBF" w:sz="4"/>
+              <w:right w:val="single" w:color="BFBFBF" w:sz="4"/>
+            </w:tcBorders>
+            <w:tcMar>
+              <w:top w:type="dxa" w:w="60"/>
+              <w:left w:type="dxa" w:w="100"/>
+              <w:bottom w:type="dxa" w:w="60"/>
+              <w:right w:type="dxa" w:w="100"/>
+            </w:tcMar>
+          </w:tcPr>
+          <w:p>
+            <w:pPr>
+              <w:spacing w:after="0" w:line="260"/>
+            </w:pPr>
+            <w:r>
+              <w:rPr>
+                <w:color w:val="262626"/>
+                <w:sz w:val="20"/>
+                <w:szCs w:val="20"/>
+              </w:rPr>
+              <w:t xml:space="preserve">Training data</w:t>
+            </w:r>
+          </w:p>
+        </w:tc>
+        <w:tc>
+          <w:tcPr>
+            <w:tcW w:type="dxa" w:w="6026"/>
+            <w:tcBorders>
+              <w:top w:val="single" w:color="BFBFBF" w:sz="4"/>
+              <w:left w:val="single" w:color="BFBFBF" w:sz="4"/>
+              <w:bottom w:val="single" w:color="BFBFBF" w:sz="4"/>
+              <w:right w:val="single" w:color="BFBFBF" w:sz="4"/>
+            </w:tcBorders>
+            <w:tcMar>
+              <w:top w:type="dxa" w:w="60"/>
+              <w:left w:type="dxa" w:w="100"/>
+              <w:bottom w:type="dxa" w:w="60"/>
+              <w:right w:type="dxa" w:w="100"/>
+            </w:tcMar>
+          </w:tcPr>
+          <w:p>
+            <w:pPr>
+              <w:spacing w:after="0" w:line="260"/>
+            </w:pPr>
+            <w:r>
+              <w:rPr>
+                <w:color w:val="262626"/>
+                <w:sz w:val="20"/>
+                <w:szCs w:val="20"/>
+              </w:rPr>
+              <w:t xml:space="preserve">1,523 train and 75 validation examples</w:t>
+            </w:r>
+          </w:p>
+        </w:tc>
+      </w:tr>
+      <w:tr>
+        <w:trPr>
+          <w:cantSplit/>
+        </w:trPr>
+        <w:tc>
+          <w:tcPr>
+            <w:tcW w:type="dxa" w:w="3000"/>
+            <w:tcBorders>
+              <w:top w:val="single" w:color="BFBFBF" w:sz="4"/>
+              <w:left w:val="single" w:color="BFBFBF" w:sz="4"/>
+              <w:bottom w:val="single" w:color="BFBFBF" w:sz="4"/>
+              <w:right w:val="single" w:color="BFBFBF" w:sz="4"/>
+            </w:tcBorders>
+            <w:shd w:fill="F2F2F2" w:color="auto" w:val="clear"/>
+            <w:tcMar>
+              <w:top w:type="dxa" w:w="60"/>
+              <w:left w:type="dxa" w:w="100"/>
+              <w:bottom w:type="dxa" w:w="60"/>
+              <w:right w:type="dxa" w:w="100"/>
+            </w:tcMar>
+          </w:tcPr>
+          <w:p>
+            <w:pPr>
+              <w:spacing w:after="0" w:line="260"/>
+            </w:pPr>
+            <w:r>
+              <w:rPr>
+                <w:color w:val="262626"/>
+                <w:sz w:val="20"/>
+                <w:szCs w:val="20"/>
+              </w:rPr>
+              <w:t xml:space="preserve">Batch</w:t>
+            </w:r>
+          </w:p>
+        </w:tc>
+        <w:tc>
+          <w:tcPr>
+            <w:tcW w:type="dxa" w:w="6026"/>
+            <w:tcBorders>
+              <w:top w:val="single" w:color="BFBFBF" w:sz="4"/>
+              <w:left w:val="single" w:color="BFBFBF" w:sz="4"/>
+              <w:bottom w:val="single" w:color="BFBFBF" w:sz="4"/>
+              <w:right w:val="single" w:color="BFBFBF" w:sz="4"/>
+            </w:tcBorders>
+            <w:shd w:fill="F2F2F2" w:color="auto" w:val="clear"/>
+            <w:tcMar>
+              <w:top w:type="dxa" w:w="60"/>
+              <w:left w:type="dxa" w:w="100"/>
+              <w:bottom w:type="dxa" w:w="60"/>
+              <w:right w:type="dxa" w:w="100"/>
+            </w:tcMar>
+          </w:tcPr>
+          <w:p>
+            <w:pPr>
+              <w:spacing w:after="0" w:line="260"/>
+            </w:pPr>
+            <w:r>
+              <w:rPr>
+                <w:color w:val="262626"/>
+                <w:sz w:val="20"/>
+                <w:szCs w:val="20"/>
+              </w:rPr>
+              <w:t xml:space="preserve">1 per step × 16 gradient accumulation</w:t>
+            </w:r>
+          </w:p>
+        </w:tc>
+      </w:tr>
+      <w:tr>
+        <w:trPr>
+          <w:cantSplit/>
+        </w:trPr>
+        <w:tc>
+          <w:tcPr>
+            <w:tcW w:type="dxa" w:w="3000"/>
+            <w:tcBorders>
+              <w:top w:val="single" w:color="BFBFBF" w:sz="4"/>
+              <w:left w:val="single" w:color="BFBFBF" w:sz="4"/>
+              <w:bottom w:val="single" w:color="BFBFBF" w:sz="4"/>
+              <w:right w:val="single" w:color="BFBFBF" w:sz="4"/>
+            </w:tcBorders>
+            <w:tcMar>
+              <w:top w:type="dxa" w:w="60"/>
+              <w:left w:type="dxa" w:w="100"/>
+              <w:bottom w:type="dxa" w:w="60"/>
+              <w:right w:type="dxa" w:w="100"/>
+            </w:tcMar>
+          </w:tcPr>
+          <w:p>
+            <w:pPr>
+              <w:spacing w:after="0" w:line="260"/>
+            </w:pPr>
+            <w:r>
+              <w:rPr>
+                <w:color w:val="262626"/>
+                <w:sz w:val="20"/>
+                <w:szCs w:val="20"/>
+              </w:rPr>
+              <w:t xml:space="preserve">Optimisation</w:t>
+            </w:r>
+          </w:p>
+        </w:tc>
+        <w:tc>
+          <w:tcPr>
+            <w:tcW w:type="dxa" w:w="6026"/>
+            <w:tcBorders>
+              <w:top w:val="single" w:color="BFBFBF" w:sz="4"/>
+              <w:left w:val="single" w:color="BFBFBF" w:sz="4"/>
+              <w:bottom w:val="single" w:color="BFBFBF" w:sz="4"/>
+              <w:right w:val="single" w:color="BFBFBF" w:sz="4"/>
+            </w:tcBorders>
+            <w:tcMar>
+              <w:top w:type="dxa" w:w="60"/>
+              <w:left w:type="dxa" w:w="100"/>
+              <w:bottom w:type="dxa" w:w="60"/>
+              <w:right w:type="dxa" w:w="100"/>
+            </w:tcMar>
+          </w:tcPr>
+          <w:p>
+            <w:pPr>
+              <w:spacing w:after="0" w:line="260"/>
+            </w:pPr>
+            <w:r>
+              <w:rPr>
+                <w:color w:val="262626"/>
+                <w:sz w:val="20"/>
+                <w:szCs w:val="20"/>
+              </w:rPr>
+              <w:t xml:space="preserve">learning rate 2e-4, cosine schedule, 3% warm-up, 2 epochs</w:t>
+            </w:r>
+          </w:p>
+        </w:tc>
+      </w:tr>
+      <w:tr>
+        <w:trPr>
+          <w:cantSplit/>
+        </w:trPr>
+        <w:tc>
+          <w:tcPr>
+            <w:tcW w:type="dxa" w:w="3000"/>
+            <w:tcBorders>
+              <w:top w:val="single" w:color="BFBFBF" w:sz="4"/>
+              <w:left w:val="single" w:color="BFBFBF" w:sz="4"/>
+              <w:bottom w:val="single" w:color="BFBFBF" w:sz="4"/>
+              <w:right w:val="single" w:color="BFBFBF" w:sz="4"/>
+            </w:tcBorders>
+            <w:shd w:fill="F2F2F2" w:color="auto" w:val="clear"/>
+            <w:tcMar>
+              <w:top w:type="dxa" w:w="60"/>
+              <w:left w:type="dxa" w:w="100"/>
+              <w:bottom w:type="dxa" w:w="60"/>
+              <w:right w:type="dxa" w:w="100"/>
+            </w:tcMar>
+          </w:tcPr>
+          <w:p>
+            <w:pPr>
+              <w:spacing w:after="0" w:line="260"/>
+            </w:pPr>
+            <w:r>
+              <w:rPr>
+                <w:color w:val="262626"/>
+                <w:sz w:val="20"/>
+                <w:szCs w:val="20"/>
+              </w:rPr>
+              <w:t xml:space="preserve">Maximum length</w:t>
+            </w:r>
+          </w:p>
+        </w:tc>
+        <w:tc>
+          <w:tcPr>
+            <w:tcW w:type="dxa" w:w="6026"/>
+            <w:tcBorders>
+              <w:top w:val="single" w:color="BFBFBF" w:sz="4"/>
+              <w:left w:val="single" w:color="BFBFBF" w:sz="4"/>
+              <w:bottom w:val="single" w:color="BFBFBF" w:sz="4"/>
+              <w:right w:val="single" w:color="BFBFBF" w:sz="4"/>
+            </w:tcBorders>
+            <w:shd w:fill="F2F2F2" w:color="auto" w:val="clear"/>
+            <w:tcMar>
+              <w:top w:type="dxa" w:w="60"/>
+              <w:left w:type="dxa" w:w="100"/>
+              <w:bottom w:type="dxa" w:w="60"/>
+              <w:right w:type="dxa" w:w="100"/>
+            </w:tcMar>
+          </w:tcPr>
+          <w:p>
+            <w:pPr>
+              <w:spacing w:after="0" w:line="260"/>
+            </w:pPr>
+            <w:r>
+              <w:rPr>
+                <w:color w:val="262626"/>
+                <w:sz w:val="20"/>
+                <w:szCs w:val="20"/>
+              </w:rPr>
+              <w:t xml:space="preserve">2,560 tokens; gradient checkpointing</w:t>
+            </w:r>
+          </w:p>
+        </w:tc>
+      </w:tr>
+      <w:tr>
+        <w:trPr>
+          <w:cantSplit/>
+        </w:trPr>
+        <w:tc>
+          <w:tcPr>
+            <w:tcW w:type="dxa" w:w="3000"/>
+            <w:tcBorders>
+              <w:top w:val="single" w:color="BFBFBF" w:sz="4"/>
+              <w:left w:val="single" w:color="BFBFBF" w:sz="4"/>
+              <w:bottom w:val="single" w:color="BFBFBF" w:sz="4"/>
+              <w:right w:val="single" w:color="BFBFBF" w:sz="4"/>
+            </w:tcBorders>
+            <w:tcMar>
+              <w:top w:type="dxa" w:w="60"/>
+              <w:left w:type="dxa" w:w="100"/>
+              <w:bottom w:type="dxa" w:w="60"/>
+              <w:right w:type="dxa" w:w="100"/>
+            </w:tcMar>
+          </w:tcPr>
+          <w:p>
+            <w:pPr>
+              <w:spacing w:after="0" w:line="260"/>
+            </w:pPr>
+            <w:r>
+              <w:rPr>
+                <w:color w:val="262626"/>
+                <w:sz w:val="20"/>
+                <w:szCs w:val="20"/>
+              </w:rPr>
+              <w:t xml:space="preserve">Hardware and time</w:t>
+            </w:r>
+          </w:p>
+        </w:tc>
+        <w:tc>
+          <w:tcPr>
+            <w:tcW w:type="dxa" w:w="6026"/>
+            <w:tcBorders>
+              <w:top w:val="single" w:color="BFBFBF" w:sz="4"/>
+              <w:left w:val="single" w:color="BFBFBF" w:sz="4"/>
+              <w:bottom w:val="single" w:color="BFBFBF" w:sz="4"/>
+              <w:right w:val="single" w:color="BFBFBF" w:sz="4"/>
+            </w:tcBorders>
+            <w:tcMar>
+              <w:top w:type="dxa" w:w="60"/>
+              <w:left w:type="dxa" w:w="100"/>
+              <w:bottom w:type="dxa" w:w="60"/>
+              <w:right w:type="dxa" w:w="100"/>
+            </w:tcMar>
+          </w:tcPr>
+          <w:p>
+            <w:pPr>
+              <w:spacing w:after="0" w:line="260"/>
+            </w:pPr>
+            <w:r>
+              <w:rPr>
+                <w:color w:val="262626"/>
+                <w:sz w:val="20"/>
+                <w:szCs w:val="20"/>
+              </w:rPr>
+              <w:t xml:space="preserve">RTX 3050 Laptop GPU (4 GB), 63 minutes, about 2 GB VRAM</w:t>
+            </w:r>
+          </w:p>
+        </w:tc>
+      </w:tr>
+    </w:tbl>
+    <w:p>
+      <w:pPr>
+        <w:spacing w:after="120"/>
+      </w:pPr>
+    </w:p>
+    <w:p>
+      <w:pPr>
+        <w:spacing w:after="140" w:line="300"/>
+        <w:jc w:val="both"/>
+      </w:pPr>
+      <w:r>
+        <w:t xml:space="preserve">Batch size 1 is forced by Qwen’s 151k-token vocabulary: the output logits for one 2,500-token sequence alone occupy about 1.5 GB in 32-bit precision.</w:t>
+      </w:r>
+    </w:p>
+    <w:p>
+      <w:pPr>
+        <w:pStyle w:val="Heading2"/>
+      </w:pPr>
+      <w:bookmarkStart w:name="_Toc23" w:id="23"/>
+      <w:r>
+        <w:t xml:space="preserve">3.8 Terminal Application</w:t>
+      </w:r>
+      <w:bookmarkEnd w:id="23"/>
+    </w:p>
+    <w:p>
+      <w:pPr>
+        <w:spacing w:after="140" w:line="300"/>
+        <w:jc w:val="both"/>
+      </w:pPr>
+      <w:r>
+        <w:t xml:space="preserve">The user runs </w:t>
+      </w:r>
+      <w:r>
+        <w:rPr>
+          <w:rFonts w:ascii="Courier New" w:cs="Courier New" w:eastAsia="Courier New" w:hAnsi="Courier New"/>
+          <w:sz w:val="22"/>
+          <w:szCs w:val="22"/>
+        </w:rPr>
+        <w:t xml:space="preserve">python -m chipdoc datasheet.pdf</w:t>
+      </w:r>
+      <w:r>
+        <w:t xml:space="preserve">. On first use the PDF is validated, extracted, chunked and indexed (one to three minutes for a few hundred pages, dominated by layout-aware text extraction); afterwards the cached index loads instantly. Each question triggers hybrid retrieval and a streamed answer (Figure 6). The </w:t>
+      </w:r>
+      <w:r>
+        <w:rPr>
+          <w:rFonts w:ascii="Courier New" w:cs="Courier New" w:eastAsia="Courier New" w:hAnsi="Courier New"/>
+          <w:sz w:val="22"/>
+          <w:szCs w:val="22"/>
+        </w:rPr>
+        <w:t xml:space="preserve">/sources</w:t>
+      </w:r>
+      <w:r>
+        <w:t xml:space="preserve"> command shows the passages behind the last answer, </w:t>
+      </w:r>
+      <w:r>
+        <w:rPr>
+          <w:rFonts w:ascii="Courier New" w:cs="Courier New" w:eastAsia="Courier New" w:hAnsi="Courier New"/>
+          <w:sz w:val="22"/>
+          <w:szCs w:val="22"/>
+        </w:rPr>
+        <w:t xml:space="preserve">-q</w:t>
+      </w:r>
+      <w:r>
+        <w:t xml:space="preserve"> answers a single question non-interactively, and </w:t>
+      </w:r>
+      <w:r>
+        <w:rPr>
+          <w:rFonts w:ascii="Courier New" w:cs="Courier New" w:eastAsia="Courier New" w:hAnsi="Courier New"/>
+          <w:sz w:val="22"/>
+          <w:szCs w:val="22"/>
+        </w:rPr>
+        <w:t xml:space="preserve">--base</w:t>
+      </w:r>
+      <w:r>
+        <w:t xml:space="preserve"> runs the untuned model for comparison. Everything runs locally; no datasheet text or question leaves the machine.</w:t>
       </w:r>
     </w:p>
     <w:p>
@@ -4129,9 +4027,9 @@
       <w:r>
         <w:drawing>
           <wp:inline distT="0" distB="0" distL="0" distR="0">
-            <wp:extent cx="4000500" cy="3143250"/>
+            <wp:extent cx="5715000" cy="3762375"/>
             <wp:effectExtent t="0" r="0" b="0" l="0"/>
-            <wp:docPr id="7" name="Figure 7" descr="Answerable and unanswerable conditions used to evaluate answer quality." title="Figure 7"/>
+            <wp:docPr id="6" name="Figure 6" descr="Query flow in the terminal application, including the per-PDF cache." title="Figure 6"/>
             <wp:cNvGraphicFramePr>
               <a:graphicFrameLocks xmlns:a="http://schemas.openxmlformats.org/drawingml/2006/main" noChangeAspect="1"/>
             </wp:cNvGraphicFramePr>
@@ -4154,6 +4052,134 @@
                   <pic:spPr bwMode="auto">
                     <a:xfrm>
                       <a:off x="0" y="0"/>
+                      <a:ext cx="5715000" cy="3762375"/>
+                    </a:xfrm>
+                    <a:prstGeom prst="rect">
+                      <a:avLst/>
+                    </a:prstGeom>
+                  </pic:spPr>
+                </pic:pic>
+              </a:graphicData>
+            </a:graphic>
+          </wp:inline>
+        </w:drawing>
+      </w:r>
+    </w:p>
+    <w:p>
+      <w:pPr>
+        <w:spacing w:after="240"/>
+        <w:jc w:val="center"/>
+      </w:pPr>
+      <w:r>
+        <w:rPr>
+          <w:b/>
+          <w:bCs/>
+          <w:sz w:val="20"/>
+          <w:szCs w:val="20"/>
+        </w:rPr>
+        <w:t xml:space="preserve">Figure 6: </w:t>
+      </w:r>
+      <w:r>
+        <w:rPr>
+          <w:sz w:val="20"/>
+          <w:szCs w:val="20"/>
+        </w:rPr>
+        <w:t xml:space="preserve">Query flow in the terminal application, including the per-PDF cache.</w:t>
+      </w:r>
+    </w:p>
+    <w:p>
+      <w:pPr>
+        <w:pStyle w:val="Heading2"/>
+      </w:pPr>
+      <w:bookmarkStart w:name="_Toc24" w:id="24"/>
+      <w:r>
+        <w:t xml:space="preserve">3.9 Evaluation Protocol</w:t>
+      </w:r>
+      <w:bookmarkEnd w:id="24"/>
+    </w:p>
+    <w:p>
+      <w:pPr>
+        <w:spacing w:after="140" w:line="300"/>
+        <w:jc w:val="both"/>
+      </w:pPr>
+      <w:r>
+        <w:t xml:space="preserve">All evaluation uses the five held-out datasheets (341 test QA pairs). </w:t>
+      </w:r>
+      <w:r>
+        <w:rPr>
+          <w:b/>
+          <w:bCs/>
+        </w:rPr>
+        <w:t xml:space="preserve">Retrieval</w:t>
+      </w:r>
+      <w:r>
+        <w:t xml:space="preserve"> is measured with Recall@k and MRR@10, where a hit is a retrieved passage that is the source passage or contains the evidence span. </w:t>
+      </w:r>
+      <w:r>
+        <w:rPr>
+          <w:b/>
+          <w:bCs/>
+        </w:rPr>
+        <w:t xml:space="preserve">Answer quality</w:t>
+      </w:r>
+      <w:r>
+        <w:t xml:space="preserve"> is measured on a seeded random sample of 100 test questions, each asked twice (Figure 7): once with the real top-five retrieval (</w:t>
+      </w:r>
+      <w:r>
+        <w:rPr>
+          <w:i/>
+          <w:iCs/>
+        </w:rPr>
+        <w:t xml:space="preserve">answerable</w:t>
+      </w:r>
+      <w:r>
+        <w:t xml:space="preserve">), and once with every passage containing the evidence removed (</w:t>
+      </w:r>
+      <w:r>
+        <w:rPr>
+          <w:i/>
+          <w:iCs/>
+        </w:rPr>
+        <w:t xml:space="preserve">unanswerable</w:t>
+      </w:r>
+      <w:r>
+        <w:t xml:space="preserve">), where the only correct output is the refusal sentence.</w:t>
+      </w:r>
+    </w:p>
+    <w:p>
+      <w:pPr>
+        <w:keepNext/>
+        <w:spacing w:after="60" w:before="120"/>
+        <w:jc w:val="center"/>
+      </w:pPr>
+      <w:r>
+        <w:drawing>
+          <wp:inline distT="0" distB="0" distL="0" distR="0">
+            <wp:extent cx="4000500" cy="3143250"/>
+            <wp:effectExtent t="0" r="0" b="0" l="0"/>
+            <wp:docPr id="7" name="Figure 7" descr="Answerable and unanswerable conditions used to evaluate answer quality." title="Figure 7"/>
+            <wp:cNvGraphicFramePr>
+              <a:graphicFrameLocks xmlns:a="http://schemas.openxmlformats.org/drawingml/2006/main" noChangeAspect="1"/>
+            </wp:cNvGraphicFramePr>
+            <a:graphic xmlns:a="http://schemas.openxmlformats.org/drawingml/2006/main">
+              <a:graphicData uri="http://schemas.openxmlformats.org/drawingml/2006/picture">
+                <pic:pic xmlns:pic="http://schemas.openxmlformats.org/drawingml/2006/picture">
+                  <pic:nvPicPr>
+                    <pic:cNvPr id="0" name="" descr=""/>
+                    <pic:cNvPicPr>
+                      <a:picLocks noChangeAspect="1" noChangeArrowheads="1"/>
+                    </pic:cNvPicPr>
+                  </pic:nvPicPr>
+                  <pic:blipFill>
+                    <a:blip r:embed="rId16" cstate="none"/>
+                    <a:srcRect/>
+                    <a:stretch>
+                      <a:fillRect/>
+                    </a:stretch>
+                  </pic:blipFill>
+                  <pic:spPr bwMode="auto">
+                    <a:xfrm>
+                      <a:off x="0" y="0"/>
                       <a:ext cx="4000500" cy="3143250"/>
                     </a:xfrm>
                     <a:prstGeom prst="rect">
@@ -5108,7 +5134,7 @@
                     </pic:cNvPicPr>
                   </pic:nvPicPr>
                   <pic:blipFill>
-                    <a:blip r:embed="rId16" cstate="none"/>
+                    <a:blip r:embed="rId17" cstate="none"/>
                     <a:srcRect/>
                     <a:stretch>
                       <a:fillRect/>
@@ -5997,726 +6023,6 @@
             <wp:extent cx="5334000" cy="2705100"/>
             <wp:effectExtent t="0" r="0" b="0" l="0"/>
             <wp:docPr id="9" name="Figure 9" descr="Retrieval quality of dense, BM25 and hybrid search on unseen datasheets." title="Figure 9"/>
-            <wp:cNvGraphicFramePr>
-              <a:graphicFrameLocks xmlns:a="http://schemas.openxmlformats.org/drawingml/2006/main" noChangeAspect="1"/>
-            </wp:cNvGraphicFramePr>
-            <a:graphic xmlns:a="http://schemas.openxmlformats.org/drawingml/2006/main">
-              <a:graphicData uri="http://schemas.openxmlformats.org/drawingml/2006/picture">
-                <pic:pic xmlns:pic="http://schemas.openxmlformats.org/drawingml/2006/picture">
-                  <pic:nvPicPr>
-                    <pic:cNvPr id="0" name="" descr=""/>
-                    <pic:cNvPicPr>
-                      <a:picLocks noChangeAspect="1" noChangeArrowheads="1"/>
-                    </pic:cNvPicPr>
-                  </pic:nvPicPr>
-                  <pic:blipFill>
-                    <a:blip r:embed="rId17" cstate="none"/>
-                    <a:srcRect/>
-                    <a:stretch>
-                      <a:fillRect/>
-                    </a:stretch>
-                  </pic:blipFill>
-                  <pic:spPr bwMode="auto">
-                    <a:xfrm>
-                      <a:off x="0" y="0"/>
-                      <a:ext cx="5334000" cy="2705100"/>
-                    </a:xfrm>
-                    <a:prstGeom prst="rect">
-                      <a:avLst/>
-                    </a:prstGeom>
-                  </pic:spPr>
-                </pic:pic>
-              </a:graphicData>
-            </a:graphic>
-          </wp:inline>
-        </w:drawing>
-      </w:r>
-    </w:p>
-    <w:p>
-      <w:pPr>
-        <w:spacing w:after="240"/>
-        <w:jc w:val="center"/>
-      </w:pPr>
-      <w:r>
-        <w:rPr>
-          <w:b/>
-          <w:bCs/>
-          <w:sz w:val="20"/>
-          <w:szCs w:val="20"/>
-        </w:rPr>
-        <w:t xml:space="preserve">Figure 9: </w:t>
-      </w:r>
-      <w:r>
-        <w:rPr>
-          <w:sz w:val="20"/>
-          <w:szCs w:val="20"/>
-        </w:rPr>
-        <w:t xml:space="preserve">Retrieval quality of dense, BM25 and hybrid search on unseen datasheets.</w:t>
-      </w:r>
-    </w:p>
-    <w:p>
-      <w:pPr>
-        <w:pStyle w:val="Heading2"/>
-      </w:pPr>
-      <w:bookmarkStart w:name="_Toc29" w:id="29"/>
-      <w:r>
-        <w:t xml:space="preserve">4.4 Answer Quality</w:t>
-      </w:r>
-      <w:bookmarkEnd w:id="29"/>
-    </w:p>
-    <w:p>
-      <w:pPr>
-        <w:spacing w:after="140" w:line="300"/>
-        <w:jc w:val="both"/>
-      </w:pPr>
-      <w:r>
-        <w:t xml:space="preserve">Table 5 and Figure 10 compare the base Qwen3-0.6B with the fine-tuned ChipDoc model on the same 100 questions and the same retrieved passages. The fine-tune changed behaviour most where it was designed to. Page citations went from 0.22 to 0.91 correct; the base model usually cited passage numbers such as [1] or no page at all. On unanswerable inputs, the base model invented an answer 70% of the time; the fine-tuned model did so 26% of the time, converting 47 hallucinations into correct refusals.</w:t>
-      </w:r>
-    </w:p>
-    <w:p>
-      <w:pPr>
-        <w:keepNext/>
-        <w:spacing w:after="80" w:before="160"/>
-        <w:jc w:val="center"/>
-      </w:pPr>
-      <w:r>
-        <w:rPr>
-          <w:b/>
-          <w:bCs/>
-          <w:sz w:val="20"/>
-          <w:szCs w:val="20"/>
-        </w:rPr>
-        <w:t xml:space="preserve">Table 5: </w:t>
-      </w:r>
-      <w:r>
-        <w:rPr>
-          <w:sz w:val="20"/>
-          <w:szCs w:val="20"/>
-        </w:rPr>
-        <w:t xml:space="preserve">Answer quality on 100 held-out questions (best value in bold)</w:t>
-      </w:r>
-    </w:p>
-    <w:tbl>
-      <w:tblPr>
-        <w:tblW w:type="dxa" w:w="9026"/>
-        <w:jc w:val="center"/>
-        <w:tblBorders>
-          <w:top w:val="single" w:color="auto" w:sz="4"/>
-          <w:left w:val="single" w:color="auto" w:sz="4"/>
-          <w:bottom w:val="single" w:color="auto" w:sz="4"/>
-          <w:right w:val="single" w:color="auto" w:sz="4"/>
-          <w:insideH w:val="single" w:color="auto" w:sz="4"/>
-          <w:insideV w:val="single" w:color="auto" w:sz="4"/>
-        </w:tblBorders>
-      </w:tblPr>
-      <w:tblGrid>
-        <w:gridCol w:w="4426"/>
-        <w:gridCol w:w="2300"/>
-        <w:gridCol w:w="2300"/>
-      </w:tblGrid>
-      <w:tr>
-        <w:trPr>
-          <w:tblHeader/>
-        </w:trPr>
-        <w:tc>
-          <w:tcPr>
-            <w:tcW w:type="dxa" w:w="4426"/>
-            <w:tcBorders>
-              <w:top w:val="single" w:color="BFBFBF" w:sz="4"/>
-              <w:left w:val="single" w:color="BFBFBF" w:sz="4"/>
-              <w:bottom w:val="single" w:color="BFBFBF" w:sz="4"/>
-              <w:right w:val="single" w:color="BFBFBF" w:sz="4"/>
-            </w:tcBorders>
-            <w:shd w:fill="1F6F8B" w:color="auto" w:val="clear"/>
-            <w:tcMar>
-              <w:top w:type="dxa" w:w="60"/>
-              <w:left w:type="dxa" w:w="100"/>
-              <w:bottom w:type="dxa" w:w="60"/>
-              <w:right w:type="dxa" w:w="100"/>
-            </w:tcMar>
-          </w:tcPr>
-          <w:p>
-            <w:pPr>
-              <w:spacing w:after="0" w:line="260"/>
-            </w:pPr>
-            <w:r>
-              <w:rPr>
-                <w:b/>
-                <w:bCs/>
-                <w:color w:val="FFFFFF"/>
-                <w:sz w:val="20"/>
-                <w:szCs w:val="20"/>
-              </w:rPr>
-              <w:t xml:space="preserve">Metric</w:t>
-            </w:r>
-          </w:p>
-        </w:tc>
-        <w:tc>
-          <w:tcPr>
-            <w:tcW w:type="dxa" w:w="2300"/>
-            <w:tcBorders>
-              <w:top w:val="single" w:color="BFBFBF" w:sz="4"/>
-              <w:left w:val="single" w:color="BFBFBF" w:sz="4"/>
-              <w:bottom w:val="single" w:color="BFBFBF" w:sz="4"/>
-              <w:right w:val="single" w:color="BFBFBF" w:sz="4"/>
-            </w:tcBorders>
-            <w:shd w:fill="1F6F8B" w:color="auto" w:val="clear"/>
-            <w:tcMar>
-              <w:top w:type="dxa" w:w="60"/>
-              <w:left w:type="dxa" w:w="100"/>
-              <w:bottom w:type="dxa" w:w="60"/>
-              <w:right w:type="dxa" w:w="100"/>
-            </w:tcMar>
-          </w:tcPr>
-          <w:p>
-            <w:pPr>
-              <w:spacing w:after="0" w:line="260"/>
-            </w:pPr>
-            <w:r>
-              <w:rPr>
-                <w:b/>
-                <w:bCs/>
-                <w:color w:val="FFFFFF"/>
-                <w:sz w:val="20"/>
-                <w:szCs w:val="20"/>
-              </w:rPr>
-              <w:t xml:space="preserve">Base Qwen3-0.6B</w:t>
-            </w:r>
-          </w:p>
-        </w:tc>
-        <w:tc>
-          <w:tcPr>
-            <w:tcW w:type="dxa" w:w="2300"/>
-            <w:tcBorders>
-              <w:top w:val="single" w:color="BFBFBF" w:sz="4"/>
-              <w:left w:val="single" w:color="BFBFBF" w:sz="4"/>
-              <w:bottom w:val="single" w:color="BFBFBF" w:sz="4"/>
-              <w:right w:val="single" w:color="BFBFBF" w:sz="4"/>
-            </w:tcBorders>
-            <w:shd w:fill="1F6F8B" w:color="auto" w:val="clear"/>
-            <w:tcMar>
-              <w:top w:type="dxa" w:w="60"/>
-              <w:left w:type="dxa" w:w="100"/>
-              <w:bottom w:type="dxa" w:w="60"/>
-              <w:right w:type="dxa" w:w="100"/>
-            </w:tcMar>
-          </w:tcPr>
-          <w:p>
-            <w:pPr>
-              <w:spacing w:after="0" w:line="260"/>
-            </w:pPr>
-            <w:r>
-              <w:rPr>
-                <w:b/>
-                <w:bCs/>
-                <w:color w:val="FFFFFF"/>
-                <w:sz w:val="20"/>
-                <w:szCs w:val="20"/>
-              </w:rPr>
-              <w:t xml:space="preserve">ChipDoc (fine-tuned)</w:t>
-            </w:r>
-          </w:p>
-        </w:tc>
-      </w:tr>
-      <w:tr>
-        <w:trPr>
-          <w:cantSplit/>
-        </w:trPr>
-        <w:tc>
-          <w:tcPr>
-            <w:tcW w:type="dxa" w:w="4426"/>
-            <w:tcBorders>
-              <w:top w:val="single" w:color="BFBFBF" w:sz="4"/>
-              <w:left w:val="single" w:color="BFBFBF" w:sz="4"/>
-              <w:bottom w:val="single" w:color="BFBFBF" w:sz="4"/>
-              <w:right w:val="single" w:color="BFBFBF" w:sz="4"/>
-            </w:tcBorders>
-            <w:tcMar>
-              <w:top w:type="dxa" w:w="60"/>
-              <w:left w:type="dxa" w:w="100"/>
-              <w:bottom w:type="dxa" w:w="60"/>
-              <w:right w:type="dxa" w:w="100"/>
-            </w:tcMar>
-          </w:tcPr>
-          <w:p>
-            <w:pPr>
-              <w:spacing w:after="0" w:line="260"/>
-            </w:pPr>
-            <w:r>
-              <w:rPr>
-                <w:color w:val="262626"/>
-                <w:sz w:val="20"/>
-                <w:szCs w:val="20"/>
-              </w:rPr>
-              <w:t xml:space="preserve">Token F1 vs. reference</w:t>
-            </w:r>
-          </w:p>
-        </w:tc>
-        <w:tc>
-          <w:tcPr>
-            <w:tcW w:type="dxa" w:w="2300"/>
-            <w:tcBorders>
-              <w:top w:val="single" w:color="BFBFBF" w:sz="4"/>
-              <w:left w:val="single" w:color="BFBFBF" w:sz="4"/>
-              <w:bottom w:val="single" w:color="BFBFBF" w:sz="4"/>
-              <w:right w:val="single" w:color="BFBFBF" w:sz="4"/>
-            </w:tcBorders>
-            <w:tcMar>
-              <w:top w:type="dxa" w:w="60"/>
-              <w:left w:type="dxa" w:w="100"/>
-              <w:bottom w:type="dxa" w:w="60"/>
-              <w:right w:type="dxa" w:w="100"/>
-            </w:tcMar>
-          </w:tcPr>
-          <w:p>
-            <w:pPr>
-              <w:spacing w:after="0" w:line="260"/>
-            </w:pPr>
-            <w:r>
-              <w:rPr>
-                <w:color w:val="262626"/>
-                <w:sz w:val="20"/>
-                <w:szCs w:val="20"/>
-              </w:rPr>
-              <w:t xml:space="preserve">0.50</w:t>
-            </w:r>
-          </w:p>
-        </w:tc>
-        <w:tc>
-          <w:tcPr>
-            <w:tcW w:type="dxa" w:w="2300"/>
-            <w:tcBorders>
-              <w:top w:val="single" w:color="BFBFBF" w:sz="4"/>
-              <w:left w:val="single" w:color="BFBFBF" w:sz="4"/>
-              <w:bottom w:val="single" w:color="BFBFBF" w:sz="4"/>
-              <w:right w:val="single" w:color="BFBFBF" w:sz="4"/>
-            </w:tcBorders>
-            <w:tcMar>
-              <w:top w:type="dxa" w:w="60"/>
-              <w:left w:type="dxa" w:w="100"/>
-              <w:bottom w:type="dxa" w:w="60"/>
-              <w:right w:type="dxa" w:w="100"/>
-            </w:tcMar>
-          </w:tcPr>
-          <w:p>
-            <w:pPr>
-              <w:spacing w:after="0" w:line="260"/>
-            </w:pPr>
-            <w:r>
-              <w:rPr>
-                <w:color w:val="262626"/>
-                <w:sz w:val="20"/>
-                <w:szCs w:val="20"/>
-              </w:rPr>
-              <w:t xml:space="preserve">0.56</w:t>
-            </w:r>
-          </w:p>
-        </w:tc>
-      </w:tr>
-      <w:tr>
-        <w:trPr>
-          <w:cantSplit/>
-        </w:trPr>
-        <w:tc>
-          <w:tcPr>
-            <w:tcW w:type="dxa" w:w="4426"/>
-            <w:tcBorders>
-              <w:top w:val="single" w:color="BFBFBF" w:sz="4"/>
-              <w:left w:val="single" w:color="BFBFBF" w:sz="4"/>
-              <w:bottom w:val="single" w:color="BFBFBF" w:sz="4"/>
-              <w:right w:val="single" w:color="BFBFBF" w:sz="4"/>
-            </w:tcBorders>
-            <w:shd w:fill="F2F2F2" w:color="auto" w:val="clear"/>
-            <w:tcMar>
-              <w:top w:type="dxa" w:w="60"/>
-              <w:left w:type="dxa" w:w="100"/>
-              <w:bottom w:type="dxa" w:w="60"/>
-              <w:right w:type="dxa" w:w="100"/>
-            </w:tcMar>
-          </w:tcPr>
-          <w:p>
-            <w:pPr>
-              <w:spacing w:after="0" w:line="260"/>
-            </w:pPr>
-            <w:r>
-              <w:rPr>
-                <w:color w:val="262626"/>
-                <w:sz w:val="20"/>
-                <w:szCs w:val="20"/>
-              </w:rPr>
-              <w:t xml:space="preserve">Numbers reproduced correctly</w:t>
-            </w:r>
-          </w:p>
-        </w:tc>
-        <w:tc>
-          <w:tcPr>
-            <w:tcW w:type="dxa" w:w="2300"/>
-            <w:tcBorders>
-              <w:top w:val="single" w:color="BFBFBF" w:sz="4"/>
-              <w:left w:val="single" w:color="BFBFBF" w:sz="4"/>
-              <w:bottom w:val="single" w:color="BFBFBF" w:sz="4"/>
-              <w:right w:val="single" w:color="BFBFBF" w:sz="4"/>
-            </w:tcBorders>
-            <w:shd w:fill="F2F2F2" w:color="auto" w:val="clear"/>
-            <w:tcMar>
-              <w:top w:type="dxa" w:w="60"/>
-              <w:left w:type="dxa" w:w="100"/>
-              <w:bottom w:type="dxa" w:w="60"/>
-              <w:right w:type="dxa" w:w="100"/>
-            </w:tcMar>
-          </w:tcPr>
-          <w:p>
-            <w:pPr>
-              <w:spacing w:after="0" w:line="260"/>
-            </w:pPr>
-            <w:r>
-              <w:rPr>
-                <w:color w:val="262626"/>
-                <w:sz w:val="20"/>
-                <w:szCs w:val="20"/>
-              </w:rPr>
-              <w:t xml:space="preserve">0.72</w:t>
-            </w:r>
-          </w:p>
-        </w:tc>
-        <w:tc>
-          <w:tcPr>
-            <w:tcW w:type="dxa" w:w="2300"/>
-            <w:tcBorders>
-              <w:top w:val="single" w:color="BFBFBF" w:sz="4"/>
-              <w:left w:val="single" w:color="BFBFBF" w:sz="4"/>
-              <w:bottom w:val="single" w:color="BFBFBF" w:sz="4"/>
-              <w:right w:val="single" w:color="BFBFBF" w:sz="4"/>
-            </w:tcBorders>
-            <w:shd w:fill="F2F2F2" w:color="auto" w:val="clear"/>
-            <w:tcMar>
-              <w:top w:type="dxa" w:w="60"/>
-              <w:left w:type="dxa" w:w="100"/>
-              <w:bottom w:type="dxa" w:w="60"/>
-              <w:right w:type="dxa" w:w="100"/>
-            </w:tcMar>
-          </w:tcPr>
-          <w:p>
-            <w:pPr>
-              <w:spacing w:after="0" w:line="260"/>
-            </w:pPr>
-            <w:r>
-              <w:rPr>
-                <w:color w:val="262626"/>
-                <w:sz w:val="20"/>
-                <w:szCs w:val="20"/>
-              </w:rPr>
-              <w:t xml:space="preserve">0.75</w:t>
-            </w:r>
-          </w:p>
-        </w:tc>
-      </w:tr>
-      <w:tr>
-        <w:trPr>
-          <w:cantSplit/>
-        </w:trPr>
-        <w:tc>
-          <w:tcPr>
-            <w:tcW w:type="dxa" w:w="4426"/>
-            <w:tcBorders>
-              <w:top w:val="single" w:color="BFBFBF" w:sz="4"/>
-              <w:left w:val="single" w:color="BFBFBF" w:sz="4"/>
-              <w:bottom w:val="single" w:color="BFBFBF" w:sz="4"/>
-              <w:right w:val="single" w:color="BFBFBF" w:sz="4"/>
-            </w:tcBorders>
-            <w:tcMar>
-              <w:top w:type="dxa" w:w="60"/>
-              <w:left w:type="dxa" w:w="100"/>
-              <w:bottom w:type="dxa" w:w="60"/>
-              <w:right w:type="dxa" w:w="100"/>
-            </w:tcMar>
-          </w:tcPr>
-          <w:p>
-            <w:pPr>
-              <w:spacing w:after="0" w:line="260"/>
-            </w:pPr>
-            <w:r>
-              <w:rPr>
-                <w:color w:val="262626"/>
-                <w:sz w:val="20"/>
-                <w:szCs w:val="20"/>
-              </w:rPr>
-              <w:t xml:space="preserve">Correct page citation</w:t>
-            </w:r>
-          </w:p>
-        </w:tc>
-        <w:tc>
-          <w:tcPr>
-            <w:tcW w:type="dxa" w:w="2300"/>
-            <w:tcBorders>
-              <w:top w:val="single" w:color="BFBFBF" w:sz="4"/>
-              <w:left w:val="single" w:color="BFBFBF" w:sz="4"/>
-              <w:bottom w:val="single" w:color="BFBFBF" w:sz="4"/>
-              <w:right w:val="single" w:color="BFBFBF" w:sz="4"/>
-            </w:tcBorders>
-            <w:tcMar>
-              <w:top w:type="dxa" w:w="60"/>
-              <w:left w:type="dxa" w:w="100"/>
-              <w:bottom w:type="dxa" w:w="60"/>
-              <w:right w:type="dxa" w:w="100"/>
-            </w:tcMar>
-          </w:tcPr>
-          <w:p>
-            <w:pPr>
-              <w:spacing w:after="0" w:line="260"/>
-            </w:pPr>
-            <w:r>
-              <w:rPr>
-                <w:color w:val="262626"/>
-                <w:sz w:val="20"/>
-                <w:szCs w:val="20"/>
-              </w:rPr>
-              <w:t xml:space="preserve">0.22</w:t>
-            </w:r>
-          </w:p>
-        </w:tc>
-        <w:tc>
-          <w:tcPr>
-            <w:tcW w:type="dxa" w:w="2300"/>
-            <w:tcBorders>
-              <w:top w:val="single" w:color="BFBFBF" w:sz="4"/>
-              <w:left w:val="single" w:color="BFBFBF" w:sz="4"/>
-              <w:bottom w:val="single" w:color="BFBFBF" w:sz="4"/>
-              <w:right w:val="single" w:color="BFBFBF" w:sz="4"/>
-            </w:tcBorders>
-            <w:tcMar>
-              <w:top w:type="dxa" w:w="60"/>
-              <w:left w:type="dxa" w:w="100"/>
-              <w:bottom w:type="dxa" w:w="60"/>
-              <w:right w:type="dxa" w:w="100"/>
-            </w:tcMar>
-          </w:tcPr>
-          <w:p>
-            <w:pPr>
-              <w:spacing w:after="0" w:line="260"/>
-            </w:pPr>
-            <w:r>
-              <w:rPr>
-                <w:color w:val="262626"/>
-                <w:sz w:val="20"/>
-                <w:szCs w:val="20"/>
-              </w:rPr>
-              <w:t xml:space="preserve">0.91</w:t>
-            </w:r>
-          </w:p>
-        </w:tc>
-      </w:tr>
-      <w:tr>
-        <w:trPr>
-          <w:cantSplit/>
-        </w:trPr>
-        <w:tc>
-          <w:tcPr>
-            <w:tcW w:type="dxa" w:w="4426"/>
-            <w:tcBorders>
-              <w:top w:val="single" w:color="BFBFBF" w:sz="4"/>
-              <w:left w:val="single" w:color="BFBFBF" w:sz="4"/>
-              <w:bottom w:val="single" w:color="BFBFBF" w:sz="4"/>
-              <w:right w:val="single" w:color="BFBFBF" w:sz="4"/>
-            </w:tcBorders>
-            <w:shd w:fill="F2F2F2" w:color="auto" w:val="clear"/>
-            <w:tcMar>
-              <w:top w:type="dxa" w:w="60"/>
-              <w:left w:type="dxa" w:w="100"/>
-              <w:bottom w:type="dxa" w:w="60"/>
-              <w:right w:type="dxa" w:w="100"/>
-            </w:tcMar>
-          </w:tcPr>
-          <w:p>
-            <w:pPr>
-              <w:spacing w:after="0" w:line="260"/>
-            </w:pPr>
-            <w:r>
-              <w:rPr>
-                <w:color w:val="262626"/>
-                <w:sz w:val="20"/>
-                <w:szCs w:val="20"/>
-              </w:rPr>
-              <w:t xml:space="preserve">False refusal (lower is better)</w:t>
-            </w:r>
-          </w:p>
-        </w:tc>
-        <w:tc>
-          <w:tcPr>
-            <w:tcW w:type="dxa" w:w="2300"/>
-            <w:tcBorders>
-              <w:top w:val="single" w:color="BFBFBF" w:sz="4"/>
-              <w:left w:val="single" w:color="BFBFBF" w:sz="4"/>
-              <w:bottom w:val="single" w:color="BFBFBF" w:sz="4"/>
-              <w:right w:val="single" w:color="BFBFBF" w:sz="4"/>
-            </w:tcBorders>
-            <w:shd w:fill="F2F2F2" w:color="auto" w:val="clear"/>
-            <w:tcMar>
-              <w:top w:type="dxa" w:w="60"/>
-              <w:left w:type="dxa" w:w="100"/>
-              <w:bottom w:type="dxa" w:w="60"/>
-              <w:right w:type="dxa" w:w="100"/>
-            </w:tcMar>
-          </w:tcPr>
-          <w:p>
-            <w:pPr>
-              <w:spacing w:after="0" w:line="260"/>
-            </w:pPr>
-            <w:r>
-              <w:rPr>
-                <w:color w:val="262626"/>
-                <w:sz w:val="20"/>
-                <w:szCs w:val="20"/>
-              </w:rPr>
-              <w:t xml:space="preserve">0.05</w:t>
-            </w:r>
-          </w:p>
-        </w:tc>
-        <w:tc>
-          <w:tcPr>
-            <w:tcW w:type="dxa" w:w="2300"/>
-            <w:tcBorders>
-              <w:top w:val="single" w:color="BFBFBF" w:sz="4"/>
-              <w:left w:val="single" w:color="BFBFBF" w:sz="4"/>
-              <w:bottom w:val="single" w:color="BFBFBF" w:sz="4"/>
-              <w:right w:val="single" w:color="BFBFBF" w:sz="4"/>
-            </w:tcBorders>
-            <w:shd w:fill="F2F2F2" w:color="auto" w:val="clear"/>
-            <w:tcMar>
-              <w:top w:type="dxa" w:w="60"/>
-              <w:left w:type="dxa" w:w="100"/>
-              <w:bottom w:type="dxa" w:w="60"/>
-              <w:right w:type="dxa" w:w="100"/>
-            </w:tcMar>
-          </w:tcPr>
-          <w:p>
-            <w:pPr>
-              <w:spacing w:after="0" w:line="260"/>
-            </w:pPr>
-            <w:r>
-              <w:rPr>
-                <w:color w:val="262626"/>
-                <w:sz w:val="20"/>
-                <w:szCs w:val="20"/>
-              </w:rPr>
-              <w:t xml:space="preserve">0.15</w:t>
-            </w:r>
-          </w:p>
-        </w:tc>
-      </w:tr>
-      <w:tr>
-        <w:trPr>
-          <w:cantSplit/>
-        </w:trPr>
-        <w:tc>
-          <w:tcPr>
-            <w:tcW w:type="dxa" w:w="4426"/>
-            <w:tcBorders>
-              <w:top w:val="single" w:color="BFBFBF" w:sz="4"/>
-              <w:left w:val="single" w:color="BFBFBF" w:sz="4"/>
-              <w:bottom w:val="single" w:color="BFBFBF" w:sz="4"/>
-              <w:right w:val="single" w:color="BFBFBF" w:sz="4"/>
-            </w:tcBorders>
-            <w:tcMar>
-              <w:top w:type="dxa" w:w="60"/>
-              <w:left w:type="dxa" w:w="100"/>
-              <w:bottom w:type="dxa" w:w="60"/>
-              <w:right w:type="dxa" w:w="100"/>
-            </w:tcMar>
-          </w:tcPr>
-          <w:p>
-            <w:pPr>
-              <w:spacing w:after="0" w:line="260"/>
-            </w:pPr>
-            <w:r>
-              <w:rPr>
-                <w:color w:val="262626"/>
-                <w:sz w:val="20"/>
-                <w:szCs w:val="20"/>
-              </w:rPr>
-              <w:t xml:space="preserve">Refusal accuracy when evidence is absent</w:t>
-            </w:r>
-          </w:p>
-        </w:tc>
-        <w:tc>
-          <w:tcPr>
-            <w:tcW w:type="dxa" w:w="2300"/>
-            <w:tcBorders>
-              <w:top w:val="single" w:color="BFBFBF" w:sz="4"/>
-              <w:left w:val="single" w:color="BFBFBF" w:sz="4"/>
-              <w:bottom w:val="single" w:color="BFBFBF" w:sz="4"/>
-              <w:right w:val="single" w:color="BFBFBF" w:sz="4"/>
-            </w:tcBorders>
-            <w:tcMar>
-              <w:top w:type="dxa" w:w="60"/>
-              <w:left w:type="dxa" w:w="100"/>
-              <w:bottom w:type="dxa" w:w="60"/>
-              <w:right w:type="dxa" w:w="100"/>
-            </w:tcMar>
-          </w:tcPr>
-          <w:p>
-            <w:pPr>
-              <w:spacing w:after="0" w:line="260"/>
-            </w:pPr>
-            <w:r>
-              <w:rPr>
-                <w:color w:val="262626"/>
-                <w:sz w:val="20"/>
-                <w:szCs w:val="20"/>
-              </w:rPr>
-              <w:t xml:space="preserve">0.30</w:t>
-            </w:r>
-          </w:p>
-        </w:tc>
-        <w:tc>
-          <w:tcPr>
-            <w:tcW w:type="dxa" w:w="2300"/>
-            <w:tcBorders>
-              <w:top w:val="single" w:color="BFBFBF" w:sz="4"/>
-              <w:left w:val="single" w:color="BFBFBF" w:sz="4"/>
-              <w:bottom w:val="single" w:color="BFBFBF" w:sz="4"/>
-              <w:right w:val="single" w:color="BFBFBF" w:sz="4"/>
-            </w:tcBorders>
-            <w:tcMar>
-              <w:top w:type="dxa" w:w="60"/>
-              <w:left w:type="dxa" w:w="100"/>
-              <w:bottom w:type="dxa" w:w="60"/>
-              <w:right w:type="dxa" w:w="100"/>
-            </w:tcMar>
-          </w:tcPr>
-          <w:p>
-            <w:pPr>
-              <w:spacing w:after="0" w:line="260"/>
-            </w:pPr>
-            <w:r>
-              <w:rPr>
-                <w:color w:val="262626"/>
-                <w:sz w:val="20"/>
-                <w:szCs w:val="20"/>
-              </w:rPr>
-              <w:t xml:space="preserve">0.74</w:t>
-            </w:r>
-          </w:p>
-        </w:tc>
-      </w:tr>
-    </w:tbl>
-    <w:p>
-      <w:pPr>
-        <w:spacing w:after="120"/>
-      </w:pPr>
-    </w:p>
-    <w:p>
-      <w:pPr>
-        <w:keepNext/>
-        <w:spacing w:after="60" w:before="120"/>
-        <w:jc w:val="center"/>
-      </w:pPr>
-      <w:r>
-        <w:drawing>
-          <wp:inline distT="0" distB="0" distL="0" distR="0">
-            <wp:extent cx="5334000" cy="2705100"/>
-            <wp:effectExtent t="0" r="0" b="0" l="0"/>
-            <wp:docPr id="10" name="Figure 10" descr="Base versus fine-tuned model on the same retrieved passages." title="Figure 10"/>
             <wp:cNvGraphicFramePr>
               <a:graphicFrameLocks xmlns:a="http://schemas.openxmlformats.org/drawingml/2006/main" noChangeAspect="1"/>
             </wp:cNvGraphicFramePr>
@@ -6764,15 +6070,25 @@
           <w:sz w:val="20"/>
           <w:szCs w:val="20"/>
         </w:rPr>
-        <w:t xml:space="preserve">Figure 10: </w:t>
+        <w:t xml:space="preserve">Figure 9: </w:t>
       </w:r>
       <w:r>
         <w:rPr>
           <w:sz w:val="20"/>
           <w:szCs w:val="20"/>
         </w:rPr>
-        <w:t xml:space="preserve">Base versus fine-tuned model on the same retrieved passages.</w:t>
-      </w:r>
+        <w:t xml:space="preserve">Retrieval quality of dense, BM25 and hybrid search on unseen datasheets.</w:t>
+      </w:r>
+    </w:p>
+    <w:p>
+      <w:pPr>
+        <w:pStyle w:val="Heading2"/>
+      </w:pPr>
+      <w:bookmarkStart w:name="_Toc29" w:id="29"/>
+      <w:r>
+        <w:t xml:space="preserve">4.4 Answer Quality</w:t>
+      </w:r>
+      <w:bookmarkEnd w:id="29"/>
     </w:p>
     <w:p>
       <w:pPr>
@@ -6780,27 +6096,640 @@
         <w:jc w:val="both"/>
       </w:pPr>
       <w:r>
-        <w:t xml:space="preserve">Answer accuracy itself improved more modestly (F1 +0.06, numbers +0.03). Both models see the same passages, and a 0.6B model’s ability to read dense electrical tables is largely set by pre-training rather than by a short fine-tune. The fine-tune mainly taught </w:t>
-      </w:r>
-      <w:r>
-        <w:rPr>
-          <w:i/>
-          <w:iCs/>
-        </w:rPr>
-        <w:t xml:space="preserve">format and discipline</w:t>
-      </w:r>
-      <w:r>
-        <w:t xml:space="preserve">: short answers, exact copying, citations and refusals.</w:t>
-      </w:r>
-    </w:p>
-    <w:p>
-      <w:pPr>
-        <w:spacing w:after="140" w:line="300"/>
-        <w:jc w:val="both"/>
-      </w:pPr>
-      <w:r>
-        <w:t xml:space="preserve">Figure 11 breaks the same results down by outcome. When the evidence was retrieved, the share of fully correct answers (token F1 of at least 0.5) rose from 48% to 58%, and partly correct or wrong answers fell from 47% to 27%; the price is a larger share of refusals, from 5% to 15%. When the evidence was removed, the share of invented answers fell from 70% to 26%.</w:t>
-      </w:r>
+        <w:t xml:space="preserve">Table 5 and Figure 10 compare the base Qwen3-0.6B with the fine-tuned ChipDoc model on the same 100 questions and the same retrieved passages. The fine-tune changed behaviour most where it was designed to. Page citations went from 0.22 to 0.91 correct; the base model usually cited passage numbers such as [1] or no page at all. On unanswerable inputs, the base model invented an answer 70% of the time; the fine-tuned model did so 26% of the time, converting 47 hallucinations into correct refusals.</w:t>
+      </w:r>
+    </w:p>
+    <w:p>
+      <w:pPr>
+        <w:keepNext/>
+        <w:spacing w:after="80" w:before="160"/>
+        <w:jc w:val="center"/>
+      </w:pPr>
+      <w:r>
+        <w:rPr>
+          <w:b/>
+          <w:bCs/>
+          <w:sz w:val="20"/>
+          <w:szCs w:val="20"/>
+        </w:rPr>
+        <w:t xml:space="preserve">Table 5: </w:t>
+      </w:r>
+      <w:r>
+        <w:rPr>
+          <w:sz w:val="20"/>
+          <w:szCs w:val="20"/>
+        </w:rPr>
+        <w:t xml:space="preserve">Answer quality on 100 held-out questions (best value in bold)</w:t>
+      </w:r>
+    </w:p>
+    <w:tbl>
+      <w:tblPr>
+        <w:tblW w:type="dxa" w:w="9026"/>
+        <w:jc w:val="center"/>
+        <w:tblBorders>
+          <w:top w:val="single" w:color="auto" w:sz="4"/>
+          <w:left w:val="single" w:color="auto" w:sz="4"/>
+          <w:bottom w:val="single" w:color="auto" w:sz="4"/>
+          <w:right w:val="single" w:color="auto" w:sz="4"/>
+          <w:insideH w:val="single" w:color="auto" w:sz="4"/>
+          <w:insideV w:val="single" w:color="auto" w:sz="4"/>
+        </w:tblBorders>
+      </w:tblPr>
+      <w:tblGrid>
+        <w:gridCol w:w="4426"/>
+        <w:gridCol w:w="2300"/>
+        <w:gridCol w:w="2300"/>
+      </w:tblGrid>
+      <w:tr>
+        <w:trPr>
+          <w:tblHeader/>
+        </w:trPr>
+        <w:tc>
+          <w:tcPr>
+            <w:tcW w:type="dxa" w:w="4426"/>
+            <w:tcBorders>
+              <w:top w:val="single" w:color="BFBFBF" w:sz="4"/>
+              <w:left w:val="single" w:color="BFBFBF" w:sz="4"/>
+              <w:bottom w:val="single" w:color="BFBFBF" w:sz="4"/>
+              <w:right w:val="single" w:color="BFBFBF" w:sz="4"/>
+            </w:tcBorders>
+            <w:shd w:fill="1F6F8B" w:color="auto" w:val="clear"/>
+            <w:tcMar>
+              <w:top w:type="dxa" w:w="60"/>
+              <w:left w:type="dxa" w:w="100"/>
+              <w:bottom w:type="dxa" w:w="60"/>
+              <w:right w:type="dxa" w:w="100"/>
+            </w:tcMar>
+          </w:tcPr>
+          <w:p>
+            <w:pPr>
+              <w:spacing w:after="0" w:line="260"/>
+            </w:pPr>
+            <w:r>
+              <w:rPr>
+                <w:b/>
+                <w:bCs/>
+                <w:color w:val="FFFFFF"/>
+                <w:sz w:val="20"/>
+                <w:szCs w:val="20"/>
+              </w:rPr>
+              <w:t xml:space="preserve">Metric</w:t>
+            </w:r>
+          </w:p>
+        </w:tc>
+        <w:tc>
+          <w:tcPr>
+            <w:tcW w:type="dxa" w:w="2300"/>
+            <w:tcBorders>
+              <w:top w:val="single" w:color="BFBFBF" w:sz="4"/>
+              <w:left w:val="single" w:color="BFBFBF" w:sz="4"/>
+              <w:bottom w:val="single" w:color="BFBFBF" w:sz="4"/>
+              <w:right w:val="single" w:color="BFBFBF" w:sz="4"/>
+            </w:tcBorders>
+            <w:shd w:fill="1F6F8B" w:color="auto" w:val="clear"/>
+            <w:tcMar>
+              <w:top w:type="dxa" w:w="60"/>
+              <w:left w:type="dxa" w:w="100"/>
+              <w:bottom w:type="dxa" w:w="60"/>
+              <w:right w:type="dxa" w:w="100"/>
+            </w:tcMar>
+          </w:tcPr>
+          <w:p>
+            <w:pPr>
+              <w:spacing w:after="0" w:line="260"/>
+            </w:pPr>
+            <w:r>
+              <w:rPr>
+                <w:b/>
+                <w:bCs/>
+                <w:color w:val="FFFFFF"/>
+                <w:sz w:val="20"/>
+                <w:szCs w:val="20"/>
+              </w:rPr>
+              <w:t xml:space="preserve">Base Qwen3-0.6B</w:t>
+            </w:r>
+          </w:p>
+        </w:tc>
+        <w:tc>
+          <w:tcPr>
+            <w:tcW w:type="dxa" w:w="2300"/>
+            <w:tcBorders>
+              <w:top w:val="single" w:color="BFBFBF" w:sz="4"/>
+              <w:left w:val="single" w:color="BFBFBF" w:sz="4"/>
+              <w:bottom w:val="single" w:color="BFBFBF" w:sz="4"/>
+              <w:right w:val="single" w:color="BFBFBF" w:sz="4"/>
+            </w:tcBorders>
+            <w:shd w:fill="1F6F8B" w:color="auto" w:val="clear"/>
+            <w:tcMar>
+              <w:top w:type="dxa" w:w="60"/>
+              <w:left w:type="dxa" w:w="100"/>
+              <w:bottom w:type="dxa" w:w="60"/>
+              <w:right w:type="dxa" w:w="100"/>
+            </w:tcMar>
+          </w:tcPr>
+          <w:p>
+            <w:pPr>
+              <w:spacing w:after="0" w:line="260"/>
+            </w:pPr>
+            <w:r>
+              <w:rPr>
+                <w:b/>
+                <w:bCs/>
+                <w:color w:val="FFFFFF"/>
+                <w:sz w:val="20"/>
+                <w:szCs w:val="20"/>
+              </w:rPr>
+              <w:t xml:space="preserve">ChipDoc (fine-tuned)</w:t>
+            </w:r>
+          </w:p>
+        </w:tc>
+      </w:tr>
+      <w:tr>
+        <w:trPr>
+          <w:cantSplit/>
+        </w:trPr>
+        <w:tc>
+          <w:tcPr>
+            <w:tcW w:type="dxa" w:w="4426"/>
+            <w:tcBorders>
+              <w:top w:val="single" w:color="BFBFBF" w:sz="4"/>
+              <w:left w:val="single" w:color="BFBFBF" w:sz="4"/>
+              <w:bottom w:val="single" w:color="BFBFBF" w:sz="4"/>
+              <w:right w:val="single" w:color="BFBFBF" w:sz="4"/>
+            </w:tcBorders>
+            <w:tcMar>
+              <w:top w:type="dxa" w:w="60"/>
+              <w:left w:type="dxa" w:w="100"/>
+              <w:bottom w:type="dxa" w:w="60"/>
+              <w:right w:type="dxa" w:w="100"/>
+            </w:tcMar>
+          </w:tcPr>
+          <w:p>
+            <w:pPr>
+              <w:spacing w:after="0" w:line="260"/>
+            </w:pPr>
+            <w:r>
+              <w:rPr>
+                <w:color w:val="262626"/>
+                <w:sz w:val="20"/>
+                <w:szCs w:val="20"/>
+              </w:rPr>
+              <w:t xml:space="preserve">Token F1 vs. reference</w:t>
+            </w:r>
+          </w:p>
+        </w:tc>
+        <w:tc>
+          <w:tcPr>
+            <w:tcW w:type="dxa" w:w="2300"/>
+            <w:tcBorders>
+              <w:top w:val="single" w:color="BFBFBF" w:sz="4"/>
+              <w:left w:val="single" w:color="BFBFBF" w:sz="4"/>
+              <w:bottom w:val="single" w:color="BFBFBF" w:sz="4"/>
+              <w:right w:val="single" w:color="BFBFBF" w:sz="4"/>
+            </w:tcBorders>
+            <w:tcMar>
+              <w:top w:type="dxa" w:w="60"/>
+              <w:left w:type="dxa" w:w="100"/>
+              <w:bottom w:type="dxa" w:w="60"/>
+              <w:right w:type="dxa" w:w="100"/>
+            </w:tcMar>
+          </w:tcPr>
+          <w:p>
+            <w:pPr>
+              <w:spacing w:after="0" w:line="260"/>
+            </w:pPr>
+            <w:r>
+              <w:rPr>
+                <w:color w:val="262626"/>
+                <w:sz w:val="20"/>
+                <w:szCs w:val="20"/>
+              </w:rPr>
+              <w:t xml:space="preserve">0.50</w:t>
+            </w:r>
+          </w:p>
+        </w:tc>
+        <w:tc>
+          <w:tcPr>
+            <w:tcW w:type="dxa" w:w="2300"/>
+            <w:tcBorders>
+              <w:top w:val="single" w:color="BFBFBF" w:sz="4"/>
+              <w:left w:val="single" w:color="BFBFBF" w:sz="4"/>
+              <w:bottom w:val="single" w:color="BFBFBF" w:sz="4"/>
+              <w:right w:val="single" w:color="BFBFBF" w:sz="4"/>
+            </w:tcBorders>
+            <w:tcMar>
+              <w:top w:type="dxa" w:w="60"/>
+              <w:left w:type="dxa" w:w="100"/>
+              <w:bottom w:type="dxa" w:w="60"/>
+              <w:right w:type="dxa" w:w="100"/>
+            </w:tcMar>
+          </w:tcPr>
+          <w:p>
+            <w:pPr>
+              <w:spacing w:after="0" w:line="260"/>
+            </w:pPr>
+            <w:r>
+              <w:rPr>
+                <w:color w:val="262626"/>
+                <w:sz w:val="20"/>
+                <w:szCs w:val="20"/>
+              </w:rPr>
+              <w:t xml:space="preserve">0.56</w:t>
+            </w:r>
+          </w:p>
+        </w:tc>
+      </w:tr>
+      <w:tr>
+        <w:trPr>
+          <w:cantSplit/>
+        </w:trPr>
+        <w:tc>
+          <w:tcPr>
+            <w:tcW w:type="dxa" w:w="4426"/>
+            <w:tcBorders>
+              <w:top w:val="single" w:color="BFBFBF" w:sz="4"/>
+              <w:left w:val="single" w:color="BFBFBF" w:sz="4"/>
+              <w:bottom w:val="single" w:color="BFBFBF" w:sz="4"/>
+              <w:right w:val="single" w:color="BFBFBF" w:sz="4"/>
+            </w:tcBorders>
+            <w:shd w:fill="F2F2F2" w:color="auto" w:val="clear"/>
+            <w:tcMar>
+              <w:top w:type="dxa" w:w="60"/>
+              <w:left w:type="dxa" w:w="100"/>
+              <w:bottom w:type="dxa" w:w="60"/>
+              <w:right w:type="dxa" w:w="100"/>
+            </w:tcMar>
+          </w:tcPr>
+          <w:p>
+            <w:pPr>
+              <w:spacing w:after="0" w:line="260"/>
+            </w:pPr>
+            <w:r>
+              <w:rPr>
+                <w:color w:val="262626"/>
+                <w:sz w:val="20"/>
+                <w:szCs w:val="20"/>
+              </w:rPr>
+              <w:t xml:space="preserve">Numbers reproduced correctly</w:t>
+            </w:r>
+          </w:p>
+        </w:tc>
+        <w:tc>
+          <w:tcPr>
+            <w:tcW w:type="dxa" w:w="2300"/>
+            <w:tcBorders>
+              <w:top w:val="single" w:color="BFBFBF" w:sz="4"/>
+              <w:left w:val="single" w:color="BFBFBF" w:sz="4"/>
+              <w:bottom w:val="single" w:color="BFBFBF" w:sz="4"/>
+              <w:right w:val="single" w:color="BFBFBF" w:sz="4"/>
+            </w:tcBorders>
+            <w:shd w:fill="F2F2F2" w:color="auto" w:val="clear"/>
+            <w:tcMar>
+              <w:top w:type="dxa" w:w="60"/>
+              <w:left w:type="dxa" w:w="100"/>
+              <w:bottom w:type="dxa" w:w="60"/>
+              <w:right w:type="dxa" w:w="100"/>
+            </w:tcMar>
+          </w:tcPr>
+          <w:p>
+            <w:pPr>
+              <w:spacing w:after="0" w:line="260"/>
+            </w:pPr>
+            <w:r>
+              <w:rPr>
+                <w:color w:val="262626"/>
+                <w:sz w:val="20"/>
+                <w:szCs w:val="20"/>
+              </w:rPr>
+              <w:t xml:space="preserve">0.72</w:t>
+            </w:r>
+          </w:p>
+        </w:tc>
+        <w:tc>
+          <w:tcPr>
+            <w:tcW w:type="dxa" w:w="2300"/>
+            <w:tcBorders>
+              <w:top w:val="single" w:color="BFBFBF" w:sz="4"/>
+              <w:left w:val="single" w:color="BFBFBF" w:sz="4"/>
+              <w:bottom w:val="single" w:color="BFBFBF" w:sz="4"/>
+              <w:right w:val="single" w:color="BFBFBF" w:sz="4"/>
+            </w:tcBorders>
+            <w:shd w:fill="F2F2F2" w:color="auto" w:val="clear"/>
+            <w:tcMar>
+              <w:top w:type="dxa" w:w="60"/>
+              <w:left w:type="dxa" w:w="100"/>
+              <w:bottom w:type="dxa" w:w="60"/>
+              <w:right w:type="dxa" w:w="100"/>
+            </w:tcMar>
+          </w:tcPr>
+          <w:p>
+            <w:pPr>
+              <w:spacing w:after="0" w:line="260"/>
+            </w:pPr>
+            <w:r>
+              <w:rPr>
+                <w:color w:val="262626"/>
+                <w:sz w:val="20"/>
+                <w:szCs w:val="20"/>
+              </w:rPr>
+              <w:t xml:space="preserve">0.75</w:t>
+            </w:r>
+          </w:p>
+        </w:tc>
+      </w:tr>
+      <w:tr>
+        <w:trPr>
+          <w:cantSplit/>
+        </w:trPr>
+        <w:tc>
+          <w:tcPr>
+            <w:tcW w:type="dxa" w:w="4426"/>
+            <w:tcBorders>
+              <w:top w:val="single" w:color="BFBFBF" w:sz="4"/>
+              <w:left w:val="single" w:color="BFBFBF" w:sz="4"/>
+              <w:bottom w:val="single" w:color="BFBFBF" w:sz="4"/>
+              <w:right w:val="single" w:color="BFBFBF" w:sz="4"/>
+            </w:tcBorders>
+            <w:tcMar>
+              <w:top w:type="dxa" w:w="60"/>
+              <w:left w:type="dxa" w:w="100"/>
+              <w:bottom w:type="dxa" w:w="60"/>
+              <w:right w:type="dxa" w:w="100"/>
+            </w:tcMar>
+          </w:tcPr>
+          <w:p>
+            <w:pPr>
+              <w:spacing w:after="0" w:line="260"/>
+            </w:pPr>
+            <w:r>
+              <w:rPr>
+                <w:color w:val="262626"/>
+                <w:sz w:val="20"/>
+                <w:szCs w:val="20"/>
+              </w:rPr>
+              <w:t xml:space="preserve">Correct page citation</w:t>
+            </w:r>
+          </w:p>
+        </w:tc>
+        <w:tc>
+          <w:tcPr>
+            <w:tcW w:type="dxa" w:w="2300"/>
+            <w:tcBorders>
+              <w:top w:val="single" w:color="BFBFBF" w:sz="4"/>
+              <w:left w:val="single" w:color="BFBFBF" w:sz="4"/>
+              <w:bottom w:val="single" w:color="BFBFBF" w:sz="4"/>
+              <w:right w:val="single" w:color="BFBFBF" w:sz="4"/>
+            </w:tcBorders>
+            <w:tcMar>
+              <w:top w:type="dxa" w:w="60"/>
+              <w:left w:type="dxa" w:w="100"/>
+              <w:bottom w:type="dxa" w:w="60"/>
+              <w:right w:type="dxa" w:w="100"/>
+            </w:tcMar>
+          </w:tcPr>
+          <w:p>
+            <w:pPr>
+              <w:spacing w:after="0" w:line="260"/>
+            </w:pPr>
+            <w:r>
+              <w:rPr>
+                <w:color w:val="262626"/>
+                <w:sz w:val="20"/>
+                <w:szCs w:val="20"/>
+              </w:rPr>
+              <w:t xml:space="preserve">0.22</w:t>
+            </w:r>
+          </w:p>
+        </w:tc>
+        <w:tc>
+          <w:tcPr>
+            <w:tcW w:type="dxa" w:w="2300"/>
+            <w:tcBorders>
+              <w:top w:val="single" w:color="BFBFBF" w:sz="4"/>
+              <w:left w:val="single" w:color="BFBFBF" w:sz="4"/>
+              <w:bottom w:val="single" w:color="BFBFBF" w:sz="4"/>
+              <w:right w:val="single" w:color="BFBFBF" w:sz="4"/>
+            </w:tcBorders>
+            <w:tcMar>
+              <w:top w:type="dxa" w:w="60"/>
+              <w:left w:type="dxa" w:w="100"/>
+              <w:bottom w:type="dxa" w:w="60"/>
+              <w:right w:type="dxa" w:w="100"/>
+            </w:tcMar>
+          </w:tcPr>
+          <w:p>
+            <w:pPr>
+              <w:spacing w:after="0" w:line="260"/>
+            </w:pPr>
+            <w:r>
+              <w:rPr>
+                <w:color w:val="262626"/>
+                <w:sz w:val="20"/>
+                <w:szCs w:val="20"/>
+              </w:rPr>
+              <w:t xml:space="preserve">0.91</w:t>
+            </w:r>
+          </w:p>
+        </w:tc>
+      </w:tr>
+      <w:tr>
+        <w:trPr>
+          <w:cantSplit/>
+        </w:trPr>
+        <w:tc>
+          <w:tcPr>
+            <w:tcW w:type="dxa" w:w="4426"/>
+            <w:tcBorders>
+              <w:top w:val="single" w:color="BFBFBF" w:sz="4"/>
+              <w:left w:val="single" w:color="BFBFBF" w:sz="4"/>
+              <w:bottom w:val="single" w:color="BFBFBF" w:sz="4"/>
+              <w:right w:val="single" w:color="BFBFBF" w:sz="4"/>
+            </w:tcBorders>
+            <w:shd w:fill="F2F2F2" w:color="auto" w:val="clear"/>
+            <w:tcMar>
+              <w:top w:type="dxa" w:w="60"/>
+              <w:left w:type="dxa" w:w="100"/>
+              <w:bottom w:type="dxa" w:w="60"/>
+              <w:right w:type="dxa" w:w="100"/>
+            </w:tcMar>
+          </w:tcPr>
+          <w:p>
+            <w:pPr>
+              <w:spacing w:after="0" w:line="260"/>
+            </w:pPr>
+            <w:r>
+              <w:rPr>
+                <w:color w:val="262626"/>
+                <w:sz w:val="20"/>
+                <w:szCs w:val="20"/>
+              </w:rPr>
+              <w:t xml:space="preserve">False refusal (lower is better)</w:t>
+            </w:r>
+          </w:p>
+        </w:tc>
+        <w:tc>
+          <w:tcPr>
+            <w:tcW w:type="dxa" w:w="2300"/>
+            <w:tcBorders>
+              <w:top w:val="single" w:color="BFBFBF" w:sz="4"/>
+              <w:left w:val="single" w:color="BFBFBF" w:sz="4"/>
+              <w:bottom w:val="single" w:color="BFBFBF" w:sz="4"/>
+              <w:right w:val="single" w:color="BFBFBF" w:sz="4"/>
+            </w:tcBorders>
+            <w:shd w:fill="F2F2F2" w:color="auto" w:val="clear"/>
+            <w:tcMar>
+              <w:top w:type="dxa" w:w="60"/>
+              <w:left w:type="dxa" w:w="100"/>
+              <w:bottom w:type="dxa" w:w="60"/>
+              <w:right w:type="dxa" w:w="100"/>
+            </w:tcMar>
+          </w:tcPr>
+          <w:p>
+            <w:pPr>
+              <w:spacing w:after="0" w:line="260"/>
+            </w:pPr>
+            <w:r>
+              <w:rPr>
+                <w:color w:val="262626"/>
+                <w:sz w:val="20"/>
+                <w:szCs w:val="20"/>
+              </w:rPr>
+              <w:t xml:space="preserve">0.05</w:t>
+            </w:r>
+          </w:p>
+        </w:tc>
+        <w:tc>
+          <w:tcPr>
+            <w:tcW w:type="dxa" w:w="2300"/>
+            <w:tcBorders>
+              <w:top w:val="single" w:color="BFBFBF" w:sz="4"/>
+              <w:left w:val="single" w:color="BFBFBF" w:sz="4"/>
+              <w:bottom w:val="single" w:color="BFBFBF" w:sz="4"/>
+              <w:right w:val="single" w:color="BFBFBF" w:sz="4"/>
+            </w:tcBorders>
+            <w:shd w:fill="F2F2F2" w:color="auto" w:val="clear"/>
+            <w:tcMar>
+              <w:top w:type="dxa" w:w="60"/>
+              <w:left w:type="dxa" w:w="100"/>
+              <w:bottom w:type="dxa" w:w="60"/>
+              <w:right w:type="dxa" w:w="100"/>
+            </w:tcMar>
+          </w:tcPr>
+          <w:p>
+            <w:pPr>
+              <w:spacing w:after="0" w:line="260"/>
+            </w:pPr>
+            <w:r>
+              <w:rPr>
+                <w:color w:val="262626"/>
+                <w:sz w:val="20"/>
+                <w:szCs w:val="20"/>
+              </w:rPr>
+              <w:t xml:space="preserve">0.15</w:t>
+            </w:r>
+          </w:p>
+        </w:tc>
+      </w:tr>
+      <w:tr>
+        <w:trPr>
+          <w:cantSplit/>
+        </w:trPr>
+        <w:tc>
+          <w:tcPr>
+            <w:tcW w:type="dxa" w:w="4426"/>
+            <w:tcBorders>
+              <w:top w:val="single" w:color="BFBFBF" w:sz="4"/>
+              <w:left w:val="single" w:color="BFBFBF" w:sz="4"/>
+              <w:bottom w:val="single" w:color="BFBFBF" w:sz="4"/>
+              <w:right w:val="single" w:color="BFBFBF" w:sz="4"/>
+            </w:tcBorders>
+            <w:tcMar>
+              <w:top w:type="dxa" w:w="60"/>
+              <w:left w:type="dxa" w:w="100"/>
+              <w:bottom w:type="dxa" w:w="60"/>
+              <w:right w:type="dxa" w:w="100"/>
+            </w:tcMar>
+          </w:tcPr>
+          <w:p>
+            <w:pPr>
+              <w:spacing w:after="0" w:line="260"/>
+            </w:pPr>
+            <w:r>
+              <w:rPr>
+                <w:color w:val="262626"/>
+                <w:sz w:val="20"/>
+                <w:szCs w:val="20"/>
+              </w:rPr>
+              <w:t xml:space="preserve">Refusal accuracy when evidence is absent</w:t>
+            </w:r>
+          </w:p>
+        </w:tc>
+        <w:tc>
+          <w:tcPr>
+            <w:tcW w:type="dxa" w:w="2300"/>
+            <w:tcBorders>
+              <w:top w:val="single" w:color="BFBFBF" w:sz="4"/>
+              <w:left w:val="single" w:color="BFBFBF" w:sz="4"/>
+              <w:bottom w:val="single" w:color="BFBFBF" w:sz="4"/>
+              <w:right w:val="single" w:color="BFBFBF" w:sz="4"/>
+            </w:tcBorders>
+            <w:tcMar>
+              <w:top w:type="dxa" w:w="60"/>
+              <w:left w:type="dxa" w:w="100"/>
+              <w:bottom w:type="dxa" w:w="60"/>
+              <w:right w:type="dxa" w:w="100"/>
+            </w:tcMar>
+          </w:tcPr>
+          <w:p>
+            <w:pPr>
+              <w:spacing w:after="0" w:line="260"/>
+            </w:pPr>
+            <w:r>
+              <w:rPr>
+                <w:color w:val="262626"/>
+                <w:sz w:val="20"/>
+                <w:szCs w:val="20"/>
+              </w:rPr>
+              <w:t xml:space="preserve">0.30</w:t>
+            </w:r>
+          </w:p>
+        </w:tc>
+        <w:tc>
+          <w:tcPr>
+            <w:tcW w:type="dxa" w:w="2300"/>
+            <w:tcBorders>
+              <w:top w:val="single" w:color="BFBFBF" w:sz="4"/>
+              <w:left w:val="single" w:color="BFBFBF" w:sz="4"/>
+              <w:bottom w:val="single" w:color="BFBFBF" w:sz="4"/>
+              <w:right w:val="single" w:color="BFBFBF" w:sz="4"/>
+            </w:tcBorders>
+            <w:tcMar>
+              <w:top w:type="dxa" w:w="60"/>
+              <w:left w:type="dxa" w:w="100"/>
+              <w:bottom w:type="dxa" w:w="60"/>
+              <w:right w:type="dxa" w:w="100"/>
+            </w:tcMar>
+          </w:tcPr>
+          <w:p>
+            <w:pPr>
+              <w:spacing w:after="0" w:line="260"/>
+            </w:pPr>
+            <w:r>
+              <w:rPr>
+                <w:color w:val="262626"/>
+                <w:sz w:val="20"/>
+                <w:szCs w:val="20"/>
+              </w:rPr>
+              <w:t xml:space="preserve">0.74</w:t>
+            </w:r>
+          </w:p>
+        </w:tc>
+      </w:tr>
+    </w:tbl>
+    <w:p>
+      <w:pPr>
+        <w:spacing w:after="120"/>
+      </w:pPr>
     </w:p>
     <w:p>
       <w:pPr>
@@ -6811,9 +6740,9 @@
       <w:r>
         <w:drawing>
           <wp:inline distT="0" distB="0" distL="0" distR="0">
-            <wp:extent cx="5715000" cy="2124075"/>
+            <wp:extent cx="5334000" cy="2705100"/>
             <wp:effectExtent t="0" r="0" b="0" l="0"/>
-            <wp:docPr id="11" name="Figure 11" descr="Outcome breakdown on the held-out questions. Left: inputs where retrieval found the evidence. Right: inputs where the evidence was removed, so the only correct output is a refusal." title="Figure 11"/>
+            <wp:docPr id="10" name="Figure 10" descr="Base versus fine-tuned model on the same retrieved passages." title="Figure 10"/>
             <wp:cNvGraphicFramePr>
               <a:graphicFrameLocks xmlns:a="http://schemas.openxmlformats.org/drawingml/2006/main" noChangeAspect="1"/>
             </wp:cNvGraphicFramePr>
@@ -6836,6 +6765,103 @@
                   <pic:spPr bwMode="auto">
                     <a:xfrm>
                       <a:off x="0" y="0"/>
+                      <a:ext cx="5334000" cy="2705100"/>
+                    </a:xfrm>
+                    <a:prstGeom prst="rect">
+                      <a:avLst/>
+                    </a:prstGeom>
+                  </pic:spPr>
+                </pic:pic>
+              </a:graphicData>
+            </a:graphic>
+          </wp:inline>
+        </w:drawing>
+      </w:r>
+    </w:p>
+    <w:p>
+      <w:pPr>
+        <w:spacing w:after="240"/>
+        <w:jc w:val="center"/>
+      </w:pPr>
+      <w:r>
+        <w:rPr>
+          <w:b/>
+          <w:bCs/>
+          <w:sz w:val="20"/>
+          <w:szCs w:val="20"/>
+        </w:rPr>
+        <w:t xml:space="preserve">Figure 10: </w:t>
+      </w:r>
+      <w:r>
+        <w:rPr>
+          <w:sz w:val="20"/>
+          <w:szCs w:val="20"/>
+        </w:rPr>
+        <w:t xml:space="preserve">Base versus fine-tuned model on the same retrieved passages.</w:t>
+      </w:r>
+    </w:p>
+    <w:p>
+      <w:pPr>
+        <w:spacing w:after="140" w:line="300"/>
+        <w:jc w:val="both"/>
+      </w:pPr>
+      <w:r>
+        <w:t xml:space="preserve">Answer accuracy itself improved more modestly (F1 +0.06, numbers +0.03). Both models see the same passages, and a 0.6B model’s ability to read dense electrical tables is largely set by pre-training rather than by a short fine-tune. The fine-tune mainly taught </w:t>
+      </w:r>
+      <w:r>
+        <w:rPr>
+          <w:i/>
+          <w:iCs/>
+        </w:rPr>
+        <w:t xml:space="preserve">format and discipline</w:t>
+      </w:r>
+      <w:r>
+        <w:t xml:space="preserve">: short answers, exact copying, citations and refusals.</w:t>
+      </w:r>
+    </w:p>
+    <w:p>
+      <w:pPr>
+        <w:spacing w:after="140" w:line="300"/>
+        <w:jc w:val="both"/>
+      </w:pPr>
+      <w:r>
+        <w:t xml:space="preserve">Figure 11 breaks the same results down by outcome. When the evidence was retrieved, the share of fully correct answers (token F1 of at least 0.5) rose from 48% to 58%, and partly correct or wrong answers fell from 47% to 27%; the price is a larger share of refusals, from 5% to 15%. When the evidence was removed, the share of invented answers fell from 70% to 26%.</w:t>
+      </w:r>
+    </w:p>
+    <w:p>
+      <w:pPr>
+        <w:keepNext/>
+        <w:spacing w:after="60" w:before="120"/>
+        <w:jc w:val="center"/>
+      </w:pPr>
+      <w:r>
+        <w:drawing>
+          <wp:inline distT="0" distB="0" distL="0" distR="0">
+            <wp:extent cx="5715000" cy="2124075"/>
+            <wp:effectExtent t="0" r="0" b="0" l="0"/>
+            <wp:docPr id="11" name="Figure 11" descr="Outcome breakdown on the held-out questions. Left: inputs where retrieval found the evidence. Right: inputs where the evidence was removed, so the only correct output is a refusal." title="Figure 11"/>
+            <wp:cNvGraphicFramePr>
+              <a:graphicFrameLocks xmlns:a="http://schemas.openxmlformats.org/drawingml/2006/main" noChangeAspect="1"/>
+            </wp:cNvGraphicFramePr>
+            <a:graphic xmlns:a="http://schemas.openxmlformats.org/drawingml/2006/main">
+              <a:graphicData uri="http://schemas.openxmlformats.org/drawingml/2006/picture">
+                <pic:pic xmlns:pic="http://schemas.openxmlformats.org/drawingml/2006/picture">
+                  <pic:nvPicPr>
+                    <pic:cNvPr id="0" name="" descr=""/>
+                    <pic:cNvPicPr>
+                      <a:picLocks noChangeAspect="1" noChangeArrowheads="1"/>
+                    </pic:cNvPicPr>
+                  </pic:nvPicPr>
+                  <pic:blipFill>
+                    <a:blip r:embed="rId20" cstate="none"/>
+                    <a:srcRect/>
+                    <a:stretch>
+                      <a:fillRect/>
+                    </a:stretch>
+                  </pic:blipFill>
+                  <pic:spPr bwMode="auto">
+                    <a:xfrm>
+                      <a:off x="0" y="0"/>
                       <a:ext cx="5715000" cy="2124075"/>
                     </a:xfrm>
                     <a:prstGeom prst="rect">
@@ -7565,7 +7591,7 @@
                     </pic:cNvPicPr>
                   </pic:nvPicPr>
                   <pic:blipFill>
-                    <a:blip r:embed="rId20" cstate="none"/>
+                    <a:blip r:embed="rId21" cstate="none"/>
                     <a:srcRect/>
                     <a:stretch>
                       <a:fillRect/>
@@ -7680,75 +7706,6 @@
             <wp:extent cx="4381500" cy="3048000"/>
             <wp:effectExtent t="0" r="0" b="0" l="0"/>
             <wp:docPr id="13" name="Figure 13" descr="Terminal session on the ATtiny85 datasheet: ADC accuracy, electrical characteristics and a correct refusal." title="Figure 13"/>
-            <wp:cNvGraphicFramePr>
-              <a:graphicFrameLocks xmlns:a="http://schemas.openxmlformats.org/drawingml/2006/main" noChangeAspect="1"/>
-            </wp:cNvGraphicFramePr>
-            <a:graphic xmlns:a="http://schemas.openxmlformats.org/drawingml/2006/main">
-              <a:graphicData uri="http://schemas.openxmlformats.org/drawingml/2006/picture">
-                <pic:pic xmlns:pic="http://schemas.openxmlformats.org/drawingml/2006/picture">
-                  <pic:nvPicPr>
-                    <pic:cNvPr id="0" name="" descr=""/>
-                    <pic:cNvPicPr>
-                      <a:picLocks noChangeAspect="1" noChangeArrowheads="1"/>
-                    </pic:cNvPicPr>
-                  </pic:nvPicPr>
-                  <pic:blipFill>
-                    <a:blip r:embed="rId21" cstate="none"/>
-                    <a:srcRect/>
-                    <a:stretch>
-                      <a:fillRect/>
-                    </a:stretch>
-                  </pic:blipFill>
-                  <pic:spPr bwMode="auto">
-                    <a:xfrm>
-                      <a:off x="0" y="0"/>
-                      <a:ext cx="4381500" cy="3048000"/>
-                    </a:xfrm>
-                    <a:prstGeom prst="rect">
-                      <a:avLst/>
-                    </a:prstGeom>
-                  </pic:spPr>
-                </pic:pic>
-              </a:graphicData>
-            </a:graphic>
-          </wp:inline>
-        </w:drawing>
-      </w:r>
-    </w:p>
-    <w:p>
-      <w:pPr>
-        <w:spacing w:after="240"/>
-        <w:jc w:val="center"/>
-      </w:pPr>
-      <w:r>
-        <w:rPr>
-          <w:b/>
-          <w:bCs/>
-          <w:sz w:val="20"/>
-          <w:szCs w:val="20"/>
-        </w:rPr>
-        <w:t xml:space="preserve">Figure 13: </w:t>
-      </w:r>
-      <w:r>
-        <w:rPr>
-          <w:sz w:val="20"/>
-          <w:szCs w:val="20"/>
-        </w:rPr>
-        <w:t xml:space="preserve">Terminal session on the ATtiny85 datasheet: ADC accuracy, electrical characteristics and a correct refusal.</w:t>
-      </w:r>
-    </w:p>
-    <w:p>
-      <w:pPr>
-        <w:keepNext/>
-        <w:spacing w:after="60" w:before="120"/>
-        <w:jc w:val="center"/>
-      </w:pPr>
-      <w:r>
-        <w:drawing>
-          <wp:inline distT="0" distB="0" distL="0" distR="0">
-            <wp:extent cx="4381500" cy="3124200"/>
-            <wp:effectExtent t="0" r="0" b="0" l="0"/>
-            <wp:docPr id="14" name="Figure 14" descr="Terminal session on the ESP32-H2 datasheet: security, radio and peripheral questions." title="Figure 14"/>
             <wp:cNvGraphicFramePr>
               <a:graphicFrameLocks xmlns:a="http://schemas.openxmlformats.org/drawingml/2006/main" noChangeAspect="1"/>
             </wp:cNvGraphicFramePr>
@@ -7771,7 +7728,7 @@
                   <pic:spPr bwMode="auto">
                     <a:xfrm>
                       <a:off x="0" y="0"/>
-                      <a:ext cx="4381500" cy="3124200"/>
+                      <a:ext cx="4381500" cy="3048000"/>
                     </a:xfrm>
                     <a:prstGeom prst="rect">
                       <a:avLst/>
@@ -7796,14 +7753,14 @@
           <w:sz w:val="20"/>
           <w:szCs w:val="20"/>
         </w:rPr>
-        <w:t xml:space="preserve">Figure 14: </w:t>
+        <w:t xml:space="preserve">Figure 13: </w:t>
       </w:r>
       <w:r>
         <w:rPr>
           <w:sz w:val="20"/>
           <w:szCs w:val="20"/>
         </w:rPr>
-        <w:t xml:space="preserve">Terminal session on the ESP32-H2 datasheet: security, radio and peripheral questions.</w:t>
+        <w:t xml:space="preserve">Terminal session on the ATtiny85 datasheet: ADC accuracy, electrical characteristics and a correct refusal.</w:t>
       </w:r>
     </w:p>
     <w:p>
@@ -7815,9 +7772,9 @@
       <w:r>
         <w:drawing>
           <wp:inline distT="0" distB="0" distL="0" distR="0">
-            <wp:extent cx="4381500" cy="3219450"/>
+            <wp:extent cx="4381500" cy="3124200"/>
             <wp:effectExtent t="0" r="0" b="0" l="0"/>
-            <wp:docPr id="15" name="Figure 15" descr="Terminal session on the CC2640R2F datasheet: power, clock, memory, pin-out and tooling questions." title="Figure 15"/>
+            <wp:docPr id="14" name="Figure 14" descr="Terminal session on the ESP32-H2 datasheet: security, radio and peripheral questions." title="Figure 14"/>
             <wp:cNvGraphicFramePr>
               <a:graphicFrameLocks xmlns:a="http://schemas.openxmlformats.org/drawingml/2006/main" noChangeAspect="1"/>
             </wp:cNvGraphicFramePr>
@@ -7840,6 +7797,75 @@
                   <pic:spPr bwMode="auto">
                     <a:xfrm>
                       <a:off x="0" y="0"/>
+                      <a:ext cx="4381500" cy="3124200"/>
+                    </a:xfrm>
+                    <a:prstGeom prst="rect">
+                      <a:avLst/>
+                    </a:prstGeom>
+                  </pic:spPr>
+                </pic:pic>
+              </a:graphicData>
+            </a:graphic>
+          </wp:inline>
+        </w:drawing>
+      </w:r>
+    </w:p>
+    <w:p>
+      <w:pPr>
+        <w:spacing w:after="240"/>
+        <w:jc w:val="center"/>
+      </w:pPr>
+      <w:r>
+        <w:rPr>
+          <w:b/>
+          <w:bCs/>
+          <w:sz w:val="20"/>
+          <w:szCs w:val="20"/>
+        </w:rPr>
+        <w:t xml:space="preserve">Figure 14: </w:t>
+      </w:r>
+      <w:r>
+        <w:rPr>
+          <w:sz w:val="20"/>
+          <w:szCs w:val="20"/>
+        </w:rPr>
+        <w:t xml:space="preserve">Terminal session on the ESP32-H2 datasheet: security, radio and peripheral questions.</w:t>
+      </w:r>
+    </w:p>
+    <w:p>
+      <w:pPr>
+        <w:keepNext/>
+        <w:spacing w:after="60" w:before="120"/>
+        <w:jc w:val="center"/>
+      </w:pPr>
+      <w:r>
+        <w:drawing>
+          <wp:inline distT="0" distB="0" distL="0" distR="0">
+            <wp:extent cx="4381500" cy="3219450"/>
+            <wp:effectExtent t="0" r="0" b="0" l="0"/>
+            <wp:docPr id="15" name="Figure 15" descr="Terminal session on the CC2640R2F datasheet: power, clock, memory, pin-out and tooling questions." title="Figure 15"/>
+            <wp:cNvGraphicFramePr>
+              <a:graphicFrameLocks xmlns:a="http://schemas.openxmlformats.org/drawingml/2006/main" noChangeAspect="1"/>
+            </wp:cNvGraphicFramePr>
+            <a:graphic xmlns:a="http://schemas.openxmlformats.org/drawingml/2006/main">
+              <a:graphicData uri="http://schemas.openxmlformats.org/drawingml/2006/picture">
+                <pic:pic xmlns:pic="http://schemas.openxmlformats.org/drawingml/2006/picture">
+                  <pic:nvPicPr>
+                    <pic:cNvPr id="0" name="" descr=""/>
+                    <pic:cNvPicPr>
+                      <a:picLocks noChangeAspect="1" noChangeArrowheads="1"/>
+                    </pic:cNvPicPr>
+                  </pic:nvPicPr>
+                  <pic:blipFill>
+                    <a:blip r:embed="rId24" cstate="none"/>
+                    <a:srcRect/>
+                    <a:stretch>
+                      <a:fillRect/>
+                    </a:stretch>
+                  </pic:blipFill>
+                  <pic:spPr bwMode="auto">
+                    <a:xfrm>
+                      <a:off x="0" y="0"/>
                       <a:ext cx="4381500" cy="3219450"/>
                     </a:xfrm>
                     <a:prstGeom prst="rect">
@@ -7920,7 +7946,7 @@
                     </pic:cNvPicPr>
                   </pic:nvPicPr>
                   <pic:blipFill>
-                    <a:blip r:embed="rId24" cstate="none"/>
+                    <a:blip r:embed="rId25" cstate="none"/>
                     <a:srcRect/>
                     <a:stretch>
                       <a:fillRect/>

</xml_diff>

<commit_message>
README: animated demo preview linking to the video; report: GitHub link on title page
Co-Authored-By: Claude Opus 5.5 <noreply@anthropic.com>
</commit_message>
<xml_diff>
--- a/docs/ChipDoc_Report.docx
+++ b/docs/ChipDoc_Report.docx
@@ -156,12 +156,6 @@
       <w:pPr>
         <w:spacing w:before="500"/>
         <w:jc w:val="center"/>
-        <w:sectPr>
-          <w:pgSz w:w="11906" w:h="16838" w:orient="portrait"/>
-          <w:pgMar w:top="1440" w:right="1440" w:bottom="1440" w:left="1440" w:header="708" w:footer="708" w:gutter="0"/>
-          <w:pgNumType/>
-          <w:docGrid w:linePitch="360"/>
-        </w:sectPr>
       </w:pPr>
       <w:r>
         <w:rPr>
@@ -172,7 +166,7 @@
         </w:rPr>
         <w:t xml:space="preserve">Video demonstration: </w:t>
       </w:r>
-      <w:hyperlink w:history="1" r:id="rIdudr9kaexdtctevahd1r7k">
+      <w:hyperlink w:history="1" r:id="rIdm1ktfwcnhaevexyf6yu_s">
         <w:r>
           <w:rPr>
             <w:color w:val="1155CC"/>
@@ -181,6 +175,38 @@
             <w:u w:val="single"/>
           </w:rPr>
           <w:t xml:space="preserve">Watch the ChipDoc demo on Google Drive</w:t>
+        </w:r>
+      </w:hyperlink>
+    </w:p>
+    <w:p>
+      <w:pPr>
+        <w:spacing w:before="120"/>
+        <w:jc w:val="center"/>
+        <w:sectPr>
+          <w:pgSz w:w="11906" w:h="16838" w:orient="portrait"/>
+          <w:pgMar w:top="1440" w:right="1440" w:bottom="1440" w:left="1440" w:header="708" w:footer="708" w:gutter="0"/>
+          <w:pgNumType/>
+          <w:docGrid w:linePitch="360"/>
+        </w:sectPr>
+      </w:pPr>
+      <w:r>
+        <w:rPr>
+          <w:b/>
+          <w:bCs/>
+          <w:sz w:val="24"/>
+          <w:szCs w:val="24"/>
+        </w:rPr>
+        <w:t xml:space="preserve">Source code: </w:t>
+      </w:r>
+      <w:hyperlink w:history="1" r:id="rIdutbcpyxlkgyfspqddizkw">
+        <w:r>
+          <w:rPr>
+            <w:color w:val="1155CC"/>
+            <w:sz w:val="24"/>
+            <w:szCs w:val="24"/>
+            <w:u w:val="single"/>
+          </w:rPr>
+          <w:t xml:space="preserve">github.com/js0nnn/chip-doc</w:t>
         </w:r>
       </w:hyperlink>
     </w:p>
@@ -2619,7 +2645,7 @@
                     </pic:cNvPicPr>
                   </pic:nvPicPr>
                   <pic:blipFill>
-                    <a:blip r:embed="rId10" cstate="none"/>
+                    <a:blip r:embed="rId11" cstate="none"/>
                     <a:srcRect/>
                     <a:stretch>
                       <a:fillRect/>
@@ -2724,134 +2750,6 @@
             <wp:extent cx="4476750" cy="4219575"/>
             <wp:effectExtent t="0" r="0" b="0" l="0"/>
             <wp:docPr id="2" name="Figure 2" descr="Pages per datasheet (log scale). Blue bars are the five held-out test datasheets." title="Figure 2"/>
-            <wp:cNvGraphicFramePr>
-              <a:graphicFrameLocks xmlns:a="http://schemas.openxmlformats.org/drawingml/2006/main" noChangeAspect="1"/>
-            </wp:cNvGraphicFramePr>
-            <a:graphic xmlns:a="http://schemas.openxmlformats.org/drawingml/2006/main">
-              <a:graphicData uri="http://schemas.openxmlformats.org/drawingml/2006/picture">
-                <pic:pic xmlns:pic="http://schemas.openxmlformats.org/drawingml/2006/picture">
-                  <pic:nvPicPr>
-                    <pic:cNvPr id="0" name="" descr=""/>
-                    <pic:cNvPicPr>
-                      <a:picLocks noChangeAspect="1" noChangeArrowheads="1"/>
-                    </pic:cNvPicPr>
-                  </pic:nvPicPr>
-                  <pic:blipFill>
-                    <a:blip r:embed="rId11" cstate="none"/>
-                    <a:srcRect/>
-                    <a:stretch>
-                      <a:fillRect/>
-                    </a:stretch>
-                  </pic:blipFill>
-                  <pic:spPr bwMode="auto">
-                    <a:xfrm>
-                      <a:off x="0" y="0"/>
-                      <a:ext cx="4476750" cy="4219575"/>
-                    </a:xfrm>
-                    <a:prstGeom prst="rect">
-                      <a:avLst/>
-                    </a:prstGeom>
-                  </pic:spPr>
-                </pic:pic>
-              </a:graphicData>
-            </a:graphic>
-          </wp:inline>
-        </w:drawing>
-      </w:r>
-    </w:p>
-    <w:p>
-      <w:pPr>
-        <w:spacing w:after="240"/>
-        <w:jc w:val="center"/>
-      </w:pPr>
-      <w:r>
-        <w:rPr>
-          <w:b/>
-          <w:bCs/>
-          <w:sz w:val="20"/>
-          <w:szCs w:val="20"/>
-        </w:rPr>
-        <w:t xml:space="preserve">Figure 2: </w:t>
-      </w:r>
-      <w:r>
-        <w:rPr>
-          <w:sz w:val="20"/>
-          <w:szCs w:val="20"/>
-        </w:rPr>
-        <w:t xml:space="preserve">Pages per datasheet (log scale). Blue bars are the five held-out test datasheets.</w:t>
-      </w:r>
-    </w:p>
-    <w:p>
-      <w:pPr>
-        <w:pStyle w:val="Heading2"/>
-      </w:pPr>
-      <w:bookmarkStart w:name="_Toc18" w:id="18"/>
-      <w:r>
-        <w:t xml:space="preserve">3.3 PDF Extraction and Chunking</w:t>
-      </w:r>
-      <w:bookmarkEnd w:id="18"/>
-    </w:p>
-    <w:p>
-      <w:pPr>
-        <w:spacing w:after="140" w:line="300"/>
-        <w:jc w:val="both"/>
-      </w:pPr>
-      <w:r>
-        <w:t xml:space="preserve">Each PDF is first validated at the trust boundary: it must exist, begin with the </w:t>
-      </w:r>
-      <w:r>
-        <w:rPr>
-          <w:rFonts w:ascii="Courier New" w:cs="Courier New" w:eastAsia="Courier New" w:hAnsi="Courier New"/>
-          <w:sz w:val="22"/>
-          <w:szCs w:val="22"/>
-        </w:rPr>
-        <w:t xml:space="preserve">%PDF-</w:t>
-      </w:r>
-      <w:r>
-        <w:t xml:space="preserve"> magic bytes, and be at most 100 MB and 2,000 pages. Text is extracted with pymupdf4llm, which converts every page to Markdown and keeps tables as Markdown tables. Lines shorter than 80 characters that repeat on at least 30% of pages (minimum five) are treated as running headers and footers and removed; table rows are exempt because separator rows repeat legitimately. Invalid Unicode surrogates produced by some PDFs are replaced.</w:t>
-      </w:r>
-    </w:p>
-    <w:p>
-      <w:pPr>
-        <w:spacing w:after="140" w:line="300"/>
-        <w:jc w:val="both"/>
-      </w:pPr>
-      <w:r>
-        <w:t xml:space="preserve">Chunking follows the steps in Figure 3. Each page is split at Markdown headings, and each block is split into passages of at most 1,200 characters, preferring paragraph, then line, then sentence boundaries, with a 150-character overlap. Two design choices matter. First, </w:t>
-      </w:r>
-      <w:r>
-        <w:rPr>
-          <w:b/>
-          <w:bCs/>
-        </w:rPr>
-        <w:t xml:space="preserve">a passage never crosses a page</w:t>
-      </w:r>
-      <w:r>
-        <w:t xml:space="preserve">, so every answer can cite one exact page. Second, the </w:t>
-      </w:r>
-      <w:r>
-        <w:rPr>
-          <w:b/>
-          <w:bCs/>
-        </w:rPr>
-        <w:t xml:space="preserve">section label</w:t>
-      </w:r>
-      <w:r>
-        <w:t xml:space="preserve"> is the most recent heading, carried across pages, with the PDF bookmarks as a fallback; PDFs without bookmarks therefore still work. The project’s initial chunker produced passages averaging 3,000 and up to 8,000 characters, far beyond the 512-token window of the embedding model, so most of each passage was never embedded; the 1,200-character limit (about 400–500 tokens of datasheet text) fixes this.</w:t>
-      </w:r>
-    </w:p>
-    <w:p>
-      <w:pPr>
-        <w:keepNext/>
-        <w:spacing w:after="60" w:before="120"/>
-        <w:jc w:val="center"/>
-      </w:pPr>
-      <w:r>
-        <w:drawing>
-          <wp:inline distT="0" distB="0" distL="0" distR="0">
-            <wp:extent cx="2762250" cy="3971925"/>
-            <wp:effectExtent t="0" r="0" b="0" l="0"/>
-            <wp:docPr id="3" name="Figure 3" descr="Chunking pipeline: from PDF pages to page-bounded passages with section labels." title="Figure 3"/>
             <wp:cNvGraphicFramePr>
               <a:graphicFrameLocks xmlns:a="http://schemas.openxmlformats.org/drawingml/2006/main" noChangeAspect="1"/>
             </wp:cNvGraphicFramePr>
@@ -2874,7 +2772,7 @@
                   <pic:spPr bwMode="auto">
                     <a:xfrm>
                       <a:off x="0" y="0"/>
-                      <a:ext cx="2762250" cy="3971925"/>
+                      <a:ext cx="4476750" cy="4219575"/>
                     </a:xfrm>
                     <a:prstGeom prst="rect">
                       <a:avLst/>
@@ -2899,25 +2797,25 @@
           <w:sz w:val="20"/>
           <w:szCs w:val="20"/>
         </w:rPr>
-        <w:t xml:space="preserve">Figure 3: </w:t>
+        <w:t xml:space="preserve">Figure 2: </w:t>
       </w:r>
       <w:r>
         <w:rPr>
           <w:sz w:val="20"/>
           <w:szCs w:val="20"/>
         </w:rPr>
-        <w:t xml:space="preserve">Chunking pipeline: from PDF pages to page-bounded passages with section labels.</w:t>
+        <w:t xml:space="preserve">Pages per datasheet (log scale). Blue bars are the five held-out test datasheets.</w:t>
       </w:r>
     </w:p>
     <w:p>
       <w:pPr>
         <w:pStyle w:val="Heading2"/>
       </w:pPr>
-      <w:bookmarkStart w:name="_Toc19" w:id="19"/>
-      <w:r>
-        <w:t xml:space="preserve">3.4 Hybrid Retrieval</w:t>
-      </w:r>
-      <w:bookmarkEnd w:id="19"/>
+      <w:bookmarkStart w:name="_Toc18" w:id="18"/>
+      <w:r>
+        <w:t xml:space="preserve">3.3 PDF Extraction and Chunking</w:t>
+      </w:r>
+      <w:bookmarkEnd w:id="18"/>
     </w:p>
     <w:p>
       <w:pPr>
@@ -2925,37 +2823,7 @@
         <w:jc w:val="both"/>
       </w:pPr>
       <w:r>
-        <w:t xml:space="preserve">Each passage is indexed twice. The </w:t>
-      </w:r>
-      <w:r>
-        <w:rPr>
-          <w:b/>
-          <w:bCs/>
-        </w:rPr>
-        <w:t xml:space="preserve">dense index</w:t>
-      </w:r>
-      <w:r>
-        <w:t xml:space="preserve"> embeds “document | section” followed by the passage text with </w:t>
-      </w:r>
-      <w:r>
-        <w:rPr>
-          <w:i/>
-          <w:iCs/>
-        </w:rPr>
-        <w:t xml:space="preserve">bge-small-en-v1.5</w:t>
-      </w:r>
-      <w:r>
-        <w:t xml:space="preserve"> (384 dimensions, normalised) and stores the vectors in a FAISS inner-product index; queries are prefixed with the model’s retrieval instruction. The </w:t>
-      </w:r>
-      <w:r>
-        <w:rPr>
-          <w:b/>
-          <w:bCs/>
-        </w:rPr>
-        <w:t xml:space="preserve">keyword index</w:t>
-      </w:r>
-      <w:r>
-        <w:t xml:space="preserve"> is BM25 over a tokenizer that keeps identifiers such as </w:t>
+        <w:t xml:space="preserve">Each PDF is first validated at the trust boundary: it must exist, begin with the </w:t>
       </w:r>
       <w:r>
         <w:rPr>
@@ -2963,34 +2831,10 @@
           <w:sz w:val="22"/>
           <w:szCs w:val="22"/>
         </w:rPr>
-        <w:t xml:space="preserve">tim2_ccr1</w:t>
-      </w:r>
-      <w:r>
-        <w:t xml:space="preserve"> and values such as </w:t>
-      </w:r>
-      <w:r>
-        <w:rPr>
-          <w:rFonts w:ascii="Courier New" w:cs="Courier New" w:eastAsia="Courier New" w:hAnsi="Courier New"/>
-          <w:sz w:val="22"/>
-          <w:szCs w:val="22"/>
-        </w:rPr>
-        <w:t xml:space="preserve">3.3</w:t>
-      </w:r>
-      <w:r>
-        <w:t xml:space="preserve"> intact. For a question, each retriever returns its top 50 passages, and the two lists are fused with Reciprocal Rank Fusion:</w:t>
-      </w:r>
-    </w:p>
-    <w:p>
-      <w:pPr>
-        <w:spacing w:after="160" w:before="80"/>
-        <w:jc w:val="center"/>
-      </w:pPr>
-      <w:r>
-        <w:rPr>
-          <w:i/>
-          <w:iCs/>
-        </w:rPr>
-        <w:t xml:space="preserve">RRF(d) = Σ over rankers r of  1 / (k + rank_r(d)),   with k = 60</w:t>
+        <w:t xml:space="preserve">%PDF-</w:t>
+      </w:r>
+      <w:r>
+        <w:t xml:space="preserve"> magic bytes, and be at most 100 MB and 2,000 pages. Text is extracted with pymupdf4llm, which converts every page to Markdown and keeps tables as Markdown tables. Lines shorter than 80 characters that repeat on at least 30% of pages (minimum five) are treated as running headers and footers and removed; table rows are exempt because separator rows repeat legitimately. Invalid Unicode surrogates produced by some PDFs are replaced.</w:t>
       </w:r>
     </w:p>
     <w:p>
@@ -2999,36 +2843,27 @@
         <w:jc w:val="both"/>
       </w:pPr>
       <w:r>
-        <w:t xml:space="preserve">The five highest-scoring passages are passed to the model. Indexes are stored as JSON plus a FAISS file, deliberately avoiding Python pickle, because loading a pickle can execute code and the cache sits next to user-supplied data. Each PDF’s index is cached under the SHA-256 hash of its contents, so a second session on the same file starts instantly.</w:t>
-      </w:r>
-    </w:p>
-    <w:p>
-      <w:pPr>
-        <w:pStyle w:val="Heading2"/>
-      </w:pPr>
-      <w:bookmarkStart w:name="_Toc20" w:id="20"/>
-      <w:r>
-        <w:t xml:space="preserve">3.5 Synthetic Question–Answer Generation</w:t>
-      </w:r>
-      <w:bookmarkEnd w:id="20"/>
-    </w:p>
-    <w:p>
-      <w:pPr>
-        <w:spacing w:after="140" w:line="300"/>
-        <w:jc w:val="both"/>
-      </w:pPr>
-      <w:r>
-        <w:t xml:space="preserve">Fine-tuning needs questions with known answers and known evidence. These were generated locally (Figure 4). Up to 40 content-rich passages were sampled per datasheet—skipping passages under 500 characters, without digits, resembling a table of contents, or from revision-history, ordering, legal or package-marking sections—for 1,144 passages in total. A teacher model, </w:t>
-      </w:r>
-      <w:r>
-        <w:rPr>
-          <w:i/>
-          <w:iCs/>
-        </w:rPr>
-        <w:t xml:space="preserve">qwen3:4b</w:t>
-      </w:r>
-      <w:r>
-        <w:t xml:space="preserve"> served by Ollama with JSON-schema-constrained output, wrote two questions per passage, each with a short answer and a verbatim evidence span copied from the passage.</w:t>
+        <w:t xml:space="preserve">Chunking follows the steps in Figure 3. Each page is split at Markdown headings, and each block is split into passages of at most 1,200 characters, preferring paragraph, then line, then sentence boundaries, with a 150-character overlap. Two design choices matter. First, </w:t>
+      </w:r>
+      <w:r>
+        <w:rPr>
+          <w:b/>
+          <w:bCs/>
+        </w:rPr>
+        <w:t xml:space="preserve">a passage never crosses a page</w:t>
+      </w:r>
+      <w:r>
+        <w:t xml:space="preserve">, so every answer can cite one exact page. Second, the </w:t>
+      </w:r>
+      <w:r>
+        <w:rPr>
+          <w:b/>
+          <w:bCs/>
+        </w:rPr>
+        <w:t xml:space="preserve">section label</w:t>
+      </w:r>
+      <w:r>
+        <w:t xml:space="preserve"> is the most recent heading, carried across pages, with the PDF bookmarks as a fallback; PDFs without bookmarks therefore still work. The project’s initial chunker produced passages averaging 3,000 and up to 8,000 characters, far beyond the 512-token window of the embedding model, so most of each passage was never embedded; the 1,200-character limit (about 400–500 tokens of datasheet text) fixes this.</w:t>
       </w:r>
     </w:p>
     <w:p>
@@ -3040,9 +2875,9 @@
       <w:r>
         <w:drawing>
           <wp:inline distT="0" distB="0" distL="0" distR="0">
-            <wp:extent cx="2476500" cy="4714875"/>
+            <wp:extent cx="2762250" cy="3971925"/>
             <wp:effectExtent t="0" r="0" b="0" l="0"/>
-            <wp:docPr id="4" name="Figure 4" descr="Data pipeline from raw PDFs to the trained adapter, with the script that produces each stage." title="Figure 4"/>
+            <wp:docPr id="3" name="Figure 3" descr="Chunking pipeline: from PDF pages to page-bounded passages with section labels." title="Figure 3"/>
             <wp:cNvGraphicFramePr>
               <a:graphicFrameLocks xmlns:a="http://schemas.openxmlformats.org/drawingml/2006/main" noChangeAspect="1"/>
             </wp:cNvGraphicFramePr>
@@ -3065,7 +2900,7 @@
                   <pic:spPr bwMode="auto">
                     <a:xfrm>
                       <a:off x="0" y="0"/>
-                      <a:ext cx="2476500" cy="4714875"/>
+                      <a:ext cx="2762250" cy="3971925"/>
                     </a:xfrm>
                     <a:prstGeom prst="rect">
                       <a:avLst/>
@@ -3090,15 +2925,25 @@
           <w:sz w:val="20"/>
           <w:szCs w:val="20"/>
         </w:rPr>
-        <w:t xml:space="preserve">Figure 4: </w:t>
+        <w:t xml:space="preserve">Figure 3: </w:t>
       </w:r>
       <w:r>
         <w:rPr>
           <w:sz w:val="20"/>
           <w:szCs w:val="20"/>
         </w:rPr>
-        <w:t xml:space="preserve">Data pipeline from raw PDFs to the trained adapter, with the script that produces each stage.</w:t>
-      </w:r>
+        <w:t xml:space="preserve">Chunking pipeline: from PDF pages to page-bounded passages with section labels.</w:t>
+      </w:r>
+    </w:p>
+    <w:p>
+      <w:pPr>
+        <w:pStyle w:val="Heading2"/>
+      </w:pPr>
+      <w:bookmarkStart w:name="_Toc19" w:id="19"/>
+      <w:r>
+        <w:t xml:space="preserve">3.4 Hybrid Retrieval</w:t>
+      </w:r>
+      <w:bookmarkEnd w:id="19"/>
     </w:p>
     <w:p>
       <w:pPr>
@@ -3106,28 +2951,73 @@
         <w:jc w:val="both"/>
       </w:pPr>
       <w:r>
-        <w:t xml:space="preserve">A small teacher is error-prone, so every pair passed four automatic filters: (1) the question is 15–300 characters, ends with a question mark and does not refer to “this table”, “the excerpt” or document metadata; (2) the evidence appears in the passage verbatim or with at least 90% of its words; (3) </w:t>
+        <w:t xml:space="preserve">Each passage is indexed twice. The </w:t>
       </w:r>
       <w:r>
         <w:rPr>
           <w:b/>
           <w:bCs/>
         </w:rPr>
-        <w:t xml:space="preserve">every number in the answer appears in the passage</w:t>
-      </w:r>
-      <w:r>
-        <w:t xml:space="preserve">, ignoring digits inside part and register names such as CC2652R; and (4) the question is not a duplicate. Filter (3) is the main guard against invented values.</w:t>
-      </w:r>
-    </w:p>
-    <w:p>
-      <w:pPr>
-        <w:pStyle w:val="Heading2"/>
-      </w:pPr>
-      <w:bookmarkStart w:name="_Toc21" w:id="21"/>
-      <w:r>
-        <w:t xml:space="preserve">3.6 RAFT-style Training Examples</w:t>
-      </w:r>
-      <w:bookmarkEnd w:id="21"/>
+        <w:t xml:space="preserve">dense index</w:t>
+      </w:r>
+      <w:r>
+        <w:t xml:space="preserve"> embeds “document | section” followed by the passage text with </w:t>
+      </w:r>
+      <w:r>
+        <w:rPr>
+          <w:i/>
+          <w:iCs/>
+        </w:rPr>
+        <w:t xml:space="preserve">bge-small-en-v1.5</w:t>
+      </w:r>
+      <w:r>
+        <w:t xml:space="preserve"> (384 dimensions, normalised) and stores the vectors in a FAISS inner-product index; queries are prefixed with the model’s retrieval instruction. The </w:t>
+      </w:r>
+      <w:r>
+        <w:rPr>
+          <w:b/>
+          <w:bCs/>
+        </w:rPr>
+        <w:t xml:space="preserve">keyword index</w:t>
+      </w:r>
+      <w:r>
+        <w:t xml:space="preserve"> is BM25 over a tokenizer that keeps identifiers such as </w:t>
+      </w:r>
+      <w:r>
+        <w:rPr>
+          <w:rFonts w:ascii="Courier New" w:cs="Courier New" w:eastAsia="Courier New" w:hAnsi="Courier New"/>
+          <w:sz w:val="22"/>
+          <w:szCs w:val="22"/>
+        </w:rPr>
+        <w:t xml:space="preserve">tim2_ccr1</w:t>
+      </w:r>
+      <w:r>
+        <w:t xml:space="preserve"> and values such as </w:t>
+      </w:r>
+      <w:r>
+        <w:rPr>
+          <w:rFonts w:ascii="Courier New" w:cs="Courier New" w:eastAsia="Courier New" w:hAnsi="Courier New"/>
+          <w:sz w:val="22"/>
+          <w:szCs w:val="22"/>
+        </w:rPr>
+        <w:t xml:space="preserve">3.3</w:t>
+      </w:r>
+      <w:r>
+        <w:t xml:space="preserve"> intact. For a question, each retriever returns its top 50 passages, and the two lists are fused with Reciprocal Rank Fusion:</w:t>
+      </w:r>
+    </w:p>
+    <w:p>
+      <w:pPr>
+        <w:spacing w:after="160" w:before="80"/>
+        <w:jc w:val="center"/>
+      </w:pPr>
+      <w:r>
+        <w:rPr>
+          <w:i/>
+          <w:iCs/>
+        </w:rPr>
+        <w:t xml:space="preserve">RRF(d) = Σ over rankers r of  1 / (k + rank_r(d)),   with k = 60</w:t>
+      </w:r>
     </w:p>
     <w:p>
       <w:pPr>
@@ -3135,17 +3025,36 @@
         <w:jc w:val="both"/>
       </w:pPr>
       <w:r>
-        <w:t xml:space="preserve">Following RAFT [12], each kept pair becomes an example that looks exactly like inference (Figure 5). The question is run through the hybrid retriever on its own datasheet; the top hits other than the source passage become </w:t>
-      </w:r>
-      <w:r>
-        <w:rPr>
-          <w:b/>
-          <w:bCs/>
-        </w:rPr>
-        <w:t xml:space="preserve">hard distractors</w:t>
-      </w:r>
-      <w:r>
-        <w:t xml:space="preserve">—same peripheral, neighbouring pages—so the model must locate the right passage rather than trust the first one. In about 80% of examples the context is the source passage plus four distractors, shuffled, and the target is the answer followed by the source page, e.g. “… up to 100 MHz. [p.1]”. In about 20% the source passage is removed and the target is “Not found in the provided datasheet.”; this happens only if no distractor contains the evidence, so the model is never taught to refuse an answerable question.</w:t>
+        <w:t xml:space="preserve">The five highest-scoring passages are passed to the model. Indexes are stored as JSON plus a FAISS file, deliberately avoiding Python pickle, because loading a pickle can execute code and the cache sits next to user-supplied data. Each PDF’s index is cached under the SHA-256 hash of its contents, so a second session on the same file starts instantly.</w:t>
+      </w:r>
+    </w:p>
+    <w:p>
+      <w:pPr>
+        <w:pStyle w:val="Heading2"/>
+      </w:pPr>
+      <w:bookmarkStart w:name="_Toc20" w:id="20"/>
+      <w:r>
+        <w:t xml:space="preserve">3.5 Synthetic Question–Answer Generation</w:t>
+      </w:r>
+      <w:bookmarkEnd w:id="20"/>
+    </w:p>
+    <w:p>
+      <w:pPr>
+        <w:spacing w:after="140" w:line="300"/>
+        <w:jc w:val="both"/>
+      </w:pPr>
+      <w:r>
+        <w:t xml:space="preserve">Fine-tuning needs questions with known answers and known evidence. These were generated locally (Figure 4). Up to 40 content-rich passages were sampled per datasheet—skipping passages under 500 characters, without digits, resembling a table of contents, or from revision-history, ordering, legal or package-marking sections—for 1,144 passages in total. A teacher model, </w:t>
+      </w:r>
+      <w:r>
+        <w:rPr>
+          <w:i/>
+          <w:iCs/>
+        </w:rPr>
+        <w:t xml:space="preserve">qwen3:4b</w:t>
+      </w:r>
+      <w:r>
+        <w:t xml:space="preserve"> served by Ollama with JSON-schema-constrained output, wrote two questions per passage, each with a short answer and a verbatim evidence span copied from the passage.</w:t>
       </w:r>
     </w:p>
     <w:p>
@@ -3157,9 +3066,9 @@
       <w:r>
         <w:drawing>
           <wp:inline distT="0" distB="0" distL="0" distR="0">
-            <wp:extent cx="4000500" cy="5219700"/>
+            <wp:extent cx="2476500" cy="4714875"/>
             <wp:effectExtent t="0" r="0" b="0" l="0"/>
-            <wp:docPr id="5" name="Figure 5" descr="Construction of a RAFT-style training example from a filtered QA pair." title="Figure 5"/>
+            <wp:docPr id="4" name="Figure 4" descr="Data pipeline from raw PDFs to the trained adapter, with the script that produces each stage." title="Figure 4"/>
             <wp:cNvGraphicFramePr>
               <a:graphicFrameLocks xmlns:a="http://schemas.openxmlformats.org/drawingml/2006/main" noChangeAspect="1"/>
             </wp:cNvGraphicFramePr>
@@ -3182,7 +3091,7 @@
                   <pic:spPr bwMode="auto">
                     <a:xfrm>
                       <a:off x="0" y="0"/>
-                      <a:ext cx="4000500" cy="5219700"/>
+                      <a:ext cx="2476500" cy="4714875"/>
                     </a:xfrm>
                     <a:prstGeom prst="rect">
                       <a:avLst/>
@@ -3207,25 +3116,15 @@
           <w:sz w:val="20"/>
           <w:szCs w:val="20"/>
         </w:rPr>
-        <w:t xml:space="preserve">Figure 5: </w:t>
+        <w:t xml:space="preserve">Figure 4: </w:t>
       </w:r>
       <w:r>
         <w:rPr>
           <w:sz w:val="20"/>
           <w:szCs w:val="20"/>
         </w:rPr>
-        <w:t xml:space="preserve">Construction of a RAFT-style training example from a filtered QA pair.</w:t>
-      </w:r>
-    </w:p>
-    <w:p>
-      <w:pPr>
-        <w:pStyle w:val="Heading2"/>
-      </w:pPr>
-      <w:bookmarkStart w:name="_Toc22" w:id="22"/>
-      <w:r>
-        <w:t xml:space="preserve">3.7 Model and Fine-tuning</w:t>
-      </w:r>
-      <w:bookmarkEnd w:id="22"/>
+        <w:t xml:space="preserve">Data pipeline from raw PDFs to the trained adapter, with the script that produces each stage.</w:t>
+      </w:r>
     </w:p>
     <w:p>
       <w:pPr>
@@ -3233,718 +3132,28 @@
         <w:jc w:val="both"/>
       </w:pPr>
       <w:r>
-        <w:t xml:space="preserve">The reader is Qwen3-0.6B with thinking mode disabled. The system prompt instructs it to use only the numbered passages, copy values and units exactly, cite pages as [p.N], and otherwise reply with the fixed refusal sentence. LoRA adapters were trained on all attention and MLP projections with loss computed on answer tokens only (Table 2). Examples longer than 2,560 tokens (3%) were dropped rather than truncated, because truncation would remove the answer, which comes last.</w:t>
-      </w:r>
-    </w:p>
-    <w:p>
-      <w:pPr>
-        <w:keepNext/>
-        <w:spacing w:after="80" w:before="160"/>
-        <w:jc w:val="center"/>
-      </w:pPr>
+        <w:t xml:space="preserve">A small teacher is error-prone, so every pair passed four automatic filters: (1) the question is 15–300 characters, ends with a question mark and does not refer to “this table”, “the excerpt” or document metadata; (2) the evidence appears in the passage verbatim or with at least 90% of its words; (3) </w:t>
+      </w:r>
       <w:r>
         <w:rPr>
           <w:b/>
           <w:bCs/>
-          <w:sz w:val="20"/>
-          <w:szCs w:val="20"/>
-        </w:rPr>
-        <w:t xml:space="preserve">Table 2: </w:t>
-      </w:r>
-      <w:r>
-        <w:rPr>
-          <w:sz w:val="20"/>
-          <w:szCs w:val="20"/>
-        </w:rPr>
-        <w:t xml:space="preserve">Fine-tuning configuration</w:t>
-      </w:r>
-    </w:p>
-    <w:tbl>
-      <w:tblPr>
-        <w:tblW w:type="dxa" w:w="9026"/>
-        <w:jc w:val="center"/>
-        <w:tblBorders>
-          <w:top w:val="single" w:color="auto" w:sz="4"/>
-          <w:left w:val="single" w:color="auto" w:sz="4"/>
-          <w:bottom w:val="single" w:color="auto" w:sz="4"/>
-          <w:right w:val="single" w:color="auto" w:sz="4"/>
-          <w:insideH w:val="single" w:color="auto" w:sz="4"/>
-          <w:insideV w:val="single" w:color="auto" w:sz="4"/>
-        </w:tblBorders>
-      </w:tblPr>
-      <w:tblGrid>
-        <w:gridCol w:w="3000"/>
-        <w:gridCol w:w="6026"/>
-      </w:tblGrid>
-      <w:tr>
-        <w:trPr>
-          <w:tblHeader/>
-        </w:trPr>
-        <w:tc>
-          <w:tcPr>
-            <w:tcW w:type="dxa" w:w="3000"/>
-            <w:tcBorders>
-              <w:top w:val="single" w:color="BFBFBF" w:sz="4"/>
-              <w:left w:val="single" w:color="BFBFBF" w:sz="4"/>
-              <w:bottom w:val="single" w:color="BFBFBF" w:sz="4"/>
-              <w:right w:val="single" w:color="BFBFBF" w:sz="4"/>
-            </w:tcBorders>
-            <w:shd w:fill="1F6F8B" w:color="auto" w:val="clear"/>
-            <w:tcMar>
-              <w:top w:type="dxa" w:w="60"/>
-              <w:left w:type="dxa" w:w="100"/>
-              <w:bottom w:type="dxa" w:w="60"/>
-              <w:right w:type="dxa" w:w="100"/>
-            </w:tcMar>
-          </w:tcPr>
-          <w:p>
-            <w:pPr>
-              <w:spacing w:after="0" w:line="260"/>
-            </w:pPr>
-            <w:r>
-              <w:rPr>
-                <w:b/>
-                <w:bCs/>
-                <w:color w:val="FFFFFF"/>
-                <w:sz w:val="20"/>
-                <w:szCs w:val="20"/>
-              </w:rPr>
-              <w:t xml:space="preserve">Setting</w:t>
-            </w:r>
-          </w:p>
-        </w:tc>
-        <w:tc>
-          <w:tcPr>
-            <w:tcW w:type="dxa" w:w="6026"/>
-            <w:tcBorders>
-              <w:top w:val="single" w:color="BFBFBF" w:sz="4"/>
-              <w:left w:val="single" w:color="BFBFBF" w:sz="4"/>
-              <w:bottom w:val="single" w:color="BFBFBF" w:sz="4"/>
-              <w:right w:val="single" w:color="BFBFBF" w:sz="4"/>
-            </w:tcBorders>
-            <w:shd w:fill="1F6F8B" w:color="auto" w:val="clear"/>
-            <w:tcMar>
-              <w:top w:type="dxa" w:w="60"/>
-              <w:left w:type="dxa" w:w="100"/>
-              <w:bottom w:type="dxa" w:w="60"/>
-              <w:right w:type="dxa" w:w="100"/>
-            </w:tcMar>
-          </w:tcPr>
-          <w:p>
-            <w:pPr>
-              <w:spacing w:after="0" w:line="260"/>
-            </w:pPr>
-            <w:r>
-              <w:rPr>
-                <w:b/>
-                <w:bCs/>
-                <w:color w:val="FFFFFF"/>
-                <w:sz w:val="20"/>
-                <w:szCs w:val="20"/>
-              </w:rPr>
-              <w:t xml:space="preserve">Value</w:t>
-            </w:r>
-          </w:p>
-        </w:tc>
-      </w:tr>
-      <w:tr>
-        <w:trPr>
-          <w:cantSplit/>
-        </w:trPr>
-        <w:tc>
-          <w:tcPr>
-            <w:tcW w:type="dxa" w:w="3000"/>
-            <w:tcBorders>
-              <w:top w:val="single" w:color="BFBFBF" w:sz="4"/>
-              <w:left w:val="single" w:color="BFBFBF" w:sz="4"/>
-              <w:bottom w:val="single" w:color="BFBFBF" w:sz="4"/>
-              <w:right w:val="single" w:color="BFBFBF" w:sz="4"/>
-            </w:tcBorders>
-            <w:tcMar>
-              <w:top w:type="dxa" w:w="60"/>
-              <w:left w:type="dxa" w:w="100"/>
-              <w:bottom w:type="dxa" w:w="60"/>
-              <w:right w:type="dxa" w:w="100"/>
-            </w:tcMar>
-          </w:tcPr>
-          <w:p>
-            <w:pPr>
-              <w:spacing w:after="0" w:line="260"/>
-            </w:pPr>
-            <w:r>
-              <w:rPr>
-                <w:color w:val="262626"/>
-                <w:sz w:val="20"/>
-                <w:szCs w:val="20"/>
-              </w:rPr>
-              <w:t xml:space="preserve">Base model</w:t>
-            </w:r>
-          </w:p>
-        </w:tc>
-        <w:tc>
-          <w:tcPr>
-            <w:tcW w:type="dxa" w:w="6026"/>
-            <w:tcBorders>
-              <w:top w:val="single" w:color="BFBFBF" w:sz="4"/>
-              <w:left w:val="single" w:color="BFBFBF" w:sz="4"/>
-              <w:bottom w:val="single" w:color="BFBFBF" w:sz="4"/>
-              <w:right w:val="single" w:color="BFBFBF" w:sz="4"/>
-            </w:tcBorders>
-            <w:tcMar>
-              <w:top w:type="dxa" w:w="60"/>
-              <w:left w:type="dxa" w:w="100"/>
-              <w:bottom w:type="dxa" w:w="60"/>
-              <w:right w:type="dxa" w:w="100"/>
-            </w:tcMar>
-          </w:tcPr>
-          <w:p>
-            <w:pPr>
-              <w:spacing w:after="0" w:line="260"/>
-            </w:pPr>
-            <w:r>
-              <w:rPr>
-                <w:color w:val="262626"/>
-                <w:sz w:val="20"/>
-                <w:szCs w:val="20"/>
-              </w:rPr>
-              <w:t xml:space="preserve">Qwen/Qwen3-0.6B (bf16, thinking off)</w:t>
-            </w:r>
-          </w:p>
-        </w:tc>
-      </w:tr>
-      <w:tr>
-        <w:trPr>
-          <w:cantSplit/>
-        </w:trPr>
-        <w:tc>
-          <w:tcPr>
-            <w:tcW w:type="dxa" w:w="3000"/>
-            <w:tcBorders>
-              <w:top w:val="single" w:color="BFBFBF" w:sz="4"/>
-              <w:left w:val="single" w:color="BFBFBF" w:sz="4"/>
-              <w:bottom w:val="single" w:color="BFBFBF" w:sz="4"/>
-              <w:right w:val="single" w:color="BFBFBF" w:sz="4"/>
-            </w:tcBorders>
-            <w:shd w:fill="F2F2F2" w:color="auto" w:val="clear"/>
-            <w:tcMar>
-              <w:top w:type="dxa" w:w="60"/>
-              <w:left w:type="dxa" w:w="100"/>
-              <w:bottom w:type="dxa" w:w="60"/>
-              <w:right w:type="dxa" w:w="100"/>
-            </w:tcMar>
-          </w:tcPr>
-          <w:p>
-            <w:pPr>
-              <w:spacing w:after="0" w:line="260"/>
-            </w:pPr>
-            <w:r>
-              <w:rPr>
-                <w:color w:val="262626"/>
-                <w:sz w:val="20"/>
-                <w:szCs w:val="20"/>
-              </w:rPr>
-              <w:t xml:space="preserve">Method</w:t>
-            </w:r>
-          </w:p>
-        </w:tc>
-        <w:tc>
-          <w:tcPr>
-            <w:tcW w:type="dxa" w:w="6026"/>
-            <w:tcBorders>
-              <w:top w:val="single" w:color="BFBFBF" w:sz="4"/>
-              <w:left w:val="single" w:color="BFBFBF" w:sz="4"/>
-              <w:bottom w:val="single" w:color="BFBFBF" w:sz="4"/>
-              <w:right w:val="single" w:color="BFBFBF" w:sz="4"/>
-            </w:tcBorders>
-            <w:shd w:fill="F2F2F2" w:color="auto" w:val="clear"/>
-            <w:tcMar>
-              <w:top w:type="dxa" w:w="60"/>
-              <w:left w:type="dxa" w:w="100"/>
-              <w:bottom w:type="dxa" w:w="60"/>
-              <w:right w:type="dxa" w:w="100"/>
-            </w:tcMar>
-          </w:tcPr>
-          <w:p>
-            <w:pPr>
-              <w:spacing w:after="0" w:line="260"/>
-            </w:pPr>
-            <w:r>
-              <w:rPr>
-                <w:color w:val="262626"/>
-                <w:sz w:val="20"/>
-                <w:szCs w:val="20"/>
-              </w:rPr>
-              <w:t xml:space="preserve">LoRA, rank 16, alpha 32, dropout 0.05</w:t>
-            </w:r>
-          </w:p>
-        </w:tc>
-      </w:tr>
-      <w:tr>
-        <w:trPr>
-          <w:cantSplit/>
-        </w:trPr>
-        <w:tc>
-          <w:tcPr>
-            <w:tcW w:type="dxa" w:w="3000"/>
-            <w:tcBorders>
-              <w:top w:val="single" w:color="BFBFBF" w:sz="4"/>
-              <w:left w:val="single" w:color="BFBFBF" w:sz="4"/>
-              <w:bottom w:val="single" w:color="BFBFBF" w:sz="4"/>
-              <w:right w:val="single" w:color="BFBFBF" w:sz="4"/>
-            </w:tcBorders>
-            <w:tcMar>
-              <w:top w:type="dxa" w:w="60"/>
-              <w:left w:type="dxa" w:w="100"/>
-              <w:bottom w:type="dxa" w:w="60"/>
-              <w:right w:type="dxa" w:w="100"/>
-            </w:tcMar>
-          </w:tcPr>
-          <w:p>
-            <w:pPr>
-              <w:spacing w:after="0" w:line="260"/>
-            </w:pPr>
-            <w:r>
-              <w:rPr>
-                <w:color w:val="262626"/>
-                <w:sz w:val="20"/>
-                <w:szCs w:val="20"/>
-              </w:rPr>
-              <w:t xml:space="preserve">Target modules</w:t>
-            </w:r>
-          </w:p>
-        </w:tc>
-        <w:tc>
-          <w:tcPr>
-            <w:tcW w:type="dxa" w:w="6026"/>
-            <w:tcBorders>
-              <w:top w:val="single" w:color="BFBFBF" w:sz="4"/>
-              <w:left w:val="single" w:color="BFBFBF" w:sz="4"/>
-              <w:bottom w:val="single" w:color="BFBFBF" w:sz="4"/>
-              <w:right w:val="single" w:color="BFBFBF" w:sz="4"/>
-            </w:tcBorders>
-            <w:tcMar>
-              <w:top w:type="dxa" w:w="60"/>
-              <w:left w:type="dxa" w:w="100"/>
-              <w:bottom w:type="dxa" w:w="60"/>
-              <w:right w:type="dxa" w:w="100"/>
-            </w:tcMar>
-          </w:tcPr>
-          <w:p>
-            <w:pPr>
-              <w:spacing w:after="0" w:line="260"/>
-            </w:pPr>
-            <w:r>
-              <w:rPr>
-                <w:color w:val="262626"/>
-                <w:sz w:val="20"/>
-                <w:szCs w:val="20"/>
-              </w:rPr>
-              <w:t xml:space="preserve">q, k, v, o, gate, up and down projections</w:t>
-            </w:r>
-          </w:p>
-        </w:tc>
-      </w:tr>
-      <w:tr>
-        <w:trPr>
-          <w:cantSplit/>
-        </w:trPr>
-        <w:tc>
-          <w:tcPr>
-            <w:tcW w:type="dxa" w:w="3000"/>
-            <w:tcBorders>
-              <w:top w:val="single" w:color="BFBFBF" w:sz="4"/>
-              <w:left w:val="single" w:color="BFBFBF" w:sz="4"/>
-              <w:bottom w:val="single" w:color="BFBFBF" w:sz="4"/>
-              <w:right w:val="single" w:color="BFBFBF" w:sz="4"/>
-            </w:tcBorders>
-            <w:shd w:fill="F2F2F2" w:color="auto" w:val="clear"/>
-            <w:tcMar>
-              <w:top w:type="dxa" w:w="60"/>
-              <w:left w:type="dxa" w:w="100"/>
-              <w:bottom w:type="dxa" w:w="60"/>
-              <w:right w:type="dxa" w:w="100"/>
-            </w:tcMar>
-          </w:tcPr>
-          <w:p>
-            <w:pPr>
-              <w:spacing w:after="0" w:line="260"/>
-            </w:pPr>
-            <w:r>
-              <w:rPr>
-                <w:color w:val="262626"/>
-                <w:sz w:val="20"/>
-                <w:szCs w:val="20"/>
-              </w:rPr>
-              <w:t xml:space="preserve">Trainable parameters</w:t>
-            </w:r>
-          </w:p>
-        </w:tc>
-        <w:tc>
-          <w:tcPr>
-            <w:tcW w:type="dxa" w:w="6026"/>
-            <w:tcBorders>
-              <w:top w:val="single" w:color="BFBFBF" w:sz="4"/>
-              <w:left w:val="single" w:color="BFBFBF" w:sz="4"/>
-              <w:bottom w:val="single" w:color="BFBFBF" w:sz="4"/>
-              <w:right w:val="single" w:color="BFBFBF" w:sz="4"/>
-            </w:tcBorders>
-            <w:shd w:fill="F2F2F2" w:color="auto" w:val="clear"/>
-            <w:tcMar>
-              <w:top w:type="dxa" w:w="60"/>
-              <w:left w:type="dxa" w:w="100"/>
-              <w:bottom w:type="dxa" w:w="60"/>
-              <w:right w:type="dxa" w:w="100"/>
-            </w:tcMar>
-          </w:tcPr>
-          <w:p>
-            <w:pPr>
-              <w:spacing w:after="0" w:line="260"/>
-            </w:pPr>
-            <w:r>
-              <w:rPr>
-                <w:color w:val="262626"/>
-                <w:sz w:val="20"/>
-                <w:szCs w:val="20"/>
-              </w:rPr>
-              <w:t xml:space="preserve">10,092,544 of 606,142,464 (1.67%)</w:t>
-            </w:r>
-          </w:p>
-        </w:tc>
-      </w:tr>
-      <w:tr>
-        <w:trPr>
-          <w:cantSplit/>
-        </w:trPr>
-        <w:tc>
-          <w:tcPr>
-            <w:tcW w:type="dxa" w:w="3000"/>
-            <w:tcBorders>
-              <w:top w:val="single" w:color="BFBFBF" w:sz="4"/>
-              <w:left w:val="single" w:color="BFBFBF" w:sz="4"/>
-              <w:bottom w:val="single" w:color="BFBFBF" w:sz="4"/>
-              <w:right w:val="single" w:color="BFBFBF" w:sz="4"/>
-            </w:tcBorders>
-            <w:tcMar>
-              <w:top w:type="dxa" w:w="60"/>
-              <w:left w:type="dxa" w:w="100"/>
-              <w:bottom w:type="dxa" w:w="60"/>
-              <w:right w:type="dxa" w:w="100"/>
-            </w:tcMar>
-          </w:tcPr>
-          <w:p>
-            <w:pPr>
-              <w:spacing w:after="0" w:line="260"/>
-            </w:pPr>
-            <w:r>
-              <w:rPr>
-                <w:color w:val="262626"/>
-                <w:sz w:val="20"/>
-                <w:szCs w:val="20"/>
-              </w:rPr>
-              <w:t xml:space="preserve">Training data</w:t>
-            </w:r>
-          </w:p>
-        </w:tc>
-        <w:tc>
-          <w:tcPr>
-            <w:tcW w:type="dxa" w:w="6026"/>
-            <w:tcBorders>
-              <w:top w:val="single" w:color="BFBFBF" w:sz="4"/>
-              <w:left w:val="single" w:color="BFBFBF" w:sz="4"/>
-              <w:bottom w:val="single" w:color="BFBFBF" w:sz="4"/>
-              <w:right w:val="single" w:color="BFBFBF" w:sz="4"/>
-            </w:tcBorders>
-            <w:tcMar>
-              <w:top w:type="dxa" w:w="60"/>
-              <w:left w:type="dxa" w:w="100"/>
-              <w:bottom w:type="dxa" w:w="60"/>
-              <w:right w:type="dxa" w:w="100"/>
-            </w:tcMar>
-          </w:tcPr>
-          <w:p>
-            <w:pPr>
-              <w:spacing w:after="0" w:line="260"/>
-            </w:pPr>
-            <w:r>
-              <w:rPr>
-                <w:color w:val="262626"/>
-                <w:sz w:val="20"/>
-                <w:szCs w:val="20"/>
-              </w:rPr>
-              <w:t xml:space="preserve">1,523 train and 75 validation examples</w:t>
-            </w:r>
-          </w:p>
-        </w:tc>
-      </w:tr>
-      <w:tr>
-        <w:trPr>
-          <w:cantSplit/>
-        </w:trPr>
-        <w:tc>
-          <w:tcPr>
-            <w:tcW w:type="dxa" w:w="3000"/>
-            <w:tcBorders>
-              <w:top w:val="single" w:color="BFBFBF" w:sz="4"/>
-              <w:left w:val="single" w:color="BFBFBF" w:sz="4"/>
-              <w:bottom w:val="single" w:color="BFBFBF" w:sz="4"/>
-              <w:right w:val="single" w:color="BFBFBF" w:sz="4"/>
-            </w:tcBorders>
-            <w:shd w:fill="F2F2F2" w:color="auto" w:val="clear"/>
-            <w:tcMar>
-              <w:top w:type="dxa" w:w="60"/>
-              <w:left w:type="dxa" w:w="100"/>
-              <w:bottom w:type="dxa" w:w="60"/>
-              <w:right w:type="dxa" w:w="100"/>
-            </w:tcMar>
-          </w:tcPr>
-          <w:p>
-            <w:pPr>
-              <w:spacing w:after="0" w:line="260"/>
-            </w:pPr>
-            <w:r>
-              <w:rPr>
-                <w:color w:val="262626"/>
-                <w:sz w:val="20"/>
-                <w:szCs w:val="20"/>
-              </w:rPr>
-              <w:t xml:space="preserve">Batch</w:t>
-            </w:r>
-          </w:p>
-        </w:tc>
-        <w:tc>
-          <w:tcPr>
-            <w:tcW w:type="dxa" w:w="6026"/>
-            <w:tcBorders>
-              <w:top w:val="single" w:color="BFBFBF" w:sz="4"/>
-              <w:left w:val="single" w:color="BFBFBF" w:sz="4"/>
-              <w:bottom w:val="single" w:color="BFBFBF" w:sz="4"/>
-              <w:right w:val="single" w:color="BFBFBF" w:sz="4"/>
-            </w:tcBorders>
-            <w:shd w:fill="F2F2F2" w:color="auto" w:val="clear"/>
-            <w:tcMar>
-              <w:top w:type="dxa" w:w="60"/>
-              <w:left w:type="dxa" w:w="100"/>
-              <w:bottom w:type="dxa" w:w="60"/>
-              <w:right w:type="dxa" w:w="100"/>
-            </w:tcMar>
-          </w:tcPr>
-          <w:p>
-            <w:pPr>
-              <w:spacing w:after="0" w:line="260"/>
-            </w:pPr>
-            <w:r>
-              <w:rPr>
-                <w:color w:val="262626"/>
-                <w:sz w:val="20"/>
-                <w:szCs w:val="20"/>
-              </w:rPr>
-              <w:t xml:space="preserve">1 per step × 16 gradient accumulation</w:t>
-            </w:r>
-          </w:p>
-        </w:tc>
-      </w:tr>
-      <w:tr>
-        <w:trPr>
-          <w:cantSplit/>
-        </w:trPr>
-        <w:tc>
-          <w:tcPr>
-            <w:tcW w:type="dxa" w:w="3000"/>
-            <w:tcBorders>
-              <w:top w:val="single" w:color="BFBFBF" w:sz="4"/>
-              <w:left w:val="single" w:color="BFBFBF" w:sz="4"/>
-              <w:bottom w:val="single" w:color="BFBFBF" w:sz="4"/>
-              <w:right w:val="single" w:color="BFBFBF" w:sz="4"/>
-            </w:tcBorders>
-            <w:tcMar>
-              <w:top w:type="dxa" w:w="60"/>
-              <w:left w:type="dxa" w:w="100"/>
-              <w:bottom w:type="dxa" w:w="60"/>
-              <w:right w:type="dxa" w:w="100"/>
-            </w:tcMar>
-          </w:tcPr>
-          <w:p>
-            <w:pPr>
-              <w:spacing w:after="0" w:line="260"/>
-            </w:pPr>
-            <w:r>
-              <w:rPr>
-                <w:color w:val="262626"/>
-                <w:sz w:val="20"/>
-                <w:szCs w:val="20"/>
-              </w:rPr>
-              <w:t xml:space="preserve">Optimisation</w:t>
-            </w:r>
-          </w:p>
-        </w:tc>
-        <w:tc>
-          <w:tcPr>
-            <w:tcW w:type="dxa" w:w="6026"/>
-            <w:tcBorders>
-              <w:top w:val="single" w:color="BFBFBF" w:sz="4"/>
-              <w:left w:val="single" w:color="BFBFBF" w:sz="4"/>
-              <w:bottom w:val="single" w:color="BFBFBF" w:sz="4"/>
-              <w:right w:val="single" w:color="BFBFBF" w:sz="4"/>
-            </w:tcBorders>
-            <w:tcMar>
-              <w:top w:type="dxa" w:w="60"/>
-              <w:left w:type="dxa" w:w="100"/>
-              <w:bottom w:type="dxa" w:w="60"/>
-              <w:right w:type="dxa" w:w="100"/>
-            </w:tcMar>
-          </w:tcPr>
-          <w:p>
-            <w:pPr>
-              <w:spacing w:after="0" w:line="260"/>
-            </w:pPr>
-            <w:r>
-              <w:rPr>
-                <w:color w:val="262626"/>
-                <w:sz w:val="20"/>
-                <w:szCs w:val="20"/>
-              </w:rPr>
-              <w:t xml:space="preserve">learning rate 2e-4, cosine schedule, 3% warm-up, 2 epochs</w:t>
-            </w:r>
-          </w:p>
-        </w:tc>
-      </w:tr>
-      <w:tr>
-        <w:trPr>
-          <w:cantSplit/>
-        </w:trPr>
-        <w:tc>
-          <w:tcPr>
-            <w:tcW w:type="dxa" w:w="3000"/>
-            <w:tcBorders>
-              <w:top w:val="single" w:color="BFBFBF" w:sz="4"/>
-              <w:left w:val="single" w:color="BFBFBF" w:sz="4"/>
-              <w:bottom w:val="single" w:color="BFBFBF" w:sz="4"/>
-              <w:right w:val="single" w:color="BFBFBF" w:sz="4"/>
-            </w:tcBorders>
-            <w:shd w:fill="F2F2F2" w:color="auto" w:val="clear"/>
-            <w:tcMar>
-              <w:top w:type="dxa" w:w="60"/>
-              <w:left w:type="dxa" w:w="100"/>
-              <w:bottom w:type="dxa" w:w="60"/>
-              <w:right w:type="dxa" w:w="100"/>
-            </w:tcMar>
-          </w:tcPr>
-          <w:p>
-            <w:pPr>
-              <w:spacing w:after="0" w:line="260"/>
-            </w:pPr>
-            <w:r>
-              <w:rPr>
-                <w:color w:val="262626"/>
-                <w:sz w:val="20"/>
-                <w:szCs w:val="20"/>
-              </w:rPr>
-              <w:t xml:space="preserve">Maximum length</w:t>
-            </w:r>
-          </w:p>
-        </w:tc>
-        <w:tc>
-          <w:tcPr>
-            <w:tcW w:type="dxa" w:w="6026"/>
-            <w:tcBorders>
-              <w:top w:val="single" w:color="BFBFBF" w:sz="4"/>
-              <w:left w:val="single" w:color="BFBFBF" w:sz="4"/>
-              <w:bottom w:val="single" w:color="BFBFBF" w:sz="4"/>
-              <w:right w:val="single" w:color="BFBFBF" w:sz="4"/>
-            </w:tcBorders>
-            <w:shd w:fill="F2F2F2" w:color="auto" w:val="clear"/>
-            <w:tcMar>
-              <w:top w:type="dxa" w:w="60"/>
-              <w:left w:type="dxa" w:w="100"/>
-              <w:bottom w:type="dxa" w:w="60"/>
-              <w:right w:type="dxa" w:w="100"/>
-            </w:tcMar>
-          </w:tcPr>
-          <w:p>
-            <w:pPr>
-              <w:spacing w:after="0" w:line="260"/>
-            </w:pPr>
-            <w:r>
-              <w:rPr>
-                <w:color w:val="262626"/>
-                <w:sz w:val="20"/>
-                <w:szCs w:val="20"/>
-              </w:rPr>
-              <w:t xml:space="preserve">2,560 tokens; gradient checkpointing</w:t>
-            </w:r>
-          </w:p>
-        </w:tc>
-      </w:tr>
-      <w:tr>
-        <w:trPr>
-          <w:cantSplit/>
-        </w:trPr>
-        <w:tc>
-          <w:tcPr>
-            <w:tcW w:type="dxa" w:w="3000"/>
-            <w:tcBorders>
-              <w:top w:val="single" w:color="BFBFBF" w:sz="4"/>
-              <w:left w:val="single" w:color="BFBFBF" w:sz="4"/>
-              <w:bottom w:val="single" w:color="BFBFBF" w:sz="4"/>
-              <w:right w:val="single" w:color="BFBFBF" w:sz="4"/>
-            </w:tcBorders>
-            <w:tcMar>
-              <w:top w:type="dxa" w:w="60"/>
-              <w:left w:type="dxa" w:w="100"/>
-              <w:bottom w:type="dxa" w:w="60"/>
-              <w:right w:type="dxa" w:w="100"/>
-            </w:tcMar>
-          </w:tcPr>
-          <w:p>
-            <w:pPr>
-              <w:spacing w:after="0" w:line="260"/>
-            </w:pPr>
-            <w:r>
-              <w:rPr>
-                <w:color w:val="262626"/>
-                <w:sz w:val="20"/>
-                <w:szCs w:val="20"/>
-              </w:rPr>
-              <w:t xml:space="preserve">Hardware and time</w:t>
-            </w:r>
-          </w:p>
-        </w:tc>
-        <w:tc>
-          <w:tcPr>
-            <w:tcW w:type="dxa" w:w="6026"/>
-            <w:tcBorders>
-              <w:top w:val="single" w:color="BFBFBF" w:sz="4"/>
-              <w:left w:val="single" w:color="BFBFBF" w:sz="4"/>
-              <w:bottom w:val="single" w:color="BFBFBF" w:sz="4"/>
-              <w:right w:val="single" w:color="BFBFBF" w:sz="4"/>
-            </w:tcBorders>
-            <w:tcMar>
-              <w:top w:type="dxa" w:w="60"/>
-              <w:left w:type="dxa" w:w="100"/>
-              <w:bottom w:type="dxa" w:w="60"/>
-              <w:right w:type="dxa" w:w="100"/>
-            </w:tcMar>
-          </w:tcPr>
-          <w:p>
-            <w:pPr>
-              <w:spacing w:after="0" w:line="260"/>
-            </w:pPr>
-            <w:r>
-              <w:rPr>
-                <w:color w:val="262626"/>
-                <w:sz w:val="20"/>
-                <w:szCs w:val="20"/>
-              </w:rPr>
-              <w:t xml:space="preserve">RTX 3050 Laptop GPU (4 GB), 63 minutes, about 2 GB VRAM</w:t>
-            </w:r>
-          </w:p>
-        </w:tc>
-      </w:tr>
-    </w:tbl>
-    <w:p>
-      <w:pPr>
-        <w:spacing w:after="120"/>
-      </w:pPr>
+        </w:rPr>
+        <w:t xml:space="preserve">every number in the answer appears in the passage</w:t>
+      </w:r>
+      <w:r>
+        <w:t xml:space="preserve">, ignoring digits inside part and register names such as CC2652R; and (4) the question is not a duplicate. Filter (3) is the main guard against invented values.</w:t>
+      </w:r>
+    </w:p>
+    <w:p>
+      <w:pPr>
+        <w:pStyle w:val="Heading2"/>
+      </w:pPr>
+      <w:bookmarkStart w:name="_Toc21" w:id="21"/>
+      <w:r>
+        <w:t xml:space="preserve">3.6 RAFT-style Training Examples</w:t>
+      </w:r>
+      <w:bookmarkEnd w:id="21"/>
     </w:p>
     <w:p>
       <w:pPr>
@@ -3952,70 +3161,17 @@
         <w:jc w:val="both"/>
       </w:pPr>
       <w:r>
-        <w:t xml:space="preserve">Batch size 1 is forced by Qwen’s 151k-token vocabulary: the output logits for one 2,500-token sequence alone occupy about 1.5 GB in 32-bit precision.</w:t>
-      </w:r>
-    </w:p>
-    <w:p>
-      <w:pPr>
-        <w:pStyle w:val="Heading2"/>
-      </w:pPr>
-      <w:bookmarkStart w:name="_Toc23" w:id="23"/>
-      <w:r>
-        <w:t xml:space="preserve">3.8 Terminal Application</w:t>
-      </w:r>
-      <w:bookmarkEnd w:id="23"/>
-    </w:p>
-    <w:p>
-      <w:pPr>
-        <w:spacing w:after="140" w:line="300"/>
-        <w:jc w:val="both"/>
-      </w:pPr>
-      <w:r>
-        <w:t xml:space="preserve">The user runs </w:t>
-      </w:r>
-      <w:r>
-        <w:rPr>
-          <w:rFonts w:ascii="Courier New" w:cs="Courier New" w:eastAsia="Courier New" w:hAnsi="Courier New"/>
-          <w:sz w:val="22"/>
-          <w:szCs w:val="22"/>
-        </w:rPr>
-        <w:t xml:space="preserve">python -m chipdoc datasheet.pdf</w:t>
-      </w:r>
-      <w:r>
-        <w:t xml:space="preserve">. On first use the PDF is validated, extracted, chunked and indexed (one to three minutes for a few hundred pages, dominated by layout-aware text extraction); afterwards the cached index loads instantly. Each question triggers hybrid retrieval and a streamed answer (Figure 6). The </w:t>
-      </w:r>
-      <w:r>
-        <w:rPr>
-          <w:rFonts w:ascii="Courier New" w:cs="Courier New" w:eastAsia="Courier New" w:hAnsi="Courier New"/>
-          <w:sz w:val="22"/>
-          <w:szCs w:val="22"/>
-        </w:rPr>
-        <w:t xml:space="preserve">/sources</w:t>
-      </w:r>
-      <w:r>
-        <w:t xml:space="preserve"> command shows the passages behind the last answer, </w:t>
-      </w:r>
-      <w:r>
-        <w:rPr>
-          <w:rFonts w:ascii="Courier New" w:cs="Courier New" w:eastAsia="Courier New" w:hAnsi="Courier New"/>
-          <w:sz w:val="22"/>
-          <w:szCs w:val="22"/>
-        </w:rPr>
-        <w:t xml:space="preserve">-q</w:t>
-      </w:r>
-      <w:r>
-        <w:t xml:space="preserve"> answers a single question non-interactively, and </w:t>
-      </w:r>
-      <w:r>
-        <w:rPr>
-          <w:rFonts w:ascii="Courier New" w:cs="Courier New" w:eastAsia="Courier New" w:hAnsi="Courier New"/>
-          <w:sz w:val="22"/>
-          <w:szCs w:val="22"/>
-        </w:rPr>
-        <w:t xml:space="preserve">--base</w:t>
-      </w:r>
-      <w:r>
-        <w:t xml:space="preserve"> runs the untuned model for comparison. Everything runs locally; no datasheet text or question leaves the machine.</w:t>
+        <w:t xml:space="preserve">Following RAFT [12], each kept pair becomes an example that looks exactly like inference (Figure 5). The question is run through the hybrid retriever on its own datasheet; the top hits other than the source passage become </w:t>
+      </w:r>
+      <w:r>
+        <w:rPr>
+          <w:b/>
+          <w:bCs/>
+        </w:rPr>
+        <w:t xml:space="preserve">hard distractors</w:t>
+      </w:r>
+      <w:r>
+        <w:t xml:space="preserve">—same peripheral, neighbouring pages—so the model must locate the right passage rather than trust the first one. In about 80% of examples the context is the source passage plus four distractors, shuffled, and the target is the answer followed by the source page, e.g. “… up to 100 MHz. [p.1]”. In about 20% the source passage is removed and the target is “Not found in the provided datasheet.”; this happens only if no distractor contains the evidence, so the model is never taught to refuse an answerable question.</w:t>
       </w:r>
     </w:p>
     <w:p>
@@ -4027,9 +3183,9 @@
       <w:r>
         <w:drawing>
           <wp:inline distT="0" distB="0" distL="0" distR="0">
-            <wp:extent cx="5715000" cy="3762375"/>
+            <wp:extent cx="4000500" cy="5219700"/>
             <wp:effectExtent t="0" r="0" b="0" l="0"/>
-            <wp:docPr id="6" name="Figure 6" descr="Query flow in the terminal application, including the per-PDF cache." title="Figure 6"/>
+            <wp:docPr id="5" name="Figure 5" descr="Construction of a RAFT-style training example from a filtered QA pair." title="Figure 5"/>
             <wp:cNvGraphicFramePr>
               <a:graphicFrameLocks xmlns:a="http://schemas.openxmlformats.org/drawingml/2006/main" noChangeAspect="1"/>
             </wp:cNvGraphicFramePr>
@@ -4052,7 +3208,7 @@
                   <pic:spPr bwMode="auto">
                     <a:xfrm>
                       <a:off x="0" y="0"/>
-                      <a:ext cx="5715000" cy="3762375"/>
+                      <a:ext cx="4000500" cy="5219700"/>
                     </a:xfrm>
                     <a:prstGeom prst="rect">
                       <a:avLst/>
@@ -4077,25 +3233,25 @@
           <w:sz w:val="20"/>
           <w:szCs w:val="20"/>
         </w:rPr>
-        <w:t xml:space="preserve">Figure 6: </w:t>
+        <w:t xml:space="preserve">Figure 5: </w:t>
       </w:r>
       <w:r>
         <w:rPr>
           <w:sz w:val="20"/>
           <w:szCs w:val="20"/>
         </w:rPr>
-        <w:t xml:space="preserve">Query flow in the terminal application, including the per-PDF cache.</w:t>
+        <w:t xml:space="preserve">Construction of a RAFT-style training example from a filtered QA pair.</w:t>
       </w:r>
     </w:p>
     <w:p>
       <w:pPr>
         <w:pStyle w:val="Heading2"/>
       </w:pPr>
-      <w:bookmarkStart w:name="_Toc24" w:id="24"/>
-      <w:r>
-        <w:t xml:space="preserve">3.9 Evaluation Protocol</w:t>
-      </w:r>
-      <w:bookmarkEnd w:id="24"/>
+      <w:bookmarkStart w:name="_Toc22" w:id="22"/>
+      <w:r>
+        <w:t xml:space="preserve">3.7 Model and Fine-tuning</w:t>
+      </w:r>
+      <w:bookmarkEnd w:id="22"/>
     </w:p>
     <w:p>
       <w:pPr>
@@ -4103,47 +3259,789 @@
         <w:jc w:val="both"/>
       </w:pPr>
       <w:r>
-        <w:t xml:space="preserve">All evaluation uses the five held-out datasheets (341 test QA pairs). </w:t>
-      </w:r>
+        <w:t xml:space="preserve">The reader is Qwen3-0.6B with thinking mode disabled. The system prompt instructs it to use only the numbered passages, copy values and units exactly, cite pages as [p.N], and otherwise reply with the fixed refusal sentence. LoRA adapters were trained on all attention and MLP projections with loss computed on answer tokens only (Table 2). Examples longer than 2,560 tokens (3%) were dropped rather than truncated, because truncation would remove the answer, which comes last.</w:t>
+      </w:r>
+    </w:p>
+    <w:p>
+      <w:pPr>
+        <w:keepNext/>
+        <w:spacing w:after="80" w:before="160"/>
+        <w:jc w:val="center"/>
+      </w:pPr>
       <w:r>
         <w:rPr>
           <w:b/>
           <w:bCs/>
-        </w:rPr>
-        <w:t xml:space="preserve">Retrieval</w:t>
-      </w:r>
-      <w:r>
-        <w:t xml:space="preserve"> is measured with Recall@k and MRR@10, where a hit is a retrieved passage that is the source passage or contains the evidence span. </w:t>
-      </w:r>
-      <w:r>
-        <w:rPr>
-          <w:b/>
-          <w:bCs/>
-        </w:rPr>
-        <w:t xml:space="preserve">Answer quality</w:t>
-      </w:r>
-      <w:r>
-        <w:t xml:space="preserve"> is measured on a seeded random sample of 100 test questions, each asked twice (Figure 7): once with the real top-five retrieval (</w:t>
-      </w:r>
-      <w:r>
-        <w:rPr>
-          <w:i/>
-          <w:iCs/>
-        </w:rPr>
-        <w:t xml:space="preserve">answerable</w:t>
-      </w:r>
-      <w:r>
-        <w:t xml:space="preserve">), and once with every passage containing the evidence removed (</w:t>
-      </w:r>
-      <w:r>
-        <w:rPr>
-          <w:i/>
-          <w:iCs/>
-        </w:rPr>
-        <w:t xml:space="preserve">unanswerable</w:t>
-      </w:r>
-      <w:r>
-        <w:t xml:space="preserve">), where the only correct output is the refusal sentence.</w:t>
+          <w:sz w:val="20"/>
+          <w:szCs w:val="20"/>
+        </w:rPr>
+        <w:t xml:space="preserve">Table 2: </w:t>
+      </w:r>
+      <w:r>
+        <w:rPr>
+          <w:sz w:val="20"/>
+          <w:szCs w:val="20"/>
+        </w:rPr>
+        <w:t xml:space="preserve">Fine-tuning configuration</w:t>
+      </w:r>
+    </w:p>
+    <w:tbl>
+      <w:tblPr>
+        <w:tblW w:type="dxa" w:w="9026"/>
+        <w:jc w:val="center"/>
+        <w:tblBorders>
+          <w:top w:val="single" w:color="auto" w:sz="4"/>
+          <w:left w:val="single" w:color="auto" w:sz="4"/>
+          <w:bottom w:val="single" w:color="auto" w:sz="4"/>
+          <w:right w:val="single" w:color="auto" w:sz="4"/>
+          <w:insideH w:val="single" w:color="auto" w:sz="4"/>
+          <w:insideV w:val="single" w:color="auto" w:sz="4"/>
+        </w:tblBorders>
+      </w:tblPr>
+      <w:tblGrid>
+        <w:gridCol w:w="3000"/>
+        <w:gridCol w:w="6026"/>
+      </w:tblGrid>
+      <w:tr>
+        <w:trPr>
+          <w:tblHeader/>
+        </w:trPr>
+        <w:tc>
+          <w:tcPr>
+            <w:tcW w:type="dxa" w:w="3000"/>
+            <w:tcBorders>
+              <w:top w:val="single" w:color="BFBFBF" w:sz="4"/>
+              <w:left w:val="single" w:color="BFBFBF" w:sz="4"/>
+              <w:bottom w:val="single" w:color="BFBFBF" w:sz="4"/>
+              <w:right w:val="single" w:color="BFBFBF" w:sz="4"/>
+            </w:tcBorders>
+            <w:shd w:fill="1F6F8B" w:color="auto" w:val="clear"/>
+            <w:tcMar>
+              <w:top w:type="dxa" w:w="60"/>
+              <w:left w:type="dxa" w:w="100"/>
+              <w:bottom w:type="dxa" w:w="60"/>
+              <w:right w:type="dxa" w:w="100"/>
+            </w:tcMar>
+          </w:tcPr>
+          <w:p>
+            <w:pPr>
+              <w:spacing w:after="0" w:line="260"/>
+            </w:pPr>
+            <w:r>
+              <w:rPr>
+                <w:b/>
+                <w:bCs/>
+                <w:color w:val="FFFFFF"/>
+                <w:sz w:val="20"/>
+                <w:szCs w:val="20"/>
+              </w:rPr>
+              <w:t xml:space="preserve">Setting</w:t>
+            </w:r>
+          </w:p>
+        </w:tc>
+        <w:tc>
+          <w:tcPr>
+            <w:tcW w:type="dxa" w:w="6026"/>
+            <w:tcBorders>
+              <w:top w:val="single" w:color="BFBFBF" w:sz="4"/>
+              <w:left w:val="single" w:color="BFBFBF" w:sz="4"/>
+              <w:bottom w:val="single" w:color="BFBFBF" w:sz="4"/>
+              <w:right w:val="single" w:color="BFBFBF" w:sz="4"/>
+            </w:tcBorders>
+            <w:shd w:fill="1F6F8B" w:color="auto" w:val="clear"/>
+            <w:tcMar>
+              <w:top w:type="dxa" w:w="60"/>
+              <w:left w:type="dxa" w:w="100"/>
+              <w:bottom w:type="dxa" w:w="60"/>
+              <w:right w:type="dxa" w:w="100"/>
+            </w:tcMar>
+          </w:tcPr>
+          <w:p>
+            <w:pPr>
+              <w:spacing w:after="0" w:line="260"/>
+            </w:pPr>
+            <w:r>
+              <w:rPr>
+                <w:b/>
+                <w:bCs/>
+                <w:color w:val="FFFFFF"/>
+                <w:sz w:val="20"/>
+                <w:szCs w:val="20"/>
+              </w:rPr>
+              <w:t xml:space="preserve">Value</w:t>
+            </w:r>
+          </w:p>
+        </w:tc>
+      </w:tr>
+      <w:tr>
+        <w:trPr>
+          <w:cantSplit/>
+        </w:trPr>
+        <w:tc>
+          <w:tcPr>
+            <w:tcW w:type="dxa" w:w="3000"/>
+            <w:tcBorders>
+              <w:top w:val="single" w:color="BFBFBF" w:sz="4"/>
+              <w:left w:val="single" w:color="BFBFBF" w:sz="4"/>
+              <w:bottom w:val="single" w:color="BFBFBF" w:sz="4"/>
+              <w:right w:val="single" w:color="BFBFBF" w:sz="4"/>
+            </w:tcBorders>
+            <w:tcMar>
+              <w:top w:type="dxa" w:w="60"/>
+              <w:left w:type="dxa" w:w="100"/>
+              <w:bottom w:type="dxa" w:w="60"/>
+              <w:right w:type="dxa" w:w="100"/>
+            </w:tcMar>
+          </w:tcPr>
+          <w:p>
+            <w:pPr>
+              <w:spacing w:after="0" w:line="260"/>
+            </w:pPr>
+            <w:r>
+              <w:rPr>
+                <w:color w:val="262626"/>
+                <w:sz w:val="20"/>
+                <w:szCs w:val="20"/>
+              </w:rPr>
+              <w:t xml:space="preserve">Base model</w:t>
+            </w:r>
+          </w:p>
+        </w:tc>
+        <w:tc>
+          <w:tcPr>
+            <w:tcW w:type="dxa" w:w="6026"/>
+            <w:tcBorders>
+              <w:top w:val="single" w:color="BFBFBF" w:sz="4"/>
+              <w:left w:val="single" w:color="BFBFBF" w:sz="4"/>
+              <w:bottom w:val="single" w:color="BFBFBF" w:sz="4"/>
+              <w:right w:val="single" w:color="BFBFBF" w:sz="4"/>
+            </w:tcBorders>
+            <w:tcMar>
+              <w:top w:type="dxa" w:w="60"/>
+              <w:left w:type="dxa" w:w="100"/>
+              <w:bottom w:type="dxa" w:w="60"/>
+              <w:right w:type="dxa" w:w="100"/>
+            </w:tcMar>
+          </w:tcPr>
+          <w:p>
+            <w:pPr>
+              <w:spacing w:after="0" w:line="260"/>
+            </w:pPr>
+            <w:r>
+              <w:rPr>
+                <w:color w:val="262626"/>
+                <w:sz w:val="20"/>
+                <w:szCs w:val="20"/>
+              </w:rPr>
+              <w:t xml:space="preserve">Qwen/Qwen3-0.6B (bf16, thinking off)</w:t>
+            </w:r>
+          </w:p>
+        </w:tc>
+      </w:tr>
+      <w:tr>
+        <w:trPr>
+          <w:cantSplit/>
+        </w:trPr>
+        <w:tc>
+          <w:tcPr>
+            <w:tcW w:type="dxa" w:w="3000"/>
+            <w:tcBorders>
+              <w:top w:val="single" w:color="BFBFBF" w:sz="4"/>
+              <w:left w:val="single" w:color="BFBFBF" w:sz="4"/>
+              <w:bottom w:val="single" w:color="BFBFBF" w:sz="4"/>
+              <w:right w:val="single" w:color="BFBFBF" w:sz="4"/>
+            </w:tcBorders>
+            <w:shd w:fill="F2F2F2" w:color="auto" w:val="clear"/>
+            <w:tcMar>
+              <w:top w:type="dxa" w:w="60"/>
+              <w:left w:type="dxa" w:w="100"/>
+              <w:bottom w:type="dxa" w:w="60"/>
+              <w:right w:type="dxa" w:w="100"/>
+            </w:tcMar>
+          </w:tcPr>
+          <w:p>
+            <w:pPr>
+              <w:spacing w:after="0" w:line="260"/>
+            </w:pPr>
+            <w:r>
+              <w:rPr>
+                <w:color w:val="262626"/>
+                <w:sz w:val="20"/>
+                <w:szCs w:val="20"/>
+              </w:rPr>
+              <w:t xml:space="preserve">Method</w:t>
+            </w:r>
+          </w:p>
+        </w:tc>
+        <w:tc>
+          <w:tcPr>
+            <w:tcW w:type="dxa" w:w="6026"/>
+            <w:tcBorders>
+              <w:top w:val="single" w:color="BFBFBF" w:sz="4"/>
+              <w:left w:val="single" w:color="BFBFBF" w:sz="4"/>
+              <w:bottom w:val="single" w:color="BFBFBF" w:sz="4"/>
+              <w:right w:val="single" w:color="BFBFBF" w:sz="4"/>
+            </w:tcBorders>
+            <w:shd w:fill="F2F2F2" w:color="auto" w:val="clear"/>
+            <w:tcMar>
+              <w:top w:type="dxa" w:w="60"/>
+              <w:left w:type="dxa" w:w="100"/>
+              <w:bottom w:type="dxa" w:w="60"/>
+              <w:right w:type="dxa" w:w="100"/>
+            </w:tcMar>
+          </w:tcPr>
+          <w:p>
+            <w:pPr>
+              <w:spacing w:after="0" w:line="260"/>
+            </w:pPr>
+            <w:r>
+              <w:rPr>
+                <w:color w:val="262626"/>
+                <w:sz w:val="20"/>
+                <w:szCs w:val="20"/>
+              </w:rPr>
+              <w:t xml:space="preserve">LoRA, rank 16, alpha 32, dropout 0.05</w:t>
+            </w:r>
+          </w:p>
+        </w:tc>
+      </w:tr>
+      <w:tr>
+        <w:trPr>
+          <w:cantSplit/>
+        </w:trPr>
+        <w:tc>
+          <w:tcPr>
+            <w:tcW w:type="dxa" w:w="3000"/>
+            <w:tcBorders>
+              <w:top w:val="single" w:color="BFBFBF" w:sz="4"/>
+              <w:left w:val="single" w:color="BFBFBF" w:sz="4"/>
+              <w:bottom w:val="single" w:color="BFBFBF" w:sz="4"/>
+              <w:right w:val="single" w:color="BFBFBF" w:sz="4"/>
+            </w:tcBorders>
+            <w:tcMar>
+              <w:top w:type="dxa" w:w="60"/>
+              <w:left w:type="dxa" w:w="100"/>
+              <w:bottom w:type="dxa" w:w="60"/>
+              <w:right w:type="dxa" w:w="100"/>
+            </w:tcMar>
+          </w:tcPr>
+          <w:p>
+            <w:pPr>
+              <w:spacing w:after="0" w:line="260"/>
+            </w:pPr>
+            <w:r>
+              <w:rPr>
+                <w:color w:val="262626"/>
+                <w:sz w:val="20"/>
+                <w:szCs w:val="20"/>
+              </w:rPr>
+              <w:t xml:space="preserve">Target modules</w:t>
+            </w:r>
+          </w:p>
+        </w:tc>
+        <w:tc>
+          <w:tcPr>
+            <w:tcW w:type="dxa" w:w="6026"/>
+            <w:tcBorders>
+              <w:top w:val="single" w:color="BFBFBF" w:sz="4"/>
+              <w:left w:val="single" w:color="BFBFBF" w:sz="4"/>
+              <w:bottom w:val="single" w:color="BFBFBF" w:sz="4"/>
+              <w:right w:val="single" w:color="BFBFBF" w:sz="4"/>
+            </w:tcBorders>
+            <w:tcMar>
+              <w:top w:type="dxa" w:w="60"/>
+              <w:left w:type="dxa" w:w="100"/>
+              <w:bottom w:type="dxa" w:w="60"/>
+              <w:right w:type="dxa" w:w="100"/>
+            </w:tcMar>
+          </w:tcPr>
+          <w:p>
+            <w:pPr>
+              <w:spacing w:after="0" w:line="260"/>
+            </w:pPr>
+            <w:r>
+              <w:rPr>
+                <w:color w:val="262626"/>
+                <w:sz w:val="20"/>
+                <w:szCs w:val="20"/>
+              </w:rPr>
+              <w:t xml:space="preserve">q, k, v, o, gate, up and down projections</w:t>
+            </w:r>
+          </w:p>
+        </w:tc>
+      </w:tr>
+      <w:tr>
+        <w:trPr>
+          <w:cantSplit/>
+        </w:trPr>
+        <w:tc>
+          <w:tcPr>
+            <w:tcW w:type="dxa" w:w="3000"/>
+            <w:tcBorders>
+              <w:top w:val="single" w:color="BFBFBF" w:sz="4"/>
+              <w:left w:val="single" w:color="BFBFBF" w:sz="4"/>
+              <w:bottom w:val="single" w:color="BFBFBF" w:sz="4"/>
+              <w:right w:val="single" w:color="BFBFBF" w:sz="4"/>
+            </w:tcBorders>
+            <w:shd w:fill="F2F2F2" w:color="auto" w:val="clear"/>
+            <w:tcMar>
+              <w:top w:type="dxa" w:w="60"/>
+              <w:left w:type="dxa" w:w="100"/>
+              <w:bottom w:type="dxa" w:w="60"/>
+              <w:right w:type="dxa" w:w="100"/>
+            </w:tcMar>
+          </w:tcPr>
+          <w:p>
+            <w:pPr>
+              <w:spacing w:after="0" w:line="260"/>
+            </w:pPr>
+            <w:r>
+              <w:rPr>
+                <w:color w:val="262626"/>
+                <w:sz w:val="20"/>
+                <w:szCs w:val="20"/>
+              </w:rPr>
+              <w:t xml:space="preserve">Trainable parameters</w:t>
+            </w:r>
+          </w:p>
+        </w:tc>
+        <w:tc>
+          <w:tcPr>
+            <w:tcW w:type="dxa" w:w="6026"/>
+            <w:tcBorders>
+              <w:top w:val="single" w:color="BFBFBF" w:sz="4"/>
+              <w:left w:val="single" w:color="BFBFBF" w:sz="4"/>
+              <w:bottom w:val="single" w:color="BFBFBF" w:sz="4"/>
+              <w:right w:val="single" w:color="BFBFBF" w:sz="4"/>
+            </w:tcBorders>
+            <w:shd w:fill="F2F2F2" w:color="auto" w:val="clear"/>
+            <w:tcMar>
+              <w:top w:type="dxa" w:w="60"/>
+              <w:left w:type="dxa" w:w="100"/>
+              <w:bottom w:type="dxa" w:w="60"/>
+              <w:right w:type="dxa" w:w="100"/>
+            </w:tcMar>
+          </w:tcPr>
+          <w:p>
+            <w:pPr>
+              <w:spacing w:after="0" w:line="260"/>
+            </w:pPr>
+            <w:r>
+              <w:rPr>
+                <w:color w:val="262626"/>
+                <w:sz w:val="20"/>
+                <w:szCs w:val="20"/>
+              </w:rPr>
+              <w:t xml:space="preserve">10,092,544 of 606,142,464 (1.67%)</w:t>
+            </w:r>
+          </w:p>
+        </w:tc>
+      </w:tr>
+      <w:tr>
+        <w:trPr>
+          <w:cantSplit/>
+        </w:trPr>
+        <w:tc>
+          <w:tcPr>
+            <w:tcW w:type="dxa" w:w="3000"/>
+            <w:tcBorders>
+              <w:top w:val="single" w:color="BFBFBF" w:sz="4"/>
+              <w:left w:val="single" w:color="BFBFBF" w:sz="4"/>
+              <w:bottom w:val="single" w:color="BFBFBF" w:sz="4"/>
+              <w:right w:val="single" w:color="BFBFBF" w:sz="4"/>
+            </w:tcBorders>
+            <w:tcMar>
+              <w:top w:type="dxa" w:w="60"/>
+              <w:left w:type="dxa" w:w="100"/>
+              <w:bottom w:type="dxa" w:w="60"/>
+              <w:right w:type="dxa" w:w="100"/>
+            </w:tcMar>
+          </w:tcPr>
+          <w:p>
+            <w:pPr>
+              <w:spacing w:after="0" w:line="260"/>
+            </w:pPr>
+            <w:r>
+              <w:rPr>
+                <w:color w:val="262626"/>
+                <w:sz w:val="20"/>
+                <w:szCs w:val="20"/>
+              </w:rPr>
+              <w:t xml:space="preserve">Training data</w:t>
+            </w:r>
+          </w:p>
+        </w:tc>
+        <w:tc>
+          <w:tcPr>
+            <w:tcW w:type="dxa" w:w="6026"/>
+            <w:tcBorders>
+              <w:top w:val="single" w:color="BFBFBF" w:sz="4"/>
+              <w:left w:val="single" w:color="BFBFBF" w:sz="4"/>
+              <w:bottom w:val="single" w:color="BFBFBF" w:sz="4"/>
+              <w:right w:val="single" w:color="BFBFBF" w:sz="4"/>
+            </w:tcBorders>
+            <w:tcMar>
+              <w:top w:type="dxa" w:w="60"/>
+              <w:left w:type="dxa" w:w="100"/>
+              <w:bottom w:type="dxa" w:w="60"/>
+              <w:right w:type="dxa" w:w="100"/>
+            </w:tcMar>
+          </w:tcPr>
+          <w:p>
+            <w:pPr>
+              <w:spacing w:after="0" w:line="260"/>
+            </w:pPr>
+            <w:r>
+              <w:rPr>
+                <w:color w:val="262626"/>
+                <w:sz w:val="20"/>
+                <w:szCs w:val="20"/>
+              </w:rPr>
+              <w:t xml:space="preserve">1,523 train and 75 validation examples</w:t>
+            </w:r>
+          </w:p>
+        </w:tc>
+      </w:tr>
+      <w:tr>
+        <w:trPr>
+          <w:cantSplit/>
+        </w:trPr>
+        <w:tc>
+          <w:tcPr>
+            <w:tcW w:type="dxa" w:w="3000"/>
+            <w:tcBorders>
+              <w:top w:val="single" w:color="BFBFBF" w:sz="4"/>
+              <w:left w:val="single" w:color="BFBFBF" w:sz="4"/>
+              <w:bottom w:val="single" w:color="BFBFBF" w:sz="4"/>
+              <w:right w:val="single" w:color="BFBFBF" w:sz="4"/>
+            </w:tcBorders>
+            <w:shd w:fill="F2F2F2" w:color="auto" w:val="clear"/>
+            <w:tcMar>
+              <w:top w:type="dxa" w:w="60"/>
+              <w:left w:type="dxa" w:w="100"/>
+              <w:bottom w:type="dxa" w:w="60"/>
+              <w:right w:type="dxa" w:w="100"/>
+            </w:tcMar>
+          </w:tcPr>
+          <w:p>
+            <w:pPr>
+              <w:spacing w:after="0" w:line="260"/>
+            </w:pPr>
+            <w:r>
+              <w:rPr>
+                <w:color w:val="262626"/>
+                <w:sz w:val="20"/>
+                <w:szCs w:val="20"/>
+              </w:rPr>
+              <w:t xml:space="preserve">Batch</w:t>
+            </w:r>
+          </w:p>
+        </w:tc>
+        <w:tc>
+          <w:tcPr>
+            <w:tcW w:type="dxa" w:w="6026"/>
+            <w:tcBorders>
+              <w:top w:val="single" w:color="BFBFBF" w:sz="4"/>
+              <w:left w:val="single" w:color="BFBFBF" w:sz="4"/>
+              <w:bottom w:val="single" w:color="BFBFBF" w:sz="4"/>
+              <w:right w:val="single" w:color="BFBFBF" w:sz="4"/>
+            </w:tcBorders>
+            <w:shd w:fill="F2F2F2" w:color="auto" w:val="clear"/>
+            <w:tcMar>
+              <w:top w:type="dxa" w:w="60"/>
+              <w:left w:type="dxa" w:w="100"/>
+              <w:bottom w:type="dxa" w:w="60"/>
+              <w:right w:type="dxa" w:w="100"/>
+            </w:tcMar>
+          </w:tcPr>
+          <w:p>
+            <w:pPr>
+              <w:spacing w:after="0" w:line="260"/>
+            </w:pPr>
+            <w:r>
+              <w:rPr>
+                <w:color w:val="262626"/>
+                <w:sz w:val="20"/>
+                <w:szCs w:val="20"/>
+              </w:rPr>
+              <w:t xml:space="preserve">1 per step × 16 gradient accumulation</w:t>
+            </w:r>
+          </w:p>
+        </w:tc>
+      </w:tr>
+      <w:tr>
+        <w:trPr>
+          <w:cantSplit/>
+        </w:trPr>
+        <w:tc>
+          <w:tcPr>
+            <w:tcW w:type="dxa" w:w="3000"/>
+            <w:tcBorders>
+              <w:top w:val="single" w:color="BFBFBF" w:sz="4"/>
+              <w:left w:val="single" w:color="BFBFBF" w:sz="4"/>
+              <w:bottom w:val="single" w:color="BFBFBF" w:sz="4"/>
+              <w:right w:val="single" w:color="BFBFBF" w:sz="4"/>
+            </w:tcBorders>
+            <w:tcMar>
+              <w:top w:type="dxa" w:w="60"/>
+              <w:left w:type="dxa" w:w="100"/>
+              <w:bottom w:type="dxa" w:w="60"/>
+              <w:right w:type="dxa" w:w="100"/>
+            </w:tcMar>
+          </w:tcPr>
+          <w:p>
+            <w:pPr>
+              <w:spacing w:after="0" w:line="260"/>
+            </w:pPr>
+            <w:r>
+              <w:rPr>
+                <w:color w:val="262626"/>
+                <w:sz w:val="20"/>
+                <w:szCs w:val="20"/>
+              </w:rPr>
+              <w:t xml:space="preserve">Optimisation</w:t>
+            </w:r>
+          </w:p>
+        </w:tc>
+        <w:tc>
+          <w:tcPr>
+            <w:tcW w:type="dxa" w:w="6026"/>
+            <w:tcBorders>
+              <w:top w:val="single" w:color="BFBFBF" w:sz="4"/>
+              <w:left w:val="single" w:color="BFBFBF" w:sz="4"/>
+              <w:bottom w:val="single" w:color="BFBFBF" w:sz="4"/>
+              <w:right w:val="single" w:color="BFBFBF" w:sz="4"/>
+            </w:tcBorders>
+            <w:tcMar>
+              <w:top w:type="dxa" w:w="60"/>
+              <w:left w:type="dxa" w:w="100"/>
+              <w:bottom w:type="dxa" w:w="60"/>
+              <w:right w:type="dxa" w:w="100"/>
+            </w:tcMar>
+          </w:tcPr>
+          <w:p>
+            <w:pPr>
+              <w:spacing w:after="0" w:line="260"/>
+            </w:pPr>
+            <w:r>
+              <w:rPr>
+                <w:color w:val="262626"/>
+                <w:sz w:val="20"/>
+                <w:szCs w:val="20"/>
+              </w:rPr>
+              <w:t xml:space="preserve">learning rate 2e-4, cosine schedule, 3% warm-up, 2 epochs</w:t>
+            </w:r>
+          </w:p>
+        </w:tc>
+      </w:tr>
+      <w:tr>
+        <w:trPr>
+          <w:cantSplit/>
+        </w:trPr>
+        <w:tc>
+          <w:tcPr>
+            <w:tcW w:type="dxa" w:w="3000"/>
+            <w:tcBorders>
+              <w:top w:val="single" w:color="BFBFBF" w:sz="4"/>
+              <w:left w:val="single" w:color="BFBFBF" w:sz="4"/>
+              <w:bottom w:val="single" w:color="BFBFBF" w:sz="4"/>
+              <w:right w:val="single" w:color="BFBFBF" w:sz="4"/>
+            </w:tcBorders>
+            <w:shd w:fill="F2F2F2" w:color="auto" w:val="clear"/>
+            <w:tcMar>
+              <w:top w:type="dxa" w:w="60"/>
+              <w:left w:type="dxa" w:w="100"/>
+              <w:bottom w:type="dxa" w:w="60"/>
+              <w:right w:type="dxa" w:w="100"/>
+            </w:tcMar>
+          </w:tcPr>
+          <w:p>
+            <w:pPr>
+              <w:spacing w:after="0" w:line="260"/>
+            </w:pPr>
+            <w:r>
+              <w:rPr>
+                <w:color w:val="262626"/>
+                <w:sz w:val="20"/>
+                <w:szCs w:val="20"/>
+              </w:rPr>
+              <w:t xml:space="preserve">Maximum length</w:t>
+            </w:r>
+          </w:p>
+        </w:tc>
+        <w:tc>
+          <w:tcPr>
+            <w:tcW w:type="dxa" w:w="6026"/>
+            <w:tcBorders>
+              <w:top w:val="single" w:color="BFBFBF" w:sz="4"/>
+              <w:left w:val="single" w:color="BFBFBF" w:sz="4"/>
+              <w:bottom w:val="single" w:color="BFBFBF" w:sz="4"/>
+              <w:right w:val="single" w:color="BFBFBF" w:sz="4"/>
+            </w:tcBorders>
+            <w:shd w:fill="F2F2F2" w:color="auto" w:val="clear"/>
+            <w:tcMar>
+              <w:top w:type="dxa" w:w="60"/>
+              <w:left w:type="dxa" w:w="100"/>
+              <w:bottom w:type="dxa" w:w="60"/>
+              <w:right w:type="dxa" w:w="100"/>
+            </w:tcMar>
+          </w:tcPr>
+          <w:p>
+            <w:pPr>
+              <w:spacing w:after="0" w:line="260"/>
+            </w:pPr>
+            <w:r>
+              <w:rPr>
+                <w:color w:val="262626"/>
+                <w:sz w:val="20"/>
+                <w:szCs w:val="20"/>
+              </w:rPr>
+              <w:t xml:space="preserve">2,560 tokens; gradient checkpointing</w:t>
+            </w:r>
+          </w:p>
+        </w:tc>
+      </w:tr>
+      <w:tr>
+        <w:trPr>
+          <w:cantSplit/>
+        </w:trPr>
+        <w:tc>
+          <w:tcPr>
+            <w:tcW w:type="dxa" w:w="3000"/>
+            <w:tcBorders>
+              <w:top w:val="single" w:color="BFBFBF" w:sz="4"/>
+              <w:left w:val="single" w:color="BFBFBF" w:sz="4"/>
+              <w:bottom w:val="single" w:color="BFBFBF" w:sz="4"/>
+              <w:right w:val="single" w:color="BFBFBF" w:sz="4"/>
+            </w:tcBorders>
+            <w:tcMar>
+              <w:top w:type="dxa" w:w="60"/>
+              <w:left w:type="dxa" w:w="100"/>
+              <w:bottom w:type="dxa" w:w="60"/>
+              <w:right w:type="dxa" w:w="100"/>
+            </w:tcMar>
+          </w:tcPr>
+          <w:p>
+            <w:pPr>
+              <w:spacing w:after="0" w:line="260"/>
+            </w:pPr>
+            <w:r>
+              <w:rPr>
+                <w:color w:val="262626"/>
+                <w:sz w:val="20"/>
+                <w:szCs w:val="20"/>
+              </w:rPr>
+              <w:t xml:space="preserve">Hardware and time</w:t>
+            </w:r>
+          </w:p>
+        </w:tc>
+        <w:tc>
+          <w:tcPr>
+            <w:tcW w:type="dxa" w:w="6026"/>
+            <w:tcBorders>
+              <w:top w:val="single" w:color="BFBFBF" w:sz="4"/>
+              <w:left w:val="single" w:color="BFBFBF" w:sz="4"/>
+              <w:bottom w:val="single" w:color="BFBFBF" w:sz="4"/>
+              <w:right w:val="single" w:color="BFBFBF" w:sz="4"/>
+            </w:tcBorders>
+            <w:tcMar>
+              <w:top w:type="dxa" w:w="60"/>
+              <w:left w:type="dxa" w:w="100"/>
+              <w:bottom w:type="dxa" w:w="60"/>
+              <w:right w:type="dxa" w:w="100"/>
+            </w:tcMar>
+          </w:tcPr>
+          <w:p>
+            <w:pPr>
+              <w:spacing w:after="0" w:line="260"/>
+            </w:pPr>
+            <w:r>
+              <w:rPr>
+                <w:color w:val="262626"/>
+                <w:sz w:val="20"/>
+                <w:szCs w:val="20"/>
+              </w:rPr>
+              <w:t xml:space="preserve">RTX 3050 Laptop GPU (4 GB), 63 minutes, about 2 GB VRAM</w:t>
+            </w:r>
+          </w:p>
+        </w:tc>
+      </w:tr>
+    </w:tbl>
+    <w:p>
+      <w:pPr>
+        <w:spacing w:after="120"/>
+      </w:pPr>
+    </w:p>
+    <w:p>
+      <w:pPr>
+        <w:spacing w:after="140" w:line="300"/>
+        <w:jc w:val="both"/>
+      </w:pPr>
+      <w:r>
+        <w:t xml:space="preserve">Batch size 1 is forced by Qwen’s 151k-token vocabulary: the output logits for one 2,500-token sequence alone occupy about 1.5 GB in 32-bit precision.</w:t>
+      </w:r>
+    </w:p>
+    <w:p>
+      <w:pPr>
+        <w:pStyle w:val="Heading2"/>
+      </w:pPr>
+      <w:bookmarkStart w:name="_Toc23" w:id="23"/>
+      <w:r>
+        <w:t xml:space="preserve">3.8 Terminal Application</w:t>
+      </w:r>
+      <w:bookmarkEnd w:id="23"/>
+    </w:p>
+    <w:p>
+      <w:pPr>
+        <w:spacing w:after="140" w:line="300"/>
+        <w:jc w:val="both"/>
+      </w:pPr>
+      <w:r>
+        <w:t xml:space="preserve">The user runs </w:t>
+      </w:r>
+      <w:r>
+        <w:rPr>
+          <w:rFonts w:ascii="Courier New" w:cs="Courier New" w:eastAsia="Courier New" w:hAnsi="Courier New"/>
+          <w:sz w:val="22"/>
+          <w:szCs w:val="22"/>
+        </w:rPr>
+        <w:t xml:space="preserve">python -m chipdoc datasheet.pdf</w:t>
+      </w:r>
+      <w:r>
+        <w:t xml:space="preserve">. On first use the PDF is validated, extracted, chunked and indexed (one to three minutes for a few hundred pages, dominated by layout-aware text extraction); afterwards the cached index loads instantly. Each question triggers hybrid retrieval and a streamed answer (Figure 6). The </w:t>
+      </w:r>
+      <w:r>
+        <w:rPr>
+          <w:rFonts w:ascii="Courier New" w:cs="Courier New" w:eastAsia="Courier New" w:hAnsi="Courier New"/>
+          <w:sz w:val="22"/>
+          <w:szCs w:val="22"/>
+        </w:rPr>
+        <w:t xml:space="preserve">/sources</w:t>
+      </w:r>
+      <w:r>
+        <w:t xml:space="preserve"> command shows the passages behind the last answer, </w:t>
+      </w:r>
+      <w:r>
+        <w:rPr>
+          <w:rFonts w:ascii="Courier New" w:cs="Courier New" w:eastAsia="Courier New" w:hAnsi="Courier New"/>
+          <w:sz w:val="22"/>
+          <w:szCs w:val="22"/>
+        </w:rPr>
+        <w:t xml:space="preserve">-q</w:t>
+      </w:r>
+      <w:r>
+        <w:t xml:space="preserve"> answers a single question non-interactively, and </w:t>
+      </w:r>
+      <w:r>
+        <w:rPr>
+          <w:rFonts w:ascii="Courier New" w:cs="Courier New" w:eastAsia="Courier New" w:hAnsi="Courier New"/>
+          <w:sz w:val="22"/>
+          <w:szCs w:val="22"/>
+        </w:rPr>
+        <w:t xml:space="preserve">--base</w:t>
+      </w:r>
+      <w:r>
+        <w:t xml:space="preserve"> runs the untuned model for comparison. Everything runs locally; no datasheet text or question leaves the machine.</w:t>
       </w:r>
     </w:p>
     <w:p>
@@ -4155,9 +4053,9 @@
       <w:r>
         <w:drawing>
           <wp:inline distT="0" distB="0" distL="0" distR="0">
-            <wp:extent cx="4000500" cy="3143250"/>
+            <wp:extent cx="5715000" cy="3762375"/>
             <wp:effectExtent t="0" r="0" b="0" l="0"/>
-            <wp:docPr id="7" name="Figure 7" descr="Answerable and unanswerable conditions used to evaluate answer quality." title="Figure 7"/>
+            <wp:docPr id="6" name="Figure 6" descr="Query flow in the terminal application, including the per-PDF cache." title="Figure 6"/>
             <wp:cNvGraphicFramePr>
               <a:graphicFrameLocks xmlns:a="http://schemas.openxmlformats.org/drawingml/2006/main" noChangeAspect="1"/>
             </wp:cNvGraphicFramePr>
@@ -4180,6 +4078,134 @@
                   <pic:spPr bwMode="auto">
                     <a:xfrm>
                       <a:off x="0" y="0"/>
+                      <a:ext cx="5715000" cy="3762375"/>
+                    </a:xfrm>
+                    <a:prstGeom prst="rect">
+                      <a:avLst/>
+                    </a:prstGeom>
+                  </pic:spPr>
+                </pic:pic>
+              </a:graphicData>
+            </a:graphic>
+          </wp:inline>
+        </w:drawing>
+      </w:r>
+    </w:p>
+    <w:p>
+      <w:pPr>
+        <w:spacing w:after="240"/>
+        <w:jc w:val="center"/>
+      </w:pPr>
+      <w:r>
+        <w:rPr>
+          <w:b/>
+          <w:bCs/>
+          <w:sz w:val="20"/>
+          <w:szCs w:val="20"/>
+        </w:rPr>
+        <w:t xml:space="preserve">Figure 6: </w:t>
+      </w:r>
+      <w:r>
+        <w:rPr>
+          <w:sz w:val="20"/>
+          <w:szCs w:val="20"/>
+        </w:rPr>
+        <w:t xml:space="preserve">Query flow in the terminal application, including the per-PDF cache.</w:t>
+      </w:r>
+    </w:p>
+    <w:p>
+      <w:pPr>
+        <w:pStyle w:val="Heading2"/>
+      </w:pPr>
+      <w:bookmarkStart w:name="_Toc24" w:id="24"/>
+      <w:r>
+        <w:t xml:space="preserve">3.9 Evaluation Protocol</w:t>
+      </w:r>
+      <w:bookmarkEnd w:id="24"/>
+    </w:p>
+    <w:p>
+      <w:pPr>
+        <w:spacing w:after="140" w:line="300"/>
+        <w:jc w:val="both"/>
+      </w:pPr>
+      <w:r>
+        <w:t xml:space="preserve">All evaluation uses the five held-out datasheets (341 test QA pairs). </w:t>
+      </w:r>
+      <w:r>
+        <w:rPr>
+          <w:b/>
+          <w:bCs/>
+        </w:rPr>
+        <w:t xml:space="preserve">Retrieval</w:t>
+      </w:r>
+      <w:r>
+        <w:t xml:space="preserve"> is measured with Recall@k and MRR@10, where a hit is a retrieved passage that is the source passage or contains the evidence span. </w:t>
+      </w:r>
+      <w:r>
+        <w:rPr>
+          <w:b/>
+          <w:bCs/>
+        </w:rPr>
+        <w:t xml:space="preserve">Answer quality</w:t>
+      </w:r>
+      <w:r>
+        <w:t xml:space="preserve"> is measured on a seeded random sample of 100 test questions, each asked twice (Figure 7): once with the real top-five retrieval (</w:t>
+      </w:r>
+      <w:r>
+        <w:rPr>
+          <w:i/>
+          <w:iCs/>
+        </w:rPr>
+        <w:t xml:space="preserve">answerable</w:t>
+      </w:r>
+      <w:r>
+        <w:t xml:space="preserve">), and once with every passage containing the evidence removed (</w:t>
+      </w:r>
+      <w:r>
+        <w:rPr>
+          <w:i/>
+          <w:iCs/>
+        </w:rPr>
+        <w:t xml:space="preserve">unanswerable</w:t>
+      </w:r>
+      <w:r>
+        <w:t xml:space="preserve">), where the only correct output is the refusal sentence.</w:t>
+      </w:r>
+    </w:p>
+    <w:p>
+      <w:pPr>
+        <w:keepNext/>
+        <w:spacing w:after="60" w:before="120"/>
+        <w:jc w:val="center"/>
+      </w:pPr>
+      <w:r>
+        <w:drawing>
+          <wp:inline distT="0" distB="0" distL="0" distR="0">
+            <wp:extent cx="4000500" cy="3143250"/>
+            <wp:effectExtent t="0" r="0" b="0" l="0"/>
+            <wp:docPr id="7" name="Figure 7" descr="Answerable and unanswerable conditions used to evaluate answer quality." title="Figure 7"/>
+            <wp:cNvGraphicFramePr>
+              <a:graphicFrameLocks xmlns:a="http://schemas.openxmlformats.org/drawingml/2006/main" noChangeAspect="1"/>
+            </wp:cNvGraphicFramePr>
+            <a:graphic xmlns:a="http://schemas.openxmlformats.org/drawingml/2006/main">
+              <a:graphicData uri="http://schemas.openxmlformats.org/drawingml/2006/picture">
+                <pic:pic xmlns:pic="http://schemas.openxmlformats.org/drawingml/2006/picture">
+                  <pic:nvPicPr>
+                    <pic:cNvPr id="0" name="" descr=""/>
+                    <pic:cNvPicPr>
+                      <a:picLocks noChangeAspect="1" noChangeArrowheads="1"/>
+                    </pic:cNvPicPr>
+                  </pic:nvPicPr>
+                  <pic:blipFill>
+                    <a:blip r:embed="rId17" cstate="none"/>
+                    <a:srcRect/>
+                    <a:stretch>
+                      <a:fillRect/>
+                    </a:stretch>
+                  </pic:blipFill>
+                  <pic:spPr bwMode="auto">
+                    <a:xfrm>
+                      <a:off x="0" y="0"/>
                       <a:ext cx="4000500" cy="3143250"/>
                     </a:xfrm>
                     <a:prstGeom prst="rect">
@@ -5134,7 +5160,7 @@
                     </pic:cNvPicPr>
                   </pic:nvPicPr>
                   <pic:blipFill>
-                    <a:blip r:embed="rId17" cstate="none"/>
+                    <a:blip r:embed="rId18" cstate="none"/>
                     <a:srcRect/>
                     <a:stretch>
                       <a:fillRect/>
@@ -6023,726 +6049,6 @@
             <wp:extent cx="5334000" cy="2705100"/>
             <wp:effectExtent t="0" r="0" b="0" l="0"/>
             <wp:docPr id="9" name="Figure 9" descr="Retrieval quality of dense, BM25 and hybrid search on unseen datasheets." title="Figure 9"/>
-            <wp:cNvGraphicFramePr>
-              <a:graphicFrameLocks xmlns:a="http://schemas.openxmlformats.org/drawingml/2006/main" noChangeAspect="1"/>
-            </wp:cNvGraphicFramePr>
-            <a:graphic xmlns:a="http://schemas.openxmlformats.org/drawingml/2006/main">
-              <a:graphicData uri="http://schemas.openxmlformats.org/drawingml/2006/picture">
-                <pic:pic xmlns:pic="http://schemas.openxmlformats.org/drawingml/2006/picture">
-                  <pic:nvPicPr>
-                    <pic:cNvPr id="0" name="" descr=""/>
-                    <pic:cNvPicPr>
-                      <a:picLocks noChangeAspect="1" noChangeArrowheads="1"/>
-                    </pic:cNvPicPr>
-                  </pic:nvPicPr>
-                  <pic:blipFill>
-                    <a:blip r:embed="rId18" cstate="none"/>
-                    <a:srcRect/>
-                    <a:stretch>
-                      <a:fillRect/>
-                    </a:stretch>
-                  </pic:blipFill>
-                  <pic:spPr bwMode="auto">
-                    <a:xfrm>
-                      <a:off x="0" y="0"/>
-                      <a:ext cx="5334000" cy="2705100"/>
-                    </a:xfrm>
-                    <a:prstGeom prst="rect">
-                      <a:avLst/>
-                    </a:prstGeom>
-                  </pic:spPr>
-                </pic:pic>
-              </a:graphicData>
-            </a:graphic>
-          </wp:inline>
-        </w:drawing>
-      </w:r>
-    </w:p>
-    <w:p>
-      <w:pPr>
-        <w:spacing w:after="240"/>
-        <w:jc w:val="center"/>
-      </w:pPr>
-      <w:r>
-        <w:rPr>
-          <w:b/>
-          <w:bCs/>
-          <w:sz w:val="20"/>
-          <w:szCs w:val="20"/>
-        </w:rPr>
-        <w:t xml:space="preserve">Figure 9: </w:t>
-      </w:r>
-      <w:r>
-        <w:rPr>
-          <w:sz w:val="20"/>
-          <w:szCs w:val="20"/>
-        </w:rPr>
-        <w:t xml:space="preserve">Retrieval quality of dense, BM25 and hybrid search on unseen datasheets.</w:t>
-      </w:r>
-    </w:p>
-    <w:p>
-      <w:pPr>
-        <w:pStyle w:val="Heading2"/>
-      </w:pPr>
-      <w:bookmarkStart w:name="_Toc29" w:id="29"/>
-      <w:r>
-        <w:t xml:space="preserve">4.4 Answer Quality</w:t>
-      </w:r>
-      <w:bookmarkEnd w:id="29"/>
-    </w:p>
-    <w:p>
-      <w:pPr>
-        <w:spacing w:after="140" w:line="300"/>
-        <w:jc w:val="both"/>
-      </w:pPr>
-      <w:r>
-        <w:t xml:space="preserve">Table 5 and Figure 10 compare the base Qwen3-0.6B with the fine-tuned ChipDoc model on the same 100 questions and the same retrieved passages. The fine-tune changed behaviour most where it was designed to. Page citations went from 0.22 to 0.91 correct; the base model usually cited passage numbers such as [1] or no page at all. On unanswerable inputs, the base model invented an answer 70% of the time; the fine-tuned model did so 26% of the time, converting 47 hallucinations into correct refusals.</w:t>
-      </w:r>
-    </w:p>
-    <w:p>
-      <w:pPr>
-        <w:keepNext/>
-        <w:spacing w:after="80" w:before="160"/>
-        <w:jc w:val="center"/>
-      </w:pPr>
-      <w:r>
-        <w:rPr>
-          <w:b/>
-          <w:bCs/>
-          <w:sz w:val="20"/>
-          <w:szCs w:val="20"/>
-        </w:rPr>
-        <w:t xml:space="preserve">Table 5: </w:t>
-      </w:r>
-      <w:r>
-        <w:rPr>
-          <w:sz w:val="20"/>
-          <w:szCs w:val="20"/>
-        </w:rPr>
-        <w:t xml:space="preserve">Answer quality on 100 held-out questions (best value in bold)</w:t>
-      </w:r>
-    </w:p>
-    <w:tbl>
-      <w:tblPr>
-        <w:tblW w:type="dxa" w:w="9026"/>
-        <w:jc w:val="center"/>
-        <w:tblBorders>
-          <w:top w:val="single" w:color="auto" w:sz="4"/>
-          <w:left w:val="single" w:color="auto" w:sz="4"/>
-          <w:bottom w:val="single" w:color="auto" w:sz="4"/>
-          <w:right w:val="single" w:color="auto" w:sz="4"/>
-          <w:insideH w:val="single" w:color="auto" w:sz="4"/>
-          <w:insideV w:val="single" w:color="auto" w:sz="4"/>
-        </w:tblBorders>
-      </w:tblPr>
-      <w:tblGrid>
-        <w:gridCol w:w="4426"/>
-        <w:gridCol w:w="2300"/>
-        <w:gridCol w:w="2300"/>
-      </w:tblGrid>
-      <w:tr>
-        <w:trPr>
-          <w:tblHeader/>
-        </w:trPr>
-        <w:tc>
-          <w:tcPr>
-            <w:tcW w:type="dxa" w:w="4426"/>
-            <w:tcBorders>
-              <w:top w:val="single" w:color="BFBFBF" w:sz="4"/>
-              <w:left w:val="single" w:color="BFBFBF" w:sz="4"/>
-              <w:bottom w:val="single" w:color="BFBFBF" w:sz="4"/>
-              <w:right w:val="single" w:color="BFBFBF" w:sz="4"/>
-            </w:tcBorders>
-            <w:shd w:fill="1F6F8B" w:color="auto" w:val="clear"/>
-            <w:tcMar>
-              <w:top w:type="dxa" w:w="60"/>
-              <w:left w:type="dxa" w:w="100"/>
-              <w:bottom w:type="dxa" w:w="60"/>
-              <w:right w:type="dxa" w:w="100"/>
-            </w:tcMar>
-          </w:tcPr>
-          <w:p>
-            <w:pPr>
-              <w:spacing w:after="0" w:line="260"/>
-            </w:pPr>
-            <w:r>
-              <w:rPr>
-                <w:b/>
-                <w:bCs/>
-                <w:color w:val="FFFFFF"/>
-                <w:sz w:val="20"/>
-                <w:szCs w:val="20"/>
-              </w:rPr>
-              <w:t xml:space="preserve">Metric</w:t>
-            </w:r>
-          </w:p>
-        </w:tc>
-        <w:tc>
-          <w:tcPr>
-            <w:tcW w:type="dxa" w:w="2300"/>
-            <w:tcBorders>
-              <w:top w:val="single" w:color="BFBFBF" w:sz="4"/>
-              <w:left w:val="single" w:color="BFBFBF" w:sz="4"/>
-              <w:bottom w:val="single" w:color="BFBFBF" w:sz="4"/>
-              <w:right w:val="single" w:color="BFBFBF" w:sz="4"/>
-            </w:tcBorders>
-            <w:shd w:fill="1F6F8B" w:color="auto" w:val="clear"/>
-            <w:tcMar>
-              <w:top w:type="dxa" w:w="60"/>
-              <w:left w:type="dxa" w:w="100"/>
-              <w:bottom w:type="dxa" w:w="60"/>
-              <w:right w:type="dxa" w:w="100"/>
-            </w:tcMar>
-          </w:tcPr>
-          <w:p>
-            <w:pPr>
-              <w:spacing w:after="0" w:line="260"/>
-            </w:pPr>
-            <w:r>
-              <w:rPr>
-                <w:b/>
-                <w:bCs/>
-                <w:color w:val="FFFFFF"/>
-                <w:sz w:val="20"/>
-                <w:szCs w:val="20"/>
-              </w:rPr>
-              <w:t xml:space="preserve">Base Qwen3-0.6B</w:t>
-            </w:r>
-          </w:p>
-        </w:tc>
-        <w:tc>
-          <w:tcPr>
-            <w:tcW w:type="dxa" w:w="2300"/>
-            <w:tcBorders>
-              <w:top w:val="single" w:color="BFBFBF" w:sz="4"/>
-              <w:left w:val="single" w:color="BFBFBF" w:sz="4"/>
-              <w:bottom w:val="single" w:color="BFBFBF" w:sz="4"/>
-              <w:right w:val="single" w:color="BFBFBF" w:sz="4"/>
-            </w:tcBorders>
-            <w:shd w:fill="1F6F8B" w:color="auto" w:val="clear"/>
-            <w:tcMar>
-              <w:top w:type="dxa" w:w="60"/>
-              <w:left w:type="dxa" w:w="100"/>
-              <w:bottom w:type="dxa" w:w="60"/>
-              <w:right w:type="dxa" w:w="100"/>
-            </w:tcMar>
-          </w:tcPr>
-          <w:p>
-            <w:pPr>
-              <w:spacing w:after="0" w:line="260"/>
-            </w:pPr>
-            <w:r>
-              <w:rPr>
-                <w:b/>
-                <w:bCs/>
-                <w:color w:val="FFFFFF"/>
-                <w:sz w:val="20"/>
-                <w:szCs w:val="20"/>
-              </w:rPr>
-              <w:t xml:space="preserve">ChipDoc (fine-tuned)</w:t>
-            </w:r>
-          </w:p>
-        </w:tc>
-      </w:tr>
-      <w:tr>
-        <w:trPr>
-          <w:cantSplit/>
-        </w:trPr>
-        <w:tc>
-          <w:tcPr>
-            <w:tcW w:type="dxa" w:w="4426"/>
-            <w:tcBorders>
-              <w:top w:val="single" w:color="BFBFBF" w:sz="4"/>
-              <w:left w:val="single" w:color="BFBFBF" w:sz="4"/>
-              <w:bottom w:val="single" w:color="BFBFBF" w:sz="4"/>
-              <w:right w:val="single" w:color="BFBFBF" w:sz="4"/>
-            </w:tcBorders>
-            <w:tcMar>
-              <w:top w:type="dxa" w:w="60"/>
-              <w:left w:type="dxa" w:w="100"/>
-              <w:bottom w:type="dxa" w:w="60"/>
-              <w:right w:type="dxa" w:w="100"/>
-            </w:tcMar>
-          </w:tcPr>
-          <w:p>
-            <w:pPr>
-              <w:spacing w:after="0" w:line="260"/>
-            </w:pPr>
-            <w:r>
-              <w:rPr>
-                <w:color w:val="262626"/>
-                <w:sz w:val="20"/>
-                <w:szCs w:val="20"/>
-              </w:rPr>
-              <w:t xml:space="preserve">Token F1 vs. reference</w:t>
-            </w:r>
-          </w:p>
-        </w:tc>
-        <w:tc>
-          <w:tcPr>
-            <w:tcW w:type="dxa" w:w="2300"/>
-            <w:tcBorders>
-              <w:top w:val="single" w:color="BFBFBF" w:sz="4"/>
-              <w:left w:val="single" w:color="BFBFBF" w:sz="4"/>
-              <w:bottom w:val="single" w:color="BFBFBF" w:sz="4"/>
-              <w:right w:val="single" w:color="BFBFBF" w:sz="4"/>
-            </w:tcBorders>
-            <w:tcMar>
-              <w:top w:type="dxa" w:w="60"/>
-              <w:left w:type="dxa" w:w="100"/>
-              <w:bottom w:type="dxa" w:w="60"/>
-              <w:right w:type="dxa" w:w="100"/>
-            </w:tcMar>
-          </w:tcPr>
-          <w:p>
-            <w:pPr>
-              <w:spacing w:after="0" w:line="260"/>
-            </w:pPr>
-            <w:r>
-              <w:rPr>
-                <w:color w:val="262626"/>
-                <w:sz w:val="20"/>
-                <w:szCs w:val="20"/>
-              </w:rPr>
-              <w:t xml:space="preserve">0.50</w:t>
-            </w:r>
-          </w:p>
-        </w:tc>
-        <w:tc>
-          <w:tcPr>
-            <w:tcW w:type="dxa" w:w="2300"/>
-            <w:tcBorders>
-              <w:top w:val="single" w:color="BFBFBF" w:sz="4"/>
-              <w:left w:val="single" w:color="BFBFBF" w:sz="4"/>
-              <w:bottom w:val="single" w:color="BFBFBF" w:sz="4"/>
-              <w:right w:val="single" w:color="BFBFBF" w:sz="4"/>
-            </w:tcBorders>
-            <w:tcMar>
-              <w:top w:type="dxa" w:w="60"/>
-              <w:left w:type="dxa" w:w="100"/>
-              <w:bottom w:type="dxa" w:w="60"/>
-              <w:right w:type="dxa" w:w="100"/>
-            </w:tcMar>
-          </w:tcPr>
-          <w:p>
-            <w:pPr>
-              <w:spacing w:after="0" w:line="260"/>
-            </w:pPr>
-            <w:r>
-              <w:rPr>
-                <w:color w:val="262626"/>
-                <w:sz w:val="20"/>
-                <w:szCs w:val="20"/>
-              </w:rPr>
-              <w:t xml:space="preserve">0.56</w:t>
-            </w:r>
-          </w:p>
-        </w:tc>
-      </w:tr>
-      <w:tr>
-        <w:trPr>
-          <w:cantSplit/>
-        </w:trPr>
-        <w:tc>
-          <w:tcPr>
-            <w:tcW w:type="dxa" w:w="4426"/>
-            <w:tcBorders>
-              <w:top w:val="single" w:color="BFBFBF" w:sz="4"/>
-              <w:left w:val="single" w:color="BFBFBF" w:sz="4"/>
-              <w:bottom w:val="single" w:color="BFBFBF" w:sz="4"/>
-              <w:right w:val="single" w:color="BFBFBF" w:sz="4"/>
-            </w:tcBorders>
-            <w:shd w:fill="F2F2F2" w:color="auto" w:val="clear"/>
-            <w:tcMar>
-              <w:top w:type="dxa" w:w="60"/>
-              <w:left w:type="dxa" w:w="100"/>
-              <w:bottom w:type="dxa" w:w="60"/>
-              <w:right w:type="dxa" w:w="100"/>
-            </w:tcMar>
-          </w:tcPr>
-          <w:p>
-            <w:pPr>
-              <w:spacing w:after="0" w:line="260"/>
-            </w:pPr>
-            <w:r>
-              <w:rPr>
-                <w:color w:val="262626"/>
-                <w:sz w:val="20"/>
-                <w:szCs w:val="20"/>
-              </w:rPr>
-              <w:t xml:space="preserve">Numbers reproduced correctly</w:t>
-            </w:r>
-          </w:p>
-        </w:tc>
-        <w:tc>
-          <w:tcPr>
-            <w:tcW w:type="dxa" w:w="2300"/>
-            <w:tcBorders>
-              <w:top w:val="single" w:color="BFBFBF" w:sz="4"/>
-              <w:left w:val="single" w:color="BFBFBF" w:sz="4"/>
-              <w:bottom w:val="single" w:color="BFBFBF" w:sz="4"/>
-              <w:right w:val="single" w:color="BFBFBF" w:sz="4"/>
-            </w:tcBorders>
-            <w:shd w:fill="F2F2F2" w:color="auto" w:val="clear"/>
-            <w:tcMar>
-              <w:top w:type="dxa" w:w="60"/>
-              <w:left w:type="dxa" w:w="100"/>
-              <w:bottom w:type="dxa" w:w="60"/>
-              <w:right w:type="dxa" w:w="100"/>
-            </w:tcMar>
-          </w:tcPr>
-          <w:p>
-            <w:pPr>
-              <w:spacing w:after="0" w:line="260"/>
-            </w:pPr>
-            <w:r>
-              <w:rPr>
-                <w:color w:val="262626"/>
-                <w:sz w:val="20"/>
-                <w:szCs w:val="20"/>
-              </w:rPr>
-              <w:t xml:space="preserve">0.72</w:t>
-            </w:r>
-          </w:p>
-        </w:tc>
-        <w:tc>
-          <w:tcPr>
-            <w:tcW w:type="dxa" w:w="2300"/>
-            <w:tcBorders>
-              <w:top w:val="single" w:color="BFBFBF" w:sz="4"/>
-              <w:left w:val="single" w:color="BFBFBF" w:sz="4"/>
-              <w:bottom w:val="single" w:color="BFBFBF" w:sz="4"/>
-              <w:right w:val="single" w:color="BFBFBF" w:sz="4"/>
-            </w:tcBorders>
-            <w:shd w:fill="F2F2F2" w:color="auto" w:val="clear"/>
-            <w:tcMar>
-              <w:top w:type="dxa" w:w="60"/>
-              <w:left w:type="dxa" w:w="100"/>
-              <w:bottom w:type="dxa" w:w="60"/>
-              <w:right w:type="dxa" w:w="100"/>
-            </w:tcMar>
-          </w:tcPr>
-          <w:p>
-            <w:pPr>
-              <w:spacing w:after="0" w:line="260"/>
-            </w:pPr>
-            <w:r>
-              <w:rPr>
-                <w:color w:val="262626"/>
-                <w:sz w:val="20"/>
-                <w:szCs w:val="20"/>
-              </w:rPr>
-              <w:t xml:space="preserve">0.75</w:t>
-            </w:r>
-          </w:p>
-        </w:tc>
-      </w:tr>
-      <w:tr>
-        <w:trPr>
-          <w:cantSplit/>
-        </w:trPr>
-        <w:tc>
-          <w:tcPr>
-            <w:tcW w:type="dxa" w:w="4426"/>
-            <w:tcBorders>
-              <w:top w:val="single" w:color="BFBFBF" w:sz="4"/>
-              <w:left w:val="single" w:color="BFBFBF" w:sz="4"/>
-              <w:bottom w:val="single" w:color="BFBFBF" w:sz="4"/>
-              <w:right w:val="single" w:color="BFBFBF" w:sz="4"/>
-            </w:tcBorders>
-            <w:tcMar>
-              <w:top w:type="dxa" w:w="60"/>
-              <w:left w:type="dxa" w:w="100"/>
-              <w:bottom w:type="dxa" w:w="60"/>
-              <w:right w:type="dxa" w:w="100"/>
-            </w:tcMar>
-          </w:tcPr>
-          <w:p>
-            <w:pPr>
-              <w:spacing w:after="0" w:line="260"/>
-            </w:pPr>
-            <w:r>
-              <w:rPr>
-                <w:color w:val="262626"/>
-                <w:sz w:val="20"/>
-                <w:szCs w:val="20"/>
-              </w:rPr>
-              <w:t xml:space="preserve">Correct page citation</w:t>
-            </w:r>
-          </w:p>
-        </w:tc>
-        <w:tc>
-          <w:tcPr>
-            <w:tcW w:type="dxa" w:w="2300"/>
-            <w:tcBorders>
-              <w:top w:val="single" w:color="BFBFBF" w:sz="4"/>
-              <w:left w:val="single" w:color="BFBFBF" w:sz="4"/>
-              <w:bottom w:val="single" w:color="BFBFBF" w:sz="4"/>
-              <w:right w:val="single" w:color="BFBFBF" w:sz="4"/>
-            </w:tcBorders>
-            <w:tcMar>
-              <w:top w:type="dxa" w:w="60"/>
-              <w:left w:type="dxa" w:w="100"/>
-              <w:bottom w:type="dxa" w:w="60"/>
-              <w:right w:type="dxa" w:w="100"/>
-            </w:tcMar>
-          </w:tcPr>
-          <w:p>
-            <w:pPr>
-              <w:spacing w:after="0" w:line="260"/>
-            </w:pPr>
-            <w:r>
-              <w:rPr>
-                <w:color w:val="262626"/>
-                <w:sz w:val="20"/>
-                <w:szCs w:val="20"/>
-              </w:rPr>
-              <w:t xml:space="preserve">0.22</w:t>
-            </w:r>
-          </w:p>
-        </w:tc>
-        <w:tc>
-          <w:tcPr>
-            <w:tcW w:type="dxa" w:w="2300"/>
-            <w:tcBorders>
-              <w:top w:val="single" w:color="BFBFBF" w:sz="4"/>
-              <w:left w:val="single" w:color="BFBFBF" w:sz="4"/>
-              <w:bottom w:val="single" w:color="BFBFBF" w:sz="4"/>
-              <w:right w:val="single" w:color="BFBFBF" w:sz="4"/>
-            </w:tcBorders>
-            <w:tcMar>
-              <w:top w:type="dxa" w:w="60"/>
-              <w:left w:type="dxa" w:w="100"/>
-              <w:bottom w:type="dxa" w:w="60"/>
-              <w:right w:type="dxa" w:w="100"/>
-            </w:tcMar>
-          </w:tcPr>
-          <w:p>
-            <w:pPr>
-              <w:spacing w:after="0" w:line="260"/>
-            </w:pPr>
-            <w:r>
-              <w:rPr>
-                <w:color w:val="262626"/>
-                <w:sz w:val="20"/>
-                <w:szCs w:val="20"/>
-              </w:rPr>
-              <w:t xml:space="preserve">0.91</w:t>
-            </w:r>
-          </w:p>
-        </w:tc>
-      </w:tr>
-      <w:tr>
-        <w:trPr>
-          <w:cantSplit/>
-        </w:trPr>
-        <w:tc>
-          <w:tcPr>
-            <w:tcW w:type="dxa" w:w="4426"/>
-            <w:tcBorders>
-              <w:top w:val="single" w:color="BFBFBF" w:sz="4"/>
-              <w:left w:val="single" w:color="BFBFBF" w:sz="4"/>
-              <w:bottom w:val="single" w:color="BFBFBF" w:sz="4"/>
-              <w:right w:val="single" w:color="BFBFBF" w:sz="4"/>
-            </w:tcBorders>
-            <w:shd w:fill="F2F2F2" w:color="auto" w:val="clear"/>
-            <w:tcMar>
-              <w:top w:type="dxa" w:w="60"/>
-              <w:left w:type="dxa" w:w="100"/>
-              <w:bottom w:type="dxa" w:w="60"/>
-              <w:right w:type="dxa" w:w="100"/>
-            </w:tcMar>
-          </w:tcPr>
-          <w:p>
-            <w:pPr>
-              <w:spacing w:after="0" w:line="260"/>
-            </w:pPr>
-            <w:r>
-              <w:rPr>
-                <w:color w:val="262626"/>
-                <w:sz w:val="20"/>
-                <w:szCs w:val="20"/>
-              </w:rPr>
-              <w:t xml:space="preserve">False refusal (lower is better)</w:t>
-            </w:r>
-          </w:p>
-        </w:tc>
-        <w:tc>
-          <w:tcPr>
-            <w:tcW w:type="dxa" w:w="2300"/>
-            <w:tcBorders>
-              <w:top w:val="single" w:color="BFBFBF" w:sz="4"/>
-              <w:left w:val="single" w:color="BFBFBF" w:sz="4"/>
-              <w:bottom w:val="single" w:color="BFBFBF" w:sz="4"/>
-              <w:right w:val="single" w:color="BFBFBF" w:sz="4"/>
-            </w:tcBorders>
-            <w:shd w:fill="F2F2F2" w:color="auto" w:val="clear"/>
-            <w:tcMar>
-              <w:top w:type="dxa" w:w="60"/>
-              <w:left w:type="dxa" w:w="100"/>
-              <w:bottom w:type="dxa" w:w="60"/>
-              <w:right w:type="dxa" w:w="100"/>
-            </w:tcMar>
-          </w:tcPr>
-          <w:p>
-            <w:pPr>
-              <w:spacing w:after="0" w:line="260"/>
-            </w:pPr>
-            <w:r>
-              <w:rPr>
-                <w:color w:val="262626"/>
-                <w:sz w:val="20"/>
-                <w:szCs w:val="20"/>
-              </w:rPr>
-              <w:t xml:space="preserve">0.05</w:t>
-            </w:r>
-          </w:p>
-        </w:tc>
-        <w:tc>
-          <w:tcPr>
-            <w:tcW w:type="dxa" w:w="2300"/>
-            <w:tcBorders>
-              <w:top w:val="single" w:color="BFBFBF" w:sz="4"/>
-              <w:left w:val="single" w:color="BFBFBF" w:sz="4"/>
-              <w:bottom w:val="single" w:color="BFBFBF" w:sz="4"/>
-              <w:right w:val="single" w:color="BFBFBF" w:sz="4"/>
-            </w:tcBorders>
-            <w:shd w:fill="F2F2F2" w:color="auto" w:val="clear"/>
-            <w:tcMar>
-              <w:top w:type="dxa" w:w="60"/>
-              <w:left w:type="dxa" w:w="100"/>
-              <w:bottom w:type="dxa" w:w="60"/>
-              <w:right w:type="dxa" w:w="100"/>
-            </w:tcMar>
-          </w:tcPr>
-          <w:p>
-            <w:pPr>
-              <w:spacing w:after="0" w:line="260"/>
-            </w:pPr>
-            <w:r>
-              <w:rPr>
-                <w:color w:val="262626"/>
-                <w:sz w:val="20"/>
-                <w:szCs w:val="20"/>
-              </w:rPr>
-              <w:t xml:space="preserve">0.15</w:t>
-            </w:r>
-          </w:p>
-        </w:tc>
-      </w:tr>
-      <w:tr>
-        <w:trPr>
-          <w:cantSplit/>
-        </w:trPr>
-        <w:tc>
-          <w:tcPr>
-            <w:tcW w:type="dxa" w:w="4426"/>
-            <w:tcBorders>
-              <w:top w:val="single" w:color="BFBFBF" w:sz="4"/>
-              <w:left w:val="single" w:color="BFBFBF" w:sz="4"/>
-              <w:bottom w:val="single" w:color="BFBFBF" w:sz="4"/>
-              <w:right w:val="single" w:color="BFBFBF" w:sz="4"/>
-            </w:tcBorders>
-            <w:tcMar>
-              <w:top w:type="dxa" w:w="60"/>
-              <w:left w:type="dxa" w:w="100"/>
-              <w:bottom w:type="dxa" w:w="60"/>
-              <w:right w:type="dxa" w:w="100"/>
-            </w:tcMar>
-          </w:tcPr>
-          <w:p>
-            <w:pPr>
-              <w:spacing w:after="0" w:line="260"/>
-            </w:pPr>
-            <w:r>
-              <w:rPr>
-                <w:color w:val="262626"/>
-                <w:sz w:val="20"/>
-                <w:szCs w:val="20"/>
-              </w:rPr>
-              <w:t xml:space="preserve">Refusal accuracy when evidence is absent</w:t>
-            </w:r>
-          </w:p>
-        </w:tc>
-        <w:tc>
-          <w:tcPr>
-            <w:tcW w:type="dxa" w:w="2300"/>
-            <w:tcBorders>
-              <w:top w:val="single" w:color="BFBFBF" w:sz="4"/>
-              <w:left w:val="single" w:color="BFBFBF" w:sz="4"/>
-              <w:bottom w:val="single" w:color="BFBFBF" w:sz="4"/>
-              <w:right w:val="single" w:color="BFBFBF" w:sz="4"/>
-            </w:tcBorders>
-            <w:tcMar>
-              <w:top w:type="dxa" w:w="60"/>
-              <w:left w:type="dxa" w:w="100"/>
-              <w:bottom w:type="dxa" w:w="60"/>
-              <w:right w:type="dxa" w:w="100"/>
-            </w:tcMar>
-          </w:tcPr>
-          <w:p>
-            <w:pPr>
-              <w:spacing w:after="0" w:line="260"/>
-            </w:pPr>
-            <w:r>
-              <w:rPr>
-                <w:color w:val="262626"/>
-                <w:sz w:val="20"/>
-                <w:szCs w:val="20"/>
-              </w:rPr>
-              <w:t xml:space="preserve">0.30</w:t>
-            </w:r>
-          </w:p>
-        </w:tc>
-        <w:tc>
-          <w:tcPr>
-            <w:tcW w:type="dxa" w:w="2300"/>
-            <w:tcBorders>
-              <w:top w:val="single" w:color="BFBFBF" w:sz="4"/>
-              <w:left w:val="single" w:color="BFBFBF" w:sz="4"/>
-              <w:bottom w:val="single" w:color="BFBFBF" w:sz="4"/>
-              <w:right w:val="single" w:color="BFBFBF" w:sz="4"/>
-            </w:tcBorders>
-            <w:tcMar>
-              <w:top w:type="dxa" w:w="60"/>
-              <w:left w:type="dxa" w:w="100"/>
-              <w:bottom w:type="dxa" w:w="60"/>
-              <w:right w:type="dxa" w:w="100"/>
-            </w:tcMar>
-          </w:tcPr>
-          <w:p>
-            <w:pPr>
-              <w:spacing w:after="0" w:line="260"/>
-            </w:pPr>
-            <w:r>
-              <w:rPr>
-                <w:color w:val="262626"/>
-                <w:sz w:val="20"/>
-                <w:szCs w:val="20"/>
-              </w:rPr>
-              <w:t xml:space="preserve">0.74</w:t>
-            </w:r>
-          </w:p>
-        </w:tc>
-      </w:tr>
-    </w:tbl>
-    <w:p>
-      <w:pPr>
-        <w:spacing w:after="120"/>
-      </w:pPr>
-    </w:p>
-    <w:p>
-      <w:pPr>
-        <w:keepNext/>
-        <w:spacing w:after="60" w:before="120"/>
-        <w:jc w:val="center"/>
-      </w:pPr>
-      <w:r>
-        <w:drawing>
-          <wp:inline distT="0" distB="0" distL="0" distR="0">
-            <wp:extent cx="5334000" cy="2705100"/>
-            <wp:effectExtent t="0" r="0" b="0" l="0"/>
-            <wp:docPr id="10" name="Figure 10" descr="Base versus fine-tuned model on the same retrieved passages." title="Figure 10"/>
             <wp:cNvGraphicFramePr>
               <a:graphicFrameLocks xmlns:a="http://schemas.openxmlformats.org/drawingml/2006/main" noChangeAspect="1"/>
             </wp:cNvGraphicFramePr>
@@ -6790,15 +6096,25 @@
           <w:sz w:val="20"/>
           <w:szCs w:val="20"/>
         </w:rPr>
-        <w:t xml:space="preserve">Figure 10: </w:t>
+        <w:t xml:space="preserve">Figure 9: </w:t>
       </w:r>
       <w:r>
         <w:rPr>
           <w:sz w:val="20"/>
           <w:szCs w:val="20"/>
         </w:rPr>
-        <w:t xml:space="preserve">Base versus fine-tuned model on the same retrieved passages.</w:t>
-      </w:r>
+        <w:t xml:space="preserve">Retrieval quality of dense, BM25 and hybrid search on unseen datasheets.</w:t>
+      </w:r>
+    </w:p>
+    <w:p>
+      <w:pPr>
+        <w:pStyle w:val="Heading2"/>
+      </w:pPr>
+      <w:bookmarkStart w:name="_Toc29" w:id="29"/>
+      <w:r>
+        <w:t xml:space="preserve">4.4 Answer Quality</w:t>
+      </w:r>
+      <w:bookmarkEnd w:id="29"/>
     </w:p>
     <w:p>
       <w:pPr>
@@ -6806,27 +6122,640 @@
         <w:jc w:val="both"/>
       </w:pPr>
       <w:r>
-        <w:t xml:space="preserve">Answer accuracy itself improved more modestly (F1 +0.06, numbers +0.03). Both models see the same passages, and a 0.6B model’s ability to read dense electrical tables is largely set by pre-training rather than by a short fine-tune. The fine-tune mainly taught </w:t>
-      </w:r>
-      <w:r>
-        <w:rPr>
-          <w:i/>
-          <w:iCs/>
-        </w:rPr>
-        <w:t xml:space="preserve">format and discipline</w:t>
-      </w:r>
-      <w:r>
-        <w:t xml:space="preserve">: short answers, exact copying, citations and refusals.</w:t>
-      </w:r>
-    </w:p>
-    <w:p>
-      <w:pPr>
-        <w:spacing w:after="140" w:line="300"/>
-        <w:jc w:val="both"/>
-      </w:pPr>
-      <w:r>
-        <w:t xml:space="preserve">Figure 11 breaks the same results down by outcome. When the evidence was retrieved, the share of fully correct answers (token F1 of at least 0.5) rose from 48% to 58%, and partly correct or wrong answers fell from 47% to 27%; the price is a larger share of refusals, from 5% to 15%. When the evidence was removed, the share of invented answers fell from 70% to 26%.</w:t>
-      </w:r>
+        <w:t xml:space="preserve">Table 5 and Figure 10 compare the base Qwen3-0.6B with the fine-tuned ChipDoc model on the same 100 questions and the same retrieved passages. The fine-tune changed behaviour most where it was designed to. Page citations went from 0.22 to 0.91 correct; the base model usually cited passage numbers such as [1] or no page at all. On unanswerable inputs, the base model invented an answer 70% of the time; the fine-tuned model did so 26% of the time, converting 47 hallucinations into correct refusals.</w:t>
+      </w:r>
+    </w:p>
+    <w:p>
+      <w:pPr>
+        <w:keepNext/>
+        <w:spacing w:after="80" w:before="160"/>
+        <w:jc w:val="center"/>
+      </w:pPr>
+      <w:r>
+        <w:rPr>
+          <w:b/>
+          <w:bCs/>
+          <w:sz w:val="20"/>
+          <w:szCs w:val="20"/>
+        </w:rPr>
+        <w:t xml:space="preserve">Table 5: </w:t>
+      </w:r>
+      <w:r>
+        <w:rPr>
+          <w:sz w:val="20"/>
+          <w:szCs w:val="20"/>
+        </w:rPr>
+        <w:t xml:space="preserve">Answer quality on 100 held-out questions (best value in bold)</w:t>
+      </w:r>
+    </w:p>
+    <w:tbl>
+      <w:tblPr>
+        <w:tblW w:type="dxa" w:w="9026"/>
+        <w:jc w:val="center"/>
+        <w:tblBorders>
+          <w:top w:val="single" w:color="auto" w:sz="4"/>
+          <w:left w:val="single" w:color="auto" w:sz="4"/>
+          <w:bottom w:val="single" w:color="auto" w:sz="4"/>
+          <w:right w:val="single" w:color="auto" w:sz="4"/>
+          <w:insideH w:val="single" w:color="auto" w:sz="4"/>
+          <w:insideV w:val="single" w:color="auto" w:sz="4"/>
+        </w:tblBorders>
+      </w:tblPr>
+      <w:tblGrid>
+        <w:gridCol w:w="4426"/>
+        <w:gridCol w:w="2300"/>
+        <w:gridCol w:w="2300"/>
+      </w:tblGrid>
+      <w:tr>
+        <w:trPr>
+          <w:tblHeader/>
+        </w:trPr>
+        <w:tc>
+          <w:tcPr>
+            <w:tcW w:type="dxa" w:w="4426"/>
+            <w:tcBorders>
+              <w:top w:val="single" w:color="BFBFBF" w:sz="4"/>
+              <w:left w:val="single" w:color="BFBFBF" w:sz="4"/>
+              <w:bottom w:val="single" w:color="BFBFBF" w:sz="4"/>
+              <w:right w:val="single" w:color="BFBFBF" w:sz="4"/>
+            </w:tcBorders>
+            <w:shd w:fill="1F6F8B" w:color="auto" w:val="clear"/>
+            <w:tcMar>
+              <w:top w:type="dxa" w:w="60"/>
+              <w:left w:type="dxa" w:w="100"/>
+              <w:bottom w:type="dxa" w:w="60"/>
+              <w:right w:type="dxa" w:w="100"/>
+            </w:tcMar>
+          </w:tcPr>
+          <w:p>
+            <w:pPr>
+              <w:spacing w:after="0" w:line="260"/>
+            </w:pPr>
+            <w:r>
+              <w:rPr>
+                <w:b/>
+                <w:bCs/>
+                <w:color w:val="FFFFFF"/>
+                <w:sz w:val="20"/>
+                <w:szCs w:val="20"/>
+              </w:rPr>
+              <w:t xml:space="preserve">Metric</w:t>
+            </w:r>
+          </w:p>
+        </w:tc>
+        <w:tc>
+          <w:tcPr>
+            <w:tcW w:type="dxa" w:w="2300"/>
+            <w:tcBorders>
+              <w:top w:val="single" w:color="BFBFBF" w:sz="4"/>
+              <w:left w:val="single" w:color="BFBFBF" w:sz="4"/>
+              <w:bottom w:val="single" w:color="BFBFBF" w:sz="4"/>
+              <w:right w:val="single" w:color="BFBFBF" w:sz="4"/>
+            </w:tcBorders>
+            <w:shd w:fill="1F6F8B" w:color="auto" w:val="clear"/>
+            <w:tcMar>
+              <w:top w:type="dxa" w:w="60"/>
+              <w:left w:type="dxa" w:w="100"/>
+              <w:bottom w:type="dxa" w:w="60"/>
+              <w:right w:type="dxa" w:w="100"/>
+            </w:tcMar>
+          </w:tcPr>
+          <w:p>
+            <w:pPr>
+              <w:spacing w:after="0" w:line="260"/>
+            </w:pPr>
+            <w:r>
+              <w:rPr>
+                <w:b/>
+                <w:bCs/>
+                <w:color w:val="FFFFFF"/>
+                <w:sz w:val="20"/>
+                <w:szCs w:val="20"/>
+              </w:rPr>
+              <w:t xml:space="preserve">Base Qwen3-0.6B</w:t>
+            </w:r>
+          </w:p>
+        </w:tc>
+        <w:tc>
+          <w:tcPr>
+            <w:tcW w:type="dxa" w:w="2300"/>
+            <w:tcBorders>
+              <w:top w:val="single" w:color="BFBFBF" w:sz="4"/>
+              <w:left w:val="single" w:color="BFBFBF" w:sz="4"/>
+              <w:bottom w:val="single" w:color="BFBFBF" w:sz="4"/>
+              <w:right w:val="single" w:color="BFBFBF" w:sz="4"/>
+            </w:tcBorders>
+            <w:shd w:fill="1F6F8B" w:color="auto" w:val="clear"/>
+            <w:tcMar>
+              <w:top w:type="dxa" w:w="60"/>
+              <w:left w:type="dxa" w:w="100"/>
+              <w:bottom w:type="dxa" w:w="60"/>
+              <w:right w:type="dxa" w:w="100"/>
+            </w:tcMar>
+          </w:tcPr>
+          <w:p>
+            <w:pPr>
+              <w:spacing w:after="0" w:line="260"/>
+            </w:pPr>
+            <w:r>
+              <w:rPr>
+                <w:b/>
+                <w:bCs/>
+                <w:color w:val="FFFFFF"/>
+                <w:sz w:val="20"/>
+                <w:szCs w:val="20"/>
+              </w:rPr>
+              <w:t xml:space="preserve">ChipDoc (fine-tuned)</w:t>
+            </w:r>
+          </w:p>
+        </w:tc>
+      </w:tr>
+      <w:tr>
+        <w:trPr>
+          <w:cantSplit/>
+        </w:trPr>
+        <w:tc>
+          <w:tcPr>
+            <w:tcW w:type="dxa" w:w="4426"/>
+            <w:tcBorders>
+              <w:top w:val="single" w:color="BFBFBF" w:sz="4"/>
+              <w:left w:val="single" w:color="BFBFBF" w:sz="4"/>
+              <w:bottom w:val="single" w:color="BFBFBF" w:sz="4"/>
+              <w:right w:val="single" w:color="BFBFBF" w:sz="4"/>
+            </w:tcBorders>
+            <w:tcMar>
+              <w:top w:type="dxa" w:w="60"/>
+              <w:left w:type="dxa" w:w="100"/>
+              <w:bottom w:type="dxa" w:w="60"/>
+              <w:right w:type="dxa" w:w="100"/>
+            </w:tcMar>
+          </w:tcPr>
+          <w:p>
+            <w:pPr>
+              <w:spacing w:after="0" w:line="260"/>
+            </w:pPr>
+            <w:r>
+              <w:rPr>
+                <w:color w:val="262626"/>
+                <w:sz w:val="20"/>
+                <w:szCs w:val="20"/>
+              </w:rPr>
+              <w:t xml:space="preserve">Token F1 vs. reference</w:t>
+            </w:r>
+          </w:p>
+        </w:tc>
+        <w:tc>
+          <w:tcPr>
+            <w:tcW w:type="dxa" w:w="2300"/>
+            <w:tcBorders>
+              <w:top w:val="single" w:color="BFBFBF" w:sz="4"/>
+              <w:left w:val="single" w:color="BFBFBF" w:sz="4"/>
+              <w:bottom w:val="single" w:color="BFBFBF" w:sz="4"/>
+              <w:right w:val="single" w:color="BFBFBF" w:sz="4"/>
+            </w:tcBorders>
+            <w:tcMar>
+              <w:top w:type="dxa" w:w="60"/>
+              <w:left w:type="dxa" w:w="100"/>
+              <w:bottom w:type="dxa" w:w="60"/>
+              <w:right w:type="dxa" w:w="100"/>
+            </w:tcMar>
+          </w:tcPr>
+          <w:p>
+            <w:pPr>
+              <w:spacing w:after="0" w:line="260"/>
+            </w:pPr>
+            <w:r>
+              <w:rPr>
+                <w:color w:val="262626"/>
+                <w:sz w:val="20"/>
+                <w:szCs w:val="20"/>
+              </w:rPr>
+              <w:t xml:space="preserve">0.50</w:t>
+            </w:r>
+          </w:p>
+        </w:tc>
+        <w:tc>
+          <w:tcPr>
+            <w:tcW w:type="dxa" w:w="2300"/>
+            <w:tcBorders>
+              <w:top w:val="single" w:color="BFBFBF" w:sz="4"/>
+              <w:left w:val="single" w:color="BFBFBF" w:sz="4"/>
+              <w:bottom w:val="single" w:color="BFBFBF" w:sz="4"/>
+              <w:right w:val="single" w:color="BFBFBF" w:sz="4"/>
+            </w:tcBorders>
+            <w:tcMar>
+              <w:top w:type="dxa" w:w="60"/>
+              <w:left w:type="dxa" w:w="100"/>
+              <w:bottom w:type="dxa" w:w="60"/>
+              <w:right w:type="dxa" w:w="100"/>
+            </w:tcMar>
+          </w:tcPr>
+          <w:p>
+            <w:pPr>
+              <w:spacing w:after="0" w:line="260"/>
+            </w:pPr>
+            <w:r>
+              <w:rPr>
+                <w:color w:val="262626"/>
+                <w:sz w:val="20"/>
+                <w:szCs w:val="20"/>
+              </w:rPr>
+              <w:t xml:space="preserve">0.56</w:t>
+            </w:r>
+          </w:p>
+        </w:tc>
+      </w:tr>
+      <w:tr>
+        <w:trPr>
+          <w:cantSplit/>
+        </w:trPr>
+        <w:tc>
+          <w:tcPr>
+            <w:tcW w:type="dxa" w:w="4426"/>
+            <w:tcBorders>
+              <w:top w:val="single" w:color="BFBFBF" w:sz="4"/>
+              <w:left w:val="single" w:color="BFBFBF" w:sz="4"/>
+              <w:bottom w:val="single" w:color="BFBFBF" w:sz="4"/>
+              <w:right w:val="single" w:color="BFBFBF" w:sz="4"/>
+            </w:tcBorders>
+            <w:shd w:fill="F2F2F2" w:color="auto" w:val="clear"/>
+            <w:tcMar>
+              <w:top w:type="dxa" w:w="60"/>
+              <w:left w:type="dxa" w:w="100"/>
+              <w:bottom w:type="dxa" w:w="60"/>
+              <w:right w:type="dxa" w:w="100"/>
+            </w:tcMar>
+          </w:tcPr>
+          <w:p>
+            <w:pPr>
+              <w:spacing w:after="0" w:line="260"/>
+            </w:pPr>
+            <w:r>
+              <w:rPr>
+                <w:color w:val="262626"/>
+                <w:sz w:val="20"/>
+                <w:szCs w:val="20"/>
+              </w:rPr>
+              <w:t xml:space="preserve">Numbers reproduced correctly</w:t>
+            </w:r>
+          </w:p>
+        </w:tc>
+        <w:tc>
+          <w:tcPr>
+            <w:tcW w:type="dxa" w:w="2300"/>
+            <w:tcBorders>
+              <w:top w:val="single" w:color="BFBFBF" w:sz="4"/>
+              <w:left w:val="single" w:color="BFBFBF" w:sz="4"/>
+              <w:bottom w:val="single" w:color="BFBFBF" w:sz="4"/>
+              <w:right w:val="single" w:color="BFBFBF" w:sz="4"/>
+            </w:tcBorders>
+            <w:shd w:fill="F2F2F2" w:color="auto" w:val="clear"/>
+            <w:tcMar>
+              <w:top w:type="dxa" w:w="60"/>
+              <w:left w:type="dxa" w:w="100"/>
+              <w:bottom w:type="dxa" w:w="60"/>
+              <w:right w:type="dxa" w:w="100"/>
+            </w:tcMar>
+          </w:tcPr>
+          <w:p>
+            <w:pPr>
+              <w:spacing w:after="0" w:line="260"/>
+            </w:pPr>
+            <w:r>
+              <w:rPr>
+                <w:color w:val="262626"/>
+                <w:sz w:val="20"/>
+                <w:szCs w:val="20"/>
+              </w:rPr>
+              <w:t xml:space="preserve">0.72</w:t>
+            </w:r>
+          </w:p>
+        </w:tc>
+        <w:tc>
+          <w:tcPr>
+            <w:tcW w:type="dxa" w:w="2300"/>
+            <w:tcBorders>
+              <w:top w:val="single" w:color="BFBFBF" w:sz="4"/>
+              <w:left w:val="single" w:color="BFBFBF" w:sz="4"/>
+              <w:bottom w:val="single" w:color="BFBFBF" w:sz="4"/>
+              <w:right w:val="single" w:color="BFBFBF" w:sz="4"/>
+            </w:tcBorders>
+            <w:shd w:fill="F2F2F2" w:color="auto" w:val="clear"/>
+            <w:tcMar>
+              <w:top w:type="dxa" w:w="60"/>
+              <w:left w:type="dxa" w:w="100"/>
+              <w:bottom w:type="dxa" w:w="60"/>
+              <w:right w:type="dxa" w:w="100"/>
+            </w:tcMar>
+          </w:tcPr>
+          <w:p>
+            <w:pPr>
+              <w:spacing w:after="0" w:line="260"/>
+            </w:pPr>
+            <w:r>
+              <w:rPr>
+                <w:color w:val="262626"/>
+                <w:sz w:val="20"/>
+                <w:szCs w:val="20"/>
+              </w:rPr>
+              <w:t xml:space="preserve">0.75</w:t>
+            </w:r>
+          </w:p>
+        </w:tc>
+      </w:tr>
+      <w:tr>
+        <w:trPr>
+          <w:cantSplit/>
+        </w:trPr>
+        <w:tc>
+          <w:tcPr>
+            <w:tcW w:type="dxa" w:w="4426"/>
+            <w:tcBorders>
+              <w:top w:val="single" w:color="BFBFBF" w:sz="4"/>
+              <w:left w:val="single" w:color="BFBFBF" w:sz="4"/>
+              <w:bottom w:val="single" w:color="BFBFBF" w:sz="4"/>
+              <w:right w:val="single" w:color="BFBFBF" w:sz="4"/>
+            </w:tcBorders>
+            <w:tcMar>
+              <w:top w:type="dxa" w:w="60"/>
+              <w:left w:type="dxa" w:w="100"/>
+              <w:bottom w:type="dxa" w:w="60"/>
+              <w:right w:type="dxa" w:w="100"/>
+            </w:tcMar>
+          </w:tcPr>
+          <w:p>
+            <w:pPr>
+              <w:spacing w:after="0" w:line="260"/>
+            </w:pPr>
+            <w:r>
+              <w:rPr>
+                <w:color w:val="262626"/>
+                <w:sz w:val="20"/>
+                <w:szCs w:val="20"/>
+              </w:rPr>
+              <w:t xml:space="preserve">Correct page citation</w:t>
+            </w:r>
+          </w:p>
+        </w:tc>
+        <w:tc>
+          <w:tcPr>
+            <w:tcW w:type="dxa" w:w="2300"/>
+            <w:tcBorders>
+              <w:top w:val="single" w:color="BFBFBF" w:sz="4"/>
+              <w:left w:val="single" w:color="BFBFBF" w:sz="4"/>
+              <w:bottom w:val="single" w:color="BFBFBF" w:sz="4"/>
+              <w:right w:val="single" w:color="BFBFBF" w:sz="4"/>
+            </w:tcBorders>
+            <w:tcMar>
+              <w:top w:type="dxa" w:w="60"/>
+              <w:left w:type="dxa" w:w="100"/>
+              <w:bottom w:type="dxa" w:w="60"/>
+              <w:right w:type="dxa" w:w="100"/>
+            </w:tcMar>
+          </w:tcPr>
+          <w:p>
+            <w:pPr>
+              <w:spacing w:after="0" w:line="260"/>
+            </w:pPr>
+            <w:r>
+              <w:rPr>
+                <w:color w:val="262626"/>
+                <w:sz w:val="20"/>
+                <w:szCs w:val="20"/>
+              </w:rPr>
+              <w:t xml:space="preserve">0.22</w:t>
+            </w:r>
+          </w:p>
+        </w:tc>
+        <w:tc>
+          <w:tcPr>
+            <w:tcW w:type="dxa" w:w="2300"/>
+            <w:tcBorders>
+              <w:top w:val="single" w:color="BFBFBF" w:sz="4"/>
+              <w:left w:val="single" w:color="BFBFBF" w:sz="4"/>
+              <w:bottom w:val="single" w:color="BFBFBF" w:sz="4"/>
+              <w:right w:val="single" w:color="BFBFBF" w:sz="4"/>
+            </w:tcBorders>
+            <w:tcMar>
+              <w:top w:type="dxa" w:w="60"/>
+              <w:left w:type="dxa" w:w="100"/>
+              <w:bottom w:type="dxa" w:w="60"/>
+              <w:right w:type="dxa" w:w="100"/>
+            </w:tcMar>
+          </w:tcPr>
+          <w:p>
+            <w:pPr>
+              <w:spacing w:after="0" w:line="260"/>
+            </w:pPr>
+            <w:r>
+              <w:rPr>
+                <w:color w:val="262626"/>
+                <w:sz w:val="20"/>
+                <w:szCs w:val="20"/>
+              </w:rPr>
+              <w:t xml:space="preserve">0.91</w:t>
+            </w:r>
+          </w:p>
+        </w:tc>
+      </w:tr>
+      <w:tr>
+        <w:trPr>
+          <w:cantSplit/>
+        </w:trPr>
+        <w:tc>
+          <w:tcPr>
+            <w:tcW w:type="dxa" w:w="4426"/>
+            <w:tcBorders>
+              <w:top w:val="single" w:color="BFBFBF" w:sz="4"/>
+              <w:left w:val="single" w:color="BFBFBF" w:sz="4"/>
+              <w:bottom w:val="single" w:color="BFBFBF" w:sz="4"/>
+              <w:right w:val="single" w:color="BFBFBF" w:sz="4"/>
+            </w:tcBorders>
+            <w:shd w:fill="F2F2F2" w:color="auto" w:val="clear"/>
+            <w:tcMar>
+              <w:top w:type="dxa" w:w="60"/>
+              <w:left w:type="dxa" w:w="100"/>
+              <w:bottom w:type="dxa" w:w="60"/>
+              <w:right w:type="dxa" w:w="100"/>
+            </w:tcMar>
+          </w:tcPr>
+          <w:p>
+            <w:pPr>
+              <w:spacing w:after="0" w:line="260"/>
+            </w:pPr>
+            <w:r>
+              <w:rPr>
+                <w:color w:val="262626"/>
+                <w:sz w:val="20"/>
+                <w:szCs w:val="20"/>
+              </w:rPr>
+              <w:t xml:space="preserve">False refusal (lower is better)</w:t>
+            </w:r>
+          </w:p>
+        </w:tc>
+        <w:tc>
+          <w:tcPr>
+            <w:tcW w:type="dxa" w:w="2300"/>
+            <w:tcBorders>
+              <w:top w:val="single" w:color="BFBFBF" w:sz="4"/>
+              <w:left w:val="single" w:color="BFBFBF" w:sz="4"/>
+              <w:bottom w:val="single" w:color="BFBFBF" w:sz="4"/>
+              <w:right w:val="single" w:color="BFBFBF" w:sz="4"/>
+            </w:tcBorders>
+            <w:shd w:fill="F2F2F2" w:color="auto" w:val="clear"/>
+            <w:tcMar>
+              <w:top w:type="dxa" w:w="60"/>
+              <w:left w:type="dxa" w:w="100"/>
+              <w:bottom w:type="dxa" w:w="60"/>
+              <w:right w:type="dxa" w:w="100"/>
+            </w:tcMar>
+          </w:tcPr>
+          <w:p>
+            <w:pPr>
+              <w:spacing w:after="0" w:line="260"/>
+            </w:pPr>
+            <w:r>
+              <w:rPr>
+                <w:color w:val="262626"/>
+                <w:sz w:val="20"/>
+                <w:szCs w:val="20"/>
+              </w:rPr>
+              <w:t xml:space="preserve">0.05</w:t>
+            </w:r>
+          </w:p>
+        </w:tc>
+        <w:tc>
+          <w:tcPr>
+            <w:tcW w:type="dxa" w:w="2300"/>
+            <w:tcBorders>
+              <w:top w:val="single" w:color="BFBFBF" w:sz="4"/>
+              <w:left w:val="single" w:color="BFBFBF" w:sz="4"/>
+              <w:bottom w:val="single" w:color="BFBFBF" w:sz="4"/>
+              <w:right w:val="single" w:color="BFBFBF" w:sz="4"/>
+            </w:tcBorders>
+            <w:shd w:fill="F2F2F2" w:color="auto" w:val="clear"/>
+            <w:tcMar>
+              <w:top w:type="dxa" w:w="60"/>
+              <w:left w:type="dxa" w:w="100"/>
+              <w:bottom w:type="dxa" w:w="60"/>
+              <w:right w:type="dxa" w:w="100"/>
+            </w:tcMar>
+          </w:tcPr>
+          <w:p>
+            <w:pPr>
+              <w:spacing w:after="0" w:line="260"/>
+            </w:pPr>
+            <w:r>
+              <w:rPr>
+                <w:color w:val="262626"/>
+                <w:sz w:val="20"/>
+                <w:szCs w:val="20"/>
+              </w:rPr>
+              <w:t xml:space="preserve">0.15</w:t>
+            </w:r>
+          </w:p>
+        </w:tc>
+      </w:tr>
+      <w:tr>
+        <w:trPr>
+          <w:cantSplit/>
+        </w:trPr>
+        <w:tc>
+          <w:tcPr>
+            <w:tcW w:type="dxa" w:w="4426"/>
+            <w:tcBorders>
+              <w:top w:val="single" w:color="BFBFBF" w:sz="4"/>
+              <w:left w:val="single" w:color="BFBFBF" w:sz="4"/>
+              <w:bottom w:val="single" w:color="BFBFBF" w:sz="4"/>
+              <w:right w:val="single" w:color="BFBFBF" w:sz="4"/>
+            </w:tcBorders>
+            <w:tcMar>
+              <w:top w:type="dxa" w:w="60"/>
+              <w:left w:type="dxa" w:w="100"/>
+              <w:bottom w:type="dxa" w:w="60"/>
+              <w:right w:type="dxa" w:w="100"/>
+            </w:tcMar>
+          </w:tcPr>
+          <w:p>
+            <w:pPr>
+              <w:spacing w:after="0" w:line="260"/>
+            </w:pPr>
+            <w:r>
+              <w:rPr>
+                <w:color w:val="262626"/>
+                <w:sz w:val="20"/>
+                <w:szCs w:val="20"/>
+              </w:rPr>
+              <w:t xml:space="preserve">Refusal accuracy when evidence is absent</w:t>
+            </w:r>
+          </w:p>
+        </w:tc>
+        <w:tc>
+          <w:tcPr>
+            <w:tcW w:type="dxa" w:w="2300"/>
+            <w:tcBorders>
+              <w:top w:val="single" w:color="BFBFBF" w:sz="4"/>
+              <w:left w:val="single" w:color="BFBFBF" w:sz="4"/>
+              <w:bottom w:val="single" w:color="BFBFBF" w:sz="4"/>
+              <w:right w:val="single" w:color="BFBFBF" w:sz="4"/>
+            </w:tcBorders>
+            <w:tcMar>
+              <w:top w:type="dxa" w:w="60"/>
+              <w:left w:type="dxa" w:w="100"/>
+              <w:bottom w:type="dxa" w:w="60"/>
+              <w:right w:type="dxa" w:w="100"/>
+            </w:tcMar>
+          </w:tcPr>
+          <w:p>
+            <w:pPr>
+              <w:spacing w:after="0" w:line="260"/>
+            </w:pPr>
+            <w:r>
+              <w:rPr>
+                <w:color w:val="262626"/>
+                <w:sz w:val="20"/>
+                <w:szCs w:val="20"/>
+              </w:rPr>
+              <w:t xml:space="preserve">0.30</w:t>
+            </w:r>
+          </w:p>
+        </w:tc>
+        <w:tc>
+          <w:tcPr>
+            <w:tcW w:type="dxa" w:w="2300"/>
+            <w:tcBorders>
+              <w:top w:val="single" w:color="BFBFBF" w:sz="4"/>
+              <w:left w:val="single" w:color="BFBFBF" w:sz="4"/>
+              <w:bottom w:val="single" w:color="BFBFBF" w:sz="4"/>
+              <w:right w:val="single" w:color="BFBFBF" w:sz="4"/>
+            </w:tcBorders>
+            <w:tcMar>
+              <w:top w:type="dxa" w:w="60"/>
+              <w:left w:type="dxa" w:w="100"/>
+              <w:bottom w:type="dxa" w:w="60"/>
+              <w:right w:type="dxa" w:w="100"/>
+            </w:tcMar>
+          </w:tcPr>
+          <w:p>
+            <w:pPr>
+              <w:spacing w:after="0" w:line="260"/>
+            </w:pPr>
+            <w:r>
+              <w:rPr>
+                <w:color w:val="262626"/>
+                <w:sz w:val="20"/>
+                <w:szCs w:val="20"/>
+              </w:rPr>
+              <w:t xml:space="preserve">0.74</w:t>
+            </w:r>
+          </w:p>
+        </w:tc>
+      </w:tr>
+    </w:tbl>
+    <w:p>
+      <w:pPr>
+        <w:spacing w:after="120"/>
+      </w:pPr>
     </w:p>
     <w:p>
       <w:pPr>
@@ -6837,9 +6766,9 @@
       <w:r>
         <w:drawing>
           <wp:inline distT="0" distB="0" distL="0" distR="0">
-            <wp:extent cx="5715000" cy="2124075"/>
+            <wp:extent cx="5334000" cy="2705100"/>
             <wp:effectExtent t="0" r="0" b="0" l="0"/>
-            <wp:docPr id="11" name="Figure 11" descr="Outcome breakdown on the held-out questions. Left: inputs where retrieval found the evidence. Right: inputs where the evidence was removed, so the only correct output is a refusal." title="Figure 11"/>
+            <wp:docPr id="10" name="Figure 10" descr="Base versus fine-tuned model on the same retrieved passages." title="Figure 10"/>
             <wp:cNvGraphicFramePr>
               <a:graphicFrameLocks xmlns:a="http://schemas.openxmlformats.org/drawingml/2006/main" noChangeAspect="1"/>
             </wp:cNvGraphicFramePr>
@@ -6862,6 +6791,103 @@
                   <pic:spPr bwMode="auto">
                     <a:xfrm>
                       <a:off x="0" y="0"/>
+                      <a:ext cx="5334000" cy="2705100"/>
+                    </a:xfrm>
+                    <a:prstGeom prst="rect">
+                      <a:avLst/>
+                    </a:prstGeom>
+                  </pic:spPr>
+                </pic:pic>
+              </a:graphicData>
+            </a:graphic>
+          </wp:inline>
+        </w:drawing>
+      </w:r>
+    </w:p>
+    <w:p>
+      <w:pPr>
+        <w:spacing w:after="240"/>
+        <w:jc w:val="center"/>
+      </w:pPr>
+      <w:r>
+        <w:rPr>
+          <w:b/>
+          <w:bCs/>
+          <w:sz w:val="20"/>
+          <w:szCs w:val="20"/>
+        </w:rPr>
+        <w:t xml:space="preserve">Figure 10: </w:t>
+      </w:r>
+      <w:r>
+        <w:rPr>
+          <w:sz w:val="20"/>
+          <w:szCs w:val="20"/>
+        </w:rPr>
+        <w:t xml:space="preserve">Base versus fine-tuned model on the same retrieved passages.</w:t>
+      </w:r>
+    </w:p>
+    <w:p>
+      <w:pPr>
+        <w:spacing w:after="140" w:line="300"/>
+        <w:jc w:val="both"/>
+      </w:pPr>
+      <w:r>
+        <w:t xml:space="preserve">Answer accuracy itself improved more modestly (F1 +0.06, numbers +0.03). Both models see the same passages, and a 0.6B model’s ability to read dense electrical tables is largely set by pre-training rather than by a short fine-tune. The fine-tune mainly taught </w:t>
+      </w:r>
+      <w:r>
+        <w:rPr>
+          <w:i/>
+          <w:iCs/>
+        </w:rPr>
+        <w:t xml:space="preserve">format and discipline</w:t>
+      </w:r>
+      <w:r>
+        <w:t xml:space="preserve">: short answers, exact copying, citations and refusals.</w:t>
+      </w:r>
+    </w:p>
+    <w:p>
+      <w:pPr>
+        <w:spacing w:after="140" w:line="300"/>
+        <w:jc w:val="both"/>
+      </w:pPr>
+      <w:r>
+        <w:t xml:space="preserve">Figure 11 breaks the same results down by outcome. When the evidence was retrieved, the share of fully correct answers (token F1 of at least 0.5) rose from 48% to 58%, and partly correct or wrong answers fell from 47% to 27%; the price is a larger share of refusals, from 5% to 15%. When the evidence was removed, the share of invented answers fell from 70% to 26%.</w:t>
+      </w:r>
+    </w:p>
+    <w:p>
+      <w:pPr>
+        <w:keepNext/>
+        <w:spacing w:after="60" w:before="120"/>
+        <w:jc w:val="center"/>
+      </w:pPr>
+      <w:r>
+        <w:drawing>
+          <wp:inline distT="0" distB="0" distL="0" distR="0">
+            <wp:extent cx="5715000" cy="2124075"/>
+            <wp:effectExtent t="0" r="0" b="0" l="0"/>
+            <wp:docPr id="11" name="Figure 11" descr="Outcome breakdown on the held-out questions. Left: inputs where retrieval found the evidence. Right: inputs where the evidence was removed, so the only correct output is a refusal." title="Figure 11"/>
+            <wp:cNvGraphicFramePr>
+              <a:graphicFrameLocks xmlns:a="http://schemas.openxmlformats.org/drawingml/2006/main" noChangeAspect="1"/>
+            </wp:cNvGraphicFramePr>
+            <a:graphic xmlns:a="http://schemas.openxmlformats.org/drawingml/2006/main">
+              <a:graphicData uri="http://schemas.openxmlformats.org/drawingml/2006/picture">
+                <pic:pic xmlns:pic="http://schemas.openxmlformats.org/drawingml/2006/picture">
+                  <pic:nvPicPr>
+                    <pic:cNvPr id="0" name="" descr=""/>
+                    <pic:cNvPicPr>
+                      <a:picLocks noChangeAspect="1" noChangeArrowheads="1"/>
+                    </pic:cNvPicPr>
+                  </pic:nvPicPr>
+                  <pic:blipFill>
+                    <a:blip r:embed="rId21" cstate="none"/>
+                    <a:srcRect/>
+                    <a:stretch>
+                      <a:fillRect/>
+                    </a:stretch>
+                  </pic:blipFill>
+                  <pic:spPr bwMode="auto">
+                    <a:xfrm>
+                      <a:off x="0" y="0"/>
                       <a:ext cx="5715000" cy="2124075"/>
                     </a:xfrm>
                     <a:prstGeom prst="rect">
@@ -7591,7 +7617,7 @@
                     </pic:cNvPicPr>
                   </pic:nvPicPr>
                   <pic:blipFill>
-                    <a:blip r:embed="rId21" cstate="none"/>
+                    <a:blip r:embed="rId22" cstate="none"/>
                     <a:srcRect/>
                     <a:stretch>
                       <a:fillRect/>
@@ -7706,75 +7732,6 @@
             <wp:extent cx="4381500" cy="3048000"/>
             <wp:effectExtent t="0" r="0" b="0" l="0"/>
             <wp:docPr id="13" name="Figure 13" descr="Terminal session on the ATtiny85 datasheet: ADC accuracy, electrical characteristics and a correct refusal." title="Figure 13"/>
-            <wp:cNvGraphicFramePr>
-              <a:graphicFrameLocks xmlns:a="http://schemas.openxmlformats.org/drawingml/2006/main" noChangeAspect="1"/>
-            </wp:cNvGraphicFramePr>
-            <a:graphic xmlns:a="http://schemas.openxmlformats.org/drawingml/2006/main">
-              <a:graphicData uri="http://schemas.openxmlformats.org/drawingml/2006/picture">
-                <pic:pic xmlns:pic="http://schemas.openxmlformats.org/drawingml/2006/picture">
-                  <pic:nvPicPr>
-                    <pic:cNvPr id="0" name="" descr=""/>
-                    <pic:cNvPicPr>
-                      <a:picLocks noChangeAspect="1" noChangeArrowheads="1"/>
-                    </pic:cNvPicPr>
-                  </pic:nvPicPr>
-                  <pic:blipFill>
-                    <a:blip r:embed="rId22" cstate="none"/>
-                    <a:srcRect/>
-                    <a:stretch>
-                      <a:fillRect/>
-                    </a:stretch>
-                  </pic:blipFill>
-                  <pic:spPr bwMode="auto">
-                    <a:xfrm>
-                      <a:off x="0" y="0"/>
-                      <a:ext cx="4381500" cy="3048000"/>
-                    </a:xfrm>
-                    <a:prstGeom prst="rect">
-                      <a:avLst/>
-                    </a:prstGeom>
-                  </pic:spPr>
-                </pic:pic>
-              </a:graphicData>
-            </a:graphic>
-          </wp:inline>
-        </w:drawing>
-      </w:r>
-    </w:p>
-    <w:p>
-      <w:pPr>
-        <w:spacing w:after="240"/>
-        <w:jc w:val="center"/>
-      </w:pPr>
-      <w:r>
-        <w:rPr>
-          <w:b/>
-          <w:bCs/>
-          <w:sz w:val="20"/>
-          <w:szCs w:val="20"/>
-        </w:rPr>
-        <w:t xml:space="preserve">Figure 13: </w:t>
-      </w:r>
-      <w:r>
-        <w:rPr>
-          <w:sz w:val="20"/>
-          <w:szCs w:val="20"/>
-        </w:rPr>
-        <w:t xml:space="preserve">Terminal session on the ATtiny85 datasheet: ADC accuracy, electrical characteristics and a correct refusal.</w:t>
-      </w:r>
-    </w:p>
-    <w:p>
-      <w:pPr>
-        <w:keepNext/>
-        <w:spacing w:after="60" w:before="120"/>
-        <w:jc w:val="center"/>
-      </w:pPr>
-      <w:r>
-        <w:drawing>
-          <wp:inline distT="0" distB="0" distL="0" distR="0">
-            <wp:extent cx="4381500" cy="3124200"/>
-            <wp:effectExtent t="0" r="0" b="0" l="0"/>
-            <wp:docPr id="14" name="Figure 14" descr="Terminal session on the ESP32-H2 datasheet: security, radio and peripheral questions." title="Figure 14"/>
             <wp:cNvGraphicFramePr>
               <a:graphicFrameLocks xmlns:a="http://schemas.openxmlformats.org/drawingml/2006/main" noChangeAspect="1"/>
             </wp:cNvGraphicFramePr>
@@ -7797,7 +7754,7 @@
                   <pic:spPr bwMode="auto">
                     <a:xfrm>
                       <a:off x="0" y="0"/>
-                      <a:ext cx="4381500" cy="3124200"/>
+                      <a:ext cx="4381500" cy="3048000"/>
                     </a:xfrm>
                     <a:prstGeom prst="rect">
                       <a:avLst/>
@@ -7822,14 +7779,14 @@
           <w:sz w:val="20"/>
           <w:szCs w:val="20"/>
         </w:rPr>
-        <w:t xml:space="preserve">Figure 14: </w:t>
+        <w:t xml:space="preserve">Figure 13: </w:t>
       </w:r>
       <w:r>
         <w:rPr>
           <w:sz w:val="20"/>
           <w:szCs w:val="20"/>
         </w:rPr>
-        <w:t xml:space="preserve">Terminal session on the ESP32-H2 datasheet: security, radio and peripheral questions.</w:t>
+        <w:t xml:space="preserve">Terminal session on the ATtiny85 datasheet: ADC accuracy, electrical characteristics and a correct refusal.</w:t>
       </w:r>
     </w:p>
     <w:p>
@@ -7841,9 +7798,9 @@
       <w:r>
         <w:drawing>
           <wp:inline distT="0" distB="0" distL="0" distR="0">
-            <wp:extent cx="4381500" cy="3219450"/>
+            <wp:extent cx="4381500" cy="3124200"/>
             <wp:effectExtent t="0" r="0" b="0" l="0"/>
-            <wp:docPr id="15" name="Figure 15" descr="Terminal session on the CC2640R2F datasheet: power, clock, memory, pin-out and tooling questions." title="Figure 15"/>
+            <wp:docPr id="14" name="Figure 14" descr="Terminal session on the ESP32-H2 datasheet: security, radio and peripheral questions." title="Figure 14"/>
             <wp:cNvGraphicFramePr>
               <a:graphicFrameLocks xmlns:a="http://schemas.openxmlformats.org/drawingml/2006/main" noChangeAspect="1"/>
             </wp:cNvGraphicFramePr>
@@ -7866,6 +7823,75 @@
                   <pic:spPr bwMode="auto">
                     <a:xfrm>
                       <a:off x="0" y="0"/>
+                      <a:ext cx="4381500" cy="3124200"/>
+                    </a:xfrm>
+                    <a:prstGeom prst="rect">
+                      <a:avLst/>
+                    </a:prstGeom>
+                  </pic:spPr>
+                </pic:pic>
+              </a:graphicData>
+            </a:graphic>
+          </wp:inline>
+        </w:drawing>
+      </w:r>
+    </w:p>
+    <w:p>
+      <w:pPr>
+        <w:spacing w:after="240"/>
+        <w:jc w:val="center"/>
+      </w:pPr>
+      <w:r>
+        <w:rPr>
+          <w:b/>
+          <w:bCs/>
+          <w:sz w:val="20"/>
+          <w:szCs w:val="20"/>
+        </w:rPr>
+        <w:t xml:space="preserve">Figure 14: </w:t>
+      </w:r>
+      <w:r>
+        <w:rPr>
+          <w:sz w:val="20"/>
+          <w:szCs w:val="20"/>
+        </w:rPr>
+        <w:t xml:space="preserve">Terminal session on the ESP32-H2 datasheet: security, radio and peripheral questions.</w:t>
+      </w:r>
+    </w:p>
+    <w:p>
+      <w:pPr>
+        <w:keepNext/>
+        <w:spacing w:after="60" w:before="120"/>
+        <w:jc w:val="center"/>
+      </w:pPr>
+      <w:r>
+        <w:drawing>
+          <wp:inline distT="0" distB="0" distL="0" distR="0">
+            <wp:extent cx="4381500" cy="3219450"/>
+            <wp:effectExtent t="0" r="0" b="0" l="0"/>
+            <wp:docPr id="15" name="Figure 15" descr="Terminal session on the CC2640R2F datasheet: power, clock, memory, pin-out and tooling questions." title="Figure 15"/>
+            <wp:cNvGraphicFramePr>
+              <a:graphicFrameLocks xmlns:a="http://schemas.openxmlformats.org/drawingml/2006/main" noChangeAspect="1"/>
+            </wp:cNvGraphicFramePr>
+            <a:graphic xmlns:a="http://schemas.openxmlformats.org/drawingml/2006/main">
+              <a:graphicData uri="http://schemas.openxmlformats.org/drawingml/2006/picture">
+                <pic:pic xmlns:pic="http://schemas.openxmlformats.org/drawingml/2006/picture">
+                  <pic:nvPicPr>
+                    <pic:cNvPr id="0" name="" descr=""/>
+                    <pic:cNvPicPr>
+                      <a:picLocks noChangeAspect="1" noChangeArrowheads="1"/>
+                    </pic:cNvPicPr>
+                  </pic:nvPicPr>
+                  <pic:blipFill>
+                    <a:blip r:embed="rId25" cstate="none"/>
+                    <a:srcRect/>
+                    <a:stretch>
+                      <a:fillRect/>
+                    </a:stretch>
+                  </pic:blipFill>
+                  <pic:spPr bwMode="auto">
+                    <a:xfrm>
+                      <a:off x="0" y="0"/>
                       <a:ext cx="4381500" cy="3219450"/>
                     </a:xfrm>
                     <a:prstGeom prst="rect">
@@ -7946,7 +7972,7 @@
                     </pic:cNvPicPr>
                   </pic:nvPicPr>
                   <pic:blipFill>
-                    <a:blip r:embed="rId25" cstate="none"/>
+                    <a:blip r:embed="rId26" cstate="none"/>
                     <a:srcRect/>
                     <a:stretch>
                       <a:fillRect/>

</xml_diff>